<commit_message>
State the cutoff in routine use (0.01) at the top of Step 4 and per tract family
Step 4 now opens with a "Cutoff in routine use" section and a table of the
cutoffs used with the atlas, including the full-sample outcome in the example
dataset (228 of 228 runs reached 2,500 streamlines at 0.01). The per-family
table in Step 5 and the consolidated parameters table carry the same value.
Supplementary Methods rebuilt.

Co-Authored-By: Claude Fable 5.1 <noreply@anthropic.com>
</commit_message>
<xml_diff>
--- a/static/supplement/MesoConnect_Supplementary_Methods.docx
+++ b/static/supplement/MesoConnect_Supplementary_Methods.docx
@@ -8438,6 +8438,18 @@
     </w:p>
     <w:p>
       <w:pPr>
+        <w:pStyle w:val="Heading2"/>
+        <w:bidi w:val="0"/>
+        <w:jc w:val="left"/>
+        <w:rPr/>
+      </w:pPr>
+      <w:r>
+        <w:rPr/>
+        <w:t>Cutoff in routine use</w:t>
+      </w:r>
+    </w:p>
+    <w:p>
+      <w:pPr>
         <w:pStyle w:val="BodyText"/>
         <w:bidi w:val="0"/>
         <w:jc w:val="left"/>
@@ -8445,7 +8457,504 @@
       </w:pPr>
       <w:r>
         <w:rPr/>
-        <w:t>During atlas construction at 7 T the cutoff was 0.06 for ventral tegmental area (VTA) → hippocampus and 0.08 for hippocampus → accumbens. The MRtrix3 default for FOD-based tracking is 0.05. Because lower field strength yields noisier FOD estimates, a higher cutoff (approximately 0.08) was anticipated for 3 T data. The pilot sweep did not support that expectation.</w:t>
+        <w:t xml:space="preserve">The value in routine use with the corridor mask is 0.01, and it is the default in </w:t>
+      </w:r>
+      <w:r>
+        <w:rPr>
+          <w:rStyle w:val="SourceText"/>
+        </w:rPr>
+        <w:t>00_config.sh</w:t>
+      </w:r>
+      <w:r>
+        <w:rPr/>
+        <w:t>. It is the recommended starting value for any tract reconstructed with this workflow; the pilot sweep described below confirms it for a new dataset or tract family and takes under an hour. Table S8 lists the cutoffs that have been used with the atlas.</w:t>
+      </w:r>
+    </w:p>
+    <w:p>
+      <w:pPr>
+        <w:pStyle w:val="BodyText"/>
+        <w:bidi w:val="0"/>
+        <w:jc w:val="left"/>
+        <w:rPr/>
+      </w:pPr>
+      <w:r>
+        <w:rPr>
+          <w:rStyle w:val="Strong"/>
+        </w:rPr>
+        <w:t>Table S8</w:t>
+      </w:r>
+    </w:p>
+    <w:p>
+      <w:pPr>
+        <w:pStyle w:val="BodyText"/>
+        <w:bidi w:val="0"/>
+        <w:jc w:val="left"/>
+        <w:rPr/>
+      </w:pPr>
+      <w:r>
+        <w:rPr>
+          <w:rStyle w:val="Emphasis"/>
+        </w:rPr>
+        <w:t>FOD Amplitude Cutoffs in Use</w:t>
+      </w:r>
+    </w:p>
+    <w:tbl>
+      <w:tblPr>
+        <w:tblW w:w="5000" w:type="pct"/>
+        <w:jc w:val="left"/>
+        <w:tblInd w:w="60" w:type="dxa"/>
+        <w:tblLayout w:type="fixed"/>
+        <w:tblCellMar>
+          <w:top w:w="60" w:type="dxa"/>
+          <w:left w:w="60" w:type="dxa"/>
+          <w:bottom w:w="60" w:type="dxa"/>
+          <w:right w:w="60" w:type="dxa"/>
+        </w:tblCellMar>
+      </w:tblPr>
+      <w:tblGrid>
+        <w:gridCol w:w="4620"/>
+        <w:gridCol w:w="806"/>
+        <w:gridCol w:w="3934"/>
+      </w:tblGrid>
+      <w:tr>
+        <w:trPr>
+          <w:tblHeader w:val="true"/>
+        </w:trPr>
+        <w:tc>
+          <w:tcPr>
+            <w:tcW w:w="4620" w:type="dxa"/>
+            <w:tcBorders>
+              <w:top w:val="single" w:sz="6" w:space="0" w:color="808080"/>
+              <w:bottom w:val="single" w:sz="2" w:space="0" w:color="808080"/>
+            </w:tcBorders>
+            <w:vAlign w:val="center"/>
+          </w:tcPr>
+          <w:p>
+            <w:pPr>
+              <w:pStyle w:val="TableHeading"/>
+              <w:suppressLineNumbers/>
+              <w:bidi w:val="0"/>
+              <w:jc w:val="left"/>
+              <w:rPr/>
+            </w:pPr>
+            <w:r>
+              <w:rPr/>
+              <w:t>Setting</w:t>
+            </w:r>
+          </w:p>
+        </w:tc>
+        <w:tc>
+          <w:tcPr>
+            <w:tcW w:w="806" w:type="dxa"/>
+            <w:tcBorders>
+              <w:top w:val="single" w:sz="6" w:space="0" w:color="808080"/>
+              <w:bottom w:val="single" w:sz="2" w:space="0" w:color="808080"/>
+            </w:tcBorders>
+            <w:vAlign w:val="center"/>
+          </w:tcPr>
+          <w:p>
+            <w:pPr>
+              <w:pStyle w:val="TableHeading"/>
+              <w:suppressLineNumbers/>
+              <w:bidi w:val="0"/>
+              <w:jc w:val="left"/>
+              <w:rPr/>
+            </w:pPr>
+            <w:r>
+              <w:rPr/>
+              <w:t>Cutoff</w:t>
+            </w:r>
+          </w:p>
+        </w:tc>
+        <w:tc>
+          <w:tcPr>
+            <w:tcW w:w="3934" w:type="dxa"/>
+            <w:tcBorders>
+              <w:top w:val="single" w:sz="6" w:space="0" w:color="808080"/>
+              <w:bottom w:val="single" w:sz="2" w:space="0" w:color="808080"/>
+            </w:tcBorders>
+            <w:vAlign w:val="center"/>
+          </w:tcPr>
+          <w:p>
+            <w:pPr>
+              <w:pStyle w:val="TableHeading"/>
+              <w:suppressLineNumbers/>
+              <w:bidi w:val="0"/>
+              <w:jc w:val="left"/>
+              <w:rPr/>
+            </w:pPr>
+            <w:r>
+              <w:rPr/>
+              <w:t>Outcome</w:t>
+            </w:r>
+          </w:p>
+        </w:tc>
+      </w:tr>
+      <w:tr>
+        <w:trPr/>
+        <w:tc>
+          <w:tcPr>
+            <w:tcW w:w="4620" w:type="dxa"/>
+            <w:tcBorders/>
+            <w:vAlign w:val="center"/>
+          </w:tcPr>
+          <w:p>
+            <w:pPr>
+              <w:pStyle w:val="TableContents"/>
+              <w:widowControl w:val="false"/>
+              <w:suppressLineNumbers/>
+              <w:bidi w:val="0"/>
+              <w:jc w:val="left"/>
+              <w:rPr/>
+            </w:pPr>
+            <w:r>
+              <w:rPr/>
+              <w:t>Corridor workflow, 3 T multi-shell data (example dataset): posterior and anterior ventral tegmental area (VTA) → hippocampus</w:t>
+            </w:r>
+          </w:p>
+        </w:tc>
+        <w:tc>
+          <w:tcPr>
+            <w:tcW w:w="806" w:type="dxa"/>
+            <w:tcBorders/>
+            <w:vAlign w:val="center"/>
+          </w:tcPr>
+          <w:p>
+            <w:pPr>
+              <w:pStyle w:val="TableContents"/>
+              <w:widowControl w:val="false"/>
+              <w:suppressLineNumbers/>
+              <w:bidi w:val="0"/>
+              <w:jc w:val="left"/>
+              <w:rPr/>
+            </w:pPr>
+            <w:r>
+              <w:rPr/>
+              <w:t>0.01</w:t>
+            </w:r>
+          </w:p>
+        </w:tc>
+        <w:tc>
+          <w:tcPr>
+            <w:tcW w:w="3934" w:type="dxa"/>
+            <w:tcBorders/>
+            <w:vAlign w:val="center"/>
+          </w:tcPr>
+          <w:p>
+            <w:pPr>
+              <w:pStyle w:val="TableContents"/>
+              <w:widowControl w:val="false"/>
+              <w:suppressLineNumbers/>
+              <w:bidi w:val="0"/>
+              <w:jc w:val="left"/>
+              <w:rPr/>
+            </w:pPr>
+            <w:r>
+              <w:rPr/>
+              <w:t>All 228 runs (57 participants, two tracts, two hemispheres) reached 2,500 streamlines; no participant excluded</w:t>
+            </w:r>
+          </w:p>
+        </w:tc>
+      </w:tr>
+      <w:tr>
+        <w:trPr/>
+        <w:tc>
+          <w:tcPr>
+            <w:tcW w:w="4620" w:type="dxa"/>
+            <w:tcBorders/>
+            <w:vAlign w:val="center"/>
+          </w:tcPr>
+          <w:p>
+            <w:pPr>
+              <w:pStyle w:val="TableContents"/>
+              <w:widowControl w:val="false"/>
+              <w:suppressLineNumbers/>
+              <w:bidi w:val="0"/>
+              <w:jc w:val="left"/>
+              <w:rPr/>
+            </w:pPr>
+            <w:r>
+              <w:rPr/>
+              <w:t>Corridor workflow, VTA → accumbens (other users of the atlas)</w:t>
+            </w:r>
+          </w:p>
+        </w:tc>
+        <w:tc>
+          <w:tcPr>
+            <w:tcW w:w="806" w:type="dxa"/>
+            <w:tcBorders/>
+            <w:vAlign w:val="center"/>
+          </w:tcPr>
+          <w:p>
+            <w:pPr>
+              <w:pStyle w:val="TableContents"/>
+              <w:widowControl w:val="false"/>
+              <w:suppressLineNumbers/>
+              <w:bidi w:val="0"/>
+              <w:jc w:val="left"/>
+              <w:rPr/>
+            </w:pPr>
+            <w:r>
+              <w:rPr/>
+              <w:t>0.01</w:t>
+            </w:r>
+          </w:p>
+        </w:tc>
+        <w:tc>
+          <w:tcPr>
+            <w:tcW w:w="3934" w:type="dxa"/>
+            <w:tcBorders/>
+            <w:vAlign w:val="center"/>
+          </w:tcPr>
+          <w:p>
+            <w:pPr>
+              <w:pStyle w:val="TableContents"/>
+              <w:widowControl w:val="false"/>
+              <w:suppressLineNumbers/>
+              <w:bidi w:val="0"/>
+              <w:jc w:val="left"/>
+              <w:rPr/>
+            </w:pPr>
+            <w:r>
+              <w:rPr/>
+              <w:t>Reported to reconstruct the tract</w:t>
+            </w:r>
+          </w:p>
+        </w:tc>
+      </w:tr>
+      <w:tr>
+        <w:trPr/>
+        <w:tc>
+          <w:tcPr>
+            <w:tcW w:w="4620" w:type="dxa"/>
+            <w:tcBorders/>
+            <w:vAlign w:val="center"/>
+          </w:tcPr>
+          <w:p>
+            <w:pPr>
+              <w:pStyle w:val="TableContents"/>
+              <w:widowControl w:val="false"/>
+              <w:suppressLineNumbers/>
+              <w:bidi w:val="0"/>
+              <w:jc w:val="left"/>
+              <w:rPr/>
+            </w:pPr>
+            <w:r>
+              <w:rPr/>
+              <w:t>Atlas construction, 7 T: VTA → hippocampus and VTA → accumbens</w:t>
+            </w:r>
+          </w:p>
+        </w:tc>
+        <w:tc>
+          <w:tcPr>
+            <w:tcW w:w="806" w:type="dxa"/>
+            <w:tcBorders/>
+            <w:vAlign w:val="center"/>
+          </w:tcPr>
+          <w:p>
+            <w:pPr>
+              <w:pStyle w:val="TableContents"/>
+              <w:widowControl w:val="false"/>
+              <w:suppressLineNumbers/>
+              <w:bidi w:val="0"/>
+              <w:jc w:val="left"/>
+              <w:rPr/>
+            </w:pPr>
+            <w:r>
+              <w:rPr/>
+              <w:t>0.06</w:t>
+            </w:r>
+          </w:p>
+        </w:tc>
+        <w:tc>
+          <w:tcPr>
+            <w:tcW w:w="3934" w:type="dxa"/>
+            <w:tcBorders/>
+            <w:vAlign w:val="center"/>
+          </w:tcPr>
+          <w:p>
+            <w:pPr>
+              <w:pStyle w:val="TableContents"/>
+              <w:widowControl w:val="false"/>
+              <w:suppressLineNumbers/>
+              <w:bidi w:val="0"/>
+              <w:jc w:val="left"/>
+              <w:rPr/>
+            </w:pPr>
+            <w:r>
+              <w:rPr/>
+              <w:t>Value used to build the atlas</w:t>
+            </w:r>
+          </w:p>
+        </w:tc>
+      </w:tr>
+      <w:tr>
+        <w:trPr/>
+        <w:tc>
+          <w:tcPr>
+            <w:tcW w:w="4620" w:type="dxa"/>
+            <w:tcBorders/>
+            <w:vAlign w:val="center"/>
+          </w:tcPr>
+          <w:p>
+            <w:pPr>
+              <w:pStyle w:val="TableContents"/>
+              <w:widowControl w:val="false"/>
+              <w:suppressLineNumbers/>
+              <w:bidi w:val="0"/>
+              <w:jc w:val="left"/>
+              <w:rPr/>
+            </w:pPr>
+            <w:r>
+              <w:rPr/>
+              <w:t>Atlas construction, 7 T: hippocampus → accumbens and hippocampus → ventral pallidum</w:t>
+            </w:r>
+          </w:p>
+        </w:tc>
+        <w:tc>
+          <w:tcPr>
+            <w:tcW w:w="806" w:type="dxa"/>
+            <w:tcBorders/>
+            <w:vAlign w:val="center"/>
+          </w:tcPr>
+          <w:p>
+            <w:pPr>
+              <w:pStyle w:val="TableContents"/>
+              <w:widowControl w:val="false"/>
+              <w:suppressLineNumbers/>
+              <w:bidi w:val="0"/>
+              <w:jc w:val="left"/>
+              <w:rPr/>
+            </w:pPr>
+            <w:r>
+              <w:rPr/>
+              <w:t>0.08</w:t>
+            </w:r>
+          </w:p>
+        </w:tc>
+        <w:tc>
+          <w:tcPr>
+            <w:tcW w:w="3934" w:type="dxa"/>
+            <w:tcBorders/>
+            <w:vAlign w:val="center"/>
+          </w:tcPr>
+          <w:p>
+            <w:pPr>
+              <w:pStyle w:val="TableContents"/>
+              <w:widowControl w:val="false"/>
+              <w:suppressLineNumbers/>
+              <w:bidi w:val="0"/>
+              <w:jc w:val="left"/>
+              <w:rPr/>
+            </w:pPr>
+            <w:r>
+              <w:rPr/>
+              <w:t>Value used to build the atlas</w:t>
+            </w:r>
+          </w:p>
+        </w:tc>
+      </w:tr>
+      <w:tr>
+        <w:trPr/>
+        <w:tc>
+          <w:tcPr>
+            <w:tcW w:w="4620" w:type="dxa"/>
+            <w:tcBorders>
+              <w:bottom w:val="single" w:sz="6" w:space="0" w:color="808080"/>
+            </w:tcBorders>
+            <w:vAlign w:val="center"/>
+          </w:tcPr>
+          <w:p>
+            <w:pPr>
+              <w:pStyle w:val="TableContents"/>
+              <w:widowControl w:val="false"/>
+              <w:suppressLineNumbers/>
+              <w:bidi w:val="0"/>
+              <w:jc w:val="left"/>
+              <w:rPr/>
+            </w:pPr>
+            <w:r>
+              <w:rPr/>
+              <w:t>MRtrix3 default for FOD-based tracking</w:t>
+            </w:r>
+          </w:p>
+        </w:tc>
+        <w:tc>
+          <w:tcPr>
+            <w:tcW w:w="806" w:type="dxa"/>
+            <w:tcBorders>
+              <w:bottom w:val="single" w:sz="6" w:space="0" w:color="808080"/>
+            </w:tcBorders>
+            <w:vAlign w:val="center"/>
+          </w:tcPr>
+          <w:p>
+            <w:pPr>
+              <w:pStyle w:val="TableContents"/>
+              <w:widowControl w:val="false"/>
+              <w:suppressLineNumbers/>
+              <w:bidi w:val="0"/>
+              <w:jc w:val="left"/>
+              <w:rPr/>
+            </w:pPr>
+            <w:r>
+              <w:rPr/>
+              <w:t>0.05</w:t>
+            </w:r>
+          </w:p>
+        </w:tc>
+        <w:tc>
+          <w:tcPr>
+            <w:tcW w:w="3934" w:type="dxa"/>
+            <w:tcBorders>
+              <w:bottom w:val="single" w:sz="6" w:space="0" w:color="808080"/>
+            </w:tcBorders>
+            <w:vAlign w:val="center"/>
+          </w:tcPr>
+          <w:p>
+            <w:pPr>
+              <w:pStyle w:val="TableContents"/>
+              <w:widowControl w:val="false"/>
+              <w:suppressLineNumbers/>
+              <w:bidi w:val="0"/>
+              <w:jc w:val="left"/>
+              <w:rPr/>
+            </w:pPr>
+            <w:r>
+              <w:rPr/>
+              <w:t>For reference; not used here</w:t>
+            </w:r>
+          </w:p>
+        </w:tc>
+      </w:tr>
+    </w:tbl>
+    <w:p>
+      <w:pPr>
+        <w:pStyle w:val="BodyText"/>
+        <w:bidi w:val="0"/>
+        <w:jc w:val="left"/>
+        <w:rPr/>
+      </w:pPr>
+      <w:r>
+        <w:rPr>
+          <w:rStyle w:val="Emphasis"/>
+        </w:rPr>
+        <w:t>Note.</w:t>
+      </w:r>
+      <w:r>
+        <w:rPr/>
+        <w:t xml:space="preserve"> A cutoff of 0.01 is usable only with the corridor's exclusion mask. Without the mask it produces streamlines throughout the brain.</w:t>
+      </w:r>
+    </w:p>
+    <w:p>
+      <w:pPr>
+        <w:pStyle w:val="BodyText"/>
+        <w:bidi w:val="0"/>
+        <w:jc w:val="left"/>
+        <w:rPr/>
+      </w:pPr>
+      <w:r>
+        <w:rPr/>
+        <w:t>Because lower field strength yields noisier FOD estimates, a cutoff higher than the 7 T values (approximately 0.08) was anticipated for 3 T data. The pilot sweep did not support that expectation: the conservative cutoffs failed to reach the target in several participants, and 0.01 reached it in all of them with about one fifth of the seeds.</w:t>
       </w:r>
     </w:p>
     <w:p>
@@ -8514,7 +9023,7 @@
       </w:pPr>
       <w:r>
         <w:rPr/>
-        <w:t>The script reports streamlines reached, seeds consumed and mean length for each participant and cutoff. Table S8 gives the streamline counts obtained in the example dataset. At 0.1 most runs exhausted the seed budget before reaching the target. At 0.08 some participants reached the target and one stopped at 309. At 0.06 and at 0.01 all runs reached the target; the 0.01 runs consumed approximately one fifth of the seeds (about 415,000 versus 2.1 million or more at 0.06). Reaching the target in every pilot participant is a necessary condition for a cutoff; the reconstructions must also correspond to the tract, which is assessed next.</w:t>
+        <w:t>The script reports streamlines reached, seeds consumed and mean length for each participant and cutoff. Table S9 gives the streamline counts obtained in the example dataset. At 0.1 most runs exhausted the seed budget before reaching the target. At 0.08 some participants reached the target and one stopped at 309. At 0.06 and at 0.01 all runs reached the target; the 0.01 runs consumed approximately one fifth of the seeds (about 415,000 versus 2.1 million or more at 0.06). Reaching the target in every pilot participant is a necessary condition for a cutoff; the reconstructions must also correspond to the tract, which is assessed next.</w:t>
       </w:r>
     </w:p>
     <w:p>
@@ -8528,7 +9037,7 @@
         <w:rPr>
           <w:rStyle w:val="Strong"/>
         </w:rPr>
-        <w:t>Table S8</w:t>
+        <w:t>Table S9</w:t>
       </w:r>
     </w:p>
     <w:p>
@@ -10042,7 +10551,7 @@
       </w:pPr>
       <w:r>
         <w:rPr/>
-        <w:t>The cutoff selected is the most permissive value that reaches the streamline target in every pilot participant and whose reconstruction matches the conservative reconstruction. In the example dataset this was 0.01. Other users of the atlas have used 0.01 for VTA → accumbens. The corridor mask is the condition that makes this value usable; the same cutoff without an exclusion mask produces streamlines throughout the brain. The sweep should be repeated for each tract family, since a cutoff selected for VTA → hippocampus is only a starting value for other pathways.</w:t>
+        <w:t>The cutoff selected is the most permissive value that reaches the streamline target in every pilot participant and whose reconstruction matches the conservative reconstruction. In the example dataset this was 0.01, the value in routine use (Table S8). A higher value is warranted only when the 0.01 reconstruction departs from the conservative reconstruction in the side-by-side images, for example by filling the corridor rather than following the tract; the next value in Table S8 (0.06) is then tried. The sweep should be repeated for each tract family, since a cutoff confirmed for VTA → hippocampus is a starting value for other pathways.</w:t>
       </w:r>
     </w:p>
     <w:p>
@@ -10352,7 +10861,7 @@
       </w:pPr>
       <w:r>
         <w:rPr/>
-        <w:t xml:space="preserve">Table S9 gives the rationale for each option, and Table S10 the values used per tract family. The script records the number of streamlines reached and the number of seeds consumed per participant in </w:t>
+        <w:t xml:space="preserve">Table S10 gives the rationale for each option, and Table S11 the values used per tract family. The script records the number of streamlines reached and the number of seeds consumed per participant in </w:t>
       </w:r>
       <w:r>
         <w:rPr>
@@ -10376,7 +10885,7 @@
         <w:rPr>
           <w:rStyle w:val="Strong"/>
         </w:rPr>
-        <w:t>Table S9</w:t>
+        <w:t>Table S10</w:t>
       </w:r>
     </w:p>
     <w:p>
@@ -11037,7 +11546,7 @@
         <w:rPr>
           <w:rStyle w:val="Strong"/>
         </w:rPr>
-        <w:t>Table S10</w:t>
+        <w:t>Table S11</w:t>
       </w:r>
     </w:p>
     <w:p>
@@ -11068,10 +11577,11 @@
         </w:tblCellMar>
       </w:tblPr>
       <w:tblGrid>
-        <w:gridCol w:w="3295"/>
-        <w:gridCol w:w="2119"/>
-        <w:gridCol w:w="1368"/>
-        <w:gridCol w:w="2578"/>
+        <w:gridCol w:w="2671"/>
+        <w:gridCol w:w="1324"/>
+        <w:gridCol w:w="1828"/>
+        <w:gridCol w:w="1256"/>
+        <w:gridCol w:w="2281"/>
       </w:tblGrid>
       <w:tr>
         <w:trPr>
@@ -11079,7 +11589,7 @@
         </w:trPr>
         <w:tc>
           <w:tcPr>
-            <w:tcW w:w="3295" w:type="dxa"/>
+            <w:tcW w:w="2671" w:type="dxa"/>
             <w:tcBorders>
               <w:top w:val="single" w:sz="6" w:space="0" w:color="808080"/>
               <w:bottom w:val="single" w:sz="2" w:space="0" w:color="808080"/>
@@ -11102,7 +11612,7 @@
         </w:tc>
         <w:tc>
           <w:tcPr>
-            <w:tcW w:w="2119" w:type="dxa"/>
+            <w:tcW w:w="1324" w:type="dxa"/>
             <w:tcBorders>
               <w:top w:val="single" w:sz="6" w:space="0" w:color="808080"/>
               <w:bottom w:val="single" w:sz="2" w:space="0" w:color="808080"/>
@@ -11119,13 +11629,13 @@
             </w:pPr>
             <w:r>
               <w:rPr/>
-              <w:t>Cutoff at 7 T (atlas construction)</w:t>
-            </w:r>
-          </w:p>
-        </w:tc>
-        <w:tc>
-          <w:tcPr>
-            <w:tcW w:w="1368" w:type="dxa"/>
+              <w:t>Cutoff with the corridor</w:t>
+            </w:r>
+          </w:p>
+        </w:tc>
+        <w:tc>
+          <w:tcPr>
+            <w:tcW w:w="1828" w:type="dxa"/>
             <w:tcBorders>
               <w:top w:val="single" w:sz="6" w:space="0" w:color="808080"/>
               <w:bottom w:val="single" w:sz="2" w:space="0" w:color="808080"/>
@@ -11142,13 +11652,13 @@
             </w:pPr>
             <w:r>
               <w:rPr/>
-              <w:t>Length bounds</w:t>
-            </w:r>
-          </w:p>
-        </w:tc>
-        <w:tc>
-          <w:tcPr>
-            <w:tcW w:w="2578" w:type="dxa"/>
+              <w:t>Cutoff at 7 T (atlas construction)</w:t>
+            </w:r>
+          </w:p>
+        </w:tc>
+        <w:tc>
+          <w:tcPr>
+            <w:tcW w:w="1256" w:type="dxa"/>
             <w:tcBorders>
               <w:top w:val="single" w:sz="6" w:space="0" w:color="808080"/>
               <w:bottom w:val="single" w:sz="2" w:space="0" w:color="808080"/>
@@ -11165,6 +11675,29 @@
             </w:pPr>
             <w:r>
               <w:rPr/>
+              <w:t>Length bounds</w:t>
+            </w:r>
+          </w:p>
+        </w:tc>
+        <w:tc>
+          <w:tcPr>
+            <w:tcW w:w="2281" w:type="dxa"/>
+            <w:tcBorders>
+              <w:top w:val="single" w:sz="6" w:space="0" w:color="808080"/>
+              <w:bottom w:val="single" w:sz="2" w:space="0" w:color="808080"/>
+            </w:tcBorders>
+            <w:vAlign w:val="center"/>
+          </w:tcPr>
+          <w:p>
+            <w:pPr>
+              <w:pStyle w:val="TableHeading"/>
+              <w:suppressLineNumbers/>
+              <w:bidi w:val="0"/>
+              <w:jc w:val="left"/>
+              <w:rPr/>
+            </w:pPr>
+            <w:r>
+              <w:rPr/>
               <w:t>Notes</w:t>
             </w:r>
           </w:p>
@@ -11174,7 +11707,7 @@
         <w:trPr/>
         <w:tc>
           <w:tcPr>
-            <w:tcW w:w="3295" w:type="dxa"/>
+            <w:tcW w:w="2671" w:type="dxa"/>
             <w:tcBorders/>
             <w:vAlign w:val="center"/>
           </w:tcPr>
@@ -11195,7 +11728,28 @@
         </w:tc>
         <w:tc>
           <w:tcPr>
-            <w:tcW w:w="2119" w:type="dxa"/>
+            <w:tcW w:w="1324" w:type="dxa"/>
+            <w:tcBorders/>
+            <w:vAlign w:val="center"/>
+          </w:tcPr>
+          <w:p>
+            <w:pPr>
+              <w:pStyle w:val="TableContents"/>
+              <w:widowControl w:val="false"/>
+              <w:suppressLineNumbers/>
+              <w:bidi w:val="0"/>
+              <w:jc w:val="left"/>
+              <w:rPr/>
+            </w:pPr>
+            <w:r>
+              <w:rPr/>
+              <w:t>0.01</w:t>
+            </w:r>
+          </w:p>
+        </w:tc>
+        <w:tc>
+          <w:tcPr>
+            <w:tcW w:w="1828" w:type="dxa"/>
             <w:tcBorders/>
             <w:vAlign w:val="center"/>
           </w:tcPr>
@@ -11216,7 +11770,7 @@
         </w:tc>
         <w:tc>
           <w:tcPr>
-            <w:tcW w:w="1368" w:type="dxa"/>
+            <w:tcW w:w="1256" w:type="dxa"/>
             <w:tcBorders/>
             <w:vAlign w:val="center"/>
           </w:tcPr>
@@ -11237,22 +11791,22 @@
         </w:tc>
         <w:tc>
           <w:tcPr>
-            <w:tcW w:w="2578" w:type="dxa"/>
-            <w:tcBorders/>
-            <w:vAlign w:val="center"/>
-          </w:tcPr>
-          <w:p>
-            <w:pPr>
-              <w:pStyle w:val="TableContents"/>
-              <w:widowControl w:val="false"/>
-              <w:suppressLineNumbers/>
-              <w:bidi w:val="0"/>
-              <w:jc w:val="left"/>
-              <w:rPr/>
-            </w:pPr>
-            <w:r>
-              <w:rPr/>
-              <w:t>Example dataset used 0.01 at 3 T with the corridor.</w:t>
+            <w:tcW w:w="2281" w:type="dxa"/>
+            <w:tcBorders/>
+            <w:vAlign w:val="center"/>
+          </w:tcPr>
+          <w:p>
+            <w:pPr>
+              <w:pStyle w:val="TableContents"/>
+              <w:widowControl w:val="false"/>
+              <w:suppressLineNumbers/>
+              <w:bidi w:val="0"/>
+              <w:jc w:val="left"/>
+              <w:rPr/>
+            </w:pPr>
+            <w:r>
+              <w:rPr/>
+              <w:t>Used for all 57 participants of the example dataset at 3 T.</w:t>
             </w:r>
           </w:p>
         </w:tc>
@@ -11261,7 +11815,7 @@
         <w:trPr/>
         <w:tc>
           <w:tcPr>
-            <w:tcW w:w="3295" w:type="dxa"/>
+            <w:tcW w:w="2671" w:type="dxa"/>
             <w:tcBorders/>
             <w:vAlign w:val="center"/>
           </w:tcPr>
@@ -11282,7 +11836,28 @@
         </w:tc>
         <w:tc>
           <w:tcPr>
-            <w:tcW w:w="2119" w:type="dxa"/>
+            <w:tcW w:w="1324" w:type="dxa"/>
+            <w:tcBorders/>
+            <w:vAlign w:val="center"/>
+          </w:tcPr>
+          <w:p>
+            <w:pPr>
+              <w:pStyle w:val="TableContents"/>
+              <w:widowControl w:val="false"/>
+              <w:suppressLineNumbers/>
+              <w:bidi w:val="0"/>
+              <w:jc w:val="left"/>
+              <w:rPr/>
+            </w:pPr>
+            <w:r>
+              <w:rPr/>
+              <w:t>0.01, confirm by pilot</w:t>
+            </w:r>
+          </w:p>
+        </w:tc>
+        <w:tc>
+          <w:tcPr>
+            <w:tcW w:w="1828" w:type="dxa"/>
             <w:tcBorders/>
             <w:vAlign w:val="center"/>
           </w:tcPr>
@@ -11303,7 +11878,7 @@
         </w:tc>
         <w:tc>
           <w:tcPr>
-            <w:tcW w:w="1368" w:type="dxa"/>
+            <w:tcW w:w="1256" w:type="dxa"/>
             <w:tcBorders/>
             <w:vAlign w:val="center"/>
           </w:tcPr>
@@ -11324,7 +11899,7 @@
         </w:tc>
         <w:tc>
           <w:tcPr>
-            <w:tcW w:w="2578" w:type="dxa"/>
+            <w:tcW w:w="2281" w:type="dxa"/>
             <w:tcBorders/>
             <w:vAlign w:val="center"/>
           </w:tcPr>
@@ -11348,7 +11923,7 @@
         <w:trPr/>
         <w:tc>
           <w:tcPr>
-            <w:tcW w:w="3295" w:type="dxa"/>
+            <w:tcW w:w="2671" w:type="dxa"/>
             <w:tcBorders/>
             <w:vAlign w:val="center"/>
           </w:tcPr>
@@ -11369,7 +11944,28 @@
         </w:tc>
         <w:tc>
           <w:tcPr>
-            <w:tcW w:w="2119" w:type="dxa"/>
+            <w:tcW w:w="1324" w:type="dxa"/>
+            <w:tcBorders/>
+            <w:vAlign w:val="center"/>
+          </w:tcPr>
+          <w:p>
+            <w:pPr>
+              <w:pStyle w:val="TableContents"/>
+              <w:widowControl w:val="false"/>
+              <w:suppressLineNumbers/>
+              <w:bidi w:val="0"/>
+              <w:jc w:val="left"/>
+              <w:rPr/>
+            </w:pPr>
+            <w:r>
+              <w:rPr/>
+              <w:t>0.01</w:t>
+            </w:r>
+          </w:p>
+        </w:tc>
+        <w:tc>
+          <w:tcPr>
+            <w:tcW w:w="1828" w:type="dxa"/>
             <w:tcBorders/>
             <w:vAlign w:val="center"/>
           </w:tcPr>
@@ -11390,7 +11986,7 @@
         </w:tc>
         <w:tc>
           <w:tcPr>
-            <w:tcW w:w="1368" w:type="dxa"/>
+            <w:tcW w:w="1256" w:type="dxa"/>
             <w:tcBorders/>
             <w:vAlign w:val="center"/>
           </w:tcPr>
@@ -11411,22 +12007,22 @@
         </w:tc>
         <w:tc>
           <w:tcPr>
-            <w:tcW w:w="2578" w:type="dxa"/>
-            <w:tcBorders/>
-            <w:vAlign w:val="center"/>
-          </w:tcPr>
-          <w:p>
-            <w:pPr>
-              <w:pStyle w:val="TableContents"/>
-              <w:widowControl w:val="false"/>
-              <w:suppressLineNumbers/>
-              <w:bidi w:val="0"/>
-              <w:jc w:val="left"/>
-              <w:rPr/>
-            </w:pPr>
-            <w:r>
-              <w:rPr/>
-              <w:t>0.01 has been used with the corridor.</w:t>
+            <w:tcW w:w="2281" w:type="dxa"/>
+            <w:tcBorders/>
+            <w:vAlign w:val="center"/>
+          </w:tcPr>
+          <w:p>
+            <w:pPr>
+              <w:pStyle w:val="TableContents"/>
+              <w:widowControl w:val="false"/>
+              <w:suppressLineNumbers/>
+              <w:bidi w:val="0"/>
+              <w:jc w:val="left"/>
+              <w:rPr/>
+            </w:pPr>
+            <w:r>
+              <w:rPr/>
+              <w:t>0.01 has been used with the corridor by other users of the atlas.</w:t>
             </w:r>
           </w:p>
         </w:tc>
@@ -11435,7 +12031,7 @@
         <w:trPr/>
         <w:tc>
           <w:tcPr>
-            <w:tcW w:w="3295" w:type="dxa"/>
+            <w:tcW w:w="2671" w:type="dxa"/>
             <w:tcBorders/>
             <w:vAlign w:val="center"/>
           </w:tcPr>
@@ -11456,7 +12052,28 @@
         </w:tc>
         <w:tc>
           <w:tcPr>
-            <w:tcW w:w="2119" w:type="dxa"/>
+            <w:tcW w:w="1324" w:type="dxa"/>
+            <w:tcBorders/>
+            <w:vAlign w:val="center"/>
+          </w:tcPr>
+          <w:p>
+            <w:pPr>
+              <w:pStyle w:val="TableContents"/>
+              <w:widowControl w:val="false"/>
+              <w:suppressLineNumbers/>
+              <w:bidi w:val="0"/>
+              <w:jc w:val="left"/>
+              <w:rPr/>
+            </w:pPr>
+            <w:r>
+              <w:rPr/>
+              <w:t>0.01, confirm by pilot</w:t>
+            </w:r>
+          </w:p>
+        </w:tc>
+        <w:tc>
+          <w:tcPr>
+            <w:tcW w:w="1828" w:type="dxa"/>
             <w:tcBorders/>
             <w:vAlign w:val="center"/>
           </w:tcPr>
@@ -11477,7 +12094,7 @@
         </w:tc>
         <w:tc>
           <w:tcPr>
-            <w:tcW w:w="1368" w:type="dxa"/>
+            <w:tcW w:w="1256" w:type="dxa"/>
             <w:tcBorders/>
             <w:vAlign w:val="center"/>
           </w:tcPr>
@@ -11498,7 +12115,7 @@
         </w:tc>
         <w:tc>
           <w:tcPr>
-            <w:tcW w:w="2578" w:type="dxa"/>
+            <w:tcW w:w="2281" w:type="dxa"/>
             <w:tcBorders/>
             <w:vAlign w:val="center"/>
           </w:tcPr>
@@ -11525,7 +12142,7 @@
         <w:trPr/>
         <w:tc>
           <w:tcPr>
-            <w:tcW w:w="3295" w:type="dxa"/>
+            <w:tcW w:w="2671" w:type="dxa"/>
             <w:tcBorders>
               <w:bottom w:val="single" w:sz="6" w:space="0" w:color="808080"/>
             </w:tcBorders>
@@ -11548,7 +12165,7 @@
         </w:tc>
         <w:tc>
           <w:tcPr>
-            <w:tcW w:w="2119" w:type="dxa"/>
+            <w:tcW w:w="1324" w:type="dxa"/>
             <w:tcBorders>
               <w:bottom w:val="single" w:sz="6" w:space="0" w:color="808080"/>
             </w:tcBorders>
@@ -11565,13 +12182,13 @@
             </w:pPr>
             <w:r>
               <w:rPr/>
-              <w:t>0.08</w:t>
-            </w:r>
-          </w:p>
-        </w:tc>
-        <w:tc>
-          <w:tcPr>
-            <w:tcW w:w="1368" w:type="dxa"/>
+              <w:t>0.01, confirm by pilot</w:t>
+            </w:r>
+          </w:p>
+        </w:tc>
+        <w:tc>
+          <w:tcPr>
+            <w:tcW w:w="1828" w:type="dxa"/>
             <w:tcBorders>
               <w:bottom w:val="single" w:sz="6" w:space="0" w:color="808080"/>
             </w:tcBorders>
@@ -11588,13 +12205,36 @@
             </w:pPr>
             <w:r>
               <w:rPr/>
+              <w:t>0.08</w:t>
+            </w:r>
+          </w:p>
+        </w:tc>
+        <w:tc>
+          <w:tcPr>
+            <w:tcW w:w="1256" w:type="dxa"/>
+            <w:tcBorders>
+              <w:bottom w:val="single" w:sz="6" w:space="0" w:color="808080"/>
+            </w:tcBorders>
+            <w:vAlign w:val="center"/>
+          </w:tcPr>
+          <w:p>
+            <w:pPr>
+              <w:pStyle w:val="TableContents"/>
+              <w:widowControl w:val="false"/>
+              <w:suppressLineNumbers/>
+              <w:bidi w:val="0"/>
+              <w:jc w:val="left"/>
+              <w:rPr/>
+            </w:pPr>
+            <w:r>
+              <w:rPr/>
               <w:t>determine by pilot</w:t>
             </w:r>
           </w:p>
         </w:tc>
         <w:tc>
           <w:tcPr>
-            <w:tcW w:w="2578" w:type="dxa"/>
+            <w:tcW w:w="2281" w:type="dxa"/>
             <w:tcBorders>
               <w:bottom w:val="single" w:sz="6" w:space="0" w:color="808080"/>
             </w:tcBorders>
@@ -11715,7 +12355,7 @@
       </w:r>
       <w:r>
         <w:rPr/>
-        <w:t xml:space="preserve"> from pyAFQ (Kruper et al., 2021), which implements the procedure of Yeatman et al. (2012): each streamline is resampled to 100 points, its Mahalanobis distance from the bundle's mean trajectory is computed, and streamlines exceeding a distance threshold or a length threshold are removed iteratively (Table S11).</w:t>
+        <w:t xml:space="preserve"> from pyAFQ (Kruper et al., 2021), which implements the procedure of Yeatman et al. (2012): each streamline is resampled to 100 points, its Mahalanobis distance from the bundle's mean trajectory is computed, and streamlines exceeding a distance threshold or a length threshold are removed iteratively (Table S12).</w:t>
       </w:r>
     </w:p>
     <w:p>
@@ -11741,7 +12381,7 @@
         <w:rPr>
           <w:rStyle w:val="Strong"/>
         </w:rPr>
-        <w:t>Table S11</w:t>
+        <w:t>Table S12</w:t>
       </w:r>
     </w:p>
     <w:p>
@@ -12455,7 +13095,7 @@
       </w:r>
       <w:r>
         <w:rPr/>
-        <w:t xml:space="preserve"> = 39%), with a minimum cleaned count of 659. These values are typical for the thresholds in Table S11, and every participant retained several hundred streamlines. Figures S9 and S10 present the comparison referred to in Step 4: the cleaned 0.01 bundle is more compact than the uncleaned 0.06 bundle, with length standard deviations of approximately 3.5 to 4.5 mm for cleaned bundles against 5 to 7 mm for either uncleaned condition.</w:t>
+        <w:t xml:space="preserve"> = 39%), with a minimum cleaned count of 659. These values are typical for the thresholds in Table S12, and every participant retained several hundred streamlines. Figures S9 and S10 present the comparison referred to in Step 4: the cleaned 0.01 bundle is more compact than the uncleaned 0.06 bundle, with length standard deviations of approximately 3.5 to 4.5 mm for cleaned bundles against 5 to 7 mm for either uncleaned condition.</w:t>
       </w:r>
     </w:p>
     <w:p>
@@ -12806,7 +13446,7 @@
       </w:r>
       <w:r>
         <w:rPr/>
-        <w:t xml:space="preserve"> = 0 image, and writes one image per participant together with automatic flags (Table S12). Flags appear in the image title and are collected in </w:t>
+        <w:t xml:space="preserve"> = 0 image, and writes one image per participant together with automatic flags (Table S13). Flags appear in the image title and are collected in </w:t>
       </w:r>
       <w:r>
         <w:rPr>
@@ -12830,7 +13470,7 @@
         <w:rPr>
           <w:rStyle w:val="Strong"/>
         </w:rPr>
-        <w:t>Table S12</w:t>
+        <w:t>Table S13</w:t>
       </w:r>
     </w:p>
     <w:p>
@@ -14614,7 +15254,7 @@
       </w:pPr>
       <w:r>
         <w:rPr/>
-        <w:t>Along-tract data can be analysed at three spatial resolutions: the whole tract, quartiles of the tract, and individual nodes (Table S13). The three address different questions, and no single resolution is appropriate for every study. The resolution, or combination of resolutions, should be specified before results are examined, and the same covariates should be used throughout. Where the neurite density index (NDI) is mentioned below, it refers to the neurite orientation dispersion and density imaging metric profiled in Step 8; VTA denotes the ventral tegmental area.</w:t>
+        <w:t>Along-tract data can be analysed at three spatial resolutions: the whole tract, quartiles of the tract, and individual nodes (Table S14). The three address different questions, and no single resolution is appropriate for every study. The resolution, or combination of resolutions, should be specified before results are examined, and the same covariates should be used throughout. Where the neurite density index (NDI) is mentioned below, it refers to the neurite orientation dispersion and density imaging metric profiled in Step 8; VTA denotes the ventral tegmental area.</w:t>
       </w:r>
     </w:p>
     <w:p>
@@ -14628,7 +15268,7 @@
         <w:rPr>
           <w:rStyle w:val="Strong"/>
         </w:rPr>
-        <w:t>Table S13</w:t>
+        <w:t>Table S14</w:t>
       </w:r>
     </w:p>
     <w:p>
@@ -16596,7 +17236,7 @@
       </w:pPr>
       <w:r>
         <w:rPr/>
-        <w:t>Table S14 consolidates the parameters used in atlas construction at 7 T and in the example dataset at 3 T.</w:t>
+        <w:t>Table S15 consolidates the parameters used in atlas construction at 7 T and in the example dataset at 3 T.</w:t>
       </w:r>
     </w:p>
     <w:p>
@@ -16610,7 +17250,7 @@
         <w:rPr>
           <w:rStyle w:val="Strong"/>
         </w:rPr>
-        <w:t>Table S14</w:t>
+        <w:t>Table S15</w:t>
       </w:r>
     </w:p>
     <w:p>
@@ -17423,7 +18063,17 @@
             </w:pPr>
             <w:r>
               <w:rPr/>
-              <w:t>MRtrix3 default 0.05; determined by pilot</w:t>
+              <w:t xml:space="preserve">0.01 is the value in routine use with the corridor mask and the default in </w:t>
+            </w:r>
+            <w:r>
+              <w:rPr>
+                <w:rStyle w:val="SourceText"/>
+              </w:rPr>
+              <w:t>00_config.sh</w:t>
+            </w:r>
+            <w:r>
+              <w:rPr/>
+              <w:t>; confirm by pilot (Step 4). MRtrix3 default 0.05</w:t>
             </w:r>
           </w:p>
         </w:tc>
@@ -19522,7 +20172,7 @@
       </w:pPr>
       <w:r>
         <w:rPr/>
-        <w:t>Table S15 lists common problems, their likely causes and remedies. A quality-assurance checklist follows.</w:t>
+        <w:t>Table S16 lists common problems, their likely causes and remedies. A quality-assurance checklist follows.</w:t>
       </w:r>
     </w:p>
     <w:p>
@@ -19536,7 +20186,7 @@
         <w:rPr>
           <w:rStyle w:val="Strong"/>
         </w:rPr>
-        <w:t>Table S15</w:t>
+        <w:t>Table S16</w:t>
       </w:r>
     </w:p>
     <w:p>
@@ -20791,7 +21441,7 @@
       </w:pPr>
       <w:r>
         <w:rPr/>
-        <w:t>Table S16 lists the software used in the workflow. The workflow depends on FSL (Jenkinson et al., 2012), ANTs (Avants et al., 2008), MRtrix3 (Tournier et al., 2019) and Python with DIPY (Garyfallidis et al., 2014) and pyAFQ (Kruper et al., 2021); AMICO (Daducci et al., 2015) is required only for neurite orientation dispersion and density imaging (NODDI) fitting and R only for the node-wise permutation test.</w:t>
+        <w:t>Table S17 lists the software used in the workflow. The workflow depends on FSL (Jenkinson et al., 2012), ANTs (Avants et al., 2008), MRtrix3 (Tournier et al., 2019) and Python with DIPY (Garyfallidis et al., 2014) and pyAFQ (Kruper et al., 2021); AMICO (Daducci et al., 2015) is required only for neurite orientation dispersion and density imaging (NODDI) fitting and R only for the node-wise permutation test.</w:t>
       </w:r>
     </w:p>
     <w:p>
@@ -20805,7 +21455,7 @@
         <w:rPr>
           <w:rStyle w:val="Strong"/>
         </w:rPr>
-        <w:t>Table S16</w:t>
+        <w:t>Table S17</w:t>
       </w:r>
     </w:p>
     <w:p>
@@ -21780,7 +22430,7 @@
       </w:pPr>
       <w:r>
         <w:rPr/>
-        <w:t xml:space="preserve">Each script appears in full on the workflow page for its step. Table S17 lists the set in run order. All scripts read a single configuration file, </w:t>
+        <w:t xml:space="preserve">Each script appears in full on the workflow page for its step. Table S18 lists the set in run order. All scripts read a single configuration file, </w:t>
       </w:r>
       <w:r>
         <w:rPr>
@@ -21834,7 +22484,7 @@
         <w:rPr>
           <w:rStyle w:val="Strong"/>
         </w:rPr>
-        <w:t>Table S17</w:t>
+        <w:t>Table S18</w:t>
       </w:r>
     </w:p>
     <w:p>
@@ -23218,7 +23868,7 @@
       </w:pPr>
       <w:r>
         <w:rPr/>
-        <w:t xml:space="preserve">The scripts generalize those used to process the example dataset, in which every step completed for all 57 participants. Table S18 records how each generalized script has been checked. Steps 0b to 5, and the two Python scripts that call </w:t>
+        <w:t xml:space="preserve">The scripts generalize those used to process the example dataset, in which every step completed for all 57 participants. Table S19 records how each generalized script has been checked. Steps 0b to 5, and the two Python scripts that call </w:t>
       </w:r>
       <w:r>
         <w:rPr>
@@ -23242,7 +23892,7 @@
         <w:rPr>
           <w:rStyle w:val="Strong"/>
         </w:rPr>
-        <w:t>Table S18</w:t>
+        <w:t>Table S19</w:t>
       </w:r>
     </w:p>
     <w:p>
@@ -25286,7 +25936,7 @@
         <w:rPr>
           <w:rStyle w:val="Strong"/>
         </w:rPr>
-        <w:t>Table S19</w:t>
+        <w:t>Table S20</w:t>
       </w:r>
     </w:p>
     <w:p>

</xml_diff>

<commit_message>
Collapse embedded scripts; reduce citation page; config-driven concurrency
- Every embedded script now renders as a collapsed block (name and line count in
  the summary); the short command excerpts remain visible on each page.
- Citation page reduced to a pointer to the forthcoming atlas paper. Removed the
  suggested tutorial citation, version history, related-work paragraph and its
  orphaned reference, version labels, and the footer copyright holder.
- Supplementary Methods links moved to the methods-text page.
- Concurrency limits (ANTS_THREADS, ANTS_JOBS, FOD_JOBS) moved into 00_config.sh.
- Atlas download command now creates the folder layout that 00_config.sh expects.

Co-Authored-By: Claude Fable 5.1 <noreply@anthropic.com>
</commit_message>
<xml_diff>
--- a/static/supplement/MesoConnect_Supplementary_Methods.docx
+++ b/static/supplement/MesoConnect_Supplementary_Methods.docx
@@ -59,7 +59,7 @@
       </w:pPr>
       <w:r>
         <w:rPr/>
-        <w:t>Version 0.1, September 2026</w:t>
+        <w:t>September 2026</w:t>
       </w:r>
     </w:p>
     <w:p>
@@ -4435,31 +4435,49 @@
       </w:pPr>
       <w:r>
         <w:rPr/>
-        <w:t>The following command retrieves all files listed above.</w:t>
-      </w:r>
-    </w:p>
-    <w:p>
-      <w:pPr>
-        <w:pStyle w:val="PreformattedTextcode"/>
-        <w:bidi w:val="0"/>
-        <w:jc w:val="left"/>
-        <w:rPr/>
-      </w:pPr>
-      <w:r>
-        <w:rPr/>
-        <w:t>mkdir -p MesoConnectAtlas &amp;&amp; cd MesoConnectAtlas</w:t>
-      </w:r>
-    </w:p>
-    <w:p>
-      <w:pPr>
-        <w:pStyle w:val="PreformattedTextcode"/>
-        <w:bidi w:val="0"/>
-        <w:jc w:val="left"/>
-        <w:rPr/>
-      </w:pPr>
-      <w:r>
-        <w:rPr/>
-        <w:t>for f in left_VTA_0.25_bin right_VTA_0.25_bin HPC_L_0.5_bin HPC_R_0.5_bin \</w:t>
+        <w:t xml:space="preserve">The following commands retrieve all files listed above into the folder layout of the full release, which is the layout that </w:t>
+      </w:r>
+      <w:r>
+        <w:rPr>
+          <w:rStyle w:val="SourceText"/>
+        </w:rPr>
+        <w:t>00_config.sh</w:t>
+      </w:r>
+      <w:r>
+        <w:rPr/>
+        <w:t xml:space="preserve"> expects (</w:t>
+      </w:r>
+      <w:r>
+        <w:rPr>
+          <w:rStyle w:val="SourceText"/>
+        </w:rPr>
+        <w:t>ATLAS_DIR</w:t>
+      </w:r>
+      <w:r>
+        <w:rPr/>
+        <w:t xml:space="preserve"> is the </w:t>
+      </w:r>
+      <w:r>
+        <w:rPr>
+          <w:rStyle w:val="SourceText"/>
+        </w:rPr>
+        <w:t>MesoConnectAtlas</w:t>
+      </w:r>
+      <w:r>
+        <w:rPr/>
+        <w:t xml:space="preserve"> folder).</w:t>
+      </w:r>
+    </w:p>
+    <w:p>
+      <w:pPr>
+        <w:pStyle w:val="PreformattedTextcode"/>
+        <w:bidi w:val="0"/>
+        <w:jc w:val="left"/>
+        <w:rPr/>
+      </w:pPr>
+      <w:r>
+        <w:rPr/>
+        <w:t>mkdir -p MesoConnectAtlas/roi_maps MesoConnectAtlas/tracts_thresholded_binary_50 \</w:t>
       </w:r>
     </w:p>
     <w:p>
@@ -4475,39 +4493,54 @@
       </w:r>
       <w:r>
         <w:rPr/>
-        <w:t>l_vta_l_hipp_1mm_MNI_GroupMean_thr50 r_vta_r_hipp_1mm_MNI_GroupMean_thr50 \</w:t>
-      </w:r>
-    </w:p>
-    <w:p>
-      <w:pPr>
-        <w:pStyle w:val="PreformattedTextcode"/>
-        <w:bidi w:val="0"/>
-        <w:jc w:val="left"/>
-        <w:rPr/>
-      </w:pPr>
-      <w:r>
-        <w:rPr/>
-        <w:t xml:space="preserve">         </w:t>
-      </w:r>
-      <w:r>
-        <w:rPr/>
-        <w:t>l_vta_l_hipp_1mm_MNI_GroupMean_OverlapProp r_vta_r_hipp_1mm_MNI_GroupMean_OverlapProp \</w:t>
-      </w:r>
-    </w:p>
-    <w:p>
-      <w:pPr>
-        <w:pStyle w:val="PreformattedTextcode"/>
-        <w:bidi w:val="0"/>
-        <w:jc w:val="left"/>
-        <w:rPr/>
-      </w:pPr>
-      <w:r>
-        <w:rPr/>
-        <w:t xml:space="preserve">         </w:t>
-      </w:r>
-      <w:r>
-        <w:rPr/>
-        <w:t>anterior_l_vta_l_hipp_1mm_MNI_GroupMean_thr50 anterior_r_vta_r_hipp_1mm_MNI_GroupMean_thr50; do</w:t>
+        <w:t>MesoConnectAtlas/tracts_probabilistic</w:t>
+      </w:r>
+    </w:p>
+    <w:p>
+      <w:pPr>
+        <w:pStyle w:val="PreformattedTextcode"/>
+        <w:bidi w:val="0"/>
+        <w:jc w:val="left"/>
+        <w:rPr/>
+      </w:pPr>
+      <w:r>
+        <w:rPr/>
+        <w:t>cd MesoConnectAtlas</w:t>
+      </w:r>
+    </w:p>
+    <w:p>
+      <w:pPr>
+        <w:pStyle w:val="PreformattedTextcode"/>
+        <w:bidi w:val="0"/>
+        <w:jc w:val="left"/>
+        <w:rPr/>
+      </w:pPr>
+      <w:r>
+        <w:rPr/>
+        <w:t>base="https://diffusiontensorimaging-repos.github.io/MesoConnect-Tutorial/atlas"</w:t>
+      </w:r>
+    </w:p>
+    <w:p>
+      <w:pPr>
+        <w:pStyle w:val="PreformattedTextcode"/>
+        <w:bidi w:val="0"/>
+        <w:jc w:val="left"/>
+        <w:rPr/>
+      </w:pPr>
+      <w:r>
+        <w:rPr/>
+      </w:r>
+    </w:p>
+    <w:p>
+      <w:pPr>
+        <w:pStyle w:val="PreformattedTextcode"/>
+        <w:bidi w:val="0"/>
+        <w:jc w:val="left"/>
+        <w:rPr/>
+      </w:pPr>
+      <w:r>
+        <w:rPr/>
+        <w:t>for f in left_VTA_0.25_bin right_VTA_0.25_bin HPC_L_0.5_bin HPC_R_0.5_bin; do</w:t>
       </w:r>
     </w:p>
     <w:p>
@@ -4523,7 +4556,119 @@
       </w:r>
       <w:r>
         <w:rPr/>
-        <w:t>curl -sSLO "https://diffusiontensorimaging-repos.github.io/MesoConnect-Tutorial/atlas/$f.nii.gz"</w:t>
+        <w:t>curl -sSL "$base/$f.nii.gz" -o "roi_maps/$f.nii.gz"</w:t>
+      </w:r>
+    </w:p>
+    <w:p>
+      <w:pPr>
+        <w:pStyle w:val="PreformattedTextcode"/>
+        <w:bidi w:val="0"/>
+        <w:jc w:val="left"/>
+        <w:rPr/>
+      </w:pPr>
+      <w:r>
+        <w:rPr/>
+        <w:t>done</w:t>
+      </w:r>
+    </w:p>
+    <w:p>
+      <w:pPr>
+        <w:pStyle w:val="PreformattedTextcode"/>
+        <w:bidi w:val="0"/>
+        <w:jc w:val="left"/>
+        <w:rPr/>
+      </w:pPr>
+      <w:r>
+        <w:rPr/>
+        <w:t>for t in l_vta_l_hipp r_vta_r_hipp anterior_l_vta_l_hipp anterior_r_vta_r_hipp; do</w:t>
+      </w:r>
+    </w:p>
+    <w:p>
+      <w:pPr>
+        <w:pStyle w:val="PreformattedTextcode"/>
+        <w:bidi w:val="0"/>
+        <w:jc w:val="left"/>
+        <w:rPr/>
+      </w:pPr>
+      <w:r>
+        <w:rPr/>
+        <w:t xml:space="preserve">  </w:t>
+      </w:r>
+      <w:r>
+        <w:rPr/>
+        <w:t>f="${t}_1mm_MNI_GroupMean_thr50.nii.gz"</w:t>
+      </w:r>
+    </w:p>
+    <w:p>
+      <w:pPr>
+        <w:pStyle w:val="PreformattedTextcode"/>
+        <w:bidi w:val="0"/>
+        <w:jc w:val="left"/>
+        <w:rPr/>
+      </w:pPr>
+      <w:r>
+        <w:rPr/>
+        <w:t xml:space="preserve">  </w:t>
+      </w:r>
+      <w:r>
+        <w:rPr/>
+        <w:t>curl -sSL "$base/$f" -o "tracts_thresholded_binary_50/$f"</w:t>
+      </w:r>
+    </w:p>
+    <w:p>
+      <w:pPr>
+        <w:pStyle w:val="PreformattedTextcode"/>
+        <w:bidi w:val="0"/>
+        <w:jc w:val="left"/>
+        <w:rPr/>
+      </w:pPr>
+      <w:r>
+        <w:rPr/>
+        <w:t>done</w:t>
+      </w:r>
+    </w:p>
+    <w:p>
+      <w:pPr>
+        <w:pStyle w:val="PreformattedTextcode"/>
+        <w:bidi w:val="0"/>
+        <w:jc w:val="left"/>
+        <w:rPr/>
+      </w:pPr>
+      <w:r>
+        <w:rPr/>
+        <w:t>for t in l_vta_l_hipp r_vta_r_hipp; do</w:t>
+      </w:r>
+    </w:p>
+    <w:p>
+      <w:pPr>
+        <w:pStyle w:val="PreformattedTextcode"/>
+        <w:bidi w:val="0"/>
+        <w:jc w:val="left"/>
+        <w:rPr/>
+      </w:pPr>
+      <w:r>
+        <w:rPr/>
+        <w:t xml:space="preserve">  </w:t>
+      </w:r>
+      <w:r>
+        <w:rPr/>
+        <w:t>f="${t}_1mm_MNI_GroupMean_OverlapProp.nii.gz"</w:t>
+      </w:r>
+    </w:p>
+    <w:p>
+      <w:pPr>
+        <w:pStyle w:val="PreformattedTextcode"/>
+        <w:bidi w:val="0"/>
+        <w:jc w:val="left"/>
+        <w:rPr/>
+      </w:pPr>
+      <w:r>
+        <w:rPr/>
+        <w:t xml:space="preserve">  </w:t>
+      </w:r>
+      <w:r>
+        <w:rPr/>
+        <w:t>curl -sSL "$base/$f" -o "tracts_probabilistic/$f"</w:t>
       </w:r>
     </w:p>
     <w:p>
@@ -4560,7 +4705,7 @@
       </w:pPr>
       <w:r>
         <w:rPr/>
-        <w:t>The complete atlas package will follow the layout below and will be archived with a versioned digital object identifier. The remaining families (amygdala, accumbens divisions, ventral pallidum, hippocampus → accumbens, hippocampus → ventral pallidum, fornix divisions), the count maps, the 25% and 75% thresholds, the endpoint maps and the exclusion masks are available from the atlas authors in the interim.</w:t>
+        <w:t>The complete atlas package will follow the layout below. The remaining families (amygdala, accumbens divisions, ventral pallidum, hippocampus → accumbens, hippocampus → ventral pallidum, fornix divisions), the count maps, the 25% and 75% thresholds, the endpoint maps and the exclusion masks are available from the atlas authors in the interim.</w:t>
       </w:r>
     </w:p>
     <w:p>
@@ -23906,7 +24051,7 @@
         <w:rPr>
           <w:rStyle w:val="Emphasis"/>
         </w:rPr>
-        <w:t>Checks Performed on the Generalized Scripts (Version 0.1)</w:t>
+        <w:t>Checks Performed on the Generalized Scripts</w:t>
       </w:r>
     </w:p>
     <w:tbl>
@@ -24593,6 +24738,42 @@
     </w:p>
     <w:p>
       <w:pPr>
+        <w:pStyle w:val="BodyText"/>
+        <w:bidi w:val="0"/>
+        <w:jc w:val="left"/>
+        <w:rPr/>
+      </w:pPr>
+      <w:r>
+        <w:rPr/>
+        <w:t xml:space="preserve">The whole tutorial is also available as a single document, with tables and figures numbered S1, S2 and so on and the scripts in an appendix: </w:t>
+      </w:r>
+      <w:hyperlink r:id="rId36">
+        <w:r>
+          <w:rPr>
+            <w:rStyle w:val="Hyperlink"/>
+          </w:rPr>
+          <w:t>PDF</w:t>
+        </w:r>
+      </w:hyperlink>
+      <w:r>
+        <w:rPr/>
+        <w:t xml:space="preserve"> and </w:t>
+      </w:r>
+      <w:hyperlink r:id="rId37">
+        <w:r>
+          <w:rPr>
+            <w:rStyle w:val="Hyperlink"/>
+          </w:rPr>
+          <w:t>Word</w:t>
+        </w:r>
+      </w:hyperlink>
+      <w:r>
+        <w:rPr/>
+        <w:t>.</w:t>
+      </w:r>
+    </w:p>
+    <w:p>
+      <w:pPr>
         <w:pStyle w:val="Heading2"/>
         <w:bidi w:val="0"/>
         <w:jc w:val="left"/>
@@ -25796,19 +25977,7 @@
       </w:pPr>
       <w:r>
         <w:rPr/>
-        <w:t>The atlas manuscript is in preparation. Until the manuscript and archived release are available, the atlas should be cited as a working resource from the Temple University collaboration that produced it, with version and date, together with a link to this site. The final release will carry a manuscript citation, a Zenodo digital object identifier, the repository URL and a version number.</w:t>
-      </w:r>
-    </w:p>
-    <w:p>
-      <w:pPr>
-        <w:pStyle w:val="Heading2"/>
-        <w:bidi w:val="0"/>
-        <w:jc w:val="left"/>
-        <w:rPr/>
-      </w:pPr>
-      <w:r>
-        <w:rPr/>
-        <w:t>Suggested citation for this tutorial</w:t>
+        <w:t>The atlas manuscript is in preparation. Work that uses the atlas or this workflow should cite that paper; the full reference will be added here when it is published.</w:t>
       </w:r>
     </w:p>
     <w:p>
@@ -25820,304 +25989,9 @@
       </w:pPr>
       <w:r>
         <w:rPr/>
-        <w:t xml:space="preserve">Temple University. (2026). </w:t>
-      </w:r>
-      <w:r>
-        <w:rPr>
-          <w:rStyle w:val="Emphasis"/>
-        </w:rPr>
-        <w:t>MesoConnect Atlas tutorial</w:t>
-      </w:r>
-      <w:r>
-        <w:rPr/>
-        <w:t xml:space="preserve"> (Version 0.1) [Website]. </w:t>
-      </w:r>
-      <w:hyperlink r:id="rId36">
-        <w:r>
-          <w:rPr>
-            <w:rStyle w:val="Hyperlink"/>
-          </w:rPr>
-          <w:t>https://diffusiontensorimaging-repos.github.io/MesoConnect-Tutorial/</w:t>
-        </w:r>
-      </w:hyperlink>
-    </w:p>
-    <w:p>
-      <w:pPr>
-        <w:pStyle w:val="Heading2"/>
-        <w:bidi w:val="0"/>
-        <w:jc w:val="left"/>
-        <w:rPr/>
-      </w:pPr>
-      <w:r>
-        <w:rPr/>
-        <w:t>Supplementary Methods document</w:t>
-      </w:r>
-    </w:p>
-    <w:p>
-      <w:pPr>
-        <w:pStyle w:val="BodyText"/>
-        <w:bidi w:val="0"/>
-        <w:jc w:val="left"/>
-        <w:rPr/>
-      </w:pPr>
-      <w:r>
-        <w:rPr/>
-        <w:t xml:space="preserve">The tutorial is also compiled as a single document for attachment to a manuscript as supplementary material: </w:t>
-      </w:r>
-      <w:hyperlink r:id="rId37">
-        <w:r>
-          <w:rPr>
-            <w:rStyle w:val="Hyperlink"/>
-          </w:rPr>
-          <w:t>PDF</w:t>
-        </w:r>
-      </w:hyperlink>
-      <w:r>
-        <w:rPr/>
-        <w:t xml:space="preserve"> and </w:t>
-      </w:r>
-      <w:hyperlink r:id="rId38">
-        <w:r>
-          <w:rPr>
-            <w:rStyle w:val="Hyperlink"/>
-          </w:rPr>
-          <w:t>Word</w:t>
-        </w:r>
-      </w:hyperlink>
-      <w:r>
-        <w:rPr/>
-        <w:t>. Tables and figures are numbered S1, S2 and so on across the document, and the scripts are reproduced in an appendix. Copy-ready Method paragraphs are on the methods text page.</w:t>
-      </w:r>
-    </w:p>
-    <w:p>
-      <w:pPr>
-        <w:pStyle w:val="Heading2"/>
-        <w:bidi w:val="0"/>
-        <w:jc w:val="left"/>
-        <w:rPr/>
-      </w:pPr>
-      <w:r>
-        <w:rPr/>
-        <w:t>Related work</w:t>
-      </w:r>
-    </w:p>
-    <w:p>
-      <w:pPr>
-        <w:pStyle w:val="BodyText"/>
-        <w:bidi w:val="0"/>
-        <w:jc w:val="left"/>
-        <w:rPr/>
-      </w:pPr>
-      <w:r>
-        <w:rPr/>
-        <w:t>A morphometric study of the substantia nigra, ventral tegmental area and dorsal raphe using T1-weighted and diffusion imaging (Toppa et al., 2026) addresses the same midbrain structures from a volumetric perspective. Software and source atlases used in the workflow are cited on the pages where they are used and listed on the references page.</w:t>
-      </w:r>
-    </w:p>
-    <w:p>
-      <w:pPr>
-        <w:pStyle w:val="Heading2"/>
-        <w:bidi w:val="0"/>
-        <w:jc w:val="left"/>
-        <w:rPr/>
-      </w:pPr>
-      <w:r>
-        <w:rPr/>
-        <w:t>Version history</w:t>
-      </w:r>
-    </w:p>
-    <w:p>
-      <w:pPr>
-        <w:pStyle w:val="BodyText"/>
-        <w:bidi w:val="0"/>
-        <w:jc w:val="left"/>
-        <w:rPr/>
-      </w:pPr>
-      <w:r>
-        <w:rPr>
-          <w:rStyle w:val="Strong"/>
-        </w:rPr>
-        <w:t>Table S20</w:t>
-      </w:r>
-    </w:p>
-    <w:p>
-      <w:pPr>
-        <w:pStyle w:val="BodyText"/>
-        <w:bidi w:val="0"/>
-        <w:jc w:val="left"/>
-        <w:rPr/>
-      </w:pPr>
-      <w:r>
-        <w:rPr>
-          <w:rStyle w:val="Emphasis"/>
-        </w:rPr>
-        <w:t>Version History</w:t>
-      </w:r>
-    </w:p>
-    <w:tbl>
-      <w:tblPr>
-        <w:tblW w:w="5000" w:type="pct"/>
-        <w:jc w:val="left"/>
-        <w:tblInd w:w="60" w:type="dxa"/>
-        <w:tblLayout w:type="fixed"/>
-        <w:tblCellMar>
-          <w:top w:w="60" w:type="dxa"/>
-          <w:left w:w="60" w:type="dxa"/>
-          <w:bottom w:w="60" w:type="dxa"/>
-          <w:right w:w="60" w:type="dxa"/>
-        </w:tblCellMar>
-      </w:tblPr>
-      <w:tblGrid>
-        <w:gridCol w:w="1173"/>
-        <w:gridCol w:w="1428"/>
-        <w:gridCol w:w="6759"/>
-      </w:tblGrid>
-      <w:tr>
-        <w:trPr>
-          <w:tblHeader w:val="true"/>
-        </w:trPr>
-        <w:tc>
-          <w:tcPr>
-            <w:tcW w:w="1173" w:type="dxa"/>
-            <w:tcBorders>
-              <w:top w:val="single" w:sz="6" w:space="0" w:color="808080"/>
-              <w:bottom w:val="single" w:sz="2" w:space="0" w:color="808080"/>
-            </w:tcBorders>
-            <w:vAlign w:val="center"/>
-          </w:tcPr>
-          <w:p>
-            <w:pPr>
-              <w:pStyle w:val="TableHeading"/>
-              <w:suppressLineNumbers/>
-              <w:bidi w:val="0"/>
-              <w:jc w:val="left"/>
-              <w:rPr/>
-            </w:pPr>
-            <w:r>
-              <w:rPr/>
-              <w:t>Version</w:t>
-            </w:r>
-          </w:p>
-        </w:tc>
-        <w:tc>
-          <w:tcPr>
-            <w:tcW w:w="1428" w:type="dxa"/>
-            <w:tcBorders>
-              <w:top w:val="single" w:sz="6" w:space="0" w:color="808080"/>
-              <w:bottom w:val="single" w:sz="2" w:space="0" w:color="808080"/>
-            </w:tcBorders>
-            <w:vAlign w:val="center"/>
-          </w:tcPr>
-          <w:p>
-            <w:pPr>
-              <w:pStyle w:val="TableHeading"/>
-              <w:suppressLineNumbers/>
-              <w:bidi w:val="0"/>
-              <w:jc w:val="left"/>
-              <w:rPr/>
-            </w:pPr>
-            <w:r>
-              <w:rPr/>
-              <w:t>Date</w:t>
-            </w:r>
-          </w:p>
-        </w:tc>
-        <w:tc>
-          <w:tcPr>
-            <w:tcW w:w="6759" w:type="dxa"/>
-            <w:tcBorders>
-              <w:top w:val="single" w:sz="6" w:space="0" w:color="808080"/>
-              <w:bottom w:val="single" w:sz="2" w:space="0" w:color="808080"/>
-            </w:tcBorders>
-            <w:vAlign w:val="center"/>
-          </w:tcPr>
-          <w:p>
-            <w:pPr>
-              <w:pStyle w:val="TableHeading"/>
-              <w:suppressLineNumbers/>
-              <w:bidi w:val="0"/>
-              <w:jc w:val="left"/>
-              <w:rPr/>
-            </w:pPr>
-            <w:r>
-              <w:rPr/>
-              <w:t>Changes</w:t>
-            </w:r>
-          </w:p>
-        </w:tc>
-      </w:tr>
-      <w:tr>
-        <w:trPr/>
-        <w:tc>
-          <w:tcPr>
-            <w:tcW w:w="1173" w:type="dxa"/>
-            <w:tcBorders>
-              <w:bottom w:val="single" w:sz="6" w:space="0" w:color="808080"/>
-            </w:tcBorders>
-            <w:vAlign w:val="center"/>
-          </w:tcPr>
-          <w:p>
-            <w:pPr>
-              <w:pStyle w:val="TableContents"/>
-              <w:widowControl w:val="false"/>
-              <w:suppressLineNumbers/>
-              <w:bidi w:val="0"/>
-              <w:jc w:val="left"/>
-              <w:rPr/>
-            </w:pPr>
-            <w:r>
-              <w:rPr/>
-              <w:t>Tutorial v0.1</w:t>
-            </w:r>
-          </w:p>
-        </w:tc>
-        <w:tc>
-          <w:tcPr>
-            <w:tcW w:w="1428" w:type="dxa"/>
-            <w:tcBorders>
-              <w:bottom w:val="single" w:sz="6" w:space="0" w:color="808080"/>
-            </w:tcBorders>
-            <w:vAlign w:val="center"/>
-          </w:tcPr>
-          <w:p>
-            <w:pPr>
-              <w:pStyle w:val="TableContents"/>
-              <w:widowControl w:val="false"/>
-              <w:suppressLineNumbers/>
-              <w:bidi w:val="0"/>
-              <w:jc w:val="left"/>
-              <w:rPr/>
-            </w:pPr>
-            <w:r>
-              <w:rPr/>
-              <w:t>September 2026</w:t>
-            </w:r>
-          </w:p>
-        </w:tc>
-        <w:tc>
-          <w:tcPr>
-            <w:tcW w:w="6759" w:type="dxa"/>
-            <w:tcBorders>
-              <w:bottom w:val="single" w:sz="6" w:space="0" w:color="808080"/>
-            </w:tcBorders>
-            <w:vAlign w:val="center"/>
-          </w:tcPr>
-          <w:p>
-            <w:pPr>
-              <w:pStyle w:val="TableContents"/>
-              <w:widowControl w:val="false"/>
-              <w:suppressLineNumbers/>
-              <w:bidi w:val="0"/>
-              <w:jc w:val="left"/>
-              <w:rPr/>
-            </w:pPr>
-            <w:r>
-              <w:rPr/>
-              <w:t>First public version: corridor workflow with the 3 T example dataset, scripts, Explorer and compiled Supplementary Methods</w:t>
-            </w:r>
-          </w:p>
-        </w:tc>
-      </w:tr>
-    </w:tbl>
+        <w:t>Source atlases and software used in the workflow are cited on the pages where they are used and listed on the references page.</w:t>
+      </w:r>
+    </w:p>
     <w:p>
       <w:pPr>
         <w:pStyle w:val="Heading1"/>
@@ -26150,7 +26024,7 @@
         <w:rPr/>
         <w:t xml:space="preserve">(1), 26–41. </w:t>
       </w:r>
-      <w:hyperlink r:id="rId39">
+      <w:hyperlink r:id="rId38">
         <w:r>
           <w:rPr>
             <w:rStyle w:val="Hyperlink"/>
@@ -26180,7 +26054,7 @@
         <w:rPr/>
         <w:t xml:space="preserve">, 32–44. </w:t>
       </w:r>
-      <w:hyperlink r:id="rId40">
+      <w:hyperlink r:id="rId39">
         <w:r>
           <w:rPr>
             <w:rStyle w:val="Hyperlink"/>
@@ -26232,7 +26106,7 @@
         <w:rPr/>
         <w:t xml:space="preserve">(7), 1256–1265. </w:t>
       </w:r>
-      <w:hyperlink r:id="rId41">
+      <w:hyperlink r:id="rId40">
         <w:r>
           <w:rPr>
             <w:rStyle w:val="Hyperlink"/>
@@ -26262,7 +26136,7 @@
         <w:rPr/>
         <w:t xml:space="preserve">(4), 292–298. </w:t>
       </w:r>
-      <w:hyperlink r:id="rId42">
+      <w:hyperlink r:id="rId41">
         <w:r>
           <w:rPr>
             <w:rStyle w:val="Hyperlink"/>
@@ -26292,7 +26166,7 @@
         <w:rPr/>
         <w:t xml:space="preserve">, 175. </w:t>
       </w:r>
-      <w:hyperlink r:id="rId43">
+      <w:hyperlink r:id="rId42">
         <w:r>
           <w:rPr>
             <w:rStyle w:val="Hyperlink"/>
@@ -26322,7 +26196,7 @@
         <w:rPr/>
         <w:t xml:space="preserve">, 8. </w:t>
       </w:r>
-      <w:hyperlink r:id="rId44">
+      <w:hyperlink r:id="rId43">
         <w:r>
           <w:rPr>
             <w:rStyle w:val="Hyperlink"/>
@@ -26352,7 +26226,7 @@
         <w:rPr/>
         <w:t xml:space="preserve">, 119474. </w:t>
       </w:r>
-      <w:hyperlink r:id="rId45">
+      <w:hyperlink r:id="rId44">
         <w:r>
           <w:rPr>
             <w:rStyle w:val="Hyperlink"/>
@@ -26382,7 +26256,7 @@
         <w:rPr/>
         <w:t xml:space="preserve">(2), 782–790. </w:t>
       </w:r>
-      <w:hyperlink r:id="rId46">
+      <w:hyperlink r:id="rId45">
         <w:r>
           <w:rPr>
             <w:rStyle w:val="Hyperlink"/>
@@ -26412,7 +26286,7 @@
         <w:rPr/>
         <w:t xml:space="preserve">, 411–426. </w:t>
       </w:r>
-      <w:hyperlink r:id="rId47">
+      <w:hyperlink r:id="rId46">
         <w:r>
           <w:rPr>
             <w:rStyle w:val="Hyperlink"/>
@@ -26442,7 +26316,7 @@
         <w:rPr/>
         <w:t xml:space="preserve">(1). </w:t>
       </w:r>
-      <w:hyperlink r:id="rId48">
+      <w:hyperlink r:id="rId47">
         <w:r>
           <w:rPr>
             <w:rStyle w:val="Hyperlink"/>
@@ -26472,7 +26346,7 @@
         <w:rPr/>
         <w:t xml:space="preserve">(2–3), 155–171. </w:t>
       </w:r>
-      <w:hyperlink r:id="rId49">
+      <w:hyperlink r:id="rId48">
         <w:r>
           <w:rPr>
             <w:rStyle w:val="Hyperlink"/>
@@ -26502,7 +26376,7 @@
         <w:rPr/>
         <w:t xml:space="preserve">, 580–589. </w:t>
       </w:r>
-      <w:hyperlink r:id="rId50">
+      <w:hyperlink r:id="rId49">
         <w:r>
           <w:rPr>
             <w:rStyle w:val="Hyperlink"/>
@@ -26532,7 +26406,7 @@
         <w:rPr/>
         <w:t xml:space="preserve">, 118749. </w:t>
       </w:r>
-      <w:hyperlink r:id="rId51">
+      <w:hyperlink r:id="rId50">
         <w:r>
           <w:rPr>
             <w:rStyle w:val="Hyperlink"/>
@@ -26562,7 +26436,7 @@
         <w:rPr/>
         <w:t xml:space="preserve">, 180063. </w:t>
       </w:r>
-      <w:hyperlink r:id="rId52">
+      <w:hyperlink r:id="rId51">
         <w:r>
           <w:rPr>
             <w:rStyle w:val="Hyperlink"/>
@@ -26602,36 +26476,6 @@
       </w:pPr>
       <w:r>
         <w:rPr/>
-        <w:t xml:space="preserve">Toppa, P. H., Rushmore, R. J., Haggerty, K., Papadimitriou, G., Dougherty, D., Kubicki, M., González-Mora, J. L., Pallanti, S., Castañeyra-Perdomo, A., Yeterian, E., &amp; Makris, N. (2026). Neuroanatomy of substantia nigra and ventral tegmental area dopaminergic, and dorsal raphe serotonergic circuits in the human brain using T1-weighted and diffusion magnetic resonance imaging: A morphometric pilot study with estimate of reliability. </w:t>
-      </w:r>
-      <w:r>
-        <w:rPr>
-          <w:rStyle w:val="Emphasis"/>
-        </w:rPr>
-        <w:t>bioRxiv</w:t>
-      </w:r>
-      <w:r>
-        <w:rPr/>
-        <w:t xml:space="preserve">. </w:t>
-      </w:r>
-      <w:hyperlink r:id="rId53">
-        <w:r>
-          <w:rPr>
-            <w:rStyle w:val="Hyperlink"/>
-          </w:rPr>
-          <w:t>https://doi.org/10.64898/2026.02.12.705574</w:t>
-        </w:r>
-      </w:hyperlink>
-    </w:p>
-    <w:p>
-      <w:pPr>
-        <w:pStyle w:val="BodyText"/>
-        <w:bidi w:val="0"/>
-        <w:jc w:val="left"/>
-        <w:rPr/>
-      </w:pPr>
-      <w:r>
-        <w:rPr/>
         <w:t xml:space="preserve">Tournier, J.-D., Calamante, F., &amp; Connelly, A. (2010). Improved probabilistic streamlines tractography by 2nd order integration over fibre orientation distributions. </w:t>
       </w:r>
       <w:r>
@@ -26666,7 +26510,7 @@
         <w:rPr/>
         <w:t xml:space="preserve">, 116137. </w:t>
       </w:r>
-      <w:hyperlink r:id="rId54">
+      <w:hyperlink r:id="rId52">
         <w:r>
           <w:rPr>
             <w:rStyle w:val="Hyperlink"/>
@@ -26696,7 +26540,7 @@
         <w:rPr/>
         <w:t xml:space="preserve">, 1155–1167. </w:t>
       </w:r>
-      <w:hyperlink r:id="rId55">
+      <w:hyperlink r:id="rId53">
         <w:r>
           <w:rPr>
             <w:rStyle w:val="Hyperlink"/>
@@ -26726,7 +26570,7 @@
         <w:rPr/>
         <w:t xml:space="preserve">(5), 1165–1177. </w:t>
       </w:r>
-      <w:hyperlink r:id="rId56">
+      <w:hyperlink r:id="rId54">
         <w:r>
           <w:rPr>
             <w:rStyle w:val="Hyperlink"/>
@@ -26756,7 +26600,7 @@
         <w:rPr/>
         <w:t xml:space="preserve">, 318–331. </w:t>
       </w:r>
-      <w:hyperlink r:id="rId57">
+      <w:hyperlink r:id="rId55">
         <w:r>
           <w:rPr>
             <w:rStyle w:val="Hyperlink"/>
@@ -26786,7 +26630,7 @@
         <w:rPr/>
         <w:t xml:space="preserve">, 239–253. </w:t>
       </w:r>
-      <w:hyperlink r:id="rId58">
+      <w:hyperlink r:id="rId56">
         <w:r>
           <w:rPr>
             <w:rStyle w:val="Hyperlink"/>
@@ -26816,7 +26660,7 @@
         <w:rPr/>
         <w:t xml:space="preserve">, 381–397. </w:t>
       </w:r>
-      <w:hyperlink r:id="rId59">
+      <w:hyperlink r:id="rId57">
         <w:r>
           <w:rPr>
             <w:rStyle w:val="Hyperlink"/>
@@ -26846,7 +26690,7 @@
         <w:rPr/>
         <w:t xml:space="preserve">(11), e49790. </w:t>
       </w:r>
-      <w:hyperlink r:id="rId60">
+      <w:hyperlink r:id="rId58">
         <w:r>
           <w:rPr>
             <w:rStyle w:val="Hyperlink"/>
@@ -26876,7 +26720,7 @@
         <w:rPr/>
         <w:t xml:space="preserve">(4), 1000–1016. </w:t>
       </w:r>
-      <w:hyperlink r:id="rId61">
+      <w:hyperlink r:id="rId59">
         <w:r>
           <w:rPr>
             <w:rStyle w:val="Hyperlink"/>
@@ -27548,19 +27392,67 @@
       </w:pPr>
       <w:r>
         <w:rPr/>
-        <w:t>export NTHREADS=8            # threads per MRtrix or ANTs command</w:t>
-      </w:r>
-    </w:p>
-    <w:p>
-      <w:pPr>
-        <w:pStyle w:val="PreformattedTextcode"/>
-        <w:bidi w:val="0"/>
-        <w:jc w:val="left"/>
-        <w:rPr/>
-      </w:pPr>
-      <w:r>
-        <w:rPr/>
-        <w:t>export MAXJOBS=8             # participants processed concurrently in light steps</w:t>
+        <w:t># Peak load is roughly threads x concurrent participants; lower these on a shared machine.</w:t>
+      </w:r>
+    </w:p>
+    <w:p>
+      <w:pPr>
+        <w:pStyle w:val="PreformattedTextcode"/>
+        <w:bidi w:val="0"/>
+        <w:jc w:val="left"/>
+        <w:rPr/>
+      </w:pPr>
+      <w:r>
+        <w:rPr/>
+        <w:t>export NTHREADS=8            # threads per MRtrix command</w:t>
+      </w:r>
+    </w:p>
+    <w:p>
+      <w:pPr>
+        <w:pStyle w:val="PreformattedTextcode"/>
+        <w:bidi w:val="0"/>
+        <w:jc w:val="left"/>
+        <w:rPr/>
+      </w:pPr>
+      <w:r>
+        <w:rPr/>
+        <w:t>export MAXJOBS=8             # participants processed concurrently in light steps (2, 3)</w:t>
+      </w:r>
+    </w:p>
+    <w:p>
+      <w:pPr>
+        <w:pStyle w:val="PreformattedTextcode"/>
+        <w:bidi w:val="0"/>
+        <w:jc w:val="left"/>
+        <w:rPr/>
+      </w:pPr>
+      <w:r>
+        <w:rPr/>
+        <w:t>export ANTS_THREADS=4        # threads per registration (Step 1)</w:t>
+      </w:r>
+    </w:p>
+    <w:p>
+      <w:pPr>
+        <w:pStyle w:val="PreformattedTextcode"/>
+        <w:bidi w:val="0"/>
+        <w:jc w:val="left"/>
+        <w:rPr/>
+      </w:pPr>
+      <w:r>
+        <w:rPr/>
+        <w:t>export ANTS_JOBS=4           # registrations run concurrently (Step 1)</w:t>
+      </w:r>
+    </w:p>
+    <w:p>
+      <w:pPr>
+        <w:pStyle w:val="PreformattedTextcode"/>
+        <w:bidi w:val="0"/>
+        <w:jc w:val="left"/>
+        <w:rPr/>
+      </w:pPr>
+      <w:r>
+        <w:rPr/>
+        <w:t>export FOD_JOBS=2            # FOD estimations run concurrently (Step 0b; memory-intensive)</w:t>
       </w:r>
     </w:p>
     <w:p>
@@ -28067,41 +27959,6 @@
       </w:pPr>
       <w:r>
         <w:rPr/>
-        <w:t>ANTS_THREADS=4      # threads per registration</w:t>
-      </w:r>
-    </w:p>
-    <w:p>
-      <w:pPr>
-        <w:pStyle w:val="PreformattedTextcode"/>
-        <w:bidi w:val="0"/>
-        <w:jc w:val="left"/>
-        <w:rPr/>
-      </w:pPr>
-      <w:r>
-        <w:rPr/>
-        <w:t>ANTS_JOBS=4         # registrations run concurrently</w:t>
-      </w:r>
-    </w:p>
-    <w:p>
-      <w:pPr>
-        <w:pStyle w:val="PreformattedTextcode"/>
-        <w:bidi w:val="0"/>
-        <w:jc w:val="left"/>
-        <w:rPr/>
-      </w:pPr>
-      <w:r>
-        <w:rPr/>
-      </w:r>
-    </w:p>
-    <w:p>
-      <w:pPr>
-        <w:pStyle w:val="PreformattedTextcode"/>
-        <w:bidi w:val="0"/>
-        <w:jc w:val="left"/>
-        <w:rPr/>
-      </w:pPr>
-      <w:r>
-        <w:rPr/>
         <w:t>register_one() {</w:t>
       </w:r>
     </w:p>
@@ -48368,7 +48225,7 @@
       </w:pPr>
       <w:r>
         <w:rPr/>
-        <w:t># Phase 3 (memory-intensive: two participants at a time)</w:t>
+        <w:t># Phase 3 (memory-intensive: $FOD_JOBS participants at a time)</w:t>
       </w:r>
     </w:p>
     <w:p>
@@ -48412,7 +48269,7 @@
       </w:r>
       <w:r>
         <w:rPr/>
-        <w:t>throttle 2</w:t>
+        <w:t>throttle "$FOD_JOBS"</w:t>
       </w:r>
     </w:p>
     <w:p>

</xml_diff>

<commit_message>
Record real-data validation of the generalized scripts
Steps 0b to 8b were run on three participants of the example dataset on the
cluster (light load) and compared with the example dataset's own outputs:
region Dice .93-.99, corridor Dice .98-.99, cleaned counts and lengths in
agreement, NODDI maps identical, along-tract profiles r = .94-1.00. The Scripts
page now reports these results and the software versions. Also strips trailing
whitespace from tckstats output and clarifies that streamlines generated equals
seeds consumed.

Co-Authored-By: Claude Fable 5.1 <noreply@anthropic.com>
</commit_message>
<xml_diff>
--- a/static/supplement/MesoConnect_Supplementary_Methods.docx
+++ b/static/supplement/MesoConnect_Supplementary_Methods.docx
@@ -9278,7 +9278,17 @@
       </w:pPr>
       <w:r>
         <w:rPr/>
-        <w:t>The script reports streamlines reached, seeds consumed and mean length for each participant and cutoff. Table S9 gives the streamline counts obtained in the example dataset. At 0.1 most runs exhausted the seed budget before reaching the target. At 0.08 some participants reached the target and one stopped at 309. At 0.06 and at 0.01 all runs reached the target; the 0.01 runs consumed approximately one fifth of the seeds (about 415,000 versus 2.1 million or more at 0.06). Reaching the target in every pilot participant is a necessary condition for a cutoff; the reconstructions must also correspond to the tract, which is assessed next.</w:t>
+        <w:t xml:space="preserve">The script reports streamlines selected, streamlines generated and mean length for each participant and cutoff. </w:t>
+      </w:r>
+      <w:r>
+        <w:rPr>
+          <w:rStyle w:val="SourceText"/>
+        </w:rPr>
+        <w:t>tckgen</w:t>
+      </w:r>
+      <w:r>
+        <w:rPr/>
+        <w:t xml:space="preserve"> generates one streamline per seed, so the number generated is also the number of seeds consumed. Table S9 gives the streamline counts obtained in the example dataset. At 0.1 most runs exhausted the seed budget before reaching the target. At 0.08 some participants reached the target and one stopped at 309. At 0.06 and at 0.01 all runs reached the target; the 0.01 runs consumed approximately one fifth of the seeds (about 415,000 versus 2.1 million or more at 0.06). Reaching the target in every pilot participant is a necessary condition for a cutoff; the reconstructions must also correspond to the tract, which is assessed next.</w:t>
       </w:r>
     </w:p>
     <w:p>
@@ -11116,7 +11126,7 @@
       </w:pPr>
       <w:r>
         <w:rPr/>
-        <w:t xml:space="preserve">Table S10 gives the rationale for each option, and Table S11 the values used per tract family. The script records the number of streamlines reached and the number of seeds consumed per participant in </w:t>
+        <w:t xml:space="preserve">Table S10 gives the rationale for each option, and Table S11 the values used per tract family. The script records the number of streamlines selected and the number generated (equal to the number of seeds consumed) per participant in </w:t>
       </w:r>
       <w:r>
         <w:rPr>
@@ -24143,17 +24153,7 @@
       </w:pPr>
       <w:r>
         <w:rPr/>
-        <w:t xml:space="preserve">The scripts generalize those used to process the example dataset, in which every step completed for all 57 participants. Table S19 records how each generalized script has been checked. Steps 0b to 5, and the two Python scripts that call </w:t>
-      </w:r>
-      <w:r>
-        <w:rPr>
-          <w:rStyle w:val="SourceText"/>
-        </w:rPr>
-        <w:t>tckmap</w:t>
-      </w:r>
-      <w:r>
-        <w:rPr/>
-        <w:t>, have not yet been run on imaging data in their generalized form; that run will be recorded here with the software versions used.</w:t>
+        <w:t>The scripts generalize those used to process the example dataset, in which every step completed for all 57 participants. The generalized set was run from Step 0b to Step 8b on three participants of that dataset (one tract, left posterior ventral tegmental area → hippocampus), starting from the preprocessed diffusion data and the skull-stripped T1 image, and its outputs were compared with those the example dataset's own scripts had produced for the same participants (Table S19). The group-level scripts, which need a full sample, were checked against the example dataset's stored results (Table S20). The run used MRtrix3 3.0.7, FSL 6.0.5.1, ANTs 2.3.5, Python 3.8.10, DIPY 1.8.0, pyAFQ 1.3.5, AMICO 2.1.1 and bash 5.0 on Linux, with four threads and one participant at a time; it took under an hour.</w:t>
       </w:r>
     </w:p>
     <w:p>
@@ -24181,7 +24181,7 @@
         <w:rPr>
           <w:rStyle w:val="Emphasis"/>
         </w:rPr>
-        <w:t>Checks Performed on the Generalized Scripts</w:t>
+        <w:t>Generalized Scripts Compared With the Example Dataset's Outputs, Three Participants</w:t>
       </w:r>
     </w:p>
     <w:tbl>
@@ -24198,9 +24198,8 @@
         </w:tblCellMar>
       </w:tblPr>
       <w:tblGrid>
-        <w:gridCol w:w="3744"/>
-        <w:gridCol w:w="2411"/>
-        <w:gridCol w:w="3205"/>
+        <w:gridCol w:w="3826"/>
+        <w:gridCol w:w="5534"/>
       </w:tblGrid>
       <w:tr>
         <w:trPr>
@@ -24208,7 +24207,7 @@
         </w:trPr>
         <w:tc>
           <w:tcPr>
-            <w:tcW w:w="3744" w:type="dxa"/>
+            <w:tcW w:w="3826" w:type="dxa"/>
             <w:tcBorders>
               <w:top w:val="single" w:sz="6" w:space="0" w:color="808080"/>
               <w:bottom w:val="single" w:sz="2" w:space="0" w:color="808080"/>
@@ -24225,13 +24224,13 @@
             </w:pPr>
             <w:r>
               <w:rPr/>
-              <w:t>Scripts</w:t>
-            </w:r>
-          </w:p>
-        </w:tc>
-        <w:tc>
-          <w:tcPr>
-            <w:tcW w:w="2411" w:type="dxa"/>
+              <w:t>Output</w:t>
+            </w:r>
+          </w:p>
+        </w:tc>
+        <w:tc>
+          <w:tcPr>
+            <w:tcW w:w="5534" w:type="dxa"/>
             <w:tcBorders>
               <w:top w:val="single" w:sz="6" w:space="0" w:color="808080"/>
               <w:bottom w:val="single" w:sz="2" w:space="0" w:color="808080"/>
@@ -24248,13 +24247,492 @@
             </w:pPr>
             <w:r>
               <w:rPr/>
-              <w:t>Check</w:t>
-            </w:r>
-          </w:p>
-        </w:tc>
-        <w:tc>
-          <w:tcPr>
-            <w:tcW w:w="3205" w:type="dxa"/>
+              <w:t>Agreement</w:t>
+            </w:r>
+          </w:p>
+        </w:tc>
+      </w:tr>
+      <w:tr>
+        <w:trPr/>
+        <w:tc>
+          <w:tcPr>
+            <w:tcW w:w="3826" w:type="dxa"/>
+            <w:tcBorders/>
+            <w:vAlign w:val="center"/>
+          </w:tcPr>
+          <w:p>
+            <w:pPr>
+              <w:pStyle w:val="TableContents"/>
+              <w:widowControl w:val="false"/>
+              <w:suppressLineNumbers/>
+              <w:bidi w:val="0"/>
+              <w:jc w:val="left"/>
+              <w:rPr/>
+            </w:pPr>
+            <w:r>
+              <w:rPr/>
+              <w:t>Warped seed, target and atlas (Dice overlap)</w:t>
+            </w:r>
+          </w:p>
+        </w:tc>
+        <w:tc>
+          <w:tcPr>
+            <w:tcW w:w="5534" w:type="dxa"/>
+            <w:tcBorders/>
+            <w:vAlign w:val="center"/>
+          </w:tcPr>
+          <w:p>
+            <w:pPr>
+              <w:pStyle w:val="TableContents"/>
+              <w:widowControl w:val="false"/>
+              <w:suppressLineNumbers/>
+              <w:bidi w:val="0"/>
+              <w:jc w:val="left"/>
+              <w:rPr/>
+            </w:pPr>
+            <w:r>
+              <w:rPr/>
+              <w:t>.93 to .99</w:t>
+            </w:r>
+          </w:p>
+        </w:tc>
+      </w:tr>
+      <w:tr>
+        <w:trPr/>
+        <w:tc>
+          <w:tcPr>
+            <w:tcW w:w="3826" w:type="dxa"/>
+            <w:tcBorders/>
+            <w:vAlign w:val="center"/>
+          </w:tcPr>
+          <w:p>
+            <w:pPr>
+              <w:pStyle w:val="TableContents"/>
+              <w:widowControl w:val="false"/>
+              <w:suppressLineNumbers/>
+              <w:bidi w:val="0"/>
+              <w:jc w:val="left"/>
+              <w:rPr/>
+            </w:pPr>
+            <w:r>
+              <w:rPr/>
+              <w:t>Corridor (Dice overlap)</w:t>
+            </w:r>
+          </w:p>
+        </w:tc>
+        <w:tc>
+          <w:tcPr>
+            <w:tcW w:w="5534" w:type="dxa"/>
+            <w:tcBorders/>
+            <w:vAlign w:val="center"/>
+          </w:tcPr>
+          <w:p>
+            <w:pPr>
+              <w:pStyle w:val="TableContents"/>
+              <w:widowControl w:val="false"/>
+              <w:suppressLineNumbers/>
+              <w:bidi w:val="0"/>
+              <w:jc w:val="left"/>
+              <w:rPr/>
+            </w:pPr>
+            <w:r>
+              <w:rPr/>
+              <w:t>.98 to .99</w:t>
+            </w:r>
+          </w:p>
+        </w:tc>
+      </w:tr>
+      <w:tr>
+        <w:trPr/>
+        <w:tc>
+          <w:tcPr>
+            <w:tcW w:w="3826" w:type="dxa"/>
+            <w:tcBorders/>
+            <w:vAlign w:val="center"/>
+          </w:tcPr>
+          <w:p>
+            <w:pPr>
+              <w:pStyle w:val="TableContents"/>
+              <w:widowControl w:val="false"/>
+              <w:suppressLineNumbers/>
+              <w:bidi w:val="0"/>
+              <w:jc w:val="left"/>
+              <w:rPr/>
+            </w:pPr>
+            <w:r>
+              <w:rPr/>
+              <w:t>Pilot sweep, 0.06 versus 0.01: streamlines generated to reach 1,000</w:t>
+            </w:r>
+          </w:p>
+        </w:tc>
+        <w:tc>
+          <w:tcPr>
+            <w:tcW w:w="5534" w:type="dxa"/>
+            <w:tcBorders/>
+            <w:vAlign w:val="center"/>
+          </w:tcPr>
+          <w:p>
+            <w:pPr>
+              <w:pStyle w:val="TableContents"/>
+              <w:widowControl w:val="false"/>
+              <w:suppressLineNumbers/>
+              <w:bidi w:val="0"/>
+              <w:jc w:val="left"/>
+              <w:rPr/>
+            </w:pPr>
+            <w:r>
+              <w:rPr/>
+              <w:t>0.39 and 3.0 million versus 0.31 and 0.43 million; Dice between cutoffs .68 and .65 (.66 in the example dataset)</w:t>
+            </w:r>
+          </w:p>
+        </w:tc>
+      </w:tr>
+      <w:tr>
+        <w:trPr/>
+        <w:tc>
+          <w:tcPr>
+            <w:tcW w:w="3826" w:type="dxa"/>
+            <w:tcBorders/>
+            <w:vAlign w:val="center"/>
+          </w:tcPr>
+          <w:p>
+            <w:pPr>
+              <w:pStyle w:val="TableContents"/>
+              <w:widowControl w:val="false"/>
+              <w:suppressLineNumbers/>
+              <w:bidi w:val="0"/>
+              <w:jc w:val="left"/>
+              <w:rPr/>
+            </w:pPr>
+            <w:r>
+              <w:rPr/>
+              <w:t>Tractography at 0.01</w:t>
+            </w:r>
+          </w:p>
+        </w:tc>
+        <w:tc>
+          <w:tcPr>
+            <w:tcW w:w="5534" w:type="dxa"/>
+            <w:tcBorders/>
+            <w:vAlign w:val="center"/>
+          </w:tcPr>
+          <w:p>
+            <w:pPr>
+              <w:pStyle w:val="TableContents"/>
+              <w:widowControl w:val="false"/>
+              <w:suppressLineNumbers/>
+              <w:bidi w:val="0"/>
+              <w:jc w:val="left"/>
+              <w:rPr/>
+            </w:pPr>
+            <w:r>
+              <w:rPr/>
+              <w:t>2,500 streamlines in all three; 0.8 to 1.3 million streamlines generated</w:t>
+            </w:r>
+          </w:p>
+        </w:tc>
+      </w:tr>
+      <w:tr>
+        <w:trPr/>
+        <w:tc>
+          <w:tcPr>
+            <w:tcW w:w="3826" w:type="dxa"/>
+            <w:tcBorders/>
+            <w:vAlign w:val="center"/>
+          </w:tcPr>
+          <w:p>
+            <w:pPr>
+              <w:pStyle w:val="TableContents"/>
+              <w:widowControl w:val="false"/>
+              <w:suppressLineNumbers/>
+              <w:bidi w:val="0"/>
+              <w:jc w:val="left"/>
+              <w:rPr/>
+            </w:pPr>
+            <w:r>
+              <w:rPr/>
+              <w:t>Cleaned bundle, streamline count</w:t>
+            </w:r>
+          </w:p>
+        </w:tc>
+        <w:tc>
+          <w:tcPr>
+            <w:tcW w:w="5534" w:type="dxa"/>
+            <w:tcBorders/>
+            <w:vAlign w:val="center"/>
+          </w:tcPr>
+          <w:p>
+            <w:pPr>
+              <w:pStyle w:val="TableContents"/>
+              <w:widowControl w:val="false"/>
+              <w:suppressLineNumbers/>
+              <w:bidi w:val="0"/>
+              <w:jc w:val="left"/>
+              <w:rPr/>
+            </w:pPr>
+            <w:r>
+              <w:rPr/>
+              <w:t>864, 886, 705 versus 857, 824, 733</w:t>
+            </w:r>
+          </w:p>
+        </w:tc>
+      </w:tr>
+      <w:tr>
+        <w:trPr/>
+        <w:tc>
+          <w:tcPr>
+            <w:tcW w:w="3826" w:type="dxa"/>
+            <w:tcBorders/>
+            <w:vAlign w:val="center"/>
+          </w:tcPr>
+          <w:p>
+            <w:pPr>
+              <w:pStyle w:val="TableContents"/>
+              <w:widowControl w:val="false"/>
+              <w:suppressLineNumbers/>
+              <w:bidi w:val="0"/>
+              <w:jc w:val="left"/>
+              <w:rPr/>
+            </w:pPr>
+            <w:r>
+              <w:rPr/>
+              <w:t>Cleaned bundle, mean length</w:t>
+            </w:r>
+          </w:p>
+        </w:tc>
+        <w:tc>
+          <w:tcPr>
+            <w:tcW w:w="5534" w:type="dxa"/>
+            <w:tcBorders/>
+            <w:vAlign w:val="center"/>
+          </w:tcPr>
+          <w:p>
+            <w:pPr>
+              <w:pStyle w:val="TableContents"/>
+              <w:widowControl w:val="false"/>
+              <w:suppressLineNumbers/>
+              <w:bidi w:val="0"/>
+              <w:jc w:val="left"/>
+              <w:rPr/>
+            </w:pPr>
+            <w:r>
+              <w:rPr/>
+              <w:t>within 0.4 mm</w:t>
+            </w:r>
+          </w:p>
+        </w:tc>
+      </w:tr>
+      <w:tr>
+        <w:trPr/>
+        <w:tc>
+          <w:tcPr>
+            <w:tcW w:w="3826" w:type="dxa"/>
+            <w:tcBorders/>
+            <w:vAlign w:val="center"/>
+          </w:tcPr>
+          <w:p>
+            <w:pPr>
+              <w:pStyle w:val="TableContents"/>
+              <w:widowControl w:val="false"/>
+              <w:suppressLineNumbers/>
+              <w:bidi w:val="0"/>
+              <w:jc w:val="left"/>
+              <w:rPr/>
+            </w:pPr>
+            <w:r>
+              <w:rPr/>
+              <w:t>Quality-control overlays</w:t>
+            </w:r>
+          </w:p>
+        </w:tc>
+        <w:tc>
+          <w:tcPr>
+            <w:tcW w:w="5534" w:type="dxa"/>
+            <w:tcBorders/>
+            <w:vAlign w:val="center"/>
+          </w:tcPr>
+          <w:p>
+            <w:pPr>
+              <w:pStyle w:val="TableContents"/>
+              <w:widowControl w:val="false"/>
+              <w:suppressLineNumbers/>
+              <w:bidi w:val="0"/>
+              <w:jc w:val="left"/>
+              <w:rPr/>
+            </w:pPr>
+            <w:r>
+              <w:rPr/>
+              <w:t>No flags; bundles follow the expected arc</w:t>
+            </w:r>
+          </w:p>
+        </w:tc>
+      </w:tr>
+      <w:tr>
+        <w:trPr/>
+        <w:tc>
+          <w:tcPr>
+            <w:tcW w:w="3826" w:type="dxa"/>
+            <w:tcBorders/>
+            <w:vAlign w:val="center"/>
+          </w:tcPr>
+          <w:p>
+            <w:pPr>
+              <w:pStyle w:val="TableContents"/>
+              <w:widowControl w:val="false"/>
+              <w:suppressLineNumbers/>
+              <w:bidi w:val="0"/>
+              <w:jc w:val="left"/>
+              <w:rPr/>
+            </w:pPr>
+            <w:r>
+              <w:rPr/>
+              <w:t>NODDI maps</w:t>
+            </w:r>
+          </w:p>
+        </w:tc>
+        <w:tc>
+          <w:tcPr>
+            <w:tcW w:w="5534" w:type="dxa"/>
+            <w:tcBorders/>
+            <w:vAlign w:val="center"/>
+          </w:tcPr>
+          <w:p>
+            <w:pPr>
+              <w:pStyle w:val="TableContents"/>
+              <w:widowControl w:val="false"/>
+              <w:suppressLineNumbers/>
+              <w:bidi w:val="0"/>
+              <w:jc w:val="left"/>
+              <w:rPr/>
+            </w:pPr>
+            <w:r>
+              <w:rPr/>
+              <w:t>Identical, voxel for voxel</w:t>
+            </w:r>
+          </w:p>
+        </w:tc>
+      </w:tr>
+      <w:tr>
+        <w:trPr/>
+        <w:tc>
+          <w:tcPr>
+            <w:tcW w:w="3826" w:type="dxa"/>
+            <w:tcBorders>
+              <w:bottom w:val="single" w:sz="6" w:space="0" w:color="808080"/>
+            </w:tcBorders>
+            <w:vAlign w:val="center"/>
+          </w:tcPr>
+          <w:p>
+            <w:pPr>
+              <w:pStyle w:val="TableContents"/>
+              <w:widowControl w:val="false"/>
+              <w:suppressLineNumbers/>
+              <w:bidi w:val="0"/>
+              <w:jc w:val="left"/>
+              <w:rPr/>
+            </w:pPr>
+            <w:r>
+              <w:rPr/>
+              <w:t>Along-tract profiles (correlation across the 100 nodes)</w:t>
+            </w:r>
+          </w:p>
+        </w:tc>
+        <w:tc>
+          <w:tcPr>
+            <w:tcW w:w="5534" w:type="dxa"/>
+            <w:tcBorders>
+              <w:bottom w:val="single" w:sz="6" w:space="0" w:color="808080"/>
+            </w:tcBorders>
+            <w:vAlign w:val="center"/>
+          </w:tcPr>
+          <w:p>
+            <w:pPr>
+              <w:pStyle w:val="TableContents"/>
+              <w:widowControl w:val="false"/>
+              <w:suppressLineNumbers/>
+              <w:bidi w:val="0"/>
+              <w:jc w:val="left"/>
+              <w:rPr/>
+            </w:pPr>
+            <w:r>
+              <w:rPr/>
+              <w:t>FA .98; NDI .99 to 1.00; ODI .99; FWF .94 to 1.00</w:t>
+            </w:r>
+          </w:p>
+        </w:tc>
+      </w:tr>
+    </w:tbl>
+    <w:p>
+      <w:pPr>
+        <w:pStyle w:val="BodyText"/>
+        <w:bidi w:val="0"/>
+        <w:jc w:val="left"/>
+        <w:rPr/>
+      </w:pPr>
+      <w:r>
+        <w:rPr>
+          <w:rStyle w:val="Emphasis"/>
+        </w:rPr>
+        <w:t>Note.</w:t>
+      </w:r>
+      <w:r>
+        <w:rPr/>
+        <w:t xml:space="preserve"> Tractography is stochastic, so streamline counts and profiles are not expected to match exactly. NODDI = neurite orientation dispersion and density imaging; FA = fractional anisotropy; NDI = neurite density index; ODI = orientation dispersion index; FWF = free-water fraction.</w:t>
+      </w:r>
+    </w:p>
+    <w:p>
+      <w:pPr>
+        <w:pStyle w:val="BodyText"/>
+        <w:bidi w:val="0"/>
+        <w:jc w:val="left"/>
+        <w:rPr/>
+      </w:pPr>
+      <w:r>
+        <w:rPr>
+          <w:rStyle w:val="Strong"/>
+        </w:rPr>
+        <w:t>Table S20</w:t>
+      </w:r>
+    </w:p>
+    <w:p>
+      <w:pPr>
+        <w:pStyle w:val="BodyText"/>
+        <w:bidi w:val="0"/>
+        <w:jc w:val="left"/>
+        <w:rPr/>
+      </w:pPr>
+      <w:r>
+        <w:rPr>
+          <w:rStyle w:val="Emphasis"/>
+        </w:rPr>
+        <w:t>Checks of the Group-Level Scripts</w:t>
+      </w:r>
+    </w:p>
+    <w:tbl>
+      <w:tblPr>
+        <w:tblW w:w="5000" w:type="pct"/>
+        <w:jc w:val="left"/>
+        <w:tblInd w:w="60" w:type="dxa"/>
+        <w:tblLayout w:type="fixed"/>
+        <w:tblCellMar>
+          <w:top w:w="60" w:type="dxa"/>
+          <w:left w:w="60" w:type="dxa"/>
+          <w:bottom w:w="60" w:type="dxa"/>
+          <w:right w:w="60" w:type="dxa"/>
+        </w:tblCellMar>
+      </w:tblPr>
+      <w:tblGrid>
+        <w:gridCol w:w="3196"/>
+        <w:gridCol w:w="2479"/>
+        <w:gridCol w:w="3685"/>
+      </w:tblGrid>
+      <w:tr>
+        <w:trPr>
+          <w:tblHeader w:val="true"/>
+        </w:trPr>
+        <w:tc>
+          <w:tcPr>
+            <w:tcW w:w="3196" w:type="dxa"/>
             <w:tcBorders>
               <w:top w:val="single" w:sz="6" w:space="0" w:color="808080"/>
               <w:bottom w:val="single" w:sz="2" w:space="0" w:color="808080"/>
@@ -24271,6 +24749,52 @@
             </w:pPr>
             <w:r>
               <w:rPr/>
+              <w:t>Script</w:t>
+            </w:r>
+          </w:p>
+        </w:tc>
+        <w:tc>
+          <w:tcPr>
+            <w:tcW w:w="2479" w:type="dxa"/>
+            <w:tcBorders>
+              <w:top w:val="single" w:sz="6" w:space="0" w:color="808080"/>
+              <w:bottom w:val="single" w:sz="2" w:space="0" w:color="808080"/>
+            </w:tcBorders>
+            <w:vAlign w:val="center"/>
+          </w:tcPr>
+          <w:p>
+            <w:pPr>
+              <w:pStyle w:val="TableHeading"/>
+              <w:suppressLineNumbers/>
+              <w:bidi w:val="0"/>
+              <w:jc w:val="left"/>
+              <w:rPr/>
+            </w:pPr>
+            <w:r>
+              <w:rPr/>
+              <w:t>Check</w:t>
+            </w:r>
+          </w:p>
+        </w:tc>
+        <w:tc>
+          <w:tcPr>
+            <w:tcW w:w="3685" w:type="dxa"/>
+            <w:tcBorders>
+              <w:top w:val="single" w:sz="6" w:space="0" w:color="808080"/>
+              <w:bottom w:val="single" w:sz="2" w:space="0" w:color="808080"/>
+            </w:tcBorders>
+            <w:vAlign w:val="center"/>
+          </w:tcPr>
+          <w:p>
+            <w:pPr>
+              <w:pStyle w:val="TableHeading"/>
+              <w:suppressLineNumbers/>
+              <w:bidi w:val="0"/>
+              <w:jc w:val="left"/>
+              <w:rPr/>
+            </w:pPr>
+            <w:r>
+              <w:rPr/>
               <w:t>Result</w:t>
             </w:r>
           </w:p>
@@ -24280,7 +24804,7 @@
         <w:trPr/>
         <w:tc>
           <w:tcPr>
-            <w:tcW w:w="3744" w:type="dxa"/>
+            <w:tcW w:w="3196" w:type="dxa"/>
             <w:tcBorders/>
             <w:vAlign w:val="center"/>
           </w:tcPr>
@@ -24303,7 +24827,7 @@
         </w:tc>
         <w:tc>
           <w:tcPr>
-            <w:tcW w:w="2411" w:type="dxa"/>
+            <w:tcW w:w="2479" w:type="dxa"/>
             <w:tcBorders/>
             <w:vAlign w:val="center"/>
           </w:tcPr>
@@ -24324,22 +24848,22 @@
         </w:tc>
         <w:tc>
           <w:tcPr>
-            <w:tcW w:w="3205" w:type="dxa"/>
-            <w:tcBorders/>
-            <w:vAlign w:val="center"/>
-          </w:tcPr>
-          <w:p>
-            <w:pPr>
-              <w:pStyle w:val="TableContents"/>
-              <w:widowControl w:val="false"/>
-              <w:suppressLineNumbers/>
-              <w:bidi w:val="0"/>
-              <w:jc w:val="left"/>
-              <w:rPr/>
-            </w:pPr>
-            <w:r>
-              <w:rPr/>
-              <w:t>Reproduces the reported whole-tract and quartile estimates, interaction tests included, to three decimals</w:t>
+            <w:tcW w:w="3685" w:type="dxa"/>
+            <w:tcBorders/>
+            <w:vAlign w:val="center"/>
+          </w:tcPr>
+          <w:p>
+            <w:pPr>
+              <w:pStyle w:val="TableContents"/>
+              <w:widowControl w:val="false"/>
+              <w:suppressLineNumbers/>
+              <w:bidi w:val="0"/>
+              <w:jc w:val="left"/>
+              <w:rPr/>
+            </w:pPr>
+            <w:r>
+              <w:rPr/>
+              <w:t>Reproduces the reported whole-tract and quartile estimates and interaction tests to three decimals</w:t>
             </w:r>
           </w:p>
         </w:tc>
@@ -24348,7 +24872,7 @@
         <w:trPr/>
         <w:tc>
           <w:tcPr>
-            <w:tcW w:w="3744" w:type="dxa"/>
+            <w:tcW w:w="3196" w:type="dxa"/>
             <w:tcBorders/>
             <w:vAlign w:val="center"/>
           </w:tcPr>
@@ -24365,49 +24889,59 @@
               <w:rPr>
                 <w:rStyle w:val="SourceText"/>
               </w:rPr>
-              <w:t>06_clean_bundles.py</w:t>
-            </w:r>
-          </w:p>
-        </w:tc>
-        <w:tc>
-          <w:tcPr>
-            <w:tcW w:w="2411" w:type="dxa"/>
-            <w:tcBorders/>
-            <w:vAlign w:val="center"/>
-          </w:tcPr>
-          <w:p>
-            <w:pPr>
-              <w:pStyle w:val="TableContents"/>
-              <w:widowControl w:val="false"/>
-              <w:suppressLineNumbers/>
-              <w:bidi w:val="0"/>
-              <w:jc w:val="left"/>
-              <w:rPr/>
-            </w:pPr>
-            <w:r>
-              <w:rPr/>
-              <w:t>Run on synthetic bundles with planted outlier streamlines (pyAFQ 3.3, DIPY 1.12)</w:t>
-            </w:r>
-          </w:p>
-        </w:tc>
-        <w:tc>
-          <w:tcPr>
-            <w:tcW w:w="3205" w:type="dxa"/>
-            <w:tcBorders/>
-            <w:vAlign w:val="center"/>
-          </w:tcPr>
-          <w:p>
-            <w:pPr>
-              <w:pStyle w:val="TableContents"/>
-              <w:widowControl w:val="false"/>
-              <w:suppressLineNumbers/>
-              <w:bidi w:val="0"/>
-              <w:jc w:val="left"/>
-              <w:rPr/>
-            </w:pPr>
-            <w:r>
-              <w:rPr/>
-              <w:t>Outliers removed; resumes; covariate table written</w:t>
+              <w:t>09b_nodewise_permutation.R</w:t>
+            </w:r>
+          </w:p>
+        </w:tc>
+        <w:tc>
+          <w:tcPr>
+            <w:tcW w:w="2479" w:type="dxa"/>
+            <w:tcBorders/>
+            <w:vAlign w:val="center"/>
+          </w:tcPr>
+          <w:p>
+            <w:pPr>
+              <w:pStyle w:val="TableContents"/>
+              <w:widowControl w:val="false"/>
+              <w:suppressLineNumbers/>
+              <w:bidi w:val="0"/>
+              <w:jc w:val="left"/>
+              <w:rPr/>
+            </w:pPr>
+            <w:r>
+              <w:rPr/>
+              <w:t>Run on an analysis file of the example dataset</w:t>
+            </w:r>
+          </w:p>
+        </w:tc>
+        <w:tc>
+          <w:tcPr>
+            <w:tcW w:w="3685" w:type="dxa"/>
+            <w:tcBorders/>
+            <w:vAlign w:val="center"/>
+          </w:tcPr>
+          <w:p>
+            <w:pPr>
+              <w:pStyle w:val="TableContents"/>
+              <w:widowControl w:val="false"/>
+              <w:suppressLineNumbers/>
+              <w:bidi w:val="0"/>
+              <w:jc w:val="left"/>
+              <w:rPr/>
+            </w:pPr>
+            <w:r>
+              <w:rPr/>
+              <w:t xml:space="preserve">Node-wise </w:t>
+            </w:r>
+            <w:r>
+              <w:rPr>
+                <w:rStyle w:val="Emphasis"/>
+              </w:rPr>
+              <w:t>t</w:t>
+            </w:r>
+            <w:r>
+              <w:rPr/>
+              <w:t xml:space="preserve"> values identical to the stored results; same clusters; identical output with one, three and four cores</w:t>
             </w:r>
           </w:p>
         </w:tc>
@@ -24416,7 +24950,7 @@
         <w:trPr/>
         <w:tc>
           <w:tcPr>
-            <w:tcW w:w="3744" w:type="dxa"/>
+            <w:tcW w:w="3196" w:type="dxa"/>
             <w:tcBorders/>
             <w:vAlign w:val="center"/>
           </w:tcPr>
@@ -24433,49 +24967,55 @@
               <w:rPr>
                 <w:rStyle w:val="SourceText"/>
               </w:rPr>
-              <w:t>08_node_profiles.py</w:t>
-            </w:r>
-          </w:p>
-        </w:tc>
-        <w:tc>
-          <w:tcPr>
-            <w:tcW w:w="2411" w:type="dxa"/>
-            <w:tcBorders/>
-            <w:vAlign w:val="center"/>
-          </w:tcPr>
-          <w:p>
-            <w:pPr>
-              <w:pStyle w:val="TableContents"/>
-              <w:widowControl w:val="false"/>
-              <w:suppressLineNumbers/>
-              <w:bidi w:val="0"/>
-              <w:jc w:val="left"/>
-              <w:rPr/>
-            </w:pPr>
-            <w:r>
-              <w:rPr/>
-              <w:t>Run on synthetic bundles, including bundles stored in reverse order</w:t>
-            </w:r>
-          </w:p>
-        </w:tc>
-        <w:tc>
-          <w:tcPr>
-            <w:tcW w:w="3205" w:type="dxa"/>
-            <w:tcBorders/>
-            <w:vAlign w:val="center"/>
-          </w:tcPr>
-          <w:p>
-            <w:pPr>
-              <w:pStyle w:val="TableContents"/>
-              <w:widowControl w:val="false"/>
-              <w:suppressLineNumbers/>
-              <w:bidi w:val="0"/>
-              <w:jc w:val="left"/>
-              <w:rPr/>
-            </w:pPr>
-            <w:r>
-              <w:rPr/>
-              <w:t>Node 0 at the seed end in every case; no missing values</w:t>
+              <w:t>09c_stack_for_explorer.py</w:t>
+            </w:r>
+          </w:p>
+        </w:tc>
+        <w:tc>
+          <w:tcPr>
+            <w:tcW w:w="2479" w:type="dxa"/>
+            <w:tcBorders/>
+            <w:vAlign w:val="center"/>
+          </w:tcPr>
+          <w:p>
+            <w:pPr>
+              <w:pStyle w:val="TableContents"/>
+              <w:widowControl w:val="false"/>
+              <w:suppressLineNumbers/>
+              <w:bidi w:val="0"/>
+              <w:jc w:val="left"/>
+              <w:rPr/>
+            </w:pPr>
+            <w:r>
+              <w:rPr/>
+              <w:t xml:space="preserve">Run on the outputs of </w:t>
+            </w:r>
+            <w:r>
+              <w:rPr>
+                <w:rStyle w:val="SourceText"/>
+              </w:rPr>
+              <w:t>09b</w:t>
+            </w:r>
+          </w:p>
+        </w:tc>
+        <w:tc>
+          <w:tcPr>
+            <w:tcW w:w="3685" w:type="dxa"/>
+            <w:tcBorders/>
+            <w:vAlign w:val="center"/>
+          </w:tcPr>
+          <w:p>
+            <w:pPr>
+              <w:pStyle w:val="TableContents"/>
+              <w:widowControl w:val="false"/>
+              <w:suppressLineNumbers/>
+              <w:bidi w:val="0"/>
+              <w:jc w:val="left"/>
+              <w:rPr/>
+            </w:pPr>
+            <w:r>
+              <w:rPr/>
+              <w:t>Explorer file written and loaded</w:t>
             </w:r>
           </w:p>
         </w:tc>
@@ -24484,86 +25024,10 @@
         <w:trPr/>
         <w:tc>
           <w:tcPr>
-            <w:tcW w:w="3744" w:type="dxa"/>
-            <w:tcBorders/>
-            <w:vAlign w:val="center"/>
-          </w:tcPr>
-          <w:p>
-            <w:pPr>
-              <w:pStyle w:val="TableContents"/>
-              <w:widowControl w:val="false"/>
-              <w:suppressLineNumbers/>
-              <w:bidi w:val="0"/>
-              <w:jc w:val="left"/>
-              <w:rPr/>
-            </w:pPr>
-            <w:r>
-              <w:rPr>
-                <w:rStyle w:val="SourceText"/>
-              </w:rPr>
-              <w:t>08a_noddi_fit.py</w:t>
-            </w:r>
-          </w:p>
-        </w:tc>
-        <w:tc>
-          <w:tcPr>
-            <w:tcW w:w="2411" w:type="dxa"/>
-            <w:tcBorders/>
-            <w:vAlign w:val="center"/>
-          </w:tcPr>
-          <w:p>
-            <w:pPr>
-              <w:pStyle w:val="TableContents"/>
-              <w:widowControl w:val="false"/>
-              <w:suppressLineNumbers/>
-              <w:bidi w:val="0"/>
-              <w:jc w:val="left"/>
-              <w:rPr/>
-            </w:pPr>
-            <w:r>
-              <w:rPr/>
-              <w:t>Run on a synthetic multi-shell dataset (AMICO 2.1.1), white-matter and gray-matter diffusivity</w:t>
-            </w:r>
-          </w:p>
-        </w:tc>
-        <w:tc>
-          <w:tcPr>
-            <w:tcW w:w="3205" w:type="dxa"/>
-            <w:tcBorders/>
-            <w:vAlign w:val="center"/>
-          </w:tcPr>
-          <w:p>
-            <w:pPr>
-              <w:pStyle w:val="TableContents"/>
-              <w:widowControl w:val="false"/>
-              <w:suppressLineNumbers/>
-              <w:bidi w:val="0"/>
-              <w:jc w:val="left"/>
-              <w:rPr/>
-            </w:pPr>
-            <w:r>
-              <w:rPr/>
-              <w:t xml:space="preserve">All maps written; resumes. Multi-threaded fitting was unstable on macOS with Python 3.13 and stable with </w:t>
-            </w:r>
-            <w:r>
-              <w:rPr>
-                <w:rStyle w:val="SourceText"/>
-              </w:rPr>
-              <w:t>NODDI_NTHREADS=1</w:t>
-            </w:r>
-            <w:r>
-              <w:rPr/>
-              <w:t>; the example dataset was fitted with 12 threads on Linux</w:t>
-            </w:r>
-          </w:p>
-        </w:tc>
-      </w:tr>
-      <w:tr>
-        <w:trPr/>
-        <w:tc>
-          <w:tcPr>
-            <w:tcW w:w="3744" w:type="dxa"/>
-            <w:tcBorders/>
+            <w:tcW w:w="3196" w:type="dxa"/>
+            <w:tcBorders>
+              <w:bottom w:val="single" w:sz="6" w:space="0" w:color="808080"/>
+            </w:tcBorders>
             <w:vAlign w:val="center"/>
           </w:tcPr>
           <w:p>
@@ -24581,158 +25045,11 @@
               </w:rPr>
               <w:t>08b_build_analysis_csv.py</w:t>
             </w:r>
-            <w:r>
-              <w:rPr/>
-              <w:t xml:space="preserve">, </w:t>
-            </w:r>
-            <w:r>
-              <w:rPr>
-                <w:rStyle w:val="SourceText"/>
-              </w:rPr>
-              <w:t>09b_nodewise_permutation.R</w:t>
-            </w:r>
-            <w:r>
-              <w:rPr/>
-              <w:t xml:space="preserve">, </w:t>
-            </w:r>
-            <w:r>
-              <w:rPr>
-                <w:rStyle w:val="SourceText"/>
-              </w:rPr>
-              <w:t>09c_stack_for_explorer.py</w:t>
-            </w:r>
-          </w:p>
-        </w:tc>
-        <w:tc>
-          <w:tcPr>
-            <w:tcW w:w="2411" w:type="dxa"/>
-            <w:tcBorders/>
-            <w:vAlign w:val="center"/>
-          </w:tcPr>
-          <w:p>
-            <w:pPr>
-              <w:pStyle w:val="TableContents"/>
-              <w:widowControl w:val="false"/>
-              <w:suppressLineNumbers/>
-              <w:bidi w:val="0"/>
-              <w:jc w:val="left"/>
-              <w:rPr/>
-            </w:pPr>
-            <w:r>
-              <w:rPr/>
-              <w:t>Run in sequence on the synthetic profiles with a planted association</w:t>
-            </w:r>
-          </w:p>
-        </w:tc>
-        <w:tc>
-          <w:tcPr>
-            <w:tcW w:w="3205" w:type="dxa"/>
-            <w:tcBorders/>
-            <w:vAlign w:val="center"/>
-          </w:tcPr>
-          <w:p>
-            <w:pPr>
-              <w:pStyle w:val="TableContents"/>
-              <w:widowControl w:val="false"/>
-              <w:suppressLineNumbers/>
-              <w:bidi w:val="0"/>
-              <w:jc w:val="left"/>
-              <w:rPr/>
-            </w:pPr>
-            <w:r>
-              <w:rPr/>
-              <w:t>Association recovered; null outcome null; Explorer file written</w:t>
-            </w:r>
-          </w:p>
-        </w:tc>
-      </w:tr>
-      <w:tr>
-        <w:trPr/>
-        <w:tc>
-          <w:tcPr>
-            <w:tcW w:w="3744" w:type="dxa"/>
-            <w:tcBorders/>
-            <w:vAlign w:val="center"/>
-          </w:tcPr>
-          <w:p>
-            <w:pPr>
-              <w:pStyle w:val="TableContents"/>
-              <w:widowControl w:val="false"/>
-              <w:suppressLineNumbers/>
-              <w:bidi w:val="0"/>
-              <w:jc w:val="left"/>
-              <w:rPr/>
-            </w:pPr>
-            <w:r>
-              <w:rPr>
-                <w:rStyle w:val="SourceText"/>
-              </w:rPr>
-              <w:t>00b</w:t>
-            </w:r>
-            <w:r>
-              <w:rPr/>
-              <w:t xml:space="preserve"> to </w:t>
-            </w:r>
-            <w:r>
-              <w:rPr>
-                <w:rStyle w:val="SourceText"/>
-              </w:rPr>
-              <w:t>05</w:t>
-            </w:r>
-            <w:r>
-              <w:rPr/>
-              <w:t xml:space="preserve"> (shell)</w:t>
-            </w:r>
-          </w:p>
-        </w:tc>
-        <w:tc>
-          <w:tcPr>
-            <w:tcW w:w="2411" w:type="dxa"/>
-            <w:tcBorders/>
-            <w:vAlign w:val="center"/>
-          </w:tcPr>
-          <w:p>
-            <w:pPr>
-              <w:pStyle w:val="TableContents"/>
-              <w:widowControl w:val="false"/>
-              <w:suppressLineNumbers/>
-              <w:bidi w:val="0"/>
-              <w:jc w:val="left"/>
-              <w:rPr/>
-            </w:pPr>
-            <w:r>
-              <w:rPr/>
-              <w:t>Syntax check; run against stand-in executables to exercise logging, concurrency, resumption, missing-input handling and audit tables</w:t>
-            </w:r>
-          </w:p>
-        </w:tc>
-        <w:tc>
-          <w:tcPr>
-            <w:tcW w:w="3205" w:type="dxa"/>
-            <w:tcBorders/>
-            <w:vAlign w:val="center"/>
-          </w:tcPr>
-          <w:p>
-            <w:pPr>
-              <w:pStyle w:val="TableContents"/>
-              <w:widowControl w:val="false"/>
-              <w:suppressLineNumbers/>
-              <w:bidi w:val="0"/>
-              <w:jc w:val="left"/>
-              <w:rPr/>
-            </w:pPr>
-            <w:r>
-              <w:rPr/>
-              <w:t>Control flow correct; commands not yet executed on imaging data</w:t>
-            </w:r>
-          </w:p>
-        </w:tc>
-      </w:tr>
-      <w:tr>
-        <w:trPr/>
-        <w:tc>
-          <w:tcPr>
-            <w:tcW w:w="3744" w:type="dxa"/>
+          </w:p>
+        </w:tc>
+        <w:tc>
+          <w:tcPr>
+            <w:tcW w:w="2479" w:type="dxa"/>
             <w:tcBorders>
               <w:bottom w:val="single" w:sz="6" w:space="0" w:color="808080"/>
             </w:tcBorders>
@@ -24748,26 +25065,14 @@
               <w:rPr/>
             </w:pPr>
             <w:r>
-              <w:rPr>
-                <w:rStyle w:val="SourceText"/>
-              </w:rPr>
-              <w:t>04b_compare_cutoffs.py</w:t>
-            </w:r>
-            <w:r>
-              <w:rPr/>
-              <w:t xml:space="preserve">, </w:t>
-            </w:r>
-            <w:r>
-              <w:rPr>
-                <w:rStyle w:val="SourceText"/>
-              </w:rPr>
-              <w:t>07_visual_qc.py</w:t>
-            </w:r>
-          </w:p>
-        </w:tc>
-        <w:tc>
-          <w:tcPr>
-            <w:tcW w:w="2411" w:type="dxa"/>
+              <w:rPr/>
+              <w:t>Run in the three-participant test</w:t>
+            </w:r>
+          </w:p>
+        </w:tc>
+        <w:tc>
+          <w:tcPr>
+            <w:tcW w:w="3685" w:type="dxa"/>
             <w:tcBorders>
               <w:bottom w:val="single" w:sz="6" w:space="0" w:color="808080"/>
             </w:tcBorders>
@@ -24784,41 +25089,34 @@
             </w:pPr>
             <w:r>
               <w:rPr/>
-              <w:t>Syntax check</w:t>
-            </w:r>
-          </w:p>
-        </w:tc>
-        <w:tc>
-          <w:tcPr>
-            <w:tcW w:w="3205" w:type="dxa"/>
-            <w:tcBorders>
-              <w:bottom w:val="single" w:sz="6" w:space="0" w:color="808080"/>
-            </w:tcBorders>
-            <w:vAlign w:val="center"/>
-          </w:tcPr>
-          <w:p>
-            <w:pPr>
-              <w:pStyle w:val="TableContents"/>
-              <w:widowControl w:val="false"/>
-              <w:suppressLineNumbers/>
-              <w:bidi w:val="0"/>
-              <w:jc w:val="left"/>
-              <w:rPr/>
-            </w:pPr>
-            <w:r>
-              <w:rPr/>
-              <w:t xml:space="preserve">Not yet run; both call </w:t>
-            </w:r>
-            <w:r>
-              <w:rPr>
-                <w:rStyle w:val="SourceText"/>
-              </w:rPr>
-              <w:t>tckmap</w:t>
+              <w:t>Analysis files written for all four metrics</w:t>
             </w:r>
           </w:p>
         </w:tc>
       </w:tr>
     </w:tbl>
+    <w:p>
+      <w:pPr>
+        <w:pStyle w:val="BodyText"/>
+        <w:bidi w:val="0"/>
+        <w:jc w:val="left"/>
+        <w:rPr/>
+      </w:pPr>
+      <w:r>
+        <w:rPr/>
+        <w:t xml:space="preserve">Two defects surfaced during validation and are fixed in the distributed scripts: on bash 5.0 to 5.2 the shell steps stalled at the end of their first participant loop, and the mean streamline length was read from the wrong line of the </w:t>
+      </w:r>
+      <w:r>
+        <w:rPr>
+          <w:rStyle w:val="SourceText"/>
+        </w:rPr>
+        <w:t>tckstats</w:t>
+      </w:r>
+      <w:r>
+        <w:rPr/>
+        <w:t xml:space="preserve"> output. The scripts were also reviewed independently; the defects found are recorded in the repository history.</w:t>
+      </w:r>
+    </w:p>
     <w:p>
       <w:pPr>
         <w:pStyle w:val="BodyText"/>
@@ -31157,7 +31455,19 @@
       </w:pPr>
       <w:r>
         <w:rPr/>
-        <w:t># the number tckgen had to generate (selected plus rejected) to obtain them.</w:t>
+        <w:t># the number tckgen had to generate (selected plus rejected) to obtain them.  tckgen</w:t>
+      </w:r>
+    </w:p>
+    <w:p>
+      <w:pPr>
+        <w:pStyle w:val="PreformattedTextcode"/>
+        <w:bidi w:val="0"/>
+        <w:jc w:val="left"/>
+        <w:rPr/>
+      </w:pPr>
+      <w:r>
+        <w:rPr/>
+        <w:t># generates one streamline per seed, so it is also the number of seeds consumed.</w:t>
       </w:r>
     </w:p>
     <w:p>
@@ -31683,7 +31993,7 @@
       </w:r>
       <w:r>
         <w:rPr/>
-        <w:t>meanlen=$(tckstats "$tck" -output mean -quiet)</w:t>
+        <w:t>meanlen=$(tckstats "$tck" -output mean -quiet | awk '{print $1}')</w:t>
       </w:r>
     </w:p>
     <w:p>
@@ -34936,7 +35246,7 @@
       </w:r>
       <w:r>
         <w:rPr/>
-        <w:t>meanlen=$(tckstats "$tck" -output mean -quiet)</w:t>
+        <w:t>meanlen=$(tckstats "$tck" -output mean -quiet | awk '{print $1}')</w:t>
       </w:r>
     </w:p>
     <w:p>

</xml_diff>

<commit_message>
Node-wise script: pass label now always agrees with the cluster p value
A cluster is marked as passing when its permutation p value is <= .05. The
previous rule (extent >= 95th percentile of the null) could mark a cluster
exactly at the threshold as passing while its own p value was above .05.
Checked on three analyses of the example dataset: labels and p values agree,
and the reported 52-node cluster is unaffected.

Co-Authored-By: Claude Fable 5.1 <noreply@anthropic.com>
</commit_message>
<xml_diff>
--- a/static/supplement/MesoConnect_Supplementary_Methods.docx
+++ b/static/supplement/MesoConnect_Supplementary_Methods.docx
@@ -16434,7 +16434,17 @@
       </w:r>
       <w:r>
         <w:rPr/>
-        <w:t xml:space="preserve"> &lt; .05 form clusters. Family-wise error is controlled at the cluster level with a Freedman–Lane permutation procedure (Freedman &amp; Lane, 1983; Winkler et al., 2014): the residuals of the reduced model are permuted, all 100 nodes are refitted, the largest cluster of each permutation is recorded, and the procedure is repeated 5,000 times. A cluster is retained when its extent equals or exceeds the 95th percentile of this null distribution of maximum cluster extent. The permutations are drawn once from a fixed seed, so results do not depend on the number of cores. Variables are not standardized in this script; the node-wise estimates are in the units of the outcome per unit of the metric.</w:t>
+        <w:t xml:space="preserve"> &lt; .05 form clusters. Family-wise error is controlled at the cluster level with a Freedman–Lane permutation procedure (Freedman &amp; Lane, 1983; Winkler et al., 2014): the residuals of the reduced model are permuted, all 100 nodes are refitted, the largest cluster of each permutation is recorded, and the procedure is repeated 5,000 times. A cluster's </w:t>
+      </w:r>
+      <w:r>
+        <w:rPr>
+          <w:rStyle w:val="Emphasis"/>
+        </w:rPr>
+        <w:t>p</w:t>
+      </w:r>
+      <w:r>
+        <w:rPr/>
+        <w:t xml:space="preserve"> value is the proportion of permutations whose largest cluster is at least as long, and a cluster is retained when that value does not exceed .05; the smallest extent that meets this criterion is reported as the extent threshold. The permutations are drawn once from a fixed seed, so results do not depend on the number of cores. Variables are not standardized in this script; the node-wise estimates are in the units of the outcome per unit of the metric.</w:t>
       </w:r>
     </w:p>
     <w:p>
@@ -25343,7 +25353,7 @@
       </w:r>
       <w:r>
         <w:rPr/>
-        <w:t xml:space="preserve"> &lt; .05 formed clusters, and family-wise error was controlled at the cluster level: a null distribution of maximum cluster extent was obtained from 5,000 Freedman–Lane permutations (Freedman &amp; Lane, 1983; Winkler et al., 2014), and clusters were retained when their extent reached the 95th percentile of that distribution.] Covariates were [intracranial volume, the mean streamline length and streamline count of the cleaned bundle, absolute head motion and age]. [Variables in the whole-tract and quartile models were standardized.] The resolution of analysis and the covariate set were specified before results were examined.</w:t>
+        <w:t xml:space="preserve"> &lt; .05 formed clusters, and family-wise error was controlled at the cluster level: a null distribution of maximum cluster extent was obtained from 5,000 Freedman–Lane permutations (Freedman &amp; Lane, 1983; Winkler et al., 2014), and clusters were retained when the proportion of permutations with a maximum cluster at least as long did not exceed .05.] Covariates were [intracranial volume, the mean streamline length and streamline count of the cleaned bundle, absolute head motion and age]. [Variables in the whole-tract and quartile models were standardized.] The resolution of analysis and the covariate set were specified before results were examined.</w:t>
       </w:r>
     </w:p>
     <w:p>
@@ -47163,7 +47173,43 @@
       </w:pPr>
       <w:r>
         <w:rPr/>
-        <w:t>extent_threshold &lt;- as.integer(quantile(perm_max_sizes, probs=1-alpha_familywise, type=1))</w:t>
+        <w:t># Cluster p value: proportion of permutations whose largest cluster is at least as long.</w:t>
+      </w:r>
+    </w:p>
+    <w:p>
+      <w:pPr>
+        <w:pStyle w:val="PreformattedTextcode"/>
+        <w:bidi w:val="0"/>
+        <w:jc w:val="left"/>
+        <w:rPr/>
+      </w:pPr>
+      <w:r>
+        <w:rPr/>
+        <w:t># The extent threshold is the smallest extent with p &lt;= alpha.  Extents are whole</w:t>
+      </w:r>
+    </w:p>
+    <w:p>
+      <w:pPr>
+        <w:pStyle w:val="PreformattedTextcode"/>
+        <w:bidi w:val="0"/>
+        <w:jc w:val="left"/>
+        <w:rPr/>
+      </w:pPr>
+      <w:r>
+        <w:rPr/>
+        <w:t># numbers, so this is one node above the (1 - alpha) quantile; a cluster exactly at the</w:t>
+      </w:r>
+    </w:p>
+    <w:p>
+      <w:pPr>
+        <w:pStyle w:val="PreformattedTextcode"/>
+        <w:bidi w:val="0"/>
+        <w:jc w:val="left"/>
+        <w:rPr/>
+      </w:pPr>
+      <w:r>
+        <w:rPr/>
+        <w:t># quantile has p &gt; alpha and does not pass.</w:t>
       </w:r>
     </w:p>
     <w:p>
@@ -47187,6 +47233,34 @@
       </w:pPr>
       <w:r>
         <w:rPr/>
+        <w:t>extent_threshold &lt;- as.integer(quantile(perm_max_sizes, probs = 1 - alpha_familywise,</w:t>
+      </w:r>
+    </w:p>
+    <w:p>
+      <w:pPr>
+        <w:pStyle w:val="PreformattedTextcode"/>
+        <w:bidi w:val="0"/>
+        <w:jc w:val="left"/>
+        <w:rPr/>
+      </w:pPr>
+      <w:r>
+        <w:rPr/>
+        <w:t xml:space="preserve">                                        </w:t>
+      </w:r>
+      <w:r>
+        <w:rPr/>
+        <w:t>type = 1)) + 1L</w:t>
+      </w:r>
+    </w:p>
+    <w:p>
+      <w:pPr>
+        <w:pStyle w:val="PreformattedTextcode"/>
+        <w:bidi w:val="0"/>
+        <w:jc w:val="left"/>
+        <w:rPr/>
+      </w:pPr>
+      <w:r>
+        <w:rPr/>
       </w:r>
     </w:p>
     <w:p>
@@ -47438,7 +47512,7 @@
       </w:r>
       <w:r>
         <w:rPr/>
-        <w:t>PassExtentThreshold=length(nodes) &gt;= extent_threshold</w:t>
+        <w:t>PassExtentThreshold=cluster_p_from_size(length(nodes)) &lt;= alpha_familywise</w:t>
       </w:r>
     </w:p>
     <w:p>

</xml_diff>

<commit_message>
Remove the example study's internal results from the tutorial
Deleted audit-log passages (pass counts, borderline participants, row counts,
corridor-size ranges, hemisphere-correlation statistics) and the paragraph
describing the example study's findings. Replaced the Explorer's data file,
which held the example study's full node-wise results, with a synthetic sample
in the same format; the Explorer's example button now loads that sample.
Figure and table wording no longer reads as per-participant records.
</commit_message>
<xml_diff>
--- a/static/supplement/MesoConnect_Supplementary_Methods.docx
+++ b/static/supplement/MesoConnect_Supplementary_Methods.docx
@@ -245,8 +245,8 @@
         </w:tblCellMar>
       </w:tblPr>
       <w:tblGrid>
-        <w:gridCol w:w="1909"/>
-        <w:gridCol w:w="7451"/>
+        <w:gridCol w:w="1902"/>
+        <w:gridCol w:w="7458"/>
       </w:tblGrid>
       <w:tr>
         <w:trPr>
@@ -254,7 +254,7 @@
         </w:trPr>
         <w:tc>
           <w:tcPr>
-            <w:tcW w:w="1909" w:type="dxa"/>
+            <w:tcW w:w="1902" w:type="dxa"/>
             <w:tcBorders>
               <w:top w:val="single" w:sz="6" w:space="0" w:color="808080"/>
               <w:bottom w:val="single" w:sz="2" w:space="0" w:color="808080"/>
@@ -277,7 +277,7 @@
         </w:tc>
         <w:tc>
           <w:tcPr>
-            <w:tcW w:w="7451" w:type="dxa"/>
+            <w:tcW w:w="7458" w:type="dxa"/>
             <w:tcBorders>
               <w:top w:val="single" w:sz="6" w:space="0" w:color="808080"/>
               <w:bottom w:val="single" w:sz="2" w:space="0" w:color="808080"/>
@@ -303,7 +303,7 @@
         <w:trPr/>
         <w:tc>
           <w:tcPr>
-            <w:tcW w:w="1909" w:type="dxa"/>
+            <w:tcW w:w="1902" w:type="dxa"/>
             <w:tcBorders/>
             <w:vAlign w:val="center"/>
           </w:tcPr>
@@ -324,7 +324,7 @@
         </w:tc>
         <w:tc>
           <w:tcPr>
-            <w:tcW w:w="7451" w:type="dxa"/>
+            <w:tcW w:w="7458" w:type="dxa"/>
             <w:tcBorders/>
             <w:vAlign w:val="center"/>
           </w:tcPr>
@@ -348,7 +348,7 @@
         <w:trPr/>
         <w:tc>
           <w:tcPr>
-            <w:tcW w:w="1909" w:type="dxa"/>
+            <w:tcW w:w="1902" w:type="dxa"/>
             <w:tcBorders/>
             <w:vAlign w:val="center"/>
           </w:tcPr>
@@ -369,7 +369,7 @@
         </w:tc>
         <w:tc>
           <w:tcPr>
-            <w:tcW w:w="7451" w:type="dxa"/>
+            <w:tcW w:w="7458" w:type="dxa"/>
             <w:tcBorders/>
             <w:vAlign w:val="center"/>
           </w:tcPr>
@@ -384,7 +384,7 @@
             </w:pPr>
             <w:r>
               <w:rPr/>
-              <w:t>The nine steps, each with parameters, verification criteria, the full script, and results from an example dataset</w:t>
+              <w:t>The nine steps, each with parameters, verification criteria, the full script, and illustrative output from an example dataset</w:t>
             </w:r>
           </w:p>
         </w:tc>
@@ -393,7 +393,7 @@
         <w:trPr/>
         <w:tc>
           <w:tcPr>
-            <w:tcW w:w="1909" w:type="dxa"/>
+            <w:tcW w:w="1902" w:type="dxa"/>
             <w:tcBorders/>
             <w:vAlign w:val="center"/>
           </w:tcPr>
@@ -414,7 +414,7 @@
         </w:tc>
         <w:tc>
           <w:tcPr>
-            <w:tcW w:w="7451" w:type="dxa"/>
+            <w:tcW w:w="7458" w:type="dxa"/>
             <w:tcBorders/>
             <w:vAlign w:val="center"/>
           </w:tcPr>
@@ -438,7 +438,7 @@
         <w:trPr/>
         <w:tc>
           <w:tcPr>
-            <w:tcW w:w="1909" w:type="dxa"/>
+            <w:tcW w:w="1902" w:type="dxa"/>
             <w:tcBorders/>
             <w:vAlign w:val="center"/>
           </w:tcPr>
@@ -459,7 +459,7 @@
         </w:tc>
         <w:tc>
           <w:tcPr>
-            <w:tcW w:w="7451" w:type="dxa"/>
+            <w:tcW w:w="7458" w:type="dxa"/>
             <w:tcBorders/>
             <w:vAlign w:val="center"/>
           </w:tcPr>
@@ -483,7 +483,7 @@
         <w:trPr/>
         <w:tc>
           <w:tcPr>
-            <w:tcW w:w="1909" w:type="dxa"/>
+            <w:tcW w:w="1902" w:type="dxa"/>
             <w:tcBorders>
               <w:bottom w:val="single" w:sz="6" w:space="0" w:color="808080"/>
             </w:tcBorders>
@@ -506,7 +506,7 @@
         </w:tc>
         <w:tc>
           <w:tcPr>
-            <w:tcW w:w="7451" w:type="dxa"/>
+            <w:tcW w:w="7458" w:type="dxa"/>
             <w:tcBorders>
               <w:bottom w:val="single" w:sz="6" w:space="0" w:color="808080"/>
             </w:tcBorders>
@@ -550,7 +550,7 @@
       </w:pPr>
       <w:r>
         <w:rPr/>
-        <w:t>Numerical results and figures on the workflow pages are drawn from a single dataset of 57 adults scanned at 3 T with a multi-shell protocol (</w:t>
+        <w:t>Figures and illustrative values on the workflow pages are drawn from a single dataset of 57 adults scanned at 3 T with a multi-shell protocol (</w:t>
       </w:r>
       <w:r>
         <w:rPr>
@@ -7096,7 +7096,7 @@
       </w:r>
       <w:r>
         <w:rPr/>
-        <w:t xml:space="preserve"> on the participant's T1 image; the ventricles, corpus callosum and brainstem outline should coincide. A registration that is globally acceptable but locally displaced in the midbrain will manifest in Step 2 as a misplaced VTA region, so this inspection supplements rather than replaces the region-level inspection described there. In the example dataset all 57 participants produced complete transforms.</w:t>
+        <w:t xml:space="preserve"> on the participant's T1 image; the ventricles, corpus callosum and brainstem outline should coincide. A registration that is globally acceptable but locally displaced in the midbrain will manifest in Step 2 as a misplaced VTA region, so this inspection supplements rather than replaces the region-level inspection described there.</w:t>
       </w:r>
     </w:p>
     <w:p>
@@ -7297,7 +7297,7 @@
       </w:pPr>
       <w:r>
         <w:rPr/>
-        <w:t>The script ends with a per-participant table of the voxel counts of the warped seed, target and atlas and of the seed–target overlap, which must be zero; participants with missing outputs are listed as such. Voxel counts far from the sample mean (more than two standard deviations is a useful criterion) indicate a failed registration and call for inspection of that participant. Table S7 gives the counts obtained in the example dataset. In that dataset image dimensions, binariness and laterality (left-hemisphere regions located in the left hemisphere) were also checked for every participant, and a cross-correlation below .60 between the warped template and the T1 image was flagged; two participants scored .59 and were retained after visual inspection. These additional checks are not part of the distributed script.</w:t>
+        <w:t>The script ends with a per-participant table of the voxel counts of the warped seed, target and atlas and of the seed–target overlap, which must be zero; participants with missing outputs are listed as such. Voxel counts far from the sample mean (more than two standard deviations is a useful criterion) indicate a failed registration and call for inspection of that participant. Table S7 gives the counts obtained in the example dataset, as a reference for the sizes to expect at 2 mm resolution.</w:t>
       </w:r>
     </w:p>
     <w:p>
@@ -8538,17 +8538,7 @@
       </w:pPr>
       <w:r>
         <w:rPr/>
-        <w:t>The script confirms that the seed and target voxels have value 0 in the exclusion mask (that is, are not excluded) and reports the corridor size. Additional checks confirm binariness, agreement of dimensions with the diffusion image, and an inclusion zone below 20% of brain volume. In the example dataset corridor sizes ranged from 1,526 to 1,934 voxels (</w:t>
-      </w:r>
-      <w:r>
-        <w:rPr>
-          <w:rStyle w:val="Emphasis"/>
-        </w:rPr>
-        <w:t>M</w:t>
-      </w:r>
-      <w:r>
-        <w:rPr/>
-        <w:t xml:space="preserve"> = 1,720) for the posterior tract and approximately 1,400 voxels for the anterior tract. An automated coverage check that flags inclusion zones below 1% of brain volume flags every participant; the corridor is that small by design.</w:t>
+        <w:t>The script confirms that the seed and target voxels have value 0 in the exclusion mask (that is, are not excluded) and reports the corridor size, which should be similar across participants (roughly 1,500 to 1,900 voxels at 2 mm for VTA → hippocampus in the example dataset). A corridor much larger or smaller than the others indicates a registration problem.</w:t>
       </w:r>
     </w:p>
     <w:p>
@@ -8767,9 +8757,9 @@
         </w:tblCellMar>
       </w:tblPr>
       <w:tblGrid>
-        <w:gridCol w:w="4620"/>
+        <w:gridCol w:w="6345"/>
         <w:gridCol w:w="806"/>
-        <w:gridCol w:w="3934"/>
+        <w:gridCol w:w="2209"/>
       </w:tblGrid>
       <w:tr>
         <w:trPr>
@@ -8777,7 +8767,7 @@
         </w:trPr>
         <w:tc>
           <w:tcPr>
-            <w:tcW w:w="4620" w:type="dxa"/>
+            <w:tcW w:w="6345" w:type="dxa"/>
             <w:tcBorders>
               <w:top w:val="single" w:sz="6" w:space="0" w:color="808080"/>
               <w:bottom w:val="single" w:sz="2" w:space="0" w:color="808080"/>
@@ -8823,7 +8813,7 @@
         </w:tc>
         <w:tc>
           <w:tcPr>
-            <w:tcW w:w="3934" w:type="dxa"/>
+            <w:tcW w:w="2209" w:type="dxa"/>
             <w:tcBorders>
               <w:top w:val="single" w:sz="6" w:space="0" w:color="808080"/>
               <w:bottom w:val="single" w:sz="2" w:space="0" w:color="808080"/>
@@ -8849,7 +8839,7 @@
         <w:trPr/>
         <w:tc>
           <w:tcPr>
-            <w:tcW w:w="4620" w:type="dxa"/>
+            <w:tcW w:w="6345" w:type="dxa"/>
             <w:tcBorders/>
             <w:vAlign w:val="center"/>
           </w:tcPr>
@@ -8891,7 +8881,7 @@
         </w:tc>
         <w:tc>
           <w:tcPr>
-            <w:tcW w:w="3934" w:type="dxa"/>
+            <w:tcW w:w="2209" w:type="dxa"/>
             <w:tcBorders/>
             <w:vAlign w:val="center"/>
           </w:tcPr>
@@ -8906,7 +8896,7 @@
             </w:pPr>
             <w:r>
               <w:rPr/>
-              <w:t>All 228 runs (57 participants, two tracts, two hemispheres) reached 2,500 streamlines; no participant excluded</w:t>
+              <w:t>Value used for the example dataset</w:t>
             </w:r>
           </w:p>
         </w:tc>
@@ -8915,7 +8905,7 @@
         <w:trPr/>
         <w:tc>
           <w:tcPr>
-            <w:tcW w:w="4620" w:type="dxa"/>
+            <w:tcW w:w="6345" w:type="dxa"/>
             <w:tcBorders/>
             <w:vAlign w:val="center"/>
           </w:tcPr>
@@ -8957,7 +8947,7 @@
         </w:tc>
         <w:tc>
           <w:tcPr>
-            <w:tcW w:w="3934" w:type="dxa"/>
+            <w:tcW w:w="2209" w:type="dxa"/>
             <w:tcBorders/>
             <w:vAlign w:val="center"/>
           </w:tcPr>
@@ -8981,7 +8971,7 @@
         <w:trPr/>
         <w:tc>
           <w:tcPr>
-            <w:tcW w:w="4620" w:type="dxa"/>
+            <w:tcW w:w="6345" w:type="dxa"/>
             <w:tcBorders/>
             <w:vAlign w:val="center"/>
           </w:tcPr>
@@ -9023,7 +9013,7 @@
         </w:tc>
         <w:tc>
           <w:tcPr>
-            <w:tcW w:w="3934" w:type="dxa"/>
+            <w:tcW w:w="2209" w:type="dxa"/>
             <w:tcBorders/>
             <w:vAlign w:val="center"/>
           </w:tcPr>
@@ -9047,7 +9037,7 @@
         <w:trPr/>
         <w:tc>
           <w:tcPr>
-            <w:tcW w:w="4620" w:type="dxa"/>
+            <w:tcW w:w="6345" w:type="dxa"/>
             <w:tcBorders/>
             <w:vAlign w:val="center"/>
           </w:tcPr>
@@ -9089,7 +9079,7 @@
         </w:tc>
         <w:tc>
           <w:tcPr>
-            <w:tcW w:w="3934" w:type="dxa"/>
+            <w:tcW w:w="2209" w:type="dxa"/>
             <w:tcBorders/>
             <w:vAlign w:val="center"/>
           </w:tcPr>
@@ -9113,7 +9103,7 @@
         <w:trPr/>
         <w:tc>
           <w:tcPr>
-            <w:tcW w:w="4620" w:type="dxa"/>
+            <w:tcW w:w="6345" w:type="dxa"/>
             <w:tcBorders>
               <w:bottom w:val="single" w:sz="6" w:space="0" w:color="808080"/>
             </w:tcBorders>
@@ -9159,7 +9149,7 @@
         </w:tc>
         <w:tc>
           <w:tcPr>
-            <w:tcW w:w="3934" w:type="dxa"/>
+            <w:tcW w:w="2209" w:type="dxa"/>
             <w:tcBorders>
               <w:bottom w:val="single" w:sz="6" w:space="0" w:color="808080"/>
             </w:tcBorders>
@@ -10543,7 +10533,7 @@
       </w:r>
       <w:r>
         <w:rPr/>
-        <w:t xml:space="preserve"> Target 1,000 streamlines; seed limit 5 million. P1 to P4 = pilot participants with all four cutoffs completed; the fifth pilot participant was run at 0.06 and 0.01 only and reached the target at both. L = left; R = right.</w:t>
+        <w:t xml:space="preserve"> Target 1,000 streamlines; seed limit 5 million. P1 to P4 = pilot participants; L = left; R = right.</w:t>
       </w:r>
     </w:p>
     <w:p>
@@ -12071,7 +12061,7 @@
             </w:pPr>
             <w:r>
               <w:rPr/>
-              <w:t>Used for all 57 participants of the example dataset at 3 T.</w:t>
+              <w:t>Used for the example dataset at 3 T.</w:t>
             </w:r>
           </w:p>
         </w:tc>
@@ -12587,7 +12577,7 @@
       </w:pPr>
       <w:r>
         <w:rPr/>
-        <w:t>The script reports the number of participants reaching the streamline target. In the example dataset all 114 hemisphere runs reached 2,500 streamlines, consuming 0.5 to 2.0 million seeds (about 4% of the ceiling). The anterior tract also reached 2,500 in all 114 runs, with higher seed consumption (1.5 to 11 million) consistent with its smaller corridor. A participant reaching a lower count, for example 1,800, is retained; a participant reaching a very low count, for example 50, is reviewed in Step 7.</w:t>
+        <w:t>The script reports the number of participants reaching the streamline target and, for each participant, the number of streamlines generated. Reaching the target in every participant with a small fraction of the seed ceiling is the expected outcome. A participant reaching a lower count, for example 1,800, is retained; a participant reaching a very low count, for example 50, is reviewed in Step 7.</w:t>
       </w:r>
     </w:p>
     <w:p>
@@ -13360,17 +13350,7 @@
       </w:pPr>
       <w:r>
         <w:rPr/>
-        <w:t>In the example dataset, cleaning retained 26% to 58% of streamlines (</w:t>
-      </w:r>
-      <w:r>
-        <w:rPr>
-          <w:rStyle w:val="Emphasis"/>
-        </w:rPr>
-        <w:t>M</w:t>
-      </w:r>
-      <w:r>
-        <w:rPr/>
-        <w:t xml:space="preserve"> = 39%), with a minimum cleaned count of 659. These values are typical for the thresholds in Table S12, and every participant retained several hundred streamlines. Figures S9 and S10 present the comparison referred to in Step 4: the cleaned 0.01 bundle is more compact than the uncleaned 0.06 bundle, with length standard deviations of approximately 3.5 to 4.5 mm for cleaned bundles against 5 to 7 mm for either uncleaned condition.</w:t>
+        <w:t>With the thresholds in Table S12, cleaning typically retains 25% to 60% of streamlines, several hundred per participant. Figures S9 and S10 present the comparison referred to in Step 4: the cleaned 0.01 bundle is more compact than the uncleaned 0.06 bundle, with length standard deviations of approximately 3.5 to 4.5 mm for cleaned bundles against 5 to 7 mm for either uncleaned condition.</w:t>
       </w:r>
     </w:p>
     <w:p>
@@ -14156,7 +14136,7 @@
         <w:rPr>
           <w:rStyle w:val="Emphasis"/>
         </w:rPr>
-        <w:t>Participant With the Lowest Cleaning Retention</w:t>
+        <w:t>Cleaned Tract at the Low End of Retention</w:t>
       </w:r>
     </w:p>
     <w:p>
@@ -14172,7 +14152,7 @@
           <wp:inline distT="0" distB="0" distL="0" distR="0">
             <wp:extent cx="5334000" cy="2476500"/>
             <wp:effectExtent l="0" t="0" r="0" b="0"/>
-            <wp:docPr id="13" name="Image13" descr="Cleaned tract from the lowest-retention participant"/>
+            <wp:docPr id="13" name="Image13" descr="Cleaned tract with low retention"/>
             <wp:cNvGraphicFramePr>
               <a:graphicFrameLocks xmlns:a="http://schemas.openxmlformats.org/drawingml/2006/main" noChangeAspect="1"/>
             </wp:cNvGraphicFramePr>
@@ -14180,7 +14160,7 @@
               <a:graphicData uri="http://schemas.openxmlformats.org/drawingml/2006/picture">
                 <pic:pic xmlns:pic="http://schemas.openxmlformats.org/drawingml/2006/picture">
                   <pic:nvPicPr>
-                    <pic:cNvPr id="13" name="Image13" descr="Cleaned tract from the lowest-retention participant"/>
+                    <pic:cNvPr id="13" name="Image13" descr="Cleaned tract with low retention"/>
                     <pic:cNvPicPr>
                       <a:picLocks noChangeAspect="1" noChangeArrowheads="1"/>
                     </pic:cNvPicPr>
@@ -14223,7 +14203,7 @@
       </w:r>
       <w:r>
         <w:rPr/>
-        <w:t xml:space="preserve"> Retention 26%; 659 streamlines.</w:t>
+        <w:t xml:space="preserve"> About a quarter of the streamlines survived cleaning; the bundle is still well formed.</w:t>
       </w:r>
     </w:p>
     <w:p>
@@ -14464,30 +14444,6 @@
     </w:p>
     <w:p>
       <w:pPr>
-        <w:pStyle w:val="Heading2"/>
-        <w:bidi w:val="0"/>
-        <w:jc w:val="left"/>
-        <w:rPr/>
-      </w:pPr>
-      <w:r>
-        <w:rPr/>
-        <w:t>Example dataset</w:t>
-      </w:r>
-    </w:p>
-    <w:p>
-      <w:pPr>
-        <w:pStyle w:val="BodyText"/>
-        <w:bidi w:val="0"/>
-        <w:jc w:val="left"/>
-        <w:rPr/>
-      </w:pPr>
-      <w:r>
-        <w:rPr/>
-        <w:t>All 114 posterior and 114 anterior tracts passed without flags. The two participants with borderline registration scores in Step 2 passed.</w:t>
-      </w:r>
-    </w:p>
-    <w:p>
-      <w:pPr>
         <w:pStyle w:val="Heading1"/>
         <w:bidi w:val="0"/>
         <w:rPr/>
@@ -14671,7 +14627,7 @@
       </w:r>
       <w:r>
         <w:rPr/>
-        <w:t xml:space="preserve"> dictionary in the script specifies the scalar maps; the script writes one long-format CSV per tract with one column per metric. Processing 57 participants and four tracts required 20 to 40 min.</w:t>
+        <w:t xml:space="preserve"> dictionary in the script specifies the scalar maps; the script writes one long-format CSV per tract with one column per metric. Processing takes roughly 10 s per participant and tract.</w:t>
       </w:r>
     </w:p>
     <w:p>
@@ -15444,7 +15400,7 @@
       </w:pPr>
       <w:r>
         <w:rPr/>
-        <w:t>The row count of each CSV should equal the number of participants × 100. In the example dataset every tract and metric produced 5,700 rows with no skipped participants.</w:t>
+        <w:t>The row count of each CSV should equal the number of participants × 100.</w:t>
       </w:r>
     </w:p>
     <w:p>
@@ -15476,37 +15432,7 @@
       </w:r>
       <w:r>
         <w:rPr/>
-        <w:t xml:space="preserve"> on the right is strongly positive when the profiles are aligned (approximately </w:t>
-      </w:r>
-      <w:r>
-        <w:rPr>
-          <w:rStyle w:val="Emphasis"/>
-        </w:rPr>
-        <w:t>r</w:t>
-      </w:r>
-      <w:r>
-        <w:rPr/>
-        <w:t xml:space="preserve"> = .98 in the example dataset) and strongly negative when one side is reversed. Mid-tract averages (nodes 25 to 74) correlated across hemispheres at approximately </w:t>
-      </w:r>
-      <w:r>
-        <w:rPr>
-          <w:rStyle w:val="Emphasis"/>
-        </w:rPr>
-        <w:t>r</w:t>
-      </w:r>
-      <w:r>
-        <w:rPr/>
-        <w:t xml:space="preserve"> = .80 to .90 for NDI and ODI and </w:t>
-      </w:r>
-      <w:r>
-        <w:rPr>
-          <w:rStyle w:val="Emphasis"/>
-        </w:rPr>
-        <w:t>r</w:t>
-      </w:r>
-      <w:r>
-        <w:rPr/>
-        <w:t xml:space="preserve"> = .50 for FA.</w:t>
+        <w:t xml:space="preserve"> on the right is strongly positive when the profiles are aligned and strongly negative when one side is reversed.</w:t>
       </w:r>
     </w:p>
     <w:p>
@@ -16673,17 +16599,7 @@
       </w:pPr>
       <w:r>
         <w:rPr/>
-        <w:t>Covariates comprise intracranial volume (ICV), the mean streamline length and streamline count of the cleaned bundle (written by Step 6), absolute head motion and age. Length and count are tract-specific and index reconstruction quality. Streamline count can be strongly correlated with the metric under test (</w:t>
-      </w:r>
-      <w:r>
-        <w:rPr>
-          <w:rStyle w:val="Emphasis"/>
-        </w:rPr>
-        <w:t>r</w:t>
-      </w:r>
-      <w:r>
-        <w:rPr/>
-        <w:t xml:space="preserve"> = .63 to .87 with tract-mean NDI across the tracts of the example dataset), which reduces the residual variance available to the test. Its inclusion should be decided in advance and both specifications reported.</w:t>
+        <w:t>Covariates comprise intracranial volume (ICV), the mean streamline length and streamline count of the cleaned bundle (written by Step 6), absolute head motion and age. Length and count are tract-specific and index reconstruction quality. Streamline count can be strongly correlated with the metric under test, which reduces the residual variance available to the test. Its inclusion should be decided in advance and both specifications reported.</w:t>
       </w:r>
     </w:p>
     <w:p>
@@ -16708,28 +16624,6 @@
       <w:r>
         <w:rPr/>
         <w:t>A hypothesis about a particular segment of a pathway calls for the quartile or node-wise model. A hypothesis about the pathway as a whole calls for the whole-tract model. Exploratory work is often best served by the whole-tract model for inference with the node-wise profile reported as description. Tests across several metrics, tracts and outcomes accumulate rapidly at any resolution; fixing the analytic hierarchy in advance (primary metric, primary outcome family) is more readily justified than correcting across all tests afterwards.</w:t>
-      </w:r>
-    </w:p>
-    <w:p>
-      <w:pPr>
-        <w:pStyle w:val="BodyText"/>
-        <w:bidi w:val="0"/>
-        <w:jc w:val="left"/>
-        <w:rPr/>
-      </w:pPr>
-      <w:r>
-        <w:rPr/>
-        <w:t xml:space="preserve">In the example dataset, three social-memory measures were associated with NDI in the whole-tract model with no subregion interaction. In the quartile model one of them (positivity bias in false memories) was significant in all four quartiles and the seed-end versus target-end contrast was null for all three, indicating uniform effects. Node-wise clusters were located at nodes 27 to 55 and changed with covariate specification. The results were therefore reported with the whole-tract model as primary, the quartile model as confirmation of uniformity, and node-wise profiles as description. Applied to the analysis files of that dataset, </w:t>
-      </w:r>
-      <w:r>
-        <w:rPr>
-          <w:rStyle w:val="SourceText"/>
-        </w:rPr>
-        <w:t>09a_tract_models.py</w:t>
-      </w:r>
-      <w:r>
-        <w:rPr/>
-        <w:t xml:space="preserve"> reproduces the reported whole-tract and quartile estimates.</w:t>
       </w:r>
     </w:p>
     <w:p>
@@ -16966,16 +16860,8 @@
       </w:hyperlink>
       <w:r>
         <w:rPr/>
-        <w:t xml:space="preserve"> · </w:t>
-      </w:r>
-      <w:hyperlink r:id="rId34">
-        <w:r>
-          <w:rPr>
-            <w:rStyle w:val="Hyperlink"/>
-          </w:rPr>
-          <w:t>example dataset</w:t>
-        </w:r>
-      </w:hyperlink>
+        <w:t xml:space="preserve"> (synthetic data in the expected format)</w:t>
+      </w:r>
     </w:p>
     <w:p>
       <w:pPr>
@@ -24163,515 +24049,19 @@
       </w:pPr>
       <w:r>
         <w:rPr/>
-        <w:t>The scripts generalize those used to process the example dataset, in which every step completed for all 57 participants. The generalized set was run from Step 0b to Step 8b on three participants of that dataset (one tract, left posterior ventral tegmental area → hippocampus), starting from the preprocessed diffusion data and the skull-stripped T1 image, and its outputs were compared with those the example dataset's own scripts had produced for the same participants (Table S19). The group-level scripts, which need a full sample, were checked against the example dataset's stored results (Table S20). The run used MRtrix3 3.0.7, FSL 6.0.5.1, ANTs 2.3.5, Python 3.8.10, DIPY 1.8.0, pyAFQ 1.3.5, AMICO 2.1.1 and bash 5.0 on Linux, with four threads and one participant at a time; it took under an hour.</w:t>
-      </w:r>
-    </w:p>
-    <w:p>
-      <w:pPr>
-        <w:pStyle w:val="BodyText"/>
-        <w:bidi w:val="0"/>
-        <w:jc w:val="left"/>
-        <w:rPr/>
-      </w:pPr>
-      <w:r>
-        <w:rPr>
-          <w:rStyle w:val="Strong"/>
-        </w:rPr>
-        <w:t>Table S19</w:t>
-      </w:r>
-    </w:p>
-    <w:p>
-      <w:pPr>
-        <w:pStyle w:val="BodyText"/>
-        <w:bidi w:val="0"/>
-        <w:jc w:val="left"/>
-        <w:rPr/>
-      </w:pPr>
+        <w:t xml:space="preserve">The scripts generalize those used to process the example dataset. Before release they were run from Step 0b to Step 8b on three participants of that dataset and compared with the outputs the dataset's own scripts had produced: warped regions and corridors overlapped at Dice ≥ .93, cleaned streamline counts and lengths agreed within the run-to-run variability of tractography, NODDI maps were identical, and along-tract profiles correlated at </w:t>
+      </w:r>
       <w:r>
         <w:rPr>
           <w:rStyle w:val="Emphasis"/>
         </w:rPr>
-        <w:t>Generalized Scripts Compared With the Example Dataset's Outputs, Three Participants</w:t>
-      </w:r>
-    </w:p>
-    <w:tbl>
-      <w:tblPr>
-        <w:tblW w:w="5000" w:type="pct"/>
-        <w:jc w:val="left"/>
-        <w:tblInd w:w="60" w:type="dxa"/>
-        <w:tblLayout w:type="fixed"/>
-        <w:tblCellMar>
-          <w:top w:w="60" w:type="dxa"/>
-          <w:left w:w="60" w:type="dxa"/>
-          <w:bottom w:w="60" w:type="dxa"/>
-          <w:right w:w="60" w:type="dxa"/>
-        </w:tblCellMar>
-      </w:tblPr>
-      <w:tblGrid>
-        <w:gridCol w:w="3826"/>
-        <w:gridCol w:w="5534"/>
-      </w:tblGrid>
-      <w:tr>
-        <w:trPr>
-          <w:tblHeader w:val="true"/>
-        </w:trPr>
-        <w:tc>
-          <w:tcPr>
-            <w:tcW w:w="3826" w:type="dxa"/>
-            <w:tcBorders>
-              <w:top w:val="single" w:sz="6" w:space="0" w:color="808080"/>
-              <w:bottom w:val="single" w:sz="2" w:space="0" w:color="808080"/>
-            </w:tcBorders>
-            <w:vAlign w:val="center"/>
-          </w:tcPr>
-          <w:p>
-            <w:pPr>
-              <w:pStyle w:val="TableHeading"/>
-              <w:suppressLineNumbers/>
-              <w:bidi w:val="0"/>
-              <w:jc w:val="left"/>
-              <w:rPr/>
-            </w:pPr>
-            <w:r>
-              <w:rPr/>
-              <w:t>Output</w:t>
-            </w:r>
-          </w:p>
-        </w:tc>
-        <w:tc>
-          <w:tcPr>
-            <w:tcW w:w="5534" w:type="dxa"/>
-            <w:tcBorders>
-              <w:top w:val="single" w:sz="6" w:space="0" w:color="808080"/>
-              <w:bottom w:val="single" w:sz="2" w:space="0" w:color="808080"/>
-            </w:tcBorders>
-            <w:vAlign w:val="center"/>
-          </w:tcPr>
-          <w:p>
-            <w:pPr>
-              <w:pStyle w:val="TableHeading"/>
-              <w:suppressLineNumbers/>
-              <w:bidi w:val="0"/>
-              <w:jc w:val="left"/>
-              <w:rPr/>
-            </w:pPr>
-            <w:r>
-              <w:rPr/>
-              <w:t>Agreement</w:t>
-            </w:r>
-          </w:p>
-        </w:tc>
-      </w:tr>
-      <w:tr>
-        <w:trPr/>
-        <w:tc>
-          <w:tcPr>
-            <w:tcW w:w="3826" w:type="dxa"/>
-            <w:tcBorders/>
-            <w:vAlign w:val="center"/>
-          </w:tcPr>
-          <w:p>
-            <w:pPr>
-              <w:pStyle w:val="TableContents"/>
-              <w:widowControl w:val="false"/>
-              <w:suppressLineNumbers/>
-              <w:bidi w:val="0"/>
-              <w:jc w:val="left"/>
-              <w:rPr/>
-            </w:pPr>
-            <w:r>
-              <w:rPr/>
-              <w:t>Warped seed, target and atlas (Dice overlap)</w:t>
-            </w:r>
-          </w:p>
-        </w:tc>
-        <w:tc>
-          <w:tcPr>
-            <w:tcW w:w="5534" w:type="dxa"/>
-            <w:tcBorders/>
-            <w:vAlign w:val="center"/>
-          </w:tcPr>
-          <w:p>
-            <w:pPr>
-              <w:pStyle w:val="TableContents"/>
-              <w:widowControl w:val="false"/>
-              <w:suppressLineNumbers/>
-              <w:bidi w:val="0"/>
-              <w:jc w:val="left"/>
-              <w:rPr/>
-            </w:pPr>
-            <w:r>
-              <w:rPr/>
-              <w:t>.93 to .99</w:t>
-            </w:r>
-          </w:p>
-        </w:tc>
-      </w:tr>
-      <w:tr>
-        <w:trPr/>
-        <w:tc>
-          <w:tcPr>
-            <w:tcW w:w="3826" w:type="dxa"/>
-            <w:tcBorders/>
-            <w:vAlign w:val="center"/>
-          </w:tcPr>
-          <w:p>
-            <w:pPr>
-              <w:pStyle w:val="TableContents"/>
-              <w:widowControl w:val="false"/>
-              <w:suppressLineNumbers/>
-              <w:bidi w:val="0"/>
-              <w:jc w:val="left"/>
-              <w:rPr/>
-            </w:pPr>
-            <w:r>
-              <w:rPr/>
-              <w:t>Corridor (Dice overlap)</w:t>
-            </w:r>
-          </w:p>
-        </w:tc>
-        <w:tc>
-          <w:tcPr>
-            <w:tcW w:w="5534" w:type="dxa"/>
-            <w:tcBorders/>
-            <w:vAlign w:val="center"/>
-          </w:tcPr>
-          <w:p>
-            <w:pPr>
-              <w:pStyle w:val="TableContents"/>
-              <w:widowControl w:val="false"/>
-              <w:suppressLineNumbers/>
-              <w:bidi w:val="0"/>
-              <w:jc w:val="left"/>
-              <w:rPr/>
-            </w:pPr>
-            <w:r>
-              <w:rPr/>
-              <w:t>.98 to .99</w:t>
-            </w:r>
-          </w:p>
-        </w:tc>
-      </w:tr>
-      <w:tr>
-        <w:trPr/>
-        <w:tc>
-          <w:tcPr>
-            <w:tcW w:w="3826" w:type="dxa"/>
-            <w:tcBorders/>
-            <w:vAlign w:val="center"/>
-          </w:tcPr>
-          <w:p>
-            <w:pPr>
-              <w:pStyle w:val="TableContents"/>
-              <w:widowControl w:val="false"/>
-              <w:suppressLineNumbers/>
-              <w:bidi w:val="0"/>
-              <w:jc w:val="left"/>
-              <w:rPr/>
-            </w:pPr>
-            <w:r>
-              <w:rPr/>
-              <w:t>Pilot sweep, 0.06 versus 0.01: streamlines generated to reach 1,000</w:t>
-            </w:r>
-          </w:p>
-        </w:tc>
-        <w:tc>
-          <w:tcPr>
-            <w:tcW w:w="5534" w:type="dxa"/>
-            <w:tcBorders/>
-            <w:vAlign w:val="center"/>
-          </w:tcPr>
-          <w:p>
-            <w:pPr>
-              <w:pStyle w:val="TableContents"/>
-              <w:widowControl w:val="false"/>
-              <w:suppressLineNumbers/>
-              <w:bidi w:val="0"/>
-              <w:jc w:val="left"/>
-              <w:rPr/>
-            </w:pPr>
-            <w:r>
-              <w:rPr/>
-              <w:t>0.39 and 3.0 million versus 0.31 and 0.43 million; Dice between cutoffs .68 and .65 (.66 in the example dataset)</w:t>
-            </w:r>
-          </w:p>
-        </w:tc>
-      </w:tr>
-      <w:tr>
-        <w:trPr/>
-        <w:tc>
-          <w:tcPr>
-            <w:tcW w:w="3826" w:type="dxa"/>
-            <w:tcBorders/>
-            <w:vAlign w:val="center"/>
-          </w:tcPr>
-          <w:p>
-            <w:pPr>
-              <w:pStyle w:val="TableContents"/>
-              <w:widowControl w:val="false"/>
-              <w:suppressLineNumbers/>
-              <w:bidi w:val="0"/>
-              <w:jc w:val="left"/>
-              <w:rPr/>
-            </w:pPr>
-            <w:r>
-              <w:rPr/>
-              <w:t>Tractography at 0.01</w:t>
-            </w:r>
-          </w:p>
-        </w:tc>
-        <w:tc>
-          <w:tcPr>
-            <w:tcW w:w="5534" w:type="dxa"/>
-            <w:tcBorders/>
-            <w:vAlign w:val="center"/>
-          </w:tcPr>
-          <w:p>
-            <w:pPr>
-              <w:pStyle w:val="TableContents"/>
-              <w:widowControl w:val="false"/>
-              <w:suppressLineNumbers/>
-              <w:bidi w:val="0"/>
-              <w:jc w:val="left"/>
-              <w:rPr/>
-            </w:pPr>
-            <w:r>
-              <w:rPr/>
-              <w:t>2,500 streamlines in all three; 0.8 to 1.3 million streamlines generated</w:t>
-            </w:r>
-          </w:p>
-        </w:tc>
-      </w:tr>
-      <w:tr>
-        <w:trPr/>
-        <w:tc>
-          <w:tcPr>
-            <w:tcW w:w="3826" w:type="dxa"/>
-            <w:tcBorders/>
-            <w:vAlign w:val="center"/>
-          </w:tcPr>
-          <w:p>
-            <w:pPr>
-              <w:pStyle w:val="TableContents"/>
-              <w:widowControl w:val="false"/>
-              <w:suppressLineNumbers/>
-              <w:bidi w:val="0"/>
-              <w:jc w:val="left"/>
-              <w:rPr/>
-            </w:pPr>
-            <w:r>
-              <w:rPr/>
-              <w:t>Cleaned bundle, streamline count</w:t>
-            </w:r>
-          </w:p>
-        </w:tc>
-        <w:tc>
-          <w:tcPr>
-            <w:tcW w:w="5534" w:type="dxa"/>
-            <w:tcBorders/>
-            <w:vAlign w:val="center"/>
-          </w:tcPr>
-          <w:p>
-            <w:pPr>
-              <w:pStyle w:val="TableContents"/>
-              <w:widowControl w:val="false"/>
-              <w:suppressLineNumbers/>
-              <w:bidi w:val="0"/>
-              <w:jc w:val="left"/>
-              <w:rPr/>
-            </w:pPr>
-            <w:r>
-              <w:rPr/>
-              <w:t>864, 886, 705 versus 857, 824, 733</w:t>
-            </w:r>
-          </w:p>
-        </w:tc>
-      </w:tr>
-      <w:tr>
-        <w:trPr/>
-        <w:tc>
-          <w:tcPr>
-            <w:tcW w:w="3826" w:type="dxa"/>
-            <w:tcBorders/>
-            <w:vAlign w:val="center"/>
-          </w:tcPr>
-          <w:p>
-            <w:pPr>
-              <w:pStyle w:val="TableContents"/>
-              <w:widowControl w:val="false"/>
-              <w:suppressLineNumbers/>
-              <w:bidi w:val="0"/>
-              <w:jc w:val="left"/>
-              <w:rPr/>
-            </w:pPr>
-            <w:r>
-              <w:rPr/>
-              <w:t>Cleaned bundle, mean length</w:t>
-            </w:r>
-          </w:p>
-        </w:tc>
-        <w:tc>
-          <w:tcPr>
-            <w:tcW w:w="5534" w:type="dxa"/>
-            <w:tcBorders/>
-            <w:vAlign w:val="center"/>
-          </w:tcPr>
-          <w:p>
-            <w:pPr>
-              <w:pStyle w:val="TableContents"/>
-              <w:widowControl w:val="false"/>
-              <w:suppressLineNumbers/>
-              <w:bidi w:val="0"/>
-              <w:jc w:val="left"/>
-              <w:rPr/>
-            </w:pPr>
-            <w:r>
-              <w:rPr/>
-              <w:t>within 0.4 mm</w:t>
-            </w:r>
-          </w:p>
-        </w:tc>
-      </w:tr>
-      <w:tr>
-        <w:trPr/>
-        <w:tc>
-          <w:tcPr>
-            <w:tcW w:w="3826" w:type="dxa"/>
-            <w:tcBorders/>
-            <w:vAlign w:val="center"/>
-          </w:tcPr>
-          <w:p>
-            <w:pPr>
-              <w:pStyle w:val="TableContents"/>
-              <w:widowControl w:val="false"/>
-              <w:suppressLineNumbers/>
-              <w:bidi w:val="0"/>
-              <w:jc w:val="left"/>
-              <w:rPr/>
-            </w:pPr>
-            <w:r>
-              <w:rPr/>
-              <w:t>Quality-control overlays</w:t>
-            </w:r>
-          </w:p>
-        </w:tc>
-        <w:tc>
-          <w:tcPr>
-            <w:tcW w:w="5534" w:type="dxa"/>
-            <w:tcBorders/>
-            <w:vAlign w:val="center"/>
-          </w:tcPr>
-          <w:p>
-            <w:pPr>
-              <w:pStyle w:val="TableContents"/>
-              <w:widowControl w:val="false"/>
-              <w:suppressLineNumbers/>
-              <w:bidi w:val="0"/>
-              <w:jc w:val="left"/>
-              <w:rPr/>
-            </w:pPr>
-            <w:r>
-              <w:rPr/>
-              <w:t>No flags; bundles follow the expected arc</w:t>
-            </w:r>
-          </w:p>
-        </w:tc>
-      </w:tr>
-      <w:tr>
-        <w:trPr/>
-        <w:tc>
-          <w:tcPr>
-            <w:tcW w:w="3826" w:type="dxa"/>
-            <w:tcBorders/>
-            <w:vAlign w:val="center"/>
-          </w:tcPr>
-          <w:p>
-            <w:pPr>
-              <w:pStyle w:val="TableContents"/>
-              <w:widowControl w:val="false"/>
-              <w:suppressLineNumbers/>
-              <w:bidi w:val="0"/>
-              <w:jc w:val="left"/>
-              <w:rPr/>
-            </w:pPr>
-            <w:r>
-              <w:rPr/>
-              <w:t>NODDI maps</w:t>
-            </w:r>
-          </w:p>
-        </w:tc>
-        <w:tc>
-          <w:tcPr>
-            <w:tcW w:w="5534" w:type="dxa"/>
-            <w:tcBorders/>
-            <w:vAlign w:val="center"/>
-          </w:tcPr>
-          <w:p>
-            <w:pPr>
-              <w:pStyle w:val="TableContents"/>
-              <w:widowControl w:val="false"/>
-              <w:suppressLineNumbers/>
-              <w:bidi w:val="0"/>
-              <w:jc w:val="left"/>
-              <w:rPr/>
-            </w:pPr>
-            <w:r>
-              <w:rPr/>
-              <w:t>Identical, voxel for voxel</w:t>
-            </w:r>
-          </w:p>
-        </w:tc>
-      </w:tr>
-      <w:tr>
-        <w:trPr/>
-        <w:tc>
-          <w:tcPr>
-            <w:tcW w:w="3826" w:type="dxa"/>
-            <w:tcBorders>
-              <w:bottom w:val="single" w:sz="6" w:space="0" w:color="808080"/>
-            </w:tcBorders>
-            <w:vAlign w:val="center"/>
-          </w:tcPr>
-          <w:p>
-            <w:pPr>
-              <w:pStyle w:val="TableContents"/>
-              <w:widowControl w:val="false"/>
-              <w:suppressLineNumbers/>
-              <w:bidi w:val="0"/>
-              <w:jc w:val="left"/>
-              <w:rPr/>
-            </w:pPr>
-            <w:r>
-              <w:rPr/>
-              <w:t>Along-tract profiles (correlation across the 100 nodes)</w:t>
-            </w:r>
-          </w:p>
-        </w:tc>
-        <w:tc>
-          <w:tcPr>
-            <w:tcW w:w="5534" w:type="dxa"/>
-            <w:tcBorders>
-              <w:bottom w:val="single" w:sz="6" w:space="0" w:color="808080"/>
-            </w:tcBorders>
-            <w:vAlign w:val="center"/>
-          </w:tcPr>
-          <w:p>
-            <w:pPr>
-              <w:pStyle w:val="TableContents"/>
-              <w:widowControl w:val="false"/>
-              <w:suppressLineNumbers/>
-              <w:bidi w:val="0"/>
-              <w:jc w:val="left"/>
-              <w:rPr/>
-            </w:pPr>
-            <w:r>
-              <w:rPr/>
-              <w:t>FA .98; NDI .99 to 1.00; ODI .99; FWF .94 to 1.00</w:t>
-            </w:r>
-          </w:p>
-        </w:tc>
-      </w:tr>
-    </w:tbl>
+        <w:t>r</w:t>
+      </w:r>
+      <w:r>
+        <w:rPr/>
+        <w:t xml:space="preserve"> ≥ .94 across nodes. The group-level scripts reproduce that dataset's whole-tract, quartile and node-wise results. The run used MRtrix3 3.0.7, FSL 6.0.5.1, ANTs 2.3.5, Python 3.8, DIPY 1.8.0, pyAFQ 1.3.5, AMICO 2.1.1 and R 4 on Linux.</w:t>
+      </w:r>
+    </w:p>
     <w:p>
       <w:pPr>
         <w:pStyle w:val="BodyText"/>
@@ -24680,465 +24070,10 @@
         <w:rPr/>
       </w:pPr>
       <w:r>
-        <w:rPr>
-          <w:rStyle w:val="Emphasis"/>
-        </w:rPr>
-        <w:t>Note.</w:t>
-      </w:r>
-      <w:r>
-        <w:rPr/>
-        <w:t xml:space="preserve"> Tractography is stochastic, so streamline counts and profiles are not expected to match exactly. NODDI = neurite orientation dispersion and density imaging; FA = fractional anisotropy; NDI = neurite density index; ODI = orientation dispersion index; FWF = free-water fraction.</w:t>
-      </w:r>
-    </w:p>
-    <w:p>
-      <w:pPr>
-        <w:pStyle w:val="BodyText"/>
-        <w:bidi w:val="0"/>
-        <w:jc w:val="left"/>
-        <w:rPr/>
-      </w:pPr>
-      <w:r>
-        <w:rPr>
-          <w:rStyle w:val="Strong"/>
-        </w:rPr>
-        <w:t>Table S20</w:t>
-      </w:r>
-    </w:p>
-    <w:p>
-      <w:pPr>
-        <w:pStyle w:val="BodyText"/>
-        <w:bidi w:val="0"/>
-        <w:jc w:val="left"/>
-        <w:rPr/>
-      </w:pPr>
-      <w:r>
-        <w:rPr>
-          <w:rStyle w:val="Emphasis"/>
-        </w:rPr>
-        <w:t>Checks of the Group-Level Scripts</w:t>
-      </w:r>
-    </w:p>
-    <w:tbl>
-      <w:tblPr>
-        <w:tblW w:w="5000" w:type="pct"/>
-        <w:jc w:val="left"/>
-        <w:tblInd w:w="60" w:type="dxa"/>
-        <w:tblLayout w:type="fixed"/>
-        <w:tblCellMar>
-          <w:top w:w="60" w:type="dxa"/>
-          <w:left w:w="60" w:type="dxa"/>
-          <w:bottom w:w="60" w:type="dxa"/>
-          <w:right w:w="60" w:type="dxa"/>
-        </w:tblCellMar>
-      </w:tblPr>
-      <w:tblGrid>
-        <w:gridCol w:w="3196"/>
-        <w:gridCol w:w="2479"/>
-        <w:gridCol w:w="3685"/>
-      </w:tblGrid>
-      <w:tr>
-        <w:trPr>
-          <w:tblHeader w:val="true"/>
-        </w:trPr>
-        <w:tc>
-          <w:tcPr>
-            <w:tcW w:w="3196" w:type="dxa"/>
-            <w:tcBorders>
-              <w:top w:val="single" w:sz="6" w:space="0" w:color="808080"/>
-              <w:bottom w:val="single" w:sz="2" w:space="0" w:color="808080"/>
-            </w:tcBorders>
-            <w:vAlign w:val="center"/>
-          </w:tcPr>
-          <w:p>
-            <w:pPr>
-              <w:pStyle w:val="TableHeading"/>
-              <w:suppressLineNumbers/>
-              <w:bidi w:val="0"/>
-              <w:jc w:val="left"/>
-              <w:rPr/>
-            </w:pPr>
-            <w:r>
-              <w:rPr/>
-              <w:t>Script</w:t>
-            </w:r>
-          </w:p>
-        </w:tc>
-        <w:tc>
-          <w:tcPr>
-            <w:tcW w:w="2479" w:type="dxa"/>
-            <w:tcBorders>
-              <w:top w:val="single" w:sz="6" w:space="0" w:color="808080"/>
-              <w:bottom w:val="single" w:sz="2" w:space="0" w:color="808080"/>
-            </w:tcBorders>
-            <w:vAlign w:val="center"/>
-          </w:tcPr>
-          <w:p>
-            <w:pPr>
-              <w:pStyle w:val="TableHeading"/>
-              <w:suppressLineNumbers/>
-              <w:bidi w:val="0"/>
-              <w:jc w:val="left"/>
-              <w:rPr/>
-            </w:pPr>
-            <w:r>
-              <w:rPr/>
-              <w:t>Check</w:t>
-            </w:r>
-          </w:p>
-        </w:tc>
-        <w:tc>
-          <w:tcPr>
-            <w:tcW w:w="3685" w:type="dxa"/>
-            <w:tcBorders>
-              <w:top w:val="single" w:sz="6" w:space="0" w:color="808080"/>
-              <w:bottom w:val="single" w:sz="2" w:space="0" w:color="808080"/>
-            </w:tcBorders>
-            <w:vAlign w:val="center"/>
-          </w:tcPr>
-          <w:p>
-            <w:pPr>
-              <w:pStyle w:val="TableHeading"/>
-              <w:suppressLineNumbers/>
-              <w:bidi w:val="0"/>
-              <w:jc w:val="left"/>
-              <w:rPr/>
-            </w:pPr>
-            <w:r>
-              <w:rPr/>
-              <w:t>Result</w:t>
-            </w:r>
-          </w:p>
-        </w:tc>
-      </w:tr>
-      <w:tr>
-        <w:trPr/>
-        <w:tc>
-          <w:tcPr>
-            <w:tcW w:w="3196" w:type="dxa"/>
-            <w:tcBorders/>
-            <w:vAlign w:val="center"/>
-          </w:tcPr>
-          <w:p>
-            <w:pPr>
-              <w:pStyle w:val="TableContents"/>
-              <w:widowControl w:val="false"/>
-              <w:suppressLineNumbers/>
-              <w:bidi w:val="0"/>
-              <w:jc w:val="left"/>
-              <w:rPr/>
-            </w:pPr>
-            <w:r>
-              <w:rPr>
-                <w:rStyle w:val="SourceText"/>
-              </w:rPr>
-              <w:t>09a_tract_models.py</w:t>
-            </w:r>
-          </w:p>
-        </w:tc>
-        <w:tc>
-          <w:tcPr>
-            <w:tcW w:w="2479" w:type="dxa"/>
-            <w:tcBorders/>
-            <w:vAlign w:val="center"/>
-          </w:tcPr>
-          <w:p>
-            <w:pPr>
-              <w:pStyle w:val="TableContents"/>
-              <w:widowControl w:val="false"/>
-              <w:suppressLineNumbers/>
-              <w:bidi w:val="0"/>
-              <w:jc w:val="left"/>
-              <w:rPr/>
-            </w:pPr>
-            <w:r>
-              <w:rPr/>
-              <w:t>Run on the analysis files of the example dataset</w:t>
-            </w:r>
-          </w:p>
-        </w:tc>
-        <w:tc>
-          <w:tcPr>
-            <w:tcW w:w="3685" w:type="dxa"/>
-            <w:tcBorders/>
-            <w:vAlign w:val="center"/>
-          </w:tcPr>
-          <w:p>
-            <w:pPr>
-              <w:pStyle w:val="TableContents"/>
-              <w:widowControl w:val="false"/>
-              <w:suppressLineNumbers/>
-              <w:bidi w:val="0"/>
-              <w:jc w:val="left"/>
-              <w:rPr/>
-            </w:pPr>
-            <w:r>
-              <w:rPr/>
-              <w:t>Reproduces the reported whole-tract and quartile estimates and interaction tests to three decimals</w:t>
-            </w:r>
-          </w:p>
-        </w:tc>
-      </w:tr>
-      <w:tr>
-        <w:trPr/>
-        <w:tc>
-          <w:tcPr>
-            <w:tcW w:w="3196" w:type="dxa"/>
-            <w:tcBorders/>
-            <w:vAlign w:val="center"/>
-          </w:tcPr>
-          <w:p>
-            <w:pPr>
-              <w:pStyle w:val="TableContents"/>
-              <w:widowControl w:val="false"/>
-              <w:suppressLineNumbers/>
-              <w:bidi w:val="0"/>
-              <w:jc w:val="left"/>
-              <w:rPr/>
-            </w:pPr>
-            <w:r>
-              <w:rPr>
-                <w:rStyle w:val="SourceText"/>
-              </w:rPr>
-              <w:t>09b_nodewise_permutation.R</w:t>
-            </w:r>
-          </w:p>
-        </w:tc>
-        <w:tc>
-          <w:tcPr>
-            <w:tcW w:w="2479" w:type="dxa"/>
-            <w:tcBorders/>
-            <w:vAlign w:val="center"/>
-          </w:tcPr>
-          <w:p>
-            <w:pPr>
-              <w:pStyle w:val="TableContents"/>
-              <w:widowControl w:val="false"/>
-              <w:suppressLineNumbers/>
-              <w:bidi w:val="0"/>
-              <w:jc w:val="left"/>
-              <w:rPr/>
-            </w:pPr>
-            <w:r>
-              <w:rPr/>
-              <w:t>Run on an analysis file of the example dataset</w:t>
-            </w:r>
-          </w:p>
-        </w:tc>
-        <w:tc>
-          <w:tcPr>
-            <w:tcW w:w="3685" w:type="dxa"/>
-            <w:tcBorders/>
-            <w:vAlign w:val="center"/>
-          </w:tcPr>
-          <w:p>
-            <w:pPr>
-              <w:pStyle w:val="TableContents"/>
-              <w:widowControl w:val="false"/>
-              <w:suppressLineNumbers/>
-              <w:bidi w:val="0"/>
-              <w:jc w:val="left"/>
-              <w:rPr/>
-            </w:pPr>
-            <w:r>
-              <w:rPr/>
-              <w:t xml:space="preserve">Node-wise </w:t>
-            </w:r>
-            <w:r>
-              <w:rPr>
-                <w:rStyle w:val="Emphasis"/>
-              </w:rPr>
-              <w:t>t</w:t>
-            </w:r>
-            <w:r>
-              <w:rPr/>
-              <w:t xml:space="preserve"> values identical to the stored results; same clusters; identical output with one, three and four cores</w:t>
-            </w:r>
-          </w:p>
-        </w:tc>
-      </w:tr>
-      <w:tr>
-        <w:trPr/>
-        <w:tc>
-          <w:tcPr>
-            <w:tcW w:w="3196" w:type="dxa"/>
-            <w:tcBorders/>
-            <w:vAlign w:val="center"/>
-          </w:tcPr>
-          <w:p>
-            <w:pPr>
-              <w:pStyle w:val="TableContents"/>
-              <w:widowControl w:val="false"/>
-              <w:suppressLineNumbers/>
-              <w:bidi w:val="0"/>
-              <w:jc w:val="left"/>
-              <w:rPr/>
-            </w:pPr>
-            <w:r>
-              <w:rPr>
-                <w:rStyle w:val="SourceText"/>
-              </w:rPr>
-              <w:t>09c_stack_for_explorer.py</w:t>
-            </w:r>
-          </w:p>
-        </w:tc>
-        <w:tc>
-          <w:tcPr>
-            <w:tcW w:w="2479" w:type="dxa"/>
-            <w:tcBorders/>
-            <w:vAlign w:val="center"/>
-          </w:tcPr>
-          <w:p>
-            <w:pPr>
-              <w:pStyle w:val="TableContents"/>
-              <w:widowControl w:val="false"/>
-              <w:suppressLineNumbers/>
-              <w:bidi w:val="0"/>
-              <w:jc w:val="left"/>
-              <w:rPr/>
-            </w:pPr>
-            <w:r>
-              <w:rPr/>
-              <w:t xml:space="preserve">Run on the outputs of </w:t>
-            </w:r>
-            <w:r>
-              <w:rPr>
-                <w:rStyle w:val="SourceText"/>
-              </w:rPr>
-              <w:t>09b</w:t>
-            </w:r>
-          </w:p>
-        </w:tc>
-        <w:tc>
-          <w:tcPr>
-            <w:tcW w:w="3685" w:type="dxa"/>
-            <w:tcBorders/>
-            <w:vAlign w:val="center"/>
-          </w:tcPr>
-          <w:p>
-            <w:pPr>
-              <w:pStyle w:val="TableContents"/>
-              <w:widowControl w:val="false"/>
-              <w:suppressLineNumbers/>
-              <w:bidi w:val="0"/>
-              <w:jc w:val="left"/>
-              <w:rPr/>
-            </w:pPr>
-            <w:r>
-              <w:rPr/>
-              <w:t>Explorer file written and loaded</w:t>
-            </w:r>
-          </w:p>
-        </w:tc>
-      </w:tr>
-      <w:tr>
-        <w:trPr/>
-        <w:tc>
-          <w:tcPr>
-            <w:tcW w:w="3196" w:type="dxa"/>
-            <w:tcBorders>
-              <w:bottom w:val="single" w:sz="6" w:space="0" w:color="808080"/>
-            </w:tcBorders>
-            <w:vAlign w:val="center"/>
-          </w:tcPr>
-          <w:p>
-            <w:pPr>
-              <w:pStyle w:val="TableContents"/>
-              <w:widowControl w:val="false"/>
-              <w:suppressLineNumbers/>
-              <w:bidi w:val="0"/>
-              <w:jc w:val="left"/>
-              <w:rPr/>
-            </w:pPr>
-            <w:r>
-              <w:rPr>
-                <w:rStyle w:val="SourceText"/>
-              </w:rPr>
-              <w:t>08b_build_analysis_csv.py</w:t>
-            </w:r>
-          </w:p>
-        </w:tc>
-        <w:tc>
-          <w:tcPr>
-            <w:tcW w:w="2479" w:type="dxa"/>
-            <w:tcBorders>
-              <w:bottom w:val="single" w:sz="6" w:space="0" w:color="808080"/>
-            </w:tcBorders>
-            <w:vAlign w:val="center"/>
-          </w:tcPr>
-          <w:p>
-            <w:pPr>
-              <w:pStyle w:val="TableContents"/>
-              <w:widowControl w:val="false"/>
-              <w:suppressLineNumbers/>
-              <w:bidi w:val="0"/>
-              <w:jc w:val="left"/>
-              <w:rPr/>
-            </w:pPr>
-            <w:r>
-              <w:rPr/>
-              <w:t>Run in the three-participant test</w:t>
-            </w:r>
-          </w:p>
-        </w:tc>
-        <w:tc>
-          <w:tcPr>
-            <w:tcW w:w="3685" w:type="dxa"/>
-            <w:tcBorders>
-              <w:bottom w:val="single" w:sz="6" w:space="0" w:color="808080"/>
-            </w:tcBorders>
-            <w:vAlign w:val="center"/>
-          </w:tcPr>
-          <w:p>
-            <w:pPr>
-              <w:pStyle w:val="TableContents"/>
-              <w:widowControl w:val="false"/>
-              <w:suppressLineNumbers/>
-              <w:bidi w:val="0"/>
-              <w:jc w:val="left"/>
-              <w:rPr/>
-            </w:pPr>
-            <w:r>
-              <w:rPr/>
-              <w:t>Analysis files written for all four metrics</w:t>
-            </w:r>
-          </w:p>
-        </w:tc>
-      </w:tr>
-    </w:tbl>
-    <w:p>
-      <w:pPr>
-        <w:pStyle w:val="BodyText"/>
-        <w:bidi w:val="0"/>
-        <w:jc w:val="left"/>
-        <w:rPr/>
-      </w:pPr>
-      <w:r>
-        <w:rPr/>
-        <w:t xml:space="preserve">Two defects surfaced during validation and are fixed in the distributed scripts: on bash 5.0 to 5.2 the shell steps stalled at the end of their first participant loop, and the mean streamline length was read from the wrong line of the </w:t>
-      </w:r>
-      <w:r>
-        <w:rPr>
-          <w:rStyle w:val="SourceText"/>
-        </w:rPr>
-        <w:t>tckstats</w:t>
-      </w:r>
-      <w:r>
-        <w:rPr/>
-        <w:t xml:space="preserve"> output. The scripts were also reviewed independently; the defects found are recorded in the repository history.</w:t>
-      </w:r>
-    </w:p>
-    <w:p>
-      <w:pPr>
-        <w:pStyle w:val="BodyText"/>
-        <w:bidi w:val="0"/>
-        <w:jc w:val="left"/>
-        <w:rPr/>
-      </w:pPr>
-      <w:r>
-        <w:rPr/>
-        <w:t xml:space="preserve">The example dataset's own per-step scripts, with its cluster paths and participant list, are in the </w:t>
-      </w:r>
-      <w:hyperlink r:id="rId35">
+        <w:rPr/>
+        <w:t xml:space="preserve">The scripts from which these were generalized are in the </w:t>
+      </w:r>
+      <w:hyperlink r:id="rId34">
         <w:r>
           <w:rPr>
             <w:rStyle w:val="Hyperlink"/>
@@ -25148,7 +24083,7 @@
       </w:hyperlink>
       <w:r>
         <w:rPr/>
-        <w:t>, Steps 20 to 30 of the ReadMe.</w:t>
+        <w:t>.</w:t>
       </w:r>
     </w:p>
     <w:p>
@@ -25185,7 +24120,7 @@
         <w:rPr/>
         <w:t xml:space="preserve">The whole tutorial is also available as a single document, with tables and figures numbered S1, S2 and so on and the scripts in an appendix: </w:t>
       </w:r>
-      <w:hyperlink r:id="rId36">
+      <w:hyperlink r:id="rId35">
         <w:r>
           <w:rPr>
             <w:rStyle w:val="Hyperlink"/>
@@ -25197,7 +24132,7 @@
         <w:rPr/>
         <w:t xml:space="preserve"> and </w:t>
       </w:r>
-      <w:hyperlink r:id="rId37">
+      <w:hyperlink r:id="rId36">
         <w:r>
           <w:rPr>
             <w:rStyle w:val="Hyperlink"/>
@@ -26452,7 +25387,7 @@
         <w:rPr/>
         <w:t xml:space="preserve">(1), 26–41. </w:t>
       </w:r>
-      <w:hyperlink r:id="rId38">
+      <w:hyperlink r:id="rId37">
         <w:r>
           <w:rPr>
             <w:rStyle w:val="Hyperlink"/>
@@ -26482,7 +25417,7 @@
         <w:rPr/>
         <w:t xml:space="preserve">, 32–44. </w:t>
       </w:r>
-      <w:hyperlink r:id="rId39">
+      <w:hyperlink r:id="rId38">
         <w:r>
           <w:rPr>
             <w:rStyle w:val="Hyperlink"/>
@@ -26534,7 +25469,7 @@
         <w:rPr/>
         <w:t xml:space="preserve">(7), 1256–1265. </w:t>
       </w:r>
-      <w:hyperlink r:id="rId40">
+      <w:hyperlink r:id="rId39">
         <w:r>
           <w:rPr>
             <w:rStyle w:val="Hyperlink"/>
@@ -26564,7 +25499,7 @@
         <w:rPr/>
         <w:t xml:space="preserve">(4), 292–298. </w:t>
       </w:r>
-      <w:hyperlink r:id="rId41">
+      <w:hyperlink r:id="rId40">
         <w:r>
           <w:rPr>
             <w:rStyle w:val="Hyperlink"/>
@@ -26594,7 +25529,7 @@
         <w:rPr/>
         <w:t xml:space="preserve">, 175. </w:t>
       </w:r>
-      <w:hyperlink r:id="rId42">
+      <w:hyperlink r:id="rId41">
         <w:r>
           <w:rPr>
             <w:rStyle w:val="Hyperlink"/>
@@ -26624,7 +25559,7 @@
         <w:rPr/>
         <w:t xml:space="preserve">, 8. </w:t>
       </w:r>
-      <w:hyperlink r:id="rId43">
+      <w:hyperlink r:id="rId42">
         <w:r>
           <w:rPr>
             <w:rStyle w:val="Hyperlink"/>
@@ -26654,7 +25589,7 @@
         <w:rPr/>
         <w:t xml:space="preserve">, 119474. </w:t>
       </w:r>
-      <w:hyperlink r:id="rId44">
+      <w:hyperlink r:id="rId43">
         <w:r>
           <w:rPr>
             <w:rStyle w:val="Hyperlink"/>
@@ -26684,7 +25619,7 @@
         <w:rPr/>
         <w:t xml:space="preserve">(2), 782–790. </w:t>
       </w:r>
-      <w:hyperlink r:id="rId45">
+      <w:hyperlink r:id="rId44">
         <w:r>
           <w:rPr>
             <w:rStyle w:val="Hyperlink"/>
@@ -26714,7 +25649,7 @@
         <w:rPr/>
         <w:t xml:space="preserve">, 411–426. </w:t>
       </w:r>
-      <w:hyperlink r:id="rId46">
+      <w:hyperlink r:id="rId45">
         <w:r>
           <w:rPr>
             <w:rStyle w:val="Hyperlink"/>
@@ -26744,7 +25679,7 @@
         <w:rPr/>
         <w:t xml:space="preserve">(1). </w:t>
       </w:r>
-      <w:hyperlink r:id="rId47">
+      <w:hyperlink r:id="rId46">
         <w:r>
           <w:rPr>
             <w:rStyle w:val="Hyperlink"/>
@@ -26774,7 +25709,7 @@
         <w:rPr/>
         <w:t xml:space="preserve">(2–3), 155–171. </w:t>
       </w:r>
-      <w:hyperlink r:id="rId48">
+      <w:hyperlink r:id="rId47">
         <w:r>
           <w:rPr>
             <w:rStyle w:val="Hyperlink"/>
@@ -26804,7 +25739,7 @@
         <w:rPr/>
         <w:t xml:space="preserve">, 580–589. </w:t>
       </w:r>
-      <w:hyperlink r:id="rId49">
+      <w:hyperlink r:id="rId48">
         <w:r>
           <w:rPr>
             <w:rStyle w:val="Hyperlink"/>
@@ -26834,7 +25769,7 @@
         <w:rPr/>
         <w:t xml:space="preserve">, 118749. </w:t>
       </w:r>
-      <w:hyperlink r:id="rId50">
+      <w:hyperlink r:id="rId49">
         <w:r>
           <w:rPr>
             <w:rStyle w:val="Hyperlink"/>
@@ -26864,7 +25799,7 @@
         <w:rPr/>
         <w:t xml:space="preserve">, 180063. </w:t>
       </w:r>
-      <w:hyperlink r:id="rId51">
+      <w:hyperlink r:id="rId50">
         <w:r>
           <w:rPr>
             <w:rStyle w:val="Hyperlink"/>
@@ -26938,7 +25873,7 @@
         <w:rPr/>
         <w:t xml:space="preserve">, 116137. </w:t>
       </w:r>
-      <w:hyperlink r:id="rId52">
+      <w:hyperlink r:id="rId51">
         <w:r>
           <w:rPr>
             <w:rStyle w:val="Hyperlink"/>
@@ -26968,7 +25903,7 @@
         <w:rPr/>
         <w:t xml:space="preserve">, 1155–1167. </w:t>
       </w:r>
-      <w:hyperlink r:id="rId53">
+      <w:hyperlink r:id="rId52">
         <w:r>
           <w:rPr>
             <w:rStyle w:val="Hyperlink"/>
@@ -26998,7 +25933,7 @@
         <w:rPr/>
         <w:t xml:space="preserve">(5), 1165–1177. </w:t>
       </w:r>
-      <w:hyperlink r:id="rId54">
+      <w:hyperlink r:id="rId53">
         <w:r>
           <w:rPr>
             <w:rStyle w:val="Hyperlink"/>
@@ -27028,7 +25963,7 @@
         <w:rPr/>
         <w:t xml:space="preserve">, 318–331. </w:t>
       </w:r>
-      <w:hyperlink r:id="rId55">
+      <w:hyperlink r:id="rId54">
         <w:r>
           <w:rPr>
             <w:rStyle w:val="Hyperlink"/>
@@ -27058,7 +25993,7 @@
         <w:rPr/>
         <w:t xml:space="preserve">, 239–253. </w:t>
       </w:r>
-      <w:hyperlink r:id="rId56">
+      <w:hyperlink r:id="rId55">
         <w:r>
           <w:rPr>
             <w:rStyle w:val="Hyperlink"/>
@@ -27088,7 +26023,7 @@
         <w:rPr/>
         <w:t xml:space="preserve">, 381–397. </w:t>
       </w:r>
-      <w:hyperlink r:id="rId57">
+      <w:hyperlink r:id="rId56">
         <w:r>
           <w:rPr>
             <w:rStyle w:val="Hyperlink"/>
@@ -27118,7 +26053,7 @@
         <w:rPr/>
         <w:t xml:space="preserve">(11), e49790. </w:t>
       </w:r>
-      <w:hyperlink r:id="rId58">
+      <w:hyperlink r:id="rId57">
         <w:r>
           <w:rPr>
             <w:rStyle w:val="Hyperlink"/>
@@ -27148,7 +26083,7 @@
         <w:rPr/>
         <w:t xml:space="preserve">(4), 1000–1016. </w:t>
       </w:r>
-      <w:hyperlink r:id="rId59">
+      <w:hyperlink r:id="rId58">
         <w:r>
           <w:rPr>
             <w:rStyle w:val="Hyperlink"/>

</xml_diff>

<commit_message>
Node-wise script: fail clearly when there are too few participants
A node whose model cannot be fitted returns an NA p value, and the cluster
search then stopped with 'missing value where TRUE/FALSE needed'. Such a node
is now treated as not significant, and the script declines up front when the
sample is too small for the covariate set, naming both counts. Verified to
reproduce the example dataset's node-wise t values to machine precision and the
same clusters.
</commit_message>
<xml_diff>
--- a/static/supplement/MesoConnect_Supplementary_Methods.docx
+++ b/static/supplement/MesoConnect_Supplementary_Methods.docx
@@ -44716,7 +44716,19 @@
       </w:pPr>
       <w:r>
         <w:rPr/>
-        <w:t>if (n_subj &lt; 5) {</w:t>
+        <w:t>min_subj &lt;- length(covariate_cols) + 3   # outcome, node, covariates, plus 2 residual df</w:t>
+      </w:r>
+    </w:p>
+    <w:p>
+      <w:pPr>
+        <w:pStyle w:val="PreformattedTextcode"/>
+        <w:bidi w:val="0"/>
+        <w:jc w:val="left"/>
+        <w:rPr/>
+      </w:pPr>
+      <w:r>
+        <w:rPr/>
+        <w:t>if (n_subj &lt; max(5, min_subj)) {</w:t>
       </w:r>
     </w:p>
     <w:p>
@@ -44732,7 +44744,23 @@
       </w:r>
       <w:r>
         <w:rPr/>
-        <w:t>message("Fewer than 5 complete participants (", n_subj, ") — skipping ", base)</w:t>
+        <w:t>message("Only ", n_subj, " complete participants for ", length(covariate_cols),</w:t>
+      </w:r>
+    </w:p>
+    <w:p>
+      <w:pPr>
+        <w:pStyle w:val="PreformattedTextcode"/>
+        <w:bidi w:val="0"/>
+        <w:jc w:val="left"/>
+        <w:rPr/>
+      </w:pPr>
+      <w:r>
+        <w:rPr/>
+        <w:t xml:space="preserve">          </w:t>
+      </w:r>
+      <w:r>
+        <w:rPr/>
+        <w:t>" covariates; at least ", max(5, min_subj), " are needed - skipping ", base)</w:t>
       </w:r>
     </w:p>
     <w:p>
@@ -45384,6 +45412,22 @@
       <w:r>
         <w:rPr/>
         <w:t>clusters_from_sig &lt;- function(sig, nodes_numeric) {</w:t>
+      </w:r>
+    </w:p>
+    <w:p>
+      <w:pPr>
+        <w:pStyle w:val="PreformattedTextcode"/>
+        <w:bidi w:val="0"/>
+        <w:jc w:val="left"/>
+        <w:rPr/>
+      </w:pPr>
+      <w:r>
+        <w:rPr/>
+        <w:t xml:space="preserve">  </w:t>
+      </w:r>
+      <w:r>
+        <w:rPr/>
+        <w:t>sig[is.na(sig)] &lt;- FALSE          # a node whose model could not be fitted is not significant</w:t>
       </w:r>
     </w:p>
     <w:p>

</xml_diff>

<commit_message>
Point the preprocessing links at the renamed site
The preprocessing tutorial moved to Diffusion-MRI-Preprocessing and its old
Pages URL now returns 404, so the navbar, footer, landing page, intro and
README all pointed at a dead link. The intro and the software page now link to
its output contract and to its FOD pages, which it covers as Steps 11 and 12;
the claim that it did not cover FOD estimation is no longer true. The FOD
section keeps the commands for readers arriving without a normalized FOD image,
and notes that the group-average response ties a cohort together. CSS variables
inherited from the old site's config renamed.
</commit_message>
<xml_diff>
--- a/static/supplement/MesoConnect_Supplementary_Methods.docx
+++ b/static/supplement/MesoConnect_Supplementary_Methods.docx
@@ -171,12 +171,24 @@
           <w:rPr>
             <w:rStyle w:val="Hyperlink"/>
           </w:rPr>
-          <w:t>TUBRIC DTI tutorial</w:t>
+          <w:t>Diffusion MRI Preprocessing tutorial</w:t>
         </w:r>
       </w:hyperlink>
       <w:r>
         <w:rPr/>
-        <w:t>; QSIPrep produces equivalent inputs. Estimation of fibre orientation distributions, which that pipeline does not include, is described on the software page.</w:t>
+        <w:t xml:space="preserve">, which ends with the exact set of files this workflow expects; its </w:t>
+      </w:r>
+      <w:hyperlink r:id="rId3">
+        <w:r>
+          <w:rPr>
+            <w:rStyle w:val="Hyperlink"/>
+          </w:rPr>
+          <w:t>output contract</w:t>
+        </w:r>
+      </w:hyperlink>
+      <w:r>
+        <w:rPr/>
+        <w:t xml:space="preserve"> lists them and names the step that produces each. QSIPrep produces equivalent inputs.</w:t>
       </w:r>
     </w:p>
     <w:p>
@@ -3736,7 +3748,7 @@
               <w:jc w:val="left"/>
               <w:rPr/>
             </w:pPr>
-            <w:hyperlink r:id="rId3">
+            <w:hyperlink r:id="rId4">
               <w:r>
                 <w:rPr>
                   <w:rStyle w:val="Hyperlink"/>
@@ -3806,7 +3818,7 @@
               <w:jc w:val="left"/>
               <w:rPr/>
             </w:pPr>
-            <w:hyperlink r:id="rId4">
+            <w:hyperlink r:id="rId5">
               <w:r>
                 <w:rPr>
                   <w:rStyle w:val="Hyperlink"/>
@@ -3876,7 +3888,7 @@
               <w:jc w:val="left"/>
               <w:rPr/>
             </w:pPr>
-            <w:hyperlink r:id="rId5">
+            <w:hyperlink r:id="rId6">
               <w:r>
                 <w:rPr>
                   <w:rStyle w:val="Hyperlink"/>
@@ -3946,7 +3958,7 @@
               <w:jc w:val="left"/>
               <w:rPr/>
             </w:pPr>
-            <w:hyperlink r:id="rId6">
+            <w:hyperlink r:id="rId7">
               <w:r>
                 <w:rPr>
                   <w:rStyle w:val="Hyperlink"/>
@@ -4016,7 +4028,7 @@
               <w:jc w:val="left"/>
               <w:rPr/>
             </w:pPr>
-            <w:hyperlink r:id="rId7">
+            <w:hyperlink r:id="rId8">
               <w:r>
                 <w:rPr>
                   <w:rStyle w:val="Hyperlink"/>
@@ -4086,7 +4098,7 @@
               <w:jc w:val="left"/>
               <w:rPr/>
             </w:pPr>
-            <w:hyperlink r:id="rId8">
+            <w:hyperlink r:id="rId9">
               <w:r>
                 <w:rPr>
                   <w:rStyle w:val="Hyperlink"/>
@@ -4156,7 +4168,7 @@
               <w:jc w:val="left"/>
               <w:rPr/>
             </w:pPr>
-            <w:hyperlink r:id="rId9">
+            <w:hyperlink r:id="rId10">
               <w:r>
                 <w:rPr>
                   <w:rStyle w:val="Hyperlink"/>
@@ -4226,7 +4238,7 @@
               <w:jc w:val="left"/>
               <w:rPr/>
             </w:pPr>
-            <w:hyperlink r:id="rId10">
+            <w:hyperlink r:id="rId11">
               <w:r>
                 <w:rPr>
                   <w:rStyle w:val="Hyperlink"/>
@@ -4296,7 +4308,7 @@
               <w:jc w:val="left"/>
               <w:rPr/>
             </w:pPr>
-            <w:hyperlink r:id="rId11">
+            <w:hyperlink r:id="rId12">
               <w:r>
                 <w:rPr>
                   <w:rStyle w:val="Hyperlink"/>
@@ -4368,7 +4380,7 @@
               <w:jc w:val="left"/>
               <w:rPr/>
             </w:pPr>
-            <w:hyperlink r:id="rId12">
+            <w:hyperlink r:id="rId13">
               <w:r>
                 <w:rPr>
                   <w:rStyle w:val="Hyperlink"/>
@@ -7902,7 +7914,7 @@
                     </pic:cNvPicPr>
                   </pic:nvPicPr>
                   <pic:blipFill>
-                    <a:blip r:embed="rId13"/>
+                    <a:blip r:embed="rId14"/>
                     <a:stretch>
                       <a:fillRect/>
                     </a:stretch>
@@ -7946,101 +7958,6 @@
                 <pic:pic xmlns:pic="http://schemas.openxmlformats.org/drawingml/2006/picture">
                   <pic:nvPicPr>
                     <pic:cNvPr id="2" name="Image2" descr="Magnified view of the warped left VTA"/>
-                    <pic:cNvPicPr>
-                      <a:picLocks noChangeAspect="1" noChangeArrowheads="1"/>
-                    </pic:cNvPicPr>
-                  </pic:nvPicPr>
-                  <pic:blipFill>
-                    <a:blip r:embed="rId14"/>
-                    <a:stretch>
-                      <a:fillRect/>
-                    </a:stretch>
-                  </pic:blipFill>
-                  <pic:spPr bwMode="auto">
-                    <a:xfrm>
-                      <a:off x="0" y="0"/>
-                      <a:ext cx="5334000" cy="1771650"/>
-                    </a:xfrm>
-                    <a:prstGeom prst="rect">
-                      <a:avLst/>
-                    </a:prstGeom>
-                    <a:noFill/>
-                  </pic:spPr>
-                </pic:pic>
-              </a:graphicData>
-            </a:graphic>
-          </wp:inline>
-        </w:drawing>
-      </w:r>
-    </w:p>
-    <w:p>
-      <w:pPr>
-        <w:pStyle w:val="BodyText"/>
-        <w:bidi w:val="0"/>
-        <w:jc w:val="left"/>
-        <w:rPr/>
-      </w:pPr>
-      <w:r>
-        <w:rPr>
-          <w:rStyle w:val="Emphasis"/>
-        </w:rPr>
-        <w:t>Note.</w:t>
-      </w:r>
-      <w:r>
-        <w:rPr/>
-        <w:t xml:space="preserve"> Whole-brain view (top) and magnified view (bottom), example dataset.</w:t>
-      </w:r>
-    </w:p>
-    <w:p>
-      <w:pPr>
-        <w:pStyle w:val="BodyText"/>
-        <w:bidi w:val="0"/>
-        <w:jc w:val="left"/>
-        <w:rPr/>
-      </w:pPr>
-      <w:r>
-        <w:rPr>
-          <w:rStyle w:val="Strong"/>
-        </w:rPr>
-        <w:t>Figure S3</w:t>
-      </w:r>
-    </w:p>
-    <w:p>
-      <w:pPr>
-        <w:pStyle w:val="BodyText"/>
-        <w:bidi w:val="0"/>
-        <w:jc w:val="left"/>
-        <w:rPr/>
-      </w:pPr>
-      <w:r>
-        <w:rPr>
-          <w:rStyle w:val="Emphasis"/>
-        </w:rPr>
-        <w:t>Warped Left Hippocampus Target and Left VTA → Hippocampus Atlas</w:t>
-      </w:r>
-    </w:p>
-    <w:p>
-      <w:pPr>
-        <w:pStyle w:val="BodyText"/>
-        <w:bidi w:val="0"/>
-        <w:jc w:val="left"/>
-        <w:rPr/>
-      </w:pPr>
-      <w:r>
-        <w:rPr/>
-        <w:drawing>
-          <wp:inline distT="0" distB="0" distL="0" distR="0">
-            <wp:extent cx="5334000" cy="1771650"/>
-            <wp:effectExtent l="0" t="0" r="0" b="0"/>
-            <wp:docPr id="3" name="Image3" descr="Magnified view of the warped left hippocampus"/>
-            <wp:cNvGraphicFramePr>
-              <a:graphicFrameLocks xmlns:a="http://schemas.openxmlformats.org/drawingml/2006/main" noChangeAspect="1"/>
-            </wp:cNvGraphicFramePr>
-            <a:graphic xmlns:a="http://schemas.openxmlformats.org/drawingml/2006/main">
-              <a:graphicData uri="http://schemas.openxmlformats.org/drawingml/2006/picture">
-                <pic:pic xmlns:pic="http://schemas.openxmlformats.org/drawingml/2006/picture">
-                  <pic:nvPicPr>
-                    <pic:cNvPr id="3" name="Image3" descr="Magnified view of the warped left hippocampus"/>
                     <pic:cNvPicPr>
                       <a:picLocks noChangeAspect="1" noChangeArrowheads="1"/>
                     </pic:cNvPicPr>
@@ -8076,12 +7993,58 @@
         <w:rPr/>
       </w:pPr>
       <w:r>
+        <w:rPr>
+          <w:rStyle w:val="Emphasis"/>
+        </w:rPr>
+        <w:t>Note.</w:t>
+      </w:r>
+      <w:r>
+        <w:rPr/>
+        <w:t xml:space="preserve"> Whole-brain view (top) and magnified view (bottom), example dataset.</w:t>
+      </w:r>
+    </w:p>
+    <w:p>
+      <w:pPr>
+        <w:pStyle w:val="BodyText"/>
+        <w:bidi w:val="0"/>
+        <w:jc w:val="left"/>
+        <w:rPr/>
+      </w:pPr>
+      <w:r>
+        <w:rPr>
+          <w:rStyle w:val="Strong"/>
+        </w:rPr>
+        <w:t>Figure S3</w:t>
+      </w:r>
+    </w:p>
+    <w:p>
+      <w:pPr>
+        <w:pStyle w:val="BodyText"/>
+        <w:bidi w:val="0"/>
+        <w:jc w:val="left"/>
+        <w:rPr/>
+      </w:pPr>
+      <w:r>
+        <w:rPr>
+          <w:rStyle w:val="Emphasis"/>
+        </w:rPr>
+        <w:t>Warped Left Hippocampus Target and Left VTA → Hippocampus Atlas</w:t>
+      </w:r>
+    </w:p>
+    <w:p>
+      <w:pPr>
+        <w:pStyle w:val="BodyText"/>
+        <w:bidi w:val="0"/>
+        <w:jc w:val="left"/>
+        <w:rPr/>
+      </w:pPr>
+      <w:r>
         <w:rPr/>
         <w:drawing>
           <wp:inline distT="0" distB="0" distL="0" distR="0">
             <wp:extent cx="5334000" cy="1771650"/>
             <wp:effectExtent l="0" t="0" r="0" b="0"/>
-            <wp:docPr id="4" name="Image4" descr="Magnified view of the warped left atlas"/>
+            <wp:docPr id="3" name="Image3" descr="Magnified view of the warped left hippocampus"/>
             <wp:cNvGraphicFramePr>
               <a:graphicFrameLocks xmlns:a="http://schemas.openxmlformats.org/drawingml/2006/main" noChangeAspect="1"/>
             </wp:cNvGraphicFramePr>
@@ -8089,7 +8052,7 @@
               <a:graphicData uri="http://schemas.openxmlformats.org/drawingml/2006/picture">
                 <pic:pic xmlns:pic="http://schemas.openxmlformats.org/drawingml/2006/picture">
                   <pic:nvPicPr>
-                    <pic:cNvPr id="4" name="Image4" descr="Magnified view of the warped left atlas"/>
+                    <pic:cNvPr id="3" name="Image3" descr="Magnified view of the warped left hippocampus"/>
                     <pic:cNvPicPr>
                       <a:picLocks noChangeAspect="1" noChangeArrowheads="1"/>
                     </pic:cNvPicPr>
@@ -8125,58 +8088,12 @@
         <w:rPr/>
       </w:pPr>
       <w:r>
-        <w:rPr>
-          <w:rStyle w:val="Emphasis"/>
-        </w:rPr>
-        <w:t>Note.</w:t>
-      </w:r>
-      <w:r>
-        <w:rPr/>
-        <w:t xml:space="preserve"> Hippocampus (top) and atlas at the 50% threshold (bottom), magnified views.</w:t>
-      </w:r>
-    </w:p>
-    <w:p>
-      <w:pPr>
-        <w:pStyle w:val="BodyText"/>
-        <w:bidi w:val="0"/>
-        <w:jc w:val="left"/>
-        <w:rPr/>
-      </w:pPr>
-      <w:r>
-        <w:rPr>
-          <w:rStyle w:val="Strong"/>
-        </w:rPr>
-        <w:t>Figure S4</w:t>
-      </w:r>
-    </w:p>
-    <w:p>
-      <w:pPr>
-        <w:pStyle w:val="BodyText"/>
-        <w:bidi w:val="0"/>
-        <w:jc w:val="left"/>
-        <w:rPr/>
-      </w:pPr>
-      <w:r>
-        <w:rPr>
-          <w:rStyle w:val="Emphasis"/>
-        </w:rPr>
-        <w:t>Orthogonal Render of the Warped Regions</w:t>
-      </w:r>
-    </w:p>
-    <w:p>
-      <w:pPr>
-        <w:pStyle w:val="BodyText"/>
-        <w:bidi w:val="0"/>
-        <w:jc w:val="left"/>
-        <w:rPr/>
-      </w:pPr>
-      <w:r>
         <w:rPr/>
         <w:drawing>
           <wp:inline distT="0" distB="0" distL="0" distR="0">
             <wp:extent cx="5334000" cy="1771650"/>
             <wp:effectExtent l="0" t="0" r="0" b="0"/>
-            <wp:docPr id="5" name="Image5" descr="Orthogonal render with VTA, hippocampus and atlas"/>
+            <wp:docPr id="4" name="Image4" descr="Magnified view of the warped left atlas"/>
             <wp:cNvGraphicFramePr>
               <a:graphicFrameLocks xmlns:a="http://schemas.openxmlformats.org/drawingml/2006/main" noChangeAspect="1"/>
             </wp:cNvGraphicFramePr>
@@ -8184,7 +8101,7 @@
               <a:graphicData uri="http://schemas.openxmlformats.org/drawingml/2006/picture">
                 <pic:pic xmlns:pic="http://schemas.openxmlformats.org/drawingml/2006/picture">
                   <pic:nvPicPr>
-                    <pic:cNvPr id="5" name="Image5" descr="Orthogonal render with VTA, hippocampus and atlas"/>
+                    <pic:cNvPr id="4" name="Image4" descr="Magnified view of the warped left atlas"/>
                     <pic:cNvPicPr>
                       <a:picLocks noChangeAspect="1" noChangeArrowheads="1"/>
                     </pic:cNvPicPr>
@@ -8227,6 +8144,101 @@
       </w:r>
       <w:r>
         <w:rPr/>
+        <w:t xml:space="preserve"> Hippocampus (top) and atlas at the 50% threshold (bottom), magnified views.</w:t>
+      </w:r>
+    </w:p>
+    <w:p>
+      <w:pPr>
+        <w:pStyle w:val="BodyText"/>
+        <w:bidi w:val="0"/>
+        <w:jc w:val="left"/>
+        <w:rPr/>
+      </w:pPr>
+      <w:r>
+        <w:rPr>
+          <w:rStyle w:val="Strong"/>
+        </w:rPr>
+        <w:t>Figure S4</w:t>
+      </w:r>
+    </w:p>
+    <w:p>
+      <w:pPr>
+        <w:pStyle w:val="BodyText"/>
+        <w:bidi w:val="0"/>
+        <w:jc w:val="left"/>
+        <w:rPr/>
+      </w:pPr>
+      <w:r>
+        <w:rPr>
+          <w:rStyle w:val="Emphasis"/>
+        </w:rPr>
+        <w:t>Orthogonal Render of the Warped Regions</w:t>
+      </w:r>
+    </w:p>
+    <w:p>
+      <w:pPr>
+        <w:pStyle w:val="BodyText"/>
+        <w:bidi w:val="0"/>
+        <w:jc w:val="left"/>
+        <w:rPr/>
+      </w:pPr>
+      <w:r>
+        <w:rPr/>
+        <w:drawing>
+          <wp:inline distT="0" distB="0" distL="0" distR="0">
+            <wp:extent cx="5334000" cy="1771650"/>
+            <wp:effectExtent l="0" t="0" r="0" b="0"/>
+            <wp:docPr id="5" name="Image5" descr="Orthogonal render with VTA, hippocampus and atlas"/>
+            <wp:cNvGraphicFramePr>
+              <a:graphicFrameLocks xmlns:a="http://schemas.openxmlformats.org/drawingml/2006/main" noChangeAspect="1"/>
+            </wp:cNvGraphicFramePr>
+            <a:graphic xmlns:a="http://schemas.openxmlformats.org/drawingml/2006/main">
+              <a:graphicData uri="http://schemas.openxmlformats.org/drawingml/2006/picture">
+                <pic:pic xmlns:pic="http://schemas.openxmlformats.org/drawingml/2006/picture">
+                  <pic:nvPicPr>
+                    <pic:cNvPr id="5" name="Image5" descr="Orthogonal render with VTA, hippocampus and atlas"/>
+                    <pic:cNvPicPr>
+                      <a:picLocks noChangeAspect="1" noChangeArrowheads="1"/>
+                    </pic:cNvPicPr>
+                  </pic:nvPicPr>
+                  <pic:blipFill>
+                    <a:blip r:embed="rId18"/>
+                    <a:stretch>
+                      <a:fillRect/>
+                    </a:stretch>
+                  </pic:blipFill>
+                  <pic:spPr bwMode="auto">
+                    <a:xfrm>
+                      <a:off x="0" y="0"/>
+                      <a:ext cx="5334000" cy="1771650"/>
+                    </a:xfrm>
+                    <a:prstGeom prst="rect">
+                      <a:avLst/>
+                    </a:prstGeom>
+                    <a:noFill/>
+                  </pic:spPr>
+                </pic:pic>
+              </a:graphicData>
+            </a:graphic>
+          </wp:inline>
+        </w:drawing>
+      </w:r>
+    </w:p>
+    <w:p>
+      <w:pPr>
+        <w:pStyle w:val="BodyText"/>
+        <w:bidi w:val="0"/>
+        <w:jc w:val="left"/>
+        <w:rPr/>
+      </w:pPr>
+      <w:r>
+        <w:rPr>
+          <w:rStyle w:val="Emphasis"/>
+        </w:rPr>
+        <w:t>Note.</w:t>
+      </w:r>
+      <w:r>
+        <w:rPr/>
         <w:t xml:space="preserve"> VTA in yellow, hippocampus in red, atlas in green.</w:t>
       </w:r>
     </w:p>
@@ -8292,317 +8304,6 @@
                 <pic:pic xmlns:pic="http://schemas.openxmlformats.org/drawingml/2006/picture">
                   <pic:nvPicPr>
                     <pic:cNvPr id="6" name="Image6" descr="Warped anterior atlas"/>
-                    <pic:cNvPicPr>
-                      <a:picLocks noChangeAspect="1" noChangeArrowheads="1"/>
-                    </pic:cNvPicPr>
-                  </pic:nvPicPr>
-                  <pic:blipFill>
-                    <a:blip r:embed="rId18"/>
-                    <a:stretch>
-                      <a:fillRect/>
-                    </a:stretch>
-                  </pic:blipFill>
-                  <pic:spPr bwMode="auto">
-                    <a:xfrm>
-                      <a:off x="0" y="0"/>
-                      <a:ext cx="5334000" cy="2495550"/>
-                    </a:xfrm>
-                    <a:prstGeom prst="rect">
-                      <a:avLst/>
-                    </a:prstGeom>
-                    <a:noFill/>
-                  </pic:spPr>
-                </pic:pic>
-              </a:graphicData>
-            </a:graphic>
-          </wp:inline>
-        </w:drawing>
-      </w:r>
-    </w:p>
-    <w:p>
-      <w:pPr>
-        <w:pStyle w:val="BodyText"/>
-        <w:bidi w:val="0"/>
-        <w:jc w:val="left"/>
-        <w:rPr/>
-      </w:pPr>
-      <w:r>
-        <w:rPr>
-          <w:rStyle w:val="Emphasis"/>
-        </w:rPr>
-        <w:t>Note.</w:t>
-      </w:r>
-      <w:r>
-        <w:rPr/>
-        <w:t xml:space="preserve"> Atlas in red over the mean </w:t>
-      </w:r>
-      <w:r>
-        <w:rPr>
-          <w:rStyle w:val="Emphasis"/>
-        </w:rPr>
-        <w:t>b</w:t>
-      </w:r>
-      <w:r>
-        <w:rPr/>
-        <w:t xml:space="preserve"> = 0 image. Left: axial view. Right: coronal view.</w:t>
-      </w:r>
-    </w:p>
-    <w:p>
-      <w:pPr>
-        <w:pStyle w:val="Heading1"/>
-        <w:bidi w:val="0"/>
-        <w:rPr/>
-      </w:pPr>
-      <w:r>
-        <w:rPr/>
-        <w:t>Step 3. Corridor construction</w:t>
-      </w:r>
-    </w:p>
-    <w:p>
-      <w:pPr>
-        <w:pStyle w:val="BodyText"/>
-        <w:bidi w:val="0"/>
-        <w:jc w:val="left"/>
-        <w:rPr/>
-      </w:pPr>
-      <w:r>
-        <w:rPr/>
-        <w:t>Atlas construction used approximately a dozen individually prepared exclusion regions per tract. The corridor workflow replaces them with a single mask derived from the warped atlas. The atlas is dilated, the seed and target regions are added, the union is binarized to form an inclusion zone, and the inclusion zone is inverted. The inverted image serves as the sole exclusion mask for tractography: any streamline leaving the corridor is discarded.</w:t>
-      </w:r>
-    </w:p>
-    <w:p>
-      <w:pPr>
-        <w:pStyle w:val="Heading2"/>
-        <w:bidi w:val="0"/>
-        <w:jc w:val="left"/>
-        <w:rPr/>
-      </w:pPr>
-      <w:r>
-        <w:rPr/>
-        <w:t>Procedure</w:t>
-      </w:r>
-    </w:p>
-    <w:p>
-      <w:pPr>
-        <w:pStyle w:val="PreformattedTextcode"/>
-        <w:bidi w:val="0"/>
-        <w:jc w:val="left"/>
-        <w:rPr/>
-      </w:pPr>
-      <w:r>
-        <w:rPr/>
-        <w:t>fslmaths "$d/${TRACT}_atlas_diff.nii.gz" -dilM -dilM "$d/${TRACT}_atlas_dilated.nii.gz"</w:t>
-      </w:r>
-    </w:p>
-    <w:p>
-      <w:pPr>
-        <w:pStyle w:val="PreformattedTextcode"/>
-        <w:bidi w:val="0"/>
-        <w:jc w:val="left"/>
-        <w:rPr/>
-      </w:pPr>
-      <w:r>
-        <w:rPr/>
-        <w:t>fslmaths "$d/${TRACT}_atlas_dilated.nii.gz" -add "$d/${TRACT}_seed_diff.nii.gz" \</w:t>
-      </w:r>
-    </w:p>
-    <w:p>
-      <w:pPr>
-        <w:pStyle w:val="PreformattedTextcode"/>
-        <w:bidi w:val="0"/>
-        <w:jc w:val="left"/>
-        <w:rPr/>
-      </w:pPr>
-      <w:r>
-        <w:rPr/>
-        <w:t xml:space="preserve">         </w:t>
-      </w:r>
-      <w:r>
-        <w:rPr/>
-        <w:t>-add "$d/${TRACT}_target_diff.nii.gz" -bin "$d/${TRACT}_inclusion_zone.nii.gz"</w:t>
-      </w:r>
-    </w:p>
-    <w:p>
-      <w:pPr>
-        <w:pStyle w:val="PreformattedTextcode"/>
-        <w:bidi w:val="0"/>
-        <w:spacing w:before="0" w:after="283"/>
-        <w:jc w:val="left"/>
-        <w:rPr/>
-      </w:pPr>
-      <w:r>
-        <w:rPr/>
-        <w:t>fslmaths "$d/${TRACT}_inclusion_zone.nii.gz" -binv "$d/${TRACT}_exclusion_mask.nii.gz"</w:t>
-      </w:r>
-    </w:p>
-    <w:p>
-      <w:pPr>
-        <w:pStyle w:val="BodyText"/>
-        <w:bidi w:val="0"/>
-        <w:jc w:val="left"/>
-        <w:rPr/>
-      </w:pPr>
-      <w:r>
-        <w:rPr/>
-        <w:t xml:space="preserve">The seed and target must be added before inversion; otherwise the corridor terminates short of them and tracking stops at the boundary. The full script follows; the </w:t>
-      </w:r>
-      <w:r>
-        <w:rPr>
-          <w:rStyle w:val="SourceText"/>
-        </w:rPr>
-        <w:t>DILATE_VOX</w:t>
-      </w:r>
-      <w:r>
-        <w:rPr/>
-        <w:t xml:space="preserve"> setting in the configuration controls the number of </w:t>
-      </w:r>
-      <w:r>
-        <w:rPr>
-          <w:rStyle w:val="SourceText"/>
-        </w:rPr>
-        <w:t>-dilM</w:t>
-      </w:r>
-      <w:r>
-        <w:rPr/>
-        <w:t xml:space="preserve"> passes.</w:t>
-      </w:r>
-    </w:p>
-    <w:p>
-      <w:pPr>
-        <w:pStyle w:val="BodyText"/>
-        <w:bidi w:val="0"/>
-        <w:jc w:val="left"/>
-        <w:rPr/>
-      </w:pPr>
-      <w:r>
-        <w:rPr>
-          <w:rStyle w:val="Emphasis"/>
-        </w:rPr>
-        <w:t xml:space="preserve">The script </w:t>
-      </w:r>
-      <w:r>
-        <w:rPr>
-          <w:rStyle w:val="SourceText"/>
-        </w:rPr>
-        <w:t>03_build_corridor_mask.sh</w:t>
-      </w:r>
-      <w:r>
-        <w:rPr>
-          <w:rStyle w:val="Emphasis"/>
-        </w:rPr>
-        <w:t xml:space="preserve"> is reproduced in the Supplementary Scripts appendix.</w:t>
-      </w:r>
-    </w:p>
-    <w:p>
-      <w:pPr>
-        <w:pStyle w:val="Heading2"/>
-        <w:bidi w:val="0"/>
-        <w:jc w:val="left"/>
-        <w:rPr/>
-      </w:pPr>
-      <w:r>
-        <w:rPr/>
-        <w:t>Dilation</w:t>
-      </w:r>
-    </w:p>
-    <w:p>
-      <w:pPr>
-        <w:pStyle w:val="BodyText"/>
-        <w:bidi w:val="0"/>
-        <w:jc w:val="left"/>
-        <w:rPr/>
-      </w:pPr>
-      <w:r>
-        <w:rPr/>
-        <w:t>A dilation of two voxels was used in the example dataset at 2 mm isotropic resolution. One voxel is appropriate when registration is accurate and pilot reconstructions appear loose; four voxels serves as a sensitivity setting when registration is uncertain. The 50% atlas is already somewhat wider than the median participant's core, which is why two voxels is generally sufficient. The dilation used should be reported.</w:t>
-      </w:r>
-    </w:p>
-    <w:p>
-      <w:pPr>
-        <w:pStyle w:val="Heading2"/>
-        <w:bidi w:val="0"/>
-        <w:jc w:val="left"/>
-        <w:rPr/>
-      </w:pPr>
-      <w:r>
-        <w:rPr/>
-        <w:t>Verification</w:t>
-      </w:r>
-    </w:p>
-    <w:p>
-      <w:pPr>
-        <w:pStyle w:val="BodyText"/>
-        <w:bidi w:val="0"/>
-        <w:jc w:val="left"/>
-        <w:rPr/>
-      </w:pPr>
-      <w:r>
-        <w:rPr/>
-        <w:t>The script confirms that the seed and target voxels have value 0 in the exclusion mask (that is, are not excluded) and reports the corridor size, which should be similar across participants (roughly 1,500 to 1,900 voxels at 2 mm for VTA → hippocampus in the example dataset). A corridor much larger or smaller than the others indicates a registration problem.</w:t>
-      </w:r>
-    </w:p>
-    <w:p>
-      <w:pPr>
-        <w:pStyle w:val="BodyText"/>
-        <w:bidi w:val="0"/>
-        <w:jc w:val="left"/>
-        <w:rPr/>
-      </w:pPr>
-      <w:r>
-        <w:rPr/>
-        <w:t>Visual inspection confirms that the corridor follows a plausible path from seed to target and contains both regions (Figure S6). Contact with the ventricle or extension into cortex indicates excessive dilation or a registration error.</w:t>
-      </w:r>
-    </w:p>
-    <w:p>
-      <w:pPr>
-        <w:pStyle w:val="BodyText"/>
-        <w:bidi w:val="0"/>
-        <w:jc w:val="left"/>
-        <w:rPr/>
-      </w:pPr>
-      <w:r>
-        <w:rPr>
-          <w:rStyle w:val="Strong"/>
-        </w:rPr>
-        <w:t>Figure S6</w:t>
-      </w:r>
-    </w:p>
-    <w:p>
-      <w:pPr>
-        <w:pStyle w:val="BodyText"/>
-        <w:bidi w:val="0"/>
-        <w:jc w:val="left"/>
-        <w:rPr/>
-      </w:pPr>
-      <w:r>
-        <w:rPr>
-          <w:rStyle w:val="Emphasis"/>
-        </w:rPr>
-        <w:t>Inclusion Zone for the Anterior VTA → Hippocampus Tract</w:t>
-      </w:r>
-    </w:p>
-    <w:p>
-      <w:pPr>
-        <w:pStyle w:val="BodyText"/>
-        <w:bidi w:val="0"/>
-        <w:jc w:val="left"/>
-        <w:rPr/>
-      </w:pPr>
-      <w:r>
-        <w:rPr/>
-        <w:drawing>
-          <wp:inline distT="0" distB="0" distL="0" distR="0">
-            <wp:extent cx="5334000" cy="2495550"/>
-            <wp:effectExtent l="0" t="0" r="0" b="0"/>
-            <wp:docPr id="7" name="Image7" descr="Inclusion zone over the mean b = 0 image"/>
-            <wp:cNvGraphicFramePr>
-              <a:graphicFrameLocks xmlns:a="http://schemas.openxmlformats.org/drawingml/2006/main" noChangeAspect="1"/>
-            </wp:cNvGraphicFramePr>
-            <a:graphic xmlns:a="http://schemas.openxmlformats.org/drawingml/2006/main">
-              <a:graphicData uri="http://schemas.openxmlformats.org/drawingml/2006/picture">
-                <pic:pic xmlns:pic="http://schemas.openxmlformats.org/drawingml/2006/picture">
-                  <pic:nvPicPr>
-                    <pic:cNvPr id="7" name="Image7" descr="Inclusion zone over the mean b = 0 image"/>
                     <pic:cNvPicPr>
                       <a:picLocks noChangeAspect="1" noChangeArrowheads="1"/>
                     </pic:cNvPicPr>
@@ -8645,6 +8346,317 @@
       </w:r>
       <w:r>
         <w:rPr/>
+        <w:t xml:space="preserve"> Atlas in red over the mean </w:t>
+      </w:r>
+      <w:r>
+        <w:rPr>
+          <w:rStyle w:val="Emphasis"/>
+        </w:rPr>
+        <w:t>b</w:t>
+      </w:r>
+      <w:r>
+        <w:rPr/>
+        <w:t xml:space="preserve"> = 0 image. Left: axial view. Right: coronal view.</w:t>
+      </w:r>
+    </w:p>
+    <w:p>
+      <w:pPr>
+        <w:pStyle w:val="Heading1"/>
+        <w:bidi w:val="0"/>
+        <w:rPr/>
+      </w:pPr>
+      <w:r>
+        <w:rPr/>
+        <w:t>Step 3. Corridor construction</w:t>
+      </w:r>
+    </w:p>
+    <w:p>
+      <w:pPr>
+        <w:pStyle w:val="BodyText"/>
+        <w:bidi w:val="0"/>
+        <w:jc w:val="left"/>
+        <w:rPr/>
+      </w:pPr>
+      <w:r>
+        <w:rPr/>
+        <w:t>Atlas construction used approximately a dozen individually prepared exclusion regions per tract. The corridor workflow replaces them with a single mask derived from the warped atlas. The atlas is dilated, the seed and target regions are added, the union is binarized to form an inclusion zone, and the inclusion zone is inverted. The inverted image serves as the sole exclusion mask for tractography: any streamline leaving the corridor is discarded.</w:t>
+      </w:r>
+    </w:p>
+    <w:p>
+      <w:pPr>
+        <w:pStyle w:val="Heading2"/>
+        <w:bidi w:val="0"/>
+        <w:jc w:val="left"/>
+        <w:rPr/>
+      </w:pPr>
+      <w:r>
+        <w:rPr/>
+        <w:t>Procedure</w:t>
+      </w:r>
+    </w:p>
+    <w:p>
+      <w:pPr>
+        <w:pStyle w:val="PreformattedTextcode"/>
+        <w:bidi w:val="0"/>
+        <w:jc w:val="left"/>
+        <w:rPr/>
+      </w:pPr>
+      <w:r>
+        <w:rPr/>
+        <w:t>fslmaths "$d/${TRACT}_atlas_diff.nii.gz" -dilM -dilM "$d/${TRACT}_atlas_dilated.nii.gz"</w:t>
+      </w:r>
+    </w:p>
+    <w:p>
+      <w:pPr>
+        <w:pStyle w:val="PreformattedTextcode"/>
+        <w:bidi w:val="0"/>
+        <w:jc w:val="left"/>
+        <w:rPr/>
+      </w:pPr>
+      <w:r>
+        <w:rPr/>
+        <w:t>fslmaths "$d/${TRACT}_atlas_dilated.nii.gz" -add "$d/${TRACT}_seed_diff.nii.gz" \</w:t>
+      </w:r>
+    </w:p>
+    <w:p>
+      <w:pPr>
+        <w:pStyle w:val="PreformattedTextcode"/>
+        <w:bidi w:val="0"/>
+        <w:jc w:val="left"/>
+        <w:rPr/>
+      </w:pPr>
+      <w:r>
+        <w:rPr/>
+        <w:t xml:space="preserve">         </w:t>
+      </w:r>
+      <w:r>
+        <w:rPr/>
+        <w:t>-add "$d/${TRACT}_target_diff.nii.gz" -bin "$d/${TRACT}_inclusion_zone.nii.gz"</w:t>
+      </w:r>
+    </w:p>
+    <w:p>
+      <w:pPr>
+        <w:pStyle w:val="PreformattedTextcode"/>
+        <w:bidi w:val="0"/>
+        <w:spacing w:before="0" w:after="283"/>
+        <w:jc w:val="left"/>
+        <w:rPr/>
+      </w:pPr>
+      <w:r>
+        <w:rPr/>
+        <w:t>fslmaths "$d/${TRACT}_inclusion_zone.nii.gz" -binv "$d/${TRACT}_exclusion_mask.nii.gz"</w:t>
+      </w:r>
+    </w:p>
+    <w:p>
+      <w:pPr>
+        <w:pStyle w:val="BodyText"/>
+        <w:bidi w:val="0"/>
+        <w:jc w:val="left"/>
+        <w:rPr/>
+      </w:pPr>
+      <w:r>
+        <w:rPr/>
+        <w:t xml:space="preserve">The seed and target must be added before inversion; otherwise the corridor terminates short of them and tracking stops at the boundary. The full script follows; the </w:t>
+      </w:r>
+      <w:r>
+        <w:rPr>
+          <w:rStyle w:val="SourceText"/>
+        </w:rPr>
+        <w:t>DILATE_VOX</w:t>
+      </w:r>
+      <w:r>
+        <w:rPr/>
+        <w:t xml:space="preserve"> setting in the configuration controls the number of </w:t>
+      </w:r>
+      <w:r>
+        <w:rPr>
+          <w:rStyle w:val="SourceText"/>
+        </w:rPr>
+        <w:t>-dilM</w:t>
+      </w:r>
+      <w:r>
+        <w:rPr/>
+        <w:t xml:space="preserve"> passes.</w:t>
+      </w:r>
+    </w:p>
+    <w:p>
+      <w:pPr>
+        <w:pStyle w:val="BodyText"/>
+        <w:bidi w:val="0"/>
+        <w:jc w:val="left"/>
+        <w:rPr/>
+      </w:pPr>
+      <w:r>
+        <w:rPr>
+          <w:rStyle w:val="Emphasis"/>
+        </w:rPr>
+        <w:t xml:space="preserve">The script </w:t>
+      </w:r>
+      <w:r>
+        <w:rPr>
+          <w:rStyle w:val="SourceText"/>
+        </w:rPr>
+        <w:t>03_build_corridor_mask.sh</w:t>
+      </w:r>
+      <w:r>
+        <w:rPr>
+          <w:rStyle w:val="Emphasis"/>
+        </w:rPr>
+        <w:t xml:space="preserve"> is reproduced in the Supplementary Scripts appendix.</w:t>
+      </w:r>
+    </w:p>
+    <w:p>
+      <w:pPr>
+        <w:pStyle w:val="Heading2"/>
+        <w:bidi w:val="0"/>
+        <w:jc w:val="left"/>
+        <w:rPr/>
+      </w:pPr>
+      <w:r>
+        <w:rPr/>
+        <w:t>Dilation</w:t>
+      </w:r>
+    </w:p>
+    <w:p>
+      <w:pPr>
+        <w:pStyle w:val="BodyText"/>
+        <w:bidi w:val="0"/>
+        <w:jc w:val="left"/>
+        <w:rPr/>
+      </w:pPr>
+      <w:r>
+        <w:rPr/>
+        <w:t>A dilation of two voxels was used in the example dataset at 2 mm isotropic resolution. One voxel is appropriate when registration is accurate and pilot reconstructions appear loose; four voxels serves as a sensitivity setting when registration is uncertain. The 50% atlas is already somewhat wider than the median participant's core, which is why two voxels is generally sufficient. The dilation used should be reported.</w:t>
+      </w:r>
+    </w:p>
+    <w:p>
+      <w:pPr>
+        <w:pStyle w:val="Heading2"/>
+        <w:bidi w:val="0"/>
+        <w:jc w:val="left"/>
+        <w:rPr/>
+      </w:pPr>
+      <w:r>
+        <w:rPr/>
+        <w:t>Verification</w:t>
+      </w:r>
+    </w:p>
+    <w:p>
+      <w:pPr>
+        <w:pStyle w:val="BodyText"/>
+        <w:bidi w:val="0"/>
+        <w:jc w:val="left"/>
+        <w:rPr/>
+      </w:pPr>
+      <w:r>
+        <w:rPr/>
+        <w:t>The script confirms that the seed and target voxels have value 0 in the exclusion mask (that is, are not excluded) and reports the corridor size, which should be similar across participants (roughly 1,500 to 1,900 voxels at 2 mm for VTA → hippocampus in the example dataset). A corridor much larger or smaller than the others indicates a registration problem.</w:t>
+      </w:r>
+    </w:p>
+    <w:p>
+      <w:pPr>
+        <w:pStyle w:val="BodyText"/>
+        <w:bidi w:val="0"/>
+        <w:jc w:val="left"/>
+        <w:rPr/>
+      </w:pPr>
+      <w:r>
+        <w:rPr/>
+        <w:t>Visual inspection confirms that the corridor follows a plausible path from seed to target and contains both regions (Figure S6). Contact with the ventricle or extension into cortex indicates excessive dilation or a registration error.</w:t>
+      </w:r>
+    </w:p>
+    <w:p>
+      <w:pPr>
+        <w:pStyle w:val="BodyText"/>
+        <w:bidi w:val="0"/>
+        <w:jc w:val="left"/>
+        <w:rPr/>
+      </w:pPr>
+      <w:r>
+        <w:rPr>
+          <w:rStyle w:val="Strong"/>
+        </w:rPr>
+        <w:t>Figure S6</w:t>
+      </w:r>
+    </w:p>
+    <w:p>
+      <w:pPr>
+        <w:pStyle w:val="BodyText"/>
+        <w:bidi w:val="0"/>
+        <w:jc w:val="left"/>
+        <w:rPr/>
+      </w:pPr>
+      <w:r>
+        <w:rPr>
+          <w:rStyle w:val="Emphasis"/>
+        </w:rPr>
+        <w:t>Inclusion Zone for the Anterior VTA → Hippocampus Tract</w:t>
+      </w:r>
+    </w:p>
+    <w:p>
+      <w:pPr>
+        <w:pStyle w:val="BodyText"/>
+        <w:bidi w:val="0"/>
+        <w:jc w:val="left"/>
+        <w:rPr/>
+      </w:pPr>
+      <w:r>
+        <w:rPr/>
+        <w:drawing>
+          <wp:inline distT="0" distB="0" distL="0" distR="0">
+            <wp:extent cx="5334000" cy="2495550"/>
+            <wp:effectExtent l="0" t="0" r="0" b="0"/>
+            <wp:docPr id="7" name="Image7" descr="Inclusion zone over the mean b = 0 image"/>
+            <wp:cNvGraphicFramePr>
+              <a:graphicFrameLocks xmlns:a="http://schemas.openxmlformats.org/drawingml/2006/main" noChangeAspect="1"/>
+            </wp:cNvGraphicFramePr>
+            <a:graphic xmlns:a="http://schemas.openxmlformats.org/drawingml/2006/main">
+              <a:graphicData uri="http://schemas.openxmlformats.org/drawingml/2006/picture">
+                <pic:pic xmlns:pic="http://schemas.openxmlformats.org/drawingml/2006/picture">
+                  <pic:nvPicPr>
+                    <pic:cNvPr id="7" name="Image7" descr="Inclusion zone over the mean b = 0 image"/>
+                    <pic:cNvPicPr>
+                      <a:picLocks noChangeAspect="1" noChangeArrowheads="1"/>
+                    </pic:cNvPicPr>
+                  </pic:nvPicPr>
+                  <pic:blipFill>
+                    <a:blip r:embed="rId20"/>
+                    <a:stretch>
+                      <a:fillRect/>
+                    </a:stretch>
+                  </pic:blipFill>
+                  <pic:spPr bwMode="auto">
+                    <a:xfrm>
+                      <a:off x="0" y="0"/>
+                      <a:ext cx="5334000" cy="2495550"/>
+                    </a:xfrm>
+                    <a:prstGeom prst="rect">
+                      <a:avLst/>
+                    </a:prstGeom>
+                    <a:noFill/>
+                  </pic:spPr>
+                </pic:pic>
+              </a:graphicData>
+            </a:graphic>
+          </wp:inline>
+        </w:drawing>
+      </w:r>
+    </w:p>
+    <w:p>
+      <w:pPr>
+        <w:pStyle w:val="BodyText"/>
+        <w:bidi w:val="0"/>
+        <w:jc w:val="left"/>
+        <w:rPr/>
+      </w:pPr>
+      <w:r>
+        <w:rPr>
+          <w:rStyle w:val="Emphasis"/>
+        </w:rPr>
+        <w:t>Note.</w:t>
+      </w:r>
+      <w:r>
+        <w:rPr/>
         <w:t xml:space="preserve"> Inclusion zone in cyan over the mean </w:t>
       </w:r>
       <w:r>
@@ -10650,7 +10662,7 @@
                     </pic:cNvPicPr>
                   </pic:nvPicPr>
                   <pic:blipFill>
-                    <a:blip r:embed="rId20"/>
+                    <a:blip r:embed="rId21"/>
                     <a:stretch>
                       <a:fillRect/>
                     </a:stretch>
@@ -10745,7 +10757,7 @@
                     </pic:cNvPicPr>
                   </pic:nvPicPr>
                   <pic:blipFill>
-                    <a:blip r:embed="rId21"/>
+                    <a:blip r:embed="rId22"/>
                     <a:stretch>
                       <a:fillRect/>
                     </a:stretch>
@@ -13408,7 +13420,7 @@
                     </pic:cNvPicPr>
                   </pic:nvPicPr>
                   <pic:blipFill>
-                    <a:blip r:embed="rId22"/>
+                    <a:blip r:embed="rId23"/>
                     <a:stretch>
                       <a:fillRect/>
                     </a:stretch>
@@ -13503,7 +13515,7 @@
                     </pic:cNvPicPr>
                   </pic:nvPicPr>
                   <pic:blipFill>
-                    <a:blip r:embed="rId23"/>
+                    <a:blip r:embed="rId24"/>
                     <a:stretch>
                       <a:fillRect/>
                     </a:stretch>
@@ -14056,111 +14068,6 @@
                 <pic:pic xmlns:pic="http://schemas.openxmlformats.org/drawingml/2006/picture">
                   <pic:nvPicPr>
                     <pic:cNvPr id="12" name="Image12" descr="Cleaned posterior tract"/>
-                    <pic:cNvPicPr>
-                      <a:picLocks noChangeAspect="1" noChangeArrowheads="1"/>
-                    </pic:cNvPicPr>
-                  </pic:nvPicPr>
-                  <pic:blipFill>
-                    <a:blip r:embed="rId24"/>
-                    <a:stretch>
-                      <a:fillRect/>
-                    </a:stretch>
-                  </pic:blipFill>
-                  <pic:spPr bwMode="auto">
-                    <a:xfrm>
-                      <a:off x="0" y="0"/>
-                      <a:ext cx="5334000" cy="2476500"/>
-                    </a:xfrm>
-                    <a:prstGeom prst="rect">
-                      <a:avLst/>
-                    </a:prstGeom>
-                    <a:noFill/>
-                  </pic:spPr>
-                </pic:pic>
-              </a:graphicData>
-            </a:graphic>
-          </wp:inline>
-        </w:drawing>
-      </w:r>
-    </w:p>
-    <w:p>
-      <w:pPr>
-        <w:pStyle w:val="BodyText"/>
-        <w:bidi w:val="0"/>
-        <w:jc w:val="left"/>
-        <w:rPr/>
-      </w:pPr>
-      <w:r>
-        <w:rPr>
-          <w:rStyle w:val="Emphasis"/>
-        </w:rPr>
-        <w:t>Note.</w:t>
-      </w:r>
-      <w:r>
-        <w:rPr/>
-        <w:t xml:space="preserve"> Streamline density over the mean </w:t>
-      </w:r>
-      <w:r>
-        <w:rPr>
-          <w:rStyle w:val="Emphasis"/>
-        </w:rPr>
-        <w:t>b</w:t>
-      </w:r>
-      <w:r>
-        <w:rPr/>
-        <w:t xml:space="preserve"> = 0 image. Left: axial view. Right: coronal view. The same layout applies to Figures S12 and S13.</w:t>
-      </w:r>
-    </w:p>
-    <w:p>
-      <w:pPr>
-        <w:pStyle w:val="BodyText"/>
-        <w:bidi w:val="0"/>
-        <w:jc w:val="left"/>
-        <w:rPr/>
-      </w:pPr>
-      <w:r>
-        <w:rPr>
-          <w:rStyle w:val="Strong"/>
-        </w:rPr>
-        <w:t>Figure S12</w:t>
-      </w:r>
-    </w:p>
-    <w:p>
-      <w:pPr>
-        <w:pStyle w:val="BodyText"/>
-        <w:bidi w:val="0"/>
-        <w:jc w:val="left"/>
-        <w:rPr/>
-      </w:pPr>
-      <w:r>
-        <w:rPr>
-          <w:rStyle w:val="Emphasis"/>
-        </w:rPr>
-        <w:t>Cleaned Tract at the Low End of Retention</w:t>
-      </w:r>
-    </w:p>
-    <w:p>
-      <w:pPr>
-        <w:pStyle w:val="BodyText"/>
-        <w:bidi w:val="0"/>
-        <w:jc w:val="left"/>
-        <w:rPr/>
-      </w:pPr>
-      <w:r>
-        <w:rPr/>
-        <w:drawing>
-          <wp:inline distT="0" distB="0" distL="0" distR="0">
-            <wp:extent cx="5334000" cy="2476500"/>
-            <wp:effectExtent l="0" t="0" r="0" b="0"/>
-            <wp:docPr id="13" name="Image13" descr="Cleaned tract with low retention"/>
-            <wp:cNvGraphicFramePr>
-              <a:graphicFrameLocks xmlns:a="http://schemas.openxmlformats.org/drawingml/2006/main" noChangeAspect="1"/>
-            </wp:cNvGraphicFramePr>
-            <a:graphic xmlns:a="http://schemas.openxmlformats.org/drawingml/2006/main">
-              <a:graphicData uri="http://schemas.openxmlformats.org/drawingml/2006/picture">
-                <pic:pic xmlns:pic="http://schemas.openxmlformats.org/drawingml/2006/picture">
-                  <pic:nvPicPr>
-                    <pic:cNvPr id="13" name="Image13" descr="Cleaned tract with low retention"/>
                     <pic:cNvPicPr>
                       <a:picLocks noChangeAspect="1" noChangeArrowheads="1"/>
                     </pic:cNvPicPr>
@@ -14203,6 +14110,111 @@
       </w:r>
       <w:r>
         <w:rPr/>
+        <w:t xml:space="preserve"> Streamline density over the mean </w:t>
+      </w:r>
+      <w:r>
+        <w:rPr>
+          <w:rStyle w:val="Emphasis"/>
+        </w:rPr>
+        <w:t>b</w:t>
+      </w:r>
+      <w:r>
+        <w:rPr/>
+        <w:t xml:space="preserve"> = 0 image. Left: axial view. Right: coronal view. The same layout applies to Figures S12 and S13.</w:t>
+      </w:r>
+    </w:p>
+    <w:p>
+      <w:pPr>
+        <w:pStyle w:val="BodyText"/>
+        <w:bidi w:val="0"/>
+        <w:jc w:val="left"/>
+        <w:rPr/>
+      </w:pPr>
+      <w:r>
+        <w:rPr>
+          <w:rStyle w:val="Strong"/>
+        </w:rPr>
+        <w:t>Figure S12</w:t>
+      </w:r>
+    </w:p>
+    <w:p>
+      <w:pPr>
+        <w:pStyle w:val="BodyText"/>
+        <w:bidi w:val="0"/>
+        <w:jc w:val="left"/>
+        <w:rPr/>
+      </w:pPr>
+      <w:r>
+        <w:rPr>
+          <w:rStyle w:val="Emphasis"/>
+        </w:rPr>
+        <w:t>Cleaned Tract at the Low End of Retention</w:t>
+      </w:r>
+    </w:p>
+    <w:p>
+      <w:pPr>
+        <w:pStyle w:val="BodyText"/>
+        <w:bidi w:val="0"/>
+        <w:jc w:val="left"/>
+        <w:rPr/>
+      </w:pPr>
+      <w:r>
+        <w:rPr/>
+        <w:drawing>
+          <wp:inline distT="0" distB="0" distL="0" distR="0">
+            <wp:extent cx="5334000" cy="2476500"/>
+            <wp:effectExtent l="0" t="0" r="0" b="0"/>
+            <wp:docPr id="13" name="Image13" descr="Cleaned tract with low retention"/>
+            <wp:cNvGraphicFramePr>
+              <a:graphicFrameLocks xmlns:a="http://schemas.openxmlformats.org/drawingml/2006/main" noChangeAspect="1"/>
+            </wp:cNvGraphicFramePr>
+            <a:graphic xmlns:a="http://schemas.openxmlformats.org/drawingml/2006/main">
+              <a:graphicData uri="http://schemas.openxmlformats.org/drawingml/2006/picture">
+                <pic:pic xmlns:pic="http://schemas.openxmlformats.org/drawingml/2006/picture">
+                  <pic:nvPicPr>
+                    <pic:cNvPr id="13" name="Image13" descr="Cleaned tract with low retention"/>
+                    <pic:cNvPicPr>
+                      <a:picLocks noChangeAspect="1" noChangeArrowheads="1"/>
+                    </pic:cNvPicPr>
+                  </pic:nvPicPr>
+                  <pic:blipFill>
+                    <a:blip r:embed="rId26"/>
+                    <a:stretch>
+                      <a:fillRect/>
+                    </a:stretch>
+                  </pic:blipFill>
+                  <pic:spPr bwMode="auto">
+                    <a:xfrm>
+                      <a:off x="0" y="0"/>
+                      <a:ext cx="5334000" cy="2476500"/>
+                    </a:xfrm>
+                    <a:prstGeom prst="rect">
+                      <a:avLst/>
+                    </a:prstGeom>
+                    <a:noFill/>
+                  </pic:spPr>
+                </pic:pic>
+              </a:graphicData>
+            </a:graphic>
+          </wp:inline>
+        </w:drawing>
+      </w:r>
+    </w:p>
+    <w:p>
+      <w:pPr>
+        <w:pStyle w:val="BodyText"/>
+        <w:bidi w:val="0"/>
+        <w:jc w:val="left"/>
+        <w:rPr/>
+      </w:pPr>
+      <w:r>
+        <w:rPr>
+          <w:rStyle w:val="Emphasis"/>
+        </w:rPr>
+        <w:t>Note.</w:t>
+      </w:r>
+      <w:r>
+        <w:rPr/>
         <w:t xml:space="preserve"> About a quarter of the streamlines survived cleaning; the bundle is still well formed.</w:t>
       </w:r>
     </w:p>
@@ -14261,7 +14273,7 @@
                     </pic:cNvPicPr>
                   </pic:nvPicPr>
                   <pic:blipFill>
-                    <a:blip r:embed="rId26"/>
+                    <a:blip r:embed="rId27"/>
                     <a:stretch>
                       <a:fillRect/>
                     </a:stretch>
@@ -15046,101 +15058,6 @@
                 <pic:pic xmlns:pic="http://schemas.openxmlformats.org/drawingml/2006/picture">
                   <pic:nvPicPr>
                     <pic:cNvPr id="15" name="Image15" descr="FA profile"/>
-                    <pic:cNvPicPr>
-                      <a:picLocks noChangeAspect="1" noChangeArrowheads="1"/>
-                    </pic:cNvPicPr>
-                  </pic:nvPicPr>
-                  <pic:blipFill>
-                    <a:blip r:embed="rId27"/>
-                    <a:stretch>
-                      <a:fillRect/>
-                    </a:stretch>
-                  </pic:blipFill>
-                  <pic:spPr bwMode="auto">
-                    <a:xfrm>
-                      <a:off x="0" y="0"/>
-                      <a:ext cx="5334000" cy="3762375"/>
-                    </a:xfrm>
-                    <a:prstGeom prst="rect">
-                      <a:avLst/>
-                    </a:prstGeom>
-                    <a:noFill/>
-                  </pic:spPr>
-                </pic:pic>
-              </a:graphicData>
-            </a:graphic>
-          </wp:inline>
-        </w:drawing>
-      </w:r>
-    </w:p>
-    <w:p>
-      <w:pPr>
-        <w:pStyle w:val="BodyText"/>
-        <w:bidi w:val="0"/>
-        <w:jc w:val="left"/>
-        <w:rPr/>
-      </w:pPr>
-      <w:r>
-        <w:rPr>
-          <w:rStyle w:val="Emphasis"/>
-        </w:rPr>
-        <w:t>Note.</w:t>
-      </w:r>
-      <w:r>
-        <w:rPr/>
-        <w:t xml:space="preserve"> FA peaks in deep white matter and declines toward the hippocampal end. VTA = ventral tegmental area.</w:t>
-      </w:r>
-    </w:p>
-    <w:p>
-      <w:pPr>
-        <w:pStyle w:val="BodyText"/>
-        <w:bidi w:val="0"/>
-        <w:jc w:val="left"/>
-        <w:rPr/>
-      </w:pPr>
-      <w:r>
-        <w:rPr>
-          <w:rStyle w:val="Strong"/>
-        </w:rPr>
-        <w:t>Figure S15</w:t>
-      </w:r>
-    </w:p>
-    <w:p>
-      <w:pPr>
-        <w:pStyle w:val="BodyText"/>
-        <w:bidi w:val="0"/>
-        <w:jc w:val="left"/>
-        <w:rPr/>
-      </w:pPr>
-      <w:r>
-        <w:rPr>
-          <w:rStyle w:val="Emphasis"/>
-        </w:rPr>
-        <w:t>NODDI Indices Along the Same Bundle</w:t>
-      </w:r>
-    </w:p>
-    <w:p>
-      <w:pPr>
-        <w:pStyle w:val="BodyText"/>
-        <w:bidi w:val="0"/>
-        <w:jc w:val="left"/>
-        <w:rPr/>
-      </w:pPr>
-      <w:r>
-        <w:rPr/>
-        <w:drawing>
-          <wp:inline distT="0" distB="0" distL="0" distR="0">
-            <wp:extent cx="5334000" cy="3762375"/>
-            <wp:effectExtent l="0" t="0" r="0" b="0"/>
-            <wp:docPr id="16" name="Image16" descr="NDI profile"/>
-            <wp:cNvGraphicFramePr>
-              <a:graphicFrameLocks xmlns:a="http://schemas.openxmlformats.org/drawingml/2006/main" noChangeAspect="1"/>
-            </wp:cNvGraphicFramePr>
-            <a:graphic xmlns:a="http://schemas.openxmlformats.org/drawingml/2006/main">
-              <a:graphicData uri="http://schemas.openxmlformats.org/drawingml/2006/picture">
-                <pic:pic xmlns:pic="http://schemas.openxmlformats.org/drawingml/2006/picture">
-                  <pic:nvPicPr>
-                    <pic:cNvPr id="16" name="Image16" descr="NDI profile"/>
                     <pic:cNvPicPr>
                       <a:picLocks noChangeAspect="1" noChangeArrowheads="1"/>
                     </pic:cNvPicPr>
@@ -15176,6 +15093,101 @@
         <w:rPr/>
       </w:pPr>
       <w:r>
+        <w:rPr>
+          <w:rStyle w:val="Emphasis"/>
+        </w:rPr>
+        <w:t>Note.</w:t>
+      </w:r>
+      <w:r>
+        <w:rPr/>
+        <w:t xml:space="preserve"> FA peaks in deep white matter and declines toward the hippocampal end. VTA = ventral tegmental area.</w:t>
+      </w:r>
+    </w:p>
+    <w:p>
+      <w:pPr>
+        <w:pStyle w:val="BodyText"/>
+        <w:bidi w:val="0"/>
+        <w:jc w:val="left"/>
+        <w:rPr/>
+      </w:pPr>
+      <w:r>
+        <w:rPr>
+          <w:rStyle w:val="Strong"/>
+        </w:rPr>
+        <w:t>Figure S15</w:t>
+      </w:r>
+    </w:p>
+    <w:p>
+      <w:pPr>
+        <w:pStyle w:val="BodyText"/>
+        <w:bidi w:val="0"/>
+        <w:jc w:val="left"/>
+        <w:rPr/>
+      </w:pPr>
+      <w:r>
+        <w:rPr>
+          <w:rStyle w:val="Emphasis"/>
+        </w:rPr>
+        <w:t>NODDI Indices Along the Same Bundle</w:t>
+      </w:r>
+    </w:p>
+    <w:p>
+      <w:pPr>
+        <w:pStyle w:val="BodyText"/>
+        <w:bidi w:val="0"/>
+        <w:jc w:val="left"/>
+        <w:rPr/>
+      </w:pPr>
+      <w:r>
+        <w:rPr/>
+        <w:drawing>
+          <wp:inline distT="0" distB="0" distL="0" distR="0">
+            <wp:extent cx="5334000" cy="3762375"/>
+            <wp:effectExtent l="0" t="0" r="0" b="0"/>
+            <wp:docPr id="16" name="Image16" descr="NDI profile"/>
+            <wp:cNvGraphicFramePr>
+              <a:graphicFrameLocks xmlns:a="http://schemas.openxmlformats.org/drawingml/2006/main" noChangeAspect="1"/>
+            </wp:cNvGraphicFramePr>
+            <a:graphic xmlns:a="http://schemas.openxmlformats.org/drawingml/2006/main">
+              <a:graphicData uri="http://schemas.openxmlformats.org/drawingml/2006/picture">
+                <pic:pic xmlns:pic="http://schemas.openxmlformats.org/drawingml/2006/picture">
+                  <pic:nvPicPr>
+                    <pic:cNvPr id="16" name="Image16" descr="NDI profile"/>
+                    <pic:cNvPicPr>
+                      <a:picLocks noChangeAspect="1" noChangeArrowheads="1"/>
+                    </pic:cNvPicPr>
+                  </pic:nvPicPr>
+                  <pic:blipFill>
+                    <a:blip r:embed="rId29"/>
+                    <a:stretch>
+                      <a:fillRect/>
+                    </a:stretch>
+                  </pic:blipFill>
+                  <pic:spPr bwMode="auto">
+                    <a:xfrm>
+                      <a:off x="0" y="0"/>
+                      <a:ext cx="5334000" cy="3762375"/>
+                    </a:xfrm>
+                    <a:prstGeom prst="rect">
+                      <a:avLst/>
+                    </a:prstGeom>
+                    <a:noFill/>
+                  </pic:spPr>
+                </pic:pic>
+              </a:graphicData>
+            </a:graphic>
+          </wp:inline>
+        </w:drawing>
+      </w:r>
+    </w:p>
+    <w:p>
+      <w:pPr>
+        <w:pStyle w:val="BodyText"/>
+        <w:bidi w:val="0"/>
+        <w:jc w:val="left"/>
+        <w:rPr/>
+      </w:pPr>
+      <w:r>
         <w:rPr/>
         <w:drawing>
           <wp:inline distT="0" distB="0" distL="0" distR="0">
@@ -15195,7 +15207,7 @@
                     </pic:cNvPicPr>
                   </pic:nvPicPr>
                   <pic:blipFill>
-                    <a:blip r:embed="rId29"/>
+                    <a:blip r:embed="rId30"/>
                     <a:stretch>
                       <a:fillRect/>
                     </a:stretch>
@@ -15239,101 +15251,6 @@
                 <pic:pic xmlns:pic="http://schemas.openxmlformats.org/drawingml/2006/picture">
                   <pic:nvPicPr>
                     <pic:cNvPr id="18" name="Image18" descr="FWF profile"/>
-                    <pic:cNvPicPr>
-                      <a:picLocks noChangeAspect="1" noChangeArrowheads="1"/>
-                    </pic:cNvPicPr>
-                  </pic:nvPicPr>
-                  <pic:blipFill>
-                    <a:blip r:embed="rId30"/>
-                    <a:stretch>
-                      <a:fillRect/>
-                    </a:stretch>
-                  </pic:blipFill>
-                  <pic:spPr bwMode="auto">
-                    <a:xfrm>
-                      <a:off x="0" y="0"/>
-                      <a:ext cx="5334000" cy="3762375"/>
-                    </a:xfrm>
-                    <a:prstGeom prst="rect">
-                      <a:avLst/>
-                    </a:prstGeom>
-                    <a:noFill/>
-                  </pic:spPr>
-                </pic:pic>
-              </a:graphicData>
-            </a:graphic>
-          </wp:inline>
-        </w:drawing>
-      </w:r>
-    </w:p>
-    <w:p>
-      <w:pPr>
-        <w:pStyle w:val="BodyText"/>
-        <w:bidi w:val="0"/>
-        <w:jc w:val="left"/>
-        <w:rPr/>
-      </w:pPr>
-      <w:r>
-        <w:rPr>
-          <w:rStyle w:val="Emphasis"/>
-        </w:rPr>
-        <w:t>Note.</w:t>
-      </w:r>
-      <w:r>
-        <w:rPr/>
-        <w:t xml:space="preserve"> NDI (top), ODI (middle) and FWF (bottom). NDI is high near the VTA and increases again toward the hippocampus; ODI is higher at both ends where fibres fan; FWF rises sharply at the hippocampal end adjacent to cerebrospinal fluid.</w:t>
-      </w:r>
-    </w:p>
-    <w:p>
-      <w:pPr>
-        <w:pStyle w:val="BodyText"/>
-        <w:bidi w:val="0"/>
-        <w:jc w:val="left"/>
-        <w:rPr/>
-      </w:pPr>
-      <w:r>
-        <w:rPr>
-          <w:rStyle w:val="Strong"/>
-        </w:rPr>
-        <w:t>Figure S16</w:t>
-      </w:r>
-    </w:p>
-    <w:p>
-      <w:pPr>
-        <w:pStyle w:val="BodyText"/>
-        <w:bidi w:val="0"/>
-        <w:jc w:val="left"/>
-        <w:rPr/>
-      </w:pPr>
-      <w:r>
-        <w:rPr>
-          <w:rStyle w:val="Emphasis"/>
-        </w:rPr>
-        <w:t>NDI Along the Anterior Tract for the Same Participant</w:t>
-      </w:r>
-    </w:p>
-    <w:p>
-      <w:pPr>
-        <w:pStyle w:val="BodyText"/>
-        <w:bidi w:val="0"/>
-        <w:jc w:val="left"/>
-        <w:rPr/>
-      </w:pPr>
-      <w:r>
-        <w:rPr/>
-        <w:drawing>
-          <wp:inline distT="0" distB="0" distL="0" distR="0">
-            <wp:extent cx="5334000" cy="3762375"/>
-            <wp:effectExtent l="0" t="0" r="0" b="0"/>
-            <wp:docPr id="19" name="Image19" descr="NDI profile, anterior tract"/>
-            <wp:cNvGraphicFramePr>
-              <a:graphicFrameLocks xmlns:a="http://schemas.openxmlformats.org/drawingml/2006/main" noChangeAspect="1"/>
-            </wp:cNvGraphicFramePr>
-            <a:graphic xmlns:a="http://schemas.openxmlformats.org/drawingml/2006/main">
-              <a:graphicData uri="http://schemas.openxmlformats.org/drawingml/2006/picture">
-                <pic:pic xmlns:pic="http://schemas.openxmlformats.org/drawingml/2006/picture">
-                  <pic:nvPicPr>
-                    <pic:cNvPr id="19" name="Image19" descr="NDI profile, anterior tract"/>
                     <pic:cNvPicPr>
                       <a:picLocks noChangeAspect="1" noChangeArrowheads="1"/>
                     </pic:cNvPicPr>
@@ -15376,6 +15293,101 @@
       </w:r>
       <w:r>
         <w:rPr/>
+        <w:t xml:space="preserve"> NDI (top), ODI (middle) and FWF (bottom). NDI is high near the VTA and increases again toward the hippocampus; ODI is higher at both ends where fibres fan; FWF rises sharply at the hippocampal end adjacent to cerebrospinal fluid.</w:t>
+      </w:r>
+    </w:p>
+    <w:p>
+      <w:pPr>
+        <w:pStyle w:val="BodyText"/>
+        <w:bidi w:val="0"/>
+        <w:jc w:val="left"/>
+        <w:rPr/>
+      </w:pPr>
+      <w:r>
+        <w:rPr>
+          <w:rStyle w:val="Strong"/>
+        </w:rPr>
+        <w:t>Figure S16</w:t>
+      </w:r>
+    </w:p>
+    <w:p>
+      <w:pPr>
+        <w:pStyle w:val="BodyText"/>
+        <w:bidi w:val="0"/>
+        <w:jc w:val="left"/>
+        <w:rPr/>
+      </w:pPr>
+      <w:r>
+        <w:rPr>
+          <w:rStyle w:val="Emphasis"/>
+        </w:rPr>
+        <w:t>NDI Along the Anterior Tract for the Same Participant</w:t>
+      </w:r>
+    </w:p>
+    <w:p>
+      <w:pPr>
+        <w:pStyle w:val="BodyText"/>
+        <w:bidi w:val="0"/>
+        <w:jc w:val="left"/>
+        <w:rPr/>
+      </w:pPr>
+      <w:r>
+        <w:rPr/>
+        <w:drawing>
+          <wp:inline distT="0" distB="0" distL="0" distR="0">
+            <wp:extent cx="5334000" cy="3762375"/>
+            <wp:effectExtent l="0" t="0" r="0" b="0"/>
+            <wp:docPr id="19" name="Image19" descr="NDI profile, anterior tract"/>
+            <wp:cNvGraphicFramePr>
+              <a:graphicFrameLocks xmlns:a="http://schemas.openxmlformats.org/drawingml/2006/main" noChangeAspect="1"/>
+            </wp:cNvGraphicFramePr>
+            <a:graphic xmlns:a="http://schemas.openxmlformats.org/drawingml/2006/main">
+              <a:graphicData uri="http://schemas.openxmlformats.org/drawingml/2006/picture">
+                <pic:pic xmlns:pic="http://schemas.openxmlformats.org/drawingml/2006/picture">
+                  <pic:nvPicPr>
+                    <pic:cNvPr id="19" name="Image19" descr="NDI profile, anterior tract"/>
+                    <pic:cNvPicPr>
+                      <a:picLocks noChangeAspect="1" noChangeArrowheads="1"/>
+                    </pic:cNvPicPr>
+                  </pic:nvPicPr>
+                  <pic:blipFill>
+                    <a:blip r:embed="rId32"/>
+                    <a:stretch>
+                      <a:fillRect/>
+                    </a:stretch>
+                  </pic:blipFill>
+                  <pic:spPr bwMode="auto">
+                    <a:xfrm>
+                      <a:off x="0" y="0"/>
+                      <a:ext cx="5334000" cy="3762375"/>
+                    </a:xfrm>
+                    <a:prstGeom prst="rect">
+                      <a:avLst/>
+                    </a:prstGeom>
+                    <a:noFill/>
+                  </pic:spPr>
+                </pic:pic>
+              </a:graphicData>
+            </a:graphic>
+          </wp:inline>
+        </w:drawing>
+      </w:r>
+    </w:p>
+    <w:p>
+      <w:pPr>
+        <w:pStyle w:val="BodyText"/>
+        <w:bidi w:val="0"/>
+        <w:jc w:val="left"/>
+        <w:rPr/>
+      </w:pPr>
+      <w:r>
+        <w:rPr>
+          <w:rStyle w:val="Emphasis"/>
+        </w:rPr>
+        <w:t>Note.</w:t>
+      </w:r>
+      <w:r>
+        <w:rPr/>
         <w:t xml:space="preserve"> The anterior tract shares the early trajectory and diverges late.</w:t>
       </w:r>
     </w:p>
@@ -16835,7 +16847,7 @@
         <w:jc w:val="left"/>
         <w:rPr/>
       </w:pPr>
-      <w:hyperlink r:id="rId32">
+      <w:hyperlink r:id="rId33">
         <w:r>
           <w:rPr>
             <w:rStyle w:val="Hyperlink"/>
@@ -16850,7 +16862,7 @@
         <w:rPr/>
         <w:t xml:space="preserve"> · </w:t>
       </w:r>
-      <w:hyperlink r:id="rId33">
+      <w:hyperlink r:id="rId34">
         <w:r>
           <w:rPr>
             <w:rStyle w:val="Hyperlink"/>
@@ -22253,7 +22265,65 @@
       </w:pPr>
       <w:r>
         <w:rPr/>
-        <w:t xml:space="preserve">When preprocessing ends at the tensor fit, as in the TUBRIC pipeline, the following MRtrix3 commands produce the normalized white-matter fibre orientation distribution (FOD) image required by the workflow. Response functions are estimated per participant with the unsupervised method of Dhollander et al. (2016), averaged across participants, and used for multi-shell multi-tissue constrained spherical deconvolution (Jeurissen et al., 2014) followed by intensity normalisation (Raffelt et al., 2017). The script </w:t>
+        <w:t xml:space="preserve">The </w:t>
+      </w:r>
+      <w:hyperlink r:id="rId35">
+        <w:r>
+          <w:rPr>
+            <w:rStyle w:val="Hyperlink"/>
+          </w:rPr>
+          <w:t>Diffusion MRI Preprocessing tutorial</w:t>
+        </w:r>
+      </w:hyperlink>
+      <w:r>
+        <w:rPr/>
+        <w:t xml:space="preserve"> covers this as its Steps 11 and 12 (</w:t>
+      </w:r>
+      <w:hyperlink r:id="rId36">
+        <w:r>
+          <w:rPr>
+            <w:rStyle w:val="Hyperlink"/>
+          </w:rPr>
+          <w:t>response functions</w:t>
+        </w:r>
+      </w:hyperlink>
+      <w:r>
+        <w:rPr/>
+        <w:t xml:space="preserve">, </w:t>
+      </w:r>
+      <w:hyperlink r:id="rId37">
+        <w:r>
+          <w:rPr>
+            <w:rStyle w:val="Hyperlink"/>
+          </w:rPr>
+          <w:t>FOD estimation</w:t>
+        </w:r>
+      </w:hyperlink>
+      <w:r>
+        <w:rPr/>
+        <w:t xml:space="preserve">) and is the fuller description. The commands are repeated here for readers whose preprocessing ended at the tensor fit and who arrive without a </w:t>
+      </w:r>
+      <w:r>
+        <w:rPr>
+          <w:rStyle w:val="SourceText"/>
+        </w:rPr>
+        <w:t>wm_fod_norm.mif</w:t>
+      </w:r>
+      <w:r>
+        <w:rPr/>
+        <w:t>.</w:t>
+      </w:r>
+    </w:p>
+    <w:p>
+      <w:pPr>
+        <w:pStyle w:val="BodyText"/>
+        <w:bidi w:val="0"/>
+        <w:jc w:val="left"/>
+        <w:rPr/>
+      </w:pPr>
+      <w:r>
+        <w:rPr/>
+        <w:t xml:space="preserve">Response functions are estimated per participant with the unsupervised method of Dhollander et al. (2016), averaged across participants, and used for multi-shell multi-tissue constrained spherical deconvolution (Jeurissen et al., 2014) followed by intensity normalisation (Raffelt et al., 2017). The group average ties the cohort together: adding participants later changes it, so their fibre orientation distributions are comparable with the earlier ones only if every participant is refitted. The script </w:t>
       </w:r>
       <w:r>
         <w:rPr>
@@ -24073,7 +24143,7 @@
         <w:rPr/>
         <w:t xml:space="preserve">The scripts from which these were generalized are in the </w:t>
       </w:r>
-      <w:hyperlink r:id="rId34">
+      <w:hyperlink r:id="rId38">
         <w:r>
           <w:rPr>
             <w:rStyle w:val="Hyperlink"/>
@@ -24120,7 +24190,7 @@
         <w:rPr/>
         <w:t xml:space="preserve">The whole tutorial is also available as a single document, with tables and figures numbered S1, S2 and so on and the scripts in an appendix: </w:t>
       </w:r>
-      <w:hyperlink r:id="rId35">
+      <w:hyperlink r:id="rId39">
         <w:r>
           <w:rPr>
             <w:rStyle w:val="Hyperlink"/>
@@ -24132,7 +24202,7 @@
         <w:rPr/>
         <w:t xml:space="preserve"> and </w:t>
       </w:r>
-      <w:hyperlink r:id="rId36">
+      <w:hyperlink r:id="rId40">
         <w:r>
           <w:rPr>
             <w:rStyle w:val="Hyperlink"/>
@@ -25387,7 +25457,7 @@
         <w:rPr/>
         <w:t xml:space="preserve">(1), 26–41. </w:t>
       </w:r>
-      <w:hyperlink r:id="rId37">
+      <w:hyperlink r:id="rId41">
         <w:r>
           <w:rPr>
             <w:rStyle w:val="Hyperlink"/>
@@ -25417,7 +25487,7 @@
         <w:rPr/>
         <w:t xml:space="preserve">, 32–44. </w:t>
       </w:r>
-      <w:hyperlink r:id="rId38">
+      <w:hyperlink r:id="rId42">
         <w:r>
           <w:rPr>
             <w:rStyle w:val="Hyperlink"/>
@@ -25469,7 +25539,7 @@
         <w:rPr/>
         <w:t xml:space="preserve">(7), 1256–1265. </w:t>
       </w:r>
-      <w:hyperlink r:id="rId39">
+      <w:hyperlink r:id="rId43">
         <w:r>
           <w:rPr>
             <w:rStyle w:val="Hyperlink"/>
@@ -25499,7 +25569,7 @@
         <w:rPr/>
         <w:t xml:space="preserve">(4), 292–298. </w:t>
       </w:r>
-      <w:hyperlink r:id="rId40">
+      <w:hyperlink r:id="rId44">
         <w:r>
           <w:rPr>
             <w:rStyle w:val="Hyperlink"/>
@@ -25529,7 +25599,7 @@
         <w:rPr/>
         <w:t xml:space="preserve">, 175. </w:t>
       </w:r>
-      <w:hyperlink r:id="rId41">
+      <w:hyperlink r:id="rId45">
         <w:r>
           <w:rPr>
             <w:rStyle w:val="Hyperlink"/>
@@ -25559,7 +25629,7 @@
         <w:rPr/>
         <w:t xml:space="preserve">, 8. </w:t>
       </w:r>
-      <w:hyperlink r:id="rId42">
+      <w:hyperlink r:id="rId46">
         <w:r>
           <w:rPr>
             <w:rStyle w:val="Hyperlink"/>
@@ -25589,7 +25659,7 @@
         <w:rPr/>
         <w:t xml:space="preserve">, 119474. </w:t>
       </w:r>
-      <w:hyperlink r:id="rId43">
+      <w:hyperlink r:id="rId47">
         <w:r>
           <w:rPr>
             <w:rStyle w:val="Hyperlink"/>
@@ -25619,7 +25689,7 @@
         <w:rPr/>
         <w:t xml:space="preserve">(2), 782–790. </w:t>
       </w:r>
-      <w:hyperlink r:id="rId44">
+      <w:hyperlink r:id="rId48">
         <w:r>
           <w:rPr>
             <w:rStyle w:val="Hyperlink"/>
@@ -25649,7 +25719,7 @@
         <w:rPr/>
         <w:t xml:space="preserve">, 411–426. </w:t>
       </w:r>
-      <w:hyperlink r:id="rId45">
+      <w:hyperlink r:id="rId49">
         <w:r>
           <w:rPr>
             <w:rStyle w:val="Hyperlink"/>
@@ -25679,7 +25749,7 @@
         <w:rPr/>
         <w:t xml:space="preserve">(1). </w:t>
       </w:r>
-      <w:hyperlink r:id="rId46">
+      <w:hyperlink r:id="rId50">
         <w:r>
           <w:rPr>
             <w:rStyle w:val="Hyperlink"/>
@@ -25709,7 +25779,7 @@
         <w:rPr/>
         <w:t xml:space="preserve">(2–3), 155–171. </w:t>
       </w:r>
-      <w:hyperlink r:id="rId47">
+      <w:hyperlink r:id="rId51">
         <w:r>
           <w:rPr>
             <w:rStyle w:val="Hyperlink"/>
@@ -25739,7 +25809,7 @@
         <w:rPr/>
         <w:t xml:space="preserve">, 580–589. </w:t>
       </w:r>
-      <w:hyperlink r:id="rId48">
+      <w:hyperlink r:id="rId52">
         <w:r>
           <w:rPr>
             <w:rStyle w:val="Hyperlink"/>
@@ -25769,7 +25839,7 @@
         <w:rPr/>
         <w:t xml:space="preserve">, 118749. </w:t>
       </w:r>
-      <w:hyperlink r:id="rId49">
+      <w:hyperlink r:id="rId53">
         <w:r>
           <w:rPr>
             <w:rStyle w:val="Hyperlink"/>
@@ -25799,7 +25869,7 @@
         <w:rPr/>
         <w:t xml:space="preserve">, 180063. </w:t>
       </w:r>
-      <w:hyperlink r:id="rId50">
+      <w:hyperlink r:id="rId54">
         <w:r>
           <w:rPr>
             <w:rStyle w:val="Hyperlink"/>
@@ -25873,7 +25943,7 @@
         <w:rPr/>
         <w:t xml:space="preserve">, 116137. </w:t>
       </w:r>
-      <w:hyperlink r:id="rId51">
+      <w:hyperlink r:id="rId55">
         <w:r>
           <w:rPr>
             <w:rStyle w:val="Hyperlink"/>
@@ -25903,7 +25973,7 @@
         <w:rPr/>
         <w:t xml:space="preserve">, 1155–1167. </w:t>
       </w:r>
-      <w:hyperlink r:id="rId52">
+      <w:hyperlink r:id="rId56">
         <w:r>
           <w:rPr>
             <w:rStyle w:val="Hyperlink"/>
@@ -25933,7 +26003,7 @@
         <w:rPr/>
         <w:t xml:space="preserve">(5), 1165–1177. </w:t>
       </w:r>
-      <w:hyperlink r:id="rId53">
+      <w:hyperlink r:id="rId57">
         <w:r>
           <w:rPr>
             <w:rStyle w:val="Hyperlink"/>
@@ -25963,7 +26033,7 @@
         <w:rPr/>
         <w:t xml:space="preserve">, 318–331. </w:t>
       </w:r>
-      <w:hyperlink r:id="rId54">
+      <w:hyperlink r:id="rId58">
         <w:r>
           <w:rPr>
             <w:rStyle w:val="Hyperlink"/>
@@ -25993,7 +26063,7 @@
         <w:rPr/>
         <w:t xml:space="preserve">, 239–253. </w:t>
       </w:r>
-      <w:hyperlink r:id="rId55">
+      <w:hyperlink r:id="rId59">
         <w:r>
           <w:rPr>
             <w:rStyle w:val="Hyperlink"/>
@@ -26023,7 +26093,7 @@
         <w:rPr/>
         <w:t xml:space="preserve">, 381–397. </w:t>
       </w:r>
-      <w:hyperlink r:id="rId56">
+      <w:hyperlink r:id="rId60">
         <w:r>
           <w:rPr>
             <w:rStyle w:val="Hyperlink"/>
@@ -26053,7 +26123,7 @@
         <w:rPr/>
         <w:t xml:space="preserve">(11), e49790. </w:t>
       </w:r>
-      <w:hyperlink r:id="rId57">
+      <w:hyperlink r:id="rId61">
         <w:r>
           <w:rPr>
             <w:rStyle w:val="Hyperlink"/>
@@ -26083,7 +26153,7 @@
         <w:rPr/>
         <w:t xml:space="preserve">(4), 1000–1016. </w:t>
       </w:r>
-      <w:hyperlink r:id="rId58">
+      <w:hyperlink r:id="rId62">
         <w:r>
           <w:rPr>
             <w:rStyle w:val="Hyperlink"/>

</xml_diff>

<commit_message>
Cut a lead-in sentence that repeated its own heading
</commit_message>
<xml_diff>
--- a/static/supplement/MesoConnect_Supplementary_Methods.docx
+++ b/static/supplement/MesoConnect_Supplementary_Methods.docx
@@ -987,18 +987,6 @@
       <w:r>
         <w:rPr/>
         <w:t>Modes of use</w:t>
-      </w:r>
-    </w:p>
-    <w:p>
-      <w:pPr>
-        <w:pStyle w:val="BodyText"/>
-        <w:bidi w:val="0"/>
-        <w:jc w:val="left"/>
-        <w:rPr/>
-      </w:pPr>
-      <w:r>
-        <w:rPr/>
-        <w:t>Three modes of use are supported.</w:t>
       </w:r>
     </w:p>
     <w:p>

</xml_diff>

<commit_message>
Rename the atlas figure so the new version is not served from cache
The file name never changed, so browsers held the earlier plate at the same
URL. The corrected one now has its own name.
</commit_message>
<xml_diff>
--- a/static/supplement/MesoConnect_Supplementary_Methods.docx
+++ b/static/supplement/MesoConnect_Supplementary_Methods.docx
@@ -4815,7 +4815,31 @@
       </w:pPr>
       <w:r>
         <w:rPr/>
-        <w:t xml:space="preserve">Table S7 lists the per-participant inputs. When the T1 image is already aligned to the diffusion image, as in Human Connectome Project data, no affine matrix is needed: </w:t>
+        <w:t xml:space="preserve">Every input below comes from preprocessing; the </w:t>
+      </w:r>
+      <w:hyperlink r:id="rId14">
+        <w:r>
+          <w:rPr>
+            <w:rStyle w:val="Hyperlink"/>
+          </w:rPr>
+          <w:t>Diffusion MRI Preprocessing tutorial</w:t>
+        </w:r>
+      </w:hyperlink>
+      <w:r>
+        <w:rPr/>
+        <w:t xml:space="preserve"> produces them, and its </w:t>
+      </w:r>
+      <w:hyperlink r:id="rId15">
+        <w:r>
+          <w:rPr>
+            <w:rStyle w:val="Hyperlink"/>
+          </w:rPr>
+          <w:t>required outputs page</w:t>
+        </w:r>
+      </w:hyperlink>
+      <w:r>
+        <w:rPr/>
+        <w:t xml:space="preserve"> names the step that writes each one. Table S7 lists them per participant. When the T1 image is already aligned to the diffusion image, as in Human Connectome Project data, no affine matrix is needed: </w:t>
       </w:r>
       <w:r>
         <w:rPr>
@@ -6502,7 +6526,19 @@
       </w:pPr>
       <w:r>
         <w:rPr/>
-        <w:t>If the T1 image has not been skull-stripped, this should be done first; atlas construction used SynthStrip (Hoopes et al., 2022) and the example dataset used ANTs brain extraction. If the T1 image is already aligned to the diffusion image, this warp is the only transform required (</w:t>
+        <w:t>If the T1 image has not been skull-stripped, this should be done first (</w:t>
+      </w:r>
+      <w:hyperlink r:id="rId16">
+        <w:r>
+          <w:rPr>
+            <w:rStyle w:val="Hyperlink"/>
+          </w:rPr>
+          <w:t>Diffusion MRI Preprocessing</w:t>
+        </w:r>
+      </w:hyperlink>
+      <w:r>
+        <w:rPr/>
+        <w:t>); atlas construction used SynthStrip (Hoopes et al., 2022) and the example dataset used ANTs brain extraction. If the T1 image is already aligned to the diffusion image, this warp is the only transform required (</w:t>
       </w:r>
       <w:r>
         <w:rPr>
@@ -7390,7 +7426,7 @@
                     </pic:cNvPicPr>
                   </pic:nvPicPr>
                   <pic:blipFill>
-                    <a:blip r:embed="rId14"/>
+                    <a:blip r:embed="rId17"/>
                     <a:stretch>
                       <a:fillRect/>
                     </a:stretch>
@@ -7434,245 +7470,6 @@
                 <pic:pic xmlns:pic="http://schemas.openxmlformats.org/drawingml/2006/picture">
                   <pic:nvPicPr>
                     <pic:cNvPr id="3" name="Image3" descr="Magnified view of the warped left VTA"/>
-                    <pic:cNvPicPr>
-                      <a:picLocks noChangeAspect="1" noChangeArrowheads="1"/>
-                    </pic:cNvPicPr>
-                  </pic:nvPicPr>
-                  <pic:blipFill>
-                    <a:blip r:embed="rId15"/>
-                    <a:stretch>
-                      <a:fillRect/>
-                    </a:stretch>
-                  </pic:blipFill>
-                  <pic:spPr bwMode="auto">
-                    <a:xfrm>
-                      <a:off x="0" y="0"/>
-                      <a:ext cx="5334000" cy="1771650"/>
-                    </a:xfrm>
-                    <a:prstGeom prst="rect">
-                      <a:avLst/>
-                    </a:prstGeom>
-                    <a:noFill/>
-                  </pic:spPr>
-                </pic:pic>
-              </a:graphicData>
-            </a:graphic>
-          </wp:inline>
-        </w:drawing>
-      </w:r>
-    </w:p>
-    <w:p>
-      <w:pPr>
-        <w:pStyle w:val="BodyText"/>
-        <w:bidi w:val="0"/>
-        <w:jc w:val="left"/>
-        <w:rPr/>
-      </w:pPr>
-      <w:r>
-        <w:rPr>
-          <w:rStyle w:val="Emphasis"/>
-        </w:rPr>
-        <w:t>Note.</w:t>
-      </w:r>
-      <w:r>
-        <w:rPr/>
-        <w:t xml:space="preserve"> Whole-brain view (top) and magnified view (bottom), example dataset.</w:t>
-      </w:r>
-    </w:p>
-    <w:p>
-      <w:pPr>
-        <w:pStyle w:val="BodyText"/>
-        <w:bidi w:val="0"/>
-        <w:jc w:val="left"/>
-        <w:rPr/>
-      </w:pPr>
-      <w:r>
-        <w:rPr>
-          <w:rStyle w:val="Strong"/>
-        </w:rPr>
-        <w:t>Figure S4</w:t>
-      </w:r>
-    </w:p>
-    <w:p>
-      <w:pPr>
-        <w:pStyle w:val="BodyText"/>
-        <w:bidi w:val="0"/>
-        <w:jc w:val="left"/>
-        <w:rPr/>
-      </w:pPr>
-      <w:r>
-        <w:rPr>
-          <w:rStyle w:val="Emphasis"/>
-        </w:rPr>
-        <w:t>Warped Left Hippocampus Target and Left VTA → Hippocampus Atlas</w:t>
-      </w:r>
-    </w:p>
-    <w:p>
-      <w:pPr>
-        <w:pStyle w:val="BodyText"/>
-        <w:bidi w:val="0"/>
-        <w:jc w:val="left"/>
-        <w:rPr/>
-      </w:pPr>
-      <w:r>
-        <w:rPr/>
-        <w:drawing>
-          <wp:inline distT="0" distB="0" distL="0" distR="0">
-            <wp:extent cx="5334000" cy="1771650"/>
-            <wp:effectExtent l="0" t="0" r="0" b="0"/>
-            <wp:docPr id="4" name="Image4" descr="Magnified view of the warped left hippocampus"/>
-            <wp:cNvGraphicFramePr>
-              <a:graphicFrameLocks xmlns:a="http://schemas.openxmlformats.org/drawingml/2006/main" noChangeAspect="1"/>
-            </wp:cNvGraphicFramePr>
-            <a:graphic xmlns:a="http://schemas.openxmlformats.org/drawingml/2006/main">
-              <a:graphicData uri="http://schemas.openxmlformats.org/drawingml/2006/picture">
-                <pic:pic xmlns:pic="http://schemas.openxmlformats.org/drawingml/2006/picture">
-                  <pic:nvPicPr>
-                    <pic:cNvPr id="4" name="Image4" descr="Magnified view of the warped left hippocampus"/>
-                    <pic:cNvPicPr>
-                      <a:picLocks noChangeAspect="1" noChangeArrowheads="1"/>
-                    </pic:cNvPicPr>
-                  </pic:nvPicPr>
-                  <pic:blipFill>
-                    <a:blip r:embed="rId16"/>
-                    <a:stretch>
-                      <a:fillRect/>
-                    </a:stretch>
-                  </pic:blipFill>
-                  <pic:spPr bwMode="auto">
-                    <a:xfrm>
-                      <a:off x="0" y="0"/>
-                      <a:ext cx="5334000" cy="1771650"/>
-                    </a:xfrm>
-                    <a:prstGeom prst="rect">
-                      <a:avLst/>
-                    </a:prstGeom>
-                    <a:noFill/>
-                  </pic:spPr>
-                </pic:pic>
-              </a:graphicData>
-            </a:graphic>
-          </wp:inline>
-        </w:drawing>
-      </w:r>
-    </w:p>
-    <w:p>
-      <w:pPr>
-        <w:pStyle w:val="BodyText"/>
-        <w:bidi w:val="0"/>
-        <w:jc w:val="left"/>
-        <w:rPr/>
-      </w:pPr>
-      <w:r>
-        <w:rPr/>
-        <w:drawing>
-          <wp:inline distT="0" distB="0" distL="0" distR="0">
-            <wp:extent cx="5334000" cy="1771650"/>
-            <wp:effectExtent l="0" t="0" r="0" b="0"/>
-            <wp:docPr id="5" name="Image5" descr="Magnified view of the warped left atlas"/>
-            <wp:cNvGraphicFramePr>
-              <a:graphicFrameLocks xmlns:a="http://schemas.openxmlformats.org/drawingml/2006/main" noChangeAspect="1"/>
-            </wp:cNvGraphicFramePr>
-            <a:graphic xmlns:a="http://schemas.openxmlformats.org/drawingml/2006/main">
-              <a:graphicData uri="http://schemas.openxmlformats.org/drawingml/2006/picture">
-                <pic:pic xmlns:pic="http://schemas.openxmlformats.org/drawingml/2006/picture">
-                  <pic:nvPicPr>
-                    <pic:cNvPr id="5" name="Image5" descr="Magnified view of the warped left atlas"/>
-                    <pic:cNvPicPr>
-                      <a:picLocks noChangeAspect="1" noChangeArrowheads="1"/>
-                    </pic:cNvPicPr>
-                  </pic:nvPicPr>
-                  <pic:blipFill>
-                    <a:blip r:embed="rId17"/>
-                    <a:stretch>
-                      <a:fillRect/>
-                    </a:stretch>
-                  </pic:blipFill>
-                  <pic:spPr bwMode="auto">
-                    <a:xfrm>
-                      <a:off x="0" y="0"/>
-                      <a:ext cx="5334000" cy="1771650"/>
-                    </a:xfrm>
-                    <a:prstGeom prst="rect">
-                      <a:avLst/>
-                    </a:prstGeom>
-                    <a:noFill/>
-                  </pic:spPr>
-                </pic:pic>
-              </a:graphicData>
-            </a:graphic>
-          </wp:inline>
-        </w:drawing>
-      </w:r>
-    </w:p>
-    <w:p>
-      <w:pPr>
-        <w:pStyle w:val="BodyText"/>
-        <w:bidi w:val="0"/>
-        <w:jc w:val="left"/>
-        <w:rPr/>
-      </w:pPr>
-      <w:r>
-        <w:rPr>
-          <w:rStyle w:val="Emphasis"/>
-        </w:rPr>
-        <w:t>Note.</w:t>
-      </w:r>
-      <w:r>
-        <w:rPr/>
-        <w:t xml:space="preserve"> Hippocampus (top) and atlas at the 50% threshold (bottom), magnified views.</w:t>
-      </w:r>
-    </w:p>
-    <w:p>
-      <w:pPr>
-        <w:pStyle w:val="BodyText"/>
-        <w:bidi w:val="0"/>
-        <w:jc w:val="left"/>
-        <w:rPr/>
-      </w:pPr>
-      <w:r>
-        <w:rPr>
-          <w:rStyle w:val="Strong"/>
-        </w:rPr>
-        <w:t>Figure S5</w:t>
-      </w:r>
-    </w:p>
-    <w:p>
-      <w:pPr>
-        <w:pStyle w:val="BodyText"/>
-        <w:bidi w:val="0"/>
-        <w:jc w:val="left"/>
-        <w:rPr/>
-      </w:pPr>
-      <w:r>
-        <w:rPr>
-          <w:rStyle w:val="Emphasis"/>
-        </w:rPr>
-        <w:t>Orthogonal Render of the Warped Regions</w:t>
-      </w:r>
-    </w:p>
-    <w:p>
-      <w:pPr>
-        <w:pStyle w:val="BodyText"/>
-        <w:bidi w:val="0"/>
-        <w:jc w:val="left"/>
-        <w:rPr/>
-      </w:pPr>
-      <w:r>
-        <w:rPr/>
-        <w:drawing>
-          <wp:inline distT="0" distB="0" distL="0" distR="0">
-            <wp:extent cx="5334000" cy="1771650"/>
-            <wp:effectExtent l="0" t="0" r="0" b="0"/>
-            <wp:docPr id="6" name="Image6" descr="Orthogonal render with VTA, hippocampus and atlas"/>
-            <wp:cNvGraphicFramePr>
-              <a:graphicFrameLocks xmlns:a="http://schemas.openxmlformats.org/drawingml/2006/main" noChangeAspect="1"/>
-            </wp:cNvGraphicFramePr>
-            <a:graphic xmlns:a="http://schemas.openxmlformats.org/drawingml/2006/main">
-              <a:graphicData uri="http://schemas.openxmlformats.org/drawingml/2006/picture">
-                <pic:pic xmlns:pic="http://schemas.openxmlformats.org/drawingml/2006/picture">
-                  <pic:nvPicPr>
-                    <pic:cNvPr id="6" name="Image6" descr="Orthogonal render with VTA, hippocampus and atlas"/>
                     <pic:cNvPicPr>
                       <a:picLocks noChangeAspect="1" noChangeArrowheads="1"/>
                     </pic:cNvPicPr>
@@ -7715,6 +7512,245 @@
       </w:r>
       <w:r>
         <w:rPr/>
+        <w:t xml:space="preserve"> Whole-brain view (top) and magnified view (bottom), example dataset.</w:t>
+      </w:r>
+    </w:p>
+    <w:p>
+      <w:pPr>
+        <w:pStyle w:val="BodyText"/>
+        <w:bidi w:val="0"/>
+        <w:jc w:val="left"/>
+        <w:rPr/>
+      </w:pPr>
+      <w:r>
+        <w:rPr>
+          <w:rStyle w:val="Strong"/>
+        </w:rPr>
+        <w:t>Figure S4</w:t>
+      </w:r>
+    </w:p>
+    <w:p>
+      <w:pPr>
+        <w:pStyle w:val="BodyText"/>
+        <w:bidi w:val="0"/>
+        <w:jc w:val="left"/>
+        <w:rPr/>
+      </w:pPr>
+      <w:r>
+        <w:rPr>
+          <w:rStyle w:val="Emphasis"/>
+        </w:rPr>
+        <w:t>Warped Left Hippocampus Target and Left VTA → Hippocampus Atlas</w:t>
+      </w:r>
+    </w:p>
+    <w:p>
+      <w:pPr>
+        <w:pStyle w:val="BodyText"/>
+        <w:bidi w:val="0"/>
+        <w:jc w:val="left"/>
+        <w:rPr/>
+      </w:pPr>
+      <w:r>
+        <w:rPr/>
+        <w:drawing>
+          <wp:inline distT="0" distB="0" distL="0" distR="0">
+            <wp:extent cx="5334000" cy="1771650"/>
+            <wp:effectExtent l="0" t="0" r="0" b="0"/>
+            <wp:docPr id="4" name="Image4" descr="Magnified view of the warped left hippocampus"/>
+            <wp:cNvGraphicFramePr>
+              <a:graphicFrameLocks xmlns:a="http://schemas.openxmlformats.org/drawingml/2006/main" noChangeAspect="1"/>
+            </wp:cNvGraphicFramePr>
+            <a:graphic xmlns:a="http://schemas.openxmlformats.org/drawingml/2006/main">
+              <a:graphicData uri="http://schemas.openxmlformats.org/drawingml/2006/picture">
+                <pic:pic xmlns:pic="http://schemas.openxmlformats.org/drawingml/2006/picture">
+                  <pic:nvPicPr>
+                    <pic:cNvPr id="4" name="Image4" descr="Magnified view of the warped left hippocampus"/>
+                    <pic:cNvPicPr>
+                      <a:picLocks noChangeAspect="1" noChangeArrowheads="1"/>
+                    </pic:cNvPicPr>
+                  </pic:nvPicPr>
+                  <pic:blipFill>
+                    <a:blip r:embed="rId19"/>
+                    <a:stretch>
+                      <a:fillRect/>
+                    </a:stretch>
+                  </pic:blipFill>
+                  <pic:spPr bwMode="auto">
+                    <a:xfrm>
+                      <a:off x="0" y="0"/>
+                      <a:ext cx="5334000" cy="1771650"/>
+                    </a:xfrm>
+                    <a:prstGeom prst="rect">
+                      <a:avLst/>
+                    </a:prstGeom>
+                    <a:noFill/>
+                  </pic:spPr>
+                </pic:pic>
+              </a:graphicData>
+            </a:graphic>
+          </wp:inline>
+        </w:drawing>
+      </w:r>
+    </w:p>
+    <w:p>
+      <w:pPr>
+        <w:pStyle w:val="BodyText"/>
+        <w:bidi w:val="0"/>
+        <w:jc w:val="left"/>
+        <w:rPr/>
+      </w:pPr>
+      <w:r>
+        <w:rPr/>
+        <w:drawing>
+          <wp:inline distT="0" distB="0" distL="0" distR="0">
+            <wp:extent cx="5334000" cy="1771650"/>
+            <wp:effectExtent l="0" t="0" r="0" b="0"/>
+            <wp:docPr id="5" name="Image5" descr="Magnified view of the warped left atlas"/>
+            <wp:cNvGraphicFramePr>
+              <a:graphicFrameLocks xmlns:a="http://schemas.openxmlformats.org/drawingml/2006/main" noChangeAspect="1"/>
+            </wp:cNvGraphicFramePr>
+            <a:graphic xmlns:a="http://schemas.openxmlformats.org/drawingml/2006/main">
+              <a:graphicData uri="http://schemas.openxmlformats.org/drawingml/2006/picture">
+                <pic:pic xmlns:pic="http://schemas.openxmlformats.org/drawingml/2006/picture">
+                  <pic:nvPicPr>
+                    <pic:cNvPr id="5" name="Image5" descr="Magnified view of the warped left atlas"/>
+                    <pic:cNvPicPr>
+                      <a:picLocks noChangeAspect="1" noChangeArrowheads="1"/>
+                    </pic:cNvPicPr>
+                  </pic:nvPicPr>
+                  <pic:blipFill>
+                    <a:blip r:embed="rId20"/>
+                    <a:stretch>
+                      <a:fillRect/>
+                    </a:stretch>
+                  </pic:blipFill>
+                  <pic:spPr bwMode="auto">
+                    <a:xfrm>
+                      <a:off x="0" y="0"/>
+                      <a:ext cx="5334000" cy="1771650"/>
+                    </a:xfrm>
+                    <a:prstGeom prst="rect">
+                      <a:avLst/>
+                    </a:prstGeom>
+                    <a:noFill/>
+                  </pic:spPr>
+                </pic:pic>
+              </a:graphicData>
+            </a:graphic>
+          </wp:inline>
+        </w:drawing>
+      </w:r>
+    </w:p>
+    <w:p>
+      <w:pPr>
+        <w:pStyle w:val="BodyText"/>
+        <w:bidi w:val="0"/>
+        <w:jc w:val="left"/>
+        <w:rPr/>
+      </w:pPr>
+      <w:r>
+        <w:rPr>
+          <w:rStyle w:val="Emphasis"/>
+        </w:rPr>
+        <w:t>Note.</w:t>
+      </w:r>
+      <w:r>
+        <w:rPr/>
+        <w:t xml:space="preserve"> Hippocampus (top) and atlas at the 50% threshold (bottom), magnified views.</w:t>
+      </w:r>
+    </w:p>
+    <w:p>
+      <w:pPr>
+        <w:pStyle w:val="BodyText"/>
+        <w:bidi w:val="0"/>
+        <w:jc w:val="left"/>
+        <w:rPr/>
+      </w:pPr>
+      <w:r>
+        <w:rPr>
+          <w:rStyle w:val="Strong"/>
+        </w:rPr>
+        <w:t>Figure S5</w:t>
+      </w:r>
+    </w:p>
+    <w:p>
+      <w:pPr>
+        <w:pStyle w:val="BodyText"/>
+        <w:bidi w:val="0"/>
+        <w:jc w:val="left"/>
+        <w:rPr/>
+      </w:pPr>
+      <w:r>
+        <w:rPr>
+          <w:rStyle w:val="Emphasis"/>
+        </w:rPr>
+        <w:t>Orthogonal Render of the Warped Regions</w:t>
+      </w:r>
+    </w:p>
+    <w:p>
+      <w:pPr>
+        <w:pStyle w:val="BodyText"/>
+        <w:bidi w:val="0"/>
+        <w:jc w:val="left"/>
+        <w:rPr/>
+      </w:pPr>
+      <w:r>
+        <w:rPr/>
+        <w:drawing>
+          <wp:inline distT="0" distB="0" distL="0" distR="0">
+            <wp:extent cx="5334000" cy="1771650"/>
+            <wp:effectExtent l="0" t="0" r="0" b="0"/>
+            <wp:docPr id="6" name="Image6" descr="Orthogonal render with VTA, hippocampus and atlas"/>
+            <wp:cNvGraphicFramePr>
+              <a:graphicFrameLocks xmlns:a="http://schemas.openxmlformats.org/drawingml/2006/main" noChangeAspect="1"/>
+            </wp:cNvGraphicFramePr>
+            <a:graphic xmlns:a="http://schemas.openxmlformats.org/drawingml/2006/main">
+              <a:graphicData uri="http://schemas.openxmlformats.org/drawingml/2006/picture">
+                <pic:pic xmlns:pic="http://schemas.openxmlformats.org/drawingml/2006/picture">
+                  <pic:nvPicPr>
+                    <pic:cNvPr id="6" name="Image6" descr="Orthogonal render with VTA, hippocampus and atlas"/>
+                    <pic:cNvPicPr>
+                      <a:picLocks noChangeAspect="1" noChangeArrowheads="1"/>
+                    </pic:cNvPicPr>
+                  </pic:nvPicPr>
+                  <pic:blipFill>
+                    <a:blip r:embed="rId21"/>
+                    <a:stretch>
+                      <a:fillRect/>
+                    </a:stretch>
+                  </pic:blipFill>
+                  <pic:spPr bwMode="auto">
+                    <a:xfrm>
+                      <a:off x="0" y="0"/>
+                      <a:ext cx="5334000" cy="1771650"/>
+                    </a:xfrm>
+                    <a:prstGeom prst="rect">
+                      <a:avLst/>
+                    </a:prstGeom>
+                    <a:noFill/>
+                  </pic:spPr>
+                </pic:pic>
+              </a:graphicData>
+            </a:graphic>
+          </wp:inline>
+        </w:drawing>
+      </w:r>
+    </w:p>
+    <w:p>
+      <w:pPr>
+        <w:pStyle w:val="BodyText"/>
+        <w:bidi w:val="0"/>
+        <w:jc w:val="left"/>
+        <w:rPr/>
+      </w:pPr>
+      <w:r>
+        <w:rPr>
+          <w:rStyle w:val="Emphasis"/>
+        </w:rPr>
+        <w:t>Note.</w:t>
+      </w:r>
+      <w:r>
+        <w:rPr/>
         <w:t xml:space="preserve"> VTA in yellow, hippocampus in red, atlas in green.</w:t>
       </w:r>
     </w:p>
@@ -7785,7 +7821,7 @@
                     </pic:cNvPicPr>
                   </pic:nvPicPr>
                   <pic:blipFill>
-                    <a:blip r:embed="rId19"/>
+                    <a:blip r:embed="rId22"/>
                     <a:stretch>
                       <a:fillRect/>
                     </a:stretch>
@@ -8096,7 +8132,7 @@
                     </pic:cNvPicPr>
                   </pic:nvPicPr>
                   <pic:blipFill>
-                    <a:blip r:embed="rId20"/>
+                    <a:blip r:embed="rId23"/>
                     <a:stretch>
                       <a:fillRect/>
                     </a:stretch>
@@ -10336,7 +10372,7 @@
                     </pic:cNvPicPr>
                   </pic:nvPicPr>
                   <pic:blipFill>
-                    <a:blip r:embed="rId21"/>
+                    <a:blip r:embed="rId24"/>
                     <a:stretch>
                       <a:fillRect/>
                     </a:stretch>
@@ -10431,7 +10467,7 @@
                     </pic:cNvPicPr>
                   </pic:nvPicPr>
                   <pic:blipFill>
-                    <a:blip r:embed="rId22"/>
+                    <a:blip r:embed="rId25"/>
                     <a:stretch>
                       <a:fillRect/>
                     </a:stretch>
@@ -10653,7 +10689,29 @@
       </w:r>
       <w:r>
         <w:rPr/>
-        <w:t xml:space="preserve"> using second-order integration over fibre orientation distributions (iFOD2; Tournier et al., 2010). Seeding is unidirectional from the seed region, the target region is required, and the inverted corridor from Step 3 is supplied as the exclusion mask.</w:t>
+        <w:t xml:space="preserve"> using second-order integration over fibre orientation distributions (iFOD2; Tournier et al., 2010). The FOD image is the last output of preprocessing (</w:t>
+      </w:r>
+      <w:hyperlink r:id="rId26">
+        <w:r>
+          <w:rPr>
+            <w:rStyle w:val="Hyperlink"/>
+          </w:rPr>
+          <w:t>Diffusion MRI Preprocessing</w:t>
+        </w:r>
+      </w:hyperlink>
+      <w:r>
+        <w:rPr/>
+        <w:t xml:space="preserve">, Step 12); </w:t>
+      </w:r>
+      <w:r>
+        <w:rPr>
+          <w:rStyle w:val="SourceText"/>
+        </w:rPr>
+        <w:t>00b_fod_estimation.sh</w:t>
+      </w:r>
+      <w:r>
+        <w:rPr/>
+        <w:t xml:space="preserve"> here is a fallback for data that stopped at the tensor. Seeding is unidirectional from the seed region, the target region is required, and the inverted corridor from Step 3 is supplied as the exclusion mask.</w:t>
       </w:r>
     </w:p>
     <w:p>
@@ -13109,7 +13167,7 @@
                     </pic:cNvPicPr>
                   </pic:nvPicPr>
                   <pic:blipFill>
-                    <a:blip r:embed="rId23"/>
+                    <a:blip r:embed="rId27"/>
                     <a:stretch>
                       <a:fillRect/>
                     </a:stretch>
@@ -13204,7 +13262,7 @@
                     </pic:cNvPicPr>
                   </pic:nvPicPr>
                   <pic:blipFill>
-                    <a:blip r:embed="rId24"/>
+                    <a:blip r:embed="rId28"/>
                     <a:stretch>
                       <a:fillRect/>
                     </a:stretch>
@@ -13762,7 +13820,7 @@
                     </pic:cNvPicPr>
                   </pic:nvPicPr>
                   <pic:blipFill>
-                    <a:blip r:embed="rId25"/>
+                    <a:blip r:embed="rId29"/>
                     <a:stretch>
                       <a:fillRect/>
                     </a:stretch>
@@ -13867,7 +13925,7 @@
                     </pic:cNvPicPr>
                   </pic:nvPicPr>
                   <pic:blipFill>
-                    <a:blip r:embed="rId26"/>
+                    <a:blip r:embed="rId30"/>
                     <a:stretch>
                       <a:fillRect/>
                     </a:stretch>
@@ -13962,7 +14020,7 @@
                     </pic:cNvPicPr>
                   </pic:nvPicPr>
                   <pic:blipFill>
-                    <a:blip r:embed="rId27"/>
+                    <a:blip r:embed="rId31"/>
                     <a:stretch>
                       <a:fillRect/>
                     </a:stretch>
@@ -14747,294 +14805,6 @@
                 <pic:pic xmlns:pic="http://schemas.openxmlformats.org/drawingml/2006/picture">
                   <pic:nvPicPr>
                     <pic:cNvPr id="16" name="Image16" descr="FA profile"/>
-                    <pic:cNvPicPr>
-                      <a:picLocks noChangeAspect="1" noChangeArrowheads="1"/>
-                    </pic:cNvPicPr>
-                  </pic:nvPicPr>
-                  <pic:blipFill>
-                    <a:blip r:embed="rId28"/>
-                    <a:stretch>
-                      <a:fillRect/>
-                    </a:stretch>
-                  </pic:blipFill>
-                  <pic:spPr bwMode="auto">
-                    <a:xfrm>
-                      <a:off x="0" y="0"/>
-                      <a:ext cx="5334000" cy="3762375"/>
-                    </a:xfrm>
-                    <a:prstGeom prst="rect">
-                      <a:avLst/>
-                    </a:prstGeom>
-                    <a:noFill/>
-                  </pic:spPr>
-                </pic:pic>
-              </a:graphicData>
-            </a:graphic>
-          </wp:inline>
-        </w:drawing>
-      </w:r>
-    </w:p>
-    <w:p>
-      <w:pPr>
-        <w:pStyle w:val="BodyText"/>
-        <w:bidi w:val="0"/>
-        <w:jc w:val="left"/>
-        <w:rPr/>
-      </w:pPr>
-      <w:r>
-        <w:rPr>
-          <w:rStyle w:val="Emphasis"/>
-        </w:rPr>
-        <w:t>Note.</w:t>
-      </w:r>
-      <w:r>
-        <w:rPr/>
-        <w:t xml:space="preserve"> FA peaks in deep white matter and declines toward the hippocampal end. VTA = ventral tegmental area.</w:t>
-      </w:r>
-    </w:p>
-    <w:p>
-      <w:pPr>
-        <w:pStyle w:val="BodyText"/>
-        <w:bidi w:val="0"/>
-        <w:jc w:val="left"/>
-        <w:rPr/>
-      </w:pPr>
-      <w:r>
-        <w:rPr>
-          <w:rStyle w:val="Strong"/>
-        </w:rPr>
-        <w:t>Figure S16</w:t>
-      </w:r>
-    </w:p>
-    <w:p>
-      <w:pPr>
-        <w:pStyle w:val="BodyText"/>
-        <w:bidi w:val="0"/>
-        <w:jc w:val="left"/>
-        <w:rPr/>
-      </w:pPr>
-      <w:r>
-        <w:rPr>
-          <w:rStyle w:val="Emphasis"/>
-        </w:rPr>
-        <w:t>NODDI Indices Along the Same Bundle</w:t>
-      </w:r>
-    </w:p>
-    <w:p>
-      <w:pPr>
-        <w:pStyle w:val="BodyText"/>
-        <w:bidi w:val="0"/>
-        <w:jc w:val="left"/>
-        <w:rPr/>
-      </w:pPr>
-      <w:r>
-        <w:rPr/>
-        <w:drawing>
-          <wp:inline distT="0" distB="0" distL="0" distR="0">
-            <wp:extent cx="5334000" cy="3762375"/>
-            <wp:effectExtent l="0" t="0" r="0" b="0"/>
-            <wp:docPr id="17" name="Image17" descr="NDI profile"/>
-            <wp:cNvGraphicFramePr>
-              <a:graphicFrameLocks xmlns:a="http://schemas.openxmlformats.org/drawingml/2006/main" noChangeAspect="1"/>
-            </wp:cNvGraphicFramePr>
-            <a:graphic xmlns:a="http://schemas.openxmlformats.org/drawingml/2006/main">
-              <a:graphicData uri="http://schemas.openxmlformats.org/drawingml/2006/picture">
-                <pic:pic xmlns:pic="http://schemas.openxmlformats.org/drawingml/2006/picture">
-                  <pic:nvPicPr>
-                    <pic:cNvPr id="17" name="Image17" descr="NDI profile"/>
-                    <pic:cNvPicPr>
-                      <a:picLocks noChangeAspect="1" noChangeArrowheads="1"/>
-                    </pic:cNvPicPr>
-                  </pic:nvPicPr>
-                  <pic:blipFill>
-                    <a:blip r:embed="rId29"/>
-                    <a:stretch>
-                      <a:fillRect/>
-                    </a:stretch>
-                  </pic:blipFill>
-                  <pic:spPr bwMode="auto">
-                    <a:xfrm>
-                      <a:off x="0" y="0"/>
-                      <a:ext cx="5334000" cy="3762375"/>
-                    </a:xfrm>
-                    <a:prstGeom prst="rect">
-                      <a:avLst/>
-                    </a:prstGeom>
-                    <a:noFill/>
-                  </pic:spPr>
-                </pic:pic>
-              </a:graphicData>
-            </a:graphic>
-          </wp:inline>
-        </w:drawing>
-      </w:r>
-    </w:p>
-    <w:p>
-      <w:pPr>
-        <w:pStyle w:val="BodyText"/>
-        <w:bidi w:val="0"/>
-        <w:jc w:val="left"/>
-        <w:rPr/>
-      </w:pPr>
-      <w:r>
-        <w:rPr/>
-        <w:drawing>
-          <wp:inline distT="0" distB="0" distL="0" distR="0">
-            <wp:extent cx="5334000" cy="3752850"/>
-            <wp:effectExtent l="0" t="0" r="0" b="0"/>
-            <wp:docPr id="18" name="Image18" descr="ODI profile"/>
-            <wp:cNvGraphicFramePr>
-              <a:graphicFrameLocks xmlns:a="http://schemas.openxmlformats.org/drawingml/2006/main" noChangeAspect="1"/>
-            </wp:cNvGraphicFramePr>
-            <a:graphic xmlns:a="http://schemas.openxmlformats.org/drawingml/2006/main">
-              <a:graphicData uri="http://schemas.openxmlformats.org/drawingml/2006/picture">
-                <pic:pic xmlns:pic="http://schemas.openxmlformats.org/drawingml/2006/picture">
-                  <pic:nvPicPr>
-                    <pic:cNvPr id="18" name="Image18" descr="ODI profile"/>
-                    <pic:cNvPicPr>
-                      <a:picLocks noChangeAspect="1" noChangeArrowheads="1"/>
-                    </pic:cNvPicPr>
-                  </pic:nvPicPr>
-                  <pic:blipFill>
-                    <a:blip r:embed="rId30"/>
-                    <a:stretch>
-                      <a:fillRect/>
-                    </a:stretch>
-                  </pic:blipFill>
-                  <pic:spPr bwMode="auto">
-                    <a:xfrm>
-                      <a:off x="0" y="0"/>
-                      <a:ext cx="5334000" cy="3752850"/>
-                    </a:xfrm>
-                    <a:prstGeom prst="rect">
-                      <a:avLst/>
-                    </a:prstGeom>
-                    <a:noFill/>
-                  </pic:spPr>
-                </pic:pic>
-              </a:graphicData>
-            </a:graphic>
-          </wp:inline>
-        </w:drawing>
-      </w:r>
-    </w:p>
-    <w:p>
-      <w:pPr>
-        <w:pStyle w:val="BodyText"/>
-        <w:bidi w:val="0"/>
-        <w:jc w:val="left"/>
-        <w:rPr/>
-      </w:pPr>
-      <w:r>
-        <w:rPr/>
-        <w:drawing>
-          <wp:inline distT="0" distB="0" distL="0" distR="0">
-            <wp:extent cx="5334000" cy="3762375"/>
-            <wp:effectExtent l="0" t="0" r="0" b="0"/>
-            <wp:docPr id="19" name="Image19" descr="FWF profile"/>
-            <wp:cNvGraphicFramePr>
-              <a:graphicFrameLocks xmlns:a="http://schemas.openxmlformats.org/drawingml/2006/main" noChangeAspect="1"/>
-            </wp:cNvGraphicFramePr>
-            <a:graphic xmlns:a="http://schemas.openxmlformats.org/drawingml/2006/main">
-              <a:graphicData uri="http://schemas.openxmlformats.org/drawingml/2006/picture">
-                <pic:pic xmlns:pic="http://schemas.openxmlformats.org/drawingml/2006/picture">
-                  <pic:nvPicPr>
-                    <pic:cNvPr id="19" name="Image19" descr="FWF profile"/>
-                    <pic:cNvPicPr>
-                      <a:picLocks noChangeAspect="1" noChangeArrowheads="1"/>
-                    </pic:cNvPicPr>
-                  </pic:nvPicPr>
-                  <pic:blipFill>
-                    <a:blip r:embed="rId31"/>
-                    <a:stretch>
-                      <a:fillRect/>
-                    </a:stretch>
-                  </pic:blipFill>
-                  <pic:spPr bwMode="auto">
-                    <a:xfrm>
-                      <a:off x="0" y="0"/>
-                      <a:ext cx="5334000" cy="3762375"/>
-                    </a:xfrm>
-                    <a:prstGeom prst="rect">
-                      <a:avLst/>
-                    </a:prstGeom>
-                    <a:noFill/>
-                  </pic:spPr>
-                </pic:pic>
-              </a:graphicData>
-            </a:graphic>
-          </wp:inline>
-        </w:drawing>
-      </w:r>
-    </w:p>
-    <w:p>
-      <w:pPr>
-        <w:pStyle w:val="BodyText"/>
-        <w:bidi w:val="0"/>
-        <w:jc w:val="left"/>
-        <w:rPr/>
-      </w:pPr>
-      <w:r>
-        <w:rPr>
-          <w:rStyle w:val="Emphasis"/>
-        </w:rPr>
-        <w:t>Note.</w:t>
-      </w:r>
-      <w:r>
-        <w:rPr/>
-        <w:t xml:space="preserve"> NDI (top), ODI (middle) and FWF (bottom). NDI is high near the VTA and increases again toward the hippocampus; ODI is higher at both ends where fibres fan; FWF rises sharply at the hippocampal end adjacent to cerebrospinal fluid.</w:t>
-      </w:r>
-    </w:p>
-    <w:p>
-      <w:pPr>
-        <w:pStyle w:val="BodyText"/>
-        <w:bidi w:val="0"/>
-        <w:jc w:val="left"/>
-        <w:rPr/>
-      </w:pPr>
-      <w:r>
-        <w:rPr>
-          <w:rStyle w:val="Strong"/>
-        </w:rPr>
-        <w:t>Figure S17</w:t>
-      </w:r>
-    </w:p>
-    <w:p>
-      <w:pPr>
-        <w:pStyle w:val="BodyText"/>
-        <w:bidi w:val="0"/>
-        <w:jc w:val="left"/>
-        <w:rPr/>
-      </w:pPr>
-      <w:r>
-        <w:rPr>
-          <w:rStyle w:val="Emphasis"/>
-        </w:rPr>
-        <w:t>NDI Along the Anterior Tract for the Same Participant</w:t>
-      </w:r>
-    </w:p>
-    <w:p>
-      <w:pPr>
-        <w:pStyle w:val="BodyText"/>
-        <w:bidi w:val="0"/>
-        <w:jc w:val="left"/>
-        <w:rPr/>
-      </w:pPr>
-      <w:r>
-        <w:rPr/>
-        <w:drawing>
-          <wp:inline distT="0" distB="0" distL="0" distR="0">
-            <wp:extent cx="5334000" cy="3762375"/>
-            <wp:effectExtent l="0" t="0" r="0" b="0"/>
-            <wp:docPr id="20" name="Image20" descr="NDI profile, anterior tract"/>
-            <wp:cNvGraphicFramePr>
-              <a:graphicFrameLocks xmlns:a="http://schemas.openxmlformats.org/drawingml/2006/main" noChangeAspect="1"/>
-            </wp:cNvGraphicFramePr>
-            <a:graphic xmlns:a="http://schemas.openxmlformats.org/drawingml/2006/main">
-              <a:graphicData uri="http://schemas.openxmlformats.org/drawingml/2006/picture">
-                <pic:pic xmlns:pic="http://schemas.openxmlformats.org/drawingml/2006/picture">
-                  <pic:nvPicPr>
-                    <pic:cNvPr id="20" name="Image20" descr="NDI profile, anterior tract"/>
                     <pic:cNvPicPr>
                       <a:picLocks noChangeAspect="1" noChangeArrowheads="1"/>
                     </pic:cNvPicPr>
@@ -15077,6 +14847,294 @@
       </w:r>
       <w:r>
         <w:rPr/>
+        <w:t xml:space="preserve"> FA peaks in deep white matter and declines toward the hippocampal end. VTA = ventral tegmental area.</w:t>
+      </w:r>
+    </w:p>
+    <w:p>
+      <w:pPr>
+        <w:pStyle w:val="BodyText"/>
+        <w:bidi w:val="0"/>
+        <w:jc w:val="left"/>
+        <w:rPr/>
+      </w:pPr>
+      <w:r>
+        <w:rPr>
+          <w:rStyle w:val="Strong"/>
+        </w:rPr>
+        <w:t>Figure S16</w:t>
+      </w:r>
+    </w:p>
+    <w:p>
+      <w:pPr>
+        <w:pStyle w:val="BodyText"/>
+        <w:bidi w:val="0"/>
+        <w:jc w:val="left"/>
+        <w:rPr/>
+      </w:pPr>
+      <w:r>
+        <w:rPr>
+          <w:rStyle w:val="Emphasis"/>
+        </w:rPr>
+        <w:t>NODDI Indices Along the Same Bundle</w:t>
+      </w:r>
+    </w:p>
+    <w:p>
+      <w:pPr>
+        <w:pStyle w:val="BodyText"/>
+        <w:bidi w:val="0"/>
+        <w:jc w:val="left"/>
+        <w:rPr/>
+      </w:pPr>
+      <w:r>
+        <w:rPr/>
+        <w:drawing>
+          <wp:inline distT="0" distB="0" distL="0" distR="0">
+            <wp:extent cx="5334000" cy="3762375"/>
+            <wp:effectExtent l="0" t="0" r="0" b="0"/>
+            <wp:docPr id="17" name="Image17" descr="NDI profile"/>
+            <wp:cNvGraphicFramePr>
+              <a:graphicFrameLocks xmlns:a="http://schemas.openxmlformats.org/drawingml/2006/main" noChangeAspect="1"/>
+            </wp:cNvGraphicFramePr>
+            <a:graphic xmlns:a="http://schemas.openxmlformats.org/drawingml/2006/main">
+              <a:graphicData uri="http://schemas.openxmlformats.org/drawingml/2006/picture">
+                <pic:pic xmlns:pic="http://schemas.openxmlformats.org/drawingml/2006/picture">
+                  <pic:nvPicPr>
+                    <pic:cNvPr id="17" name="Image17" descr="NDI profile"/>
+                    <pic:cNvPicPr>
+                      <a:picLocks noChangeAspect="1" noChangeArrowheads="1"/>
+                    </pic:cNvPicPr>
+                  </pic:nvPicPr>
+                  <pic:blipFill>
+                    <a:blip r:embed="rId33"/>
+                    <a:stretch>
+                      <a:fillRect/>
+                    </a:stretch>
+                  </pic:blipFill>
+                  <pic:spPr bwMode="auto">
+                    <a:xfrm>
+                      <a:off x="0" y="0"/>
+                      <a:ext cx="5334000" cy="3762375"/>
+                    </a:xfrm>
+                    <a:prstGeom prst="rect">
+                      <a:avLst/>
+                    </a:prstGeom>
+                    <a:noFill/>
+                  </pic:spPr>
+                </pic:pic>
+              </a:graphicData>
+            </a:graphic>
+          </wp:inline>
+        </w:drawing>
+      </w:r>
+    </w:p>
+    <w:p>
+      <w:pPr>
+        <w:pStyle w:val="BodyText"/>
+        <w:bidi w:val="0"/>
+        <w:jc w:val="left"/>
+        <w:rPr/>
+      </w:pPr>
+      <w:r>
+        <w:rPr/>
+        <w:drawing>
+          <wp:inline distT="0" distB="0" distL="0" distR="0">
+            <wp:extent cx="5334000" cy="3752850"/>
+            <wp:effectExtent l="0" t="0" r="0" b="0"/>
+            <wp:docPr id="18" name="Image18" descr="ODI profile"/>
+            <wp:cNvGraphicFramePr>
+              <a:graphicFrameLocks xmlns:a="http://schemas.openxmlformats.org/drawingml/2006/main" noChangeAspect="1"/>
+            </wp:cNvGraphicFramePr>
+            <a:graphic xmlns:a="http://schemas.openxmlformats.org/drawingml/2006/main">
+              <a:graphicData uri="http://schemas.openxmlformats.org/drawingml/2006/picture">
+                <pic:pic xmlns:pic="http://schemas.openxmlformats.org/drawingml/2006/picture">
+                  <pic:nvPicPr>
+                    <pic:cNvPr id="18" name="Image18" descr="ODI profile"/>
+                    <pic:cNvPicPr>
+                      <a:picLocks noChangeAspect="1" noChangeArrowheads="1"/>
+                    </pic:cNvPicPr>
+                  </pic:nvPicPr>
+                  <pic:blipFill>
+                    <a:blip r:embed="rId34"/>
+                    <a:stretch>
+                      <a:fillRect/>
+                    </a:stretch>
+                  </pic:blipFill>
+                  <pic:spPr bwMode="auto">
+                    <a:xfrm>
+                      <a:off x="0" y="0"/>
+                      <a:ext cx="5334000" cy="3752850"/>
+                    </a:xfrm>
+                    <a:prstGeom prst="rect">
+                      <a:avLst/>
+                    </a:prstGeom>
+                    <a:noFill/>
+                  </pic:spPr>
+                </pic:pic>
+              </a:graphicData>
+            </a:graphic>
+          </wp:inline>
+        </w:drawing>
+      </w:r>
+    </w:p>
+    <w:p>
+      <w:pPr>
+        <w:pStyle w:val="BodyText"/>
+        <w:bidi w:val="0"/>
+        <w:jc w:val="left"/>
+        <w:rPr/>
+      </w:pPr>
+      <w:r>
+        <w:rPr/>
+        <w:drawing>
+          <wp:inline distT="0" distB="0" distL="0" distR="0">
+            <wp:extent cx="5334000" cy="3762375"/>
+            <wp:effectExtent l="0" t="0" r="0" b="0"/>
+            <wp:docPr id="19" name="Image19" descr="FWF profile"/>
+            <wp:cNvGraphicFramePr>
+              <a:graphicFrameLocks xmlns:a="http://schemas.openxmlformats.org/drawingml/2006/main" noChangeAspect="1"/>
+            </wp:cNvGraphicFramePr>
+            <a:graphic xmlns:a="http://schemas.openxmlformats.org/drawingml/2006/main">
+              <a:graphicData uri="http://schemas.openxmlformats.org/drawingml/2006/picture">
+                <pic:pic xmlns:pic="http://schemas.openxmlformats.org/drawingml/2006/picture">
+                  <pic:nvPicPr>
+                    <pic:cNvPr id="19" name="Image19" descr="FWF profile"/>
+                    <pic:cNvPicPr>
+                      <a:picLocks noChangeAspect="1" noChangeArrowheads="1"/>
+                    </pic:cNvPicPr>
+                  </pic:nvPicPr>
+                  <pic:blipFill>
+                    <a:blip r:embed="rId35"/>
+                    <a:stretch>
+                      <a:fillRect/>
+                    </a:stretch>
+                  </pic:blipFill>
+                  <pic:spPr bwMode="auto">
+                    <a:xfrm>
+                      <a:off x="0" y="0"/>
+                      <a:ext cx="5334000" cy="3762375"/>
+                    </a:xfrm>
+                    <a:prstGeom prst="rect">
+                      <a:avLst/>
+                    </a:prstGeom>
+                    <a:noFill/>
+                  </pic:spPr>
+                </pic:pic>
+              </a:graphicData>
+            </a:graphic>
+          </wp:inline>
+        </w:drawing>
+      </w:r>
+    </w:p>
+    <w:p>
+      <w:pPr>
+        <w:pStyle w:val="BodyText"/>
+        <w:bidi w:val="0"/>
+        <w:jc w:val="left"/>
+        <w:rPr/>
+      </w:pPr>
+      <w:r>
+        <w:rPr>
+          <w:rStyle w:val="Emphasis"/>
+        </w:rPr>
+        <w:t>Note.</w:t>
+      </w:r>
+      <w:r>
+        <w:rPr/>
+        <w:t xml:space="preserve"> NDI (top), ODI (middle) and FWF (bottom). NDI is high near the VTA and increases again toward the hippocampus; ODI is higher at both ends where fibres fan; FWF rises sharply at the hippocampal end adjacent to cerebrospinal fluid.</w:t>
+      </w:r>
+    </w:p>
+    <w:p>
+      <w:pPr>
+        <w:pStyle w:val="BodyText"/>
+        <w:bidi w:val="0"/>
+        <w:jc w:val="left"/>
+        <w:rPr/>
+      </w:pPr>
+      <w:r>
+        <w:rPr>
+          <w:rStyle w:val="Strong"/>
+        </w:rPr>
+        <w:t>Figure S17</w:t>
+      </w:r>
+    </w:p>
+    <w:p>
+      <w:pPr>
+        <w:pStyle w:val="BodyText"/>
+        <w:bidi w:val="0"/>
+        <w:jc w:val="left"/>
+        <w:rPr/>
+      </w:pPr>
+      <w:r>
+        <w:rPr>
+          <w:rStyle w:val="Emphasis"/>
+        </w:rPr>
+        <w:t>NDI Along the Anterior Tract for the Same Participant</w:t>
+      </w:r>
+    </w:p>
+    <w:p>
+      <w:pPr>
+        <w:pStyle w:val="BodyText"/>
+        <w:bidi w:val="0"/>
+        <w:jc w:val="left"/>
+        <w:rPr/>
+      </w:pPr>
+      <w:r>
+        <w:rPr/>
+        <w:drawing>
+          <wp:inline distT="0" distB="0" distL="0" distR="0">
+            <wp:extent cx="5334000" cy="3762375"/>
+            <wp:effectExtent l="0" t="0" r="0" b="0"/>
+            <wp:docPr id="20" name="Image20" descr="NDI profile, anterior tract"/>
+            <wp:cNvGraphicFramePr>
+              <a:graphicFrameLocks xmlns:a="http://schemas.openxmlformats.org/drawingml/2006/main" noChangeAspect="1"/>
+            </wp:cNvGraphicFramePr>
+            <a:graphic xmlns:a="http://schemas.openxmlformats.org/drawingml/2006/main">
+              <a:graphicData uri="http://schemas.openxmlformats.org/drawingml/2006/picture">
+                <pic:pic xmlns:pic="http://schemas.openxmlformats.org/drawingml/2006/picture">
+                  <pic:nvPicPr>
+                    <pic:cNvPr id="20" name="Image20" descr="NDI profile, anterior tract"/>
+                    <pic:cNvPicPr>
+                      <a:picLocks noChangeAspect="1" noChangeArrowheads="1"/>
+                    </pic:cNvPicPr>
+                  </pic:nvPicPr>
+                  <pic:blipFill>
+                    <a:blip r:embed="rId36"/>
+                    <a:stretch>
+                      <a:fillRect/>
+                    </a:stretch>
+                  </pic:blipFill>
+                  <pic:spPr bwMode="auto">
+                    <a:xfrm>
+                      <a:off x="0" y="0"/>
+                      <a:ext cx="5334000" cy="3762375"/>
+                    </a:xfrm>
+                    <a:prstGeom prst="rect">
+                      <a:avLst/>
+                    </a:prstGeom>
+                    <a:noFill/>
+                  </pic:spPr>
+                </pic:pic>
+              </a:graphicData>
+            </a:graphic>
+          </wp:inline>
+        </w:drawing>
+      </w:r>
+    </w:p>
+    <w:p>
+      <w:pPr>
+        <w:pStyle w:val="BodyText"/>
+        <w:bidi w:val="0"/>
+        <w:jc w:val="left"/>
+        <w:rPr/>
+      </w:pPr>
+      <w:r>
+        <w:rPr>
+          <w:rStyle w:val="Emphasis"/>
+        </w:rPr>
+        <w:t>Note.</w:t>
+      </w:r>
+      <w:r>
+        <w:rPr/>
         <w:t xml:space="preserve"> The anterior tract shares the early trajectory and diverges late.</w:t>
       </w:r>
     </w:p>
@@ -16536,7 +16594,7 @@
         <w:jc w:val="left"/>
         <w:rPr/>
       </w:pPr>
-      <w:hyperlink r:id="rId33">
+      <w:hyperlink r:id="rId37">
         <w:r>
           <w:rPr>
             <w:rStyle w:val="Hyperlink"/>
@@ -16551,7 +16609,7 @@
         <w:rPr/>
         <w:t xml:space="preserve"> · </w:t>
       </w:r>
-      <w:hyperlink r:id="rId34">
+      <w:hyperlink r:id="rId38">
         <w:r>
           <w:rPr>
             <w:rStyle w:val="Hyperlink"/>
@@ -21170,6 +21228,30 @@
     </w:p>
     <w:p>
       <w:pPr>
+        <w:pStyle w:val="BodyText"/>
+        <w:bidi w:val="0"/>
+        <w:jc w:val="left"/>
+        <w:rPr/>
+      </w:pPr>
+      <w:r>
+        <w:rPr/>
+        <w:t xml:space="preserve">Symptoms that appear at Step 1 or Step 2 often originate upstream, in the brain mask, the skull strip or the T1-to-diffusion transform; those steps are documented in the </w:t>
+      </w:r>
+      <w:hyperlink r:id="rId39">
+        <w:r>
+          <w:rPr>
+            <w:rStyle w:val="Hyperlink"/>
+          </w:rPr>
+          <w:t>Diffusion MRI Preprocessing tutorial</w:t>
+        </w:r>
+      </w:hyperlink>
+      <w:r>
+        <w:rPr/>
+        <w:t>.</w:t>
+      </w:r>
+    </w:p>
+    <w:p>
+      <w:pPr>
         <w:pStyle w:val="Heading2"/>
         <w:bidi w:val="0"/>
         <w:jc w:val="left"/>
@@ -21963,7 +22045,7 @@
         <w:rPr/>
         <w:t xml:space="preserve">The </w:t>
       </w:r>
-      <w:hyperlink r:id="rId35">
+      <w:hyperlink r:id="rId40">
         <w:r>
           <w:rPr>
             <w:rStyle w:val="Hyperlink"/>
@@ -21975,7 +22057,7 @@
         <w:rPr/>
         <w:t xml:space="preserve"> covers this as its Steps 11 and 12 (</w:t>
       </w:r>
-      <w:hyperlink r:id="rId36">
+      <w:hyperlink r:id="rId41">
         <w:r>
           <w:rPr>
             <w:rStyle w:val="Hyperlink"/>
@@ -21987,7 +22069,7 @@
         <w:rPr/>
         <w:t xml:space="preserve">, </w:t>
       </w:r>
-      <w:hyperlink r:id="rId37">
+      <w:hyperlink r:id="rId42">
         <w:r>
           <w:rPr>
             <w:rStyle w:val="Hyperlink"/>
@@ -23839,7 +23921,7 @@
         <w:rPr/>
         <w:t xml:space="preserve">The scripts from which these were generalized are in the </w:t>
       </w:r>
-      <w:hyperlink r:id="rId38">
+      <w:hyperlink r:id="rId43">
         <w:r>
           <w:rPr>
             <w:rStyle w:val="Hyperlink"/>
@@ -23886,7 +23968,7 @@
         <w:rPr/>
         <w:t xml:space="preserve">The whole tutorial is also available as a single document, with tables and figures numbered S1, S2 and so on and the scripts in an appendix: </w:t>
       </w:r>
-      <w:hyperlink r:id="rId39">
+      <w:hyperlink r:id="rId44">
         <w:r>
           <w:rPr>
             <w:rStyle w:val="Hyperlink"/>
@@ -23898,7 +23980,7 @@
         <w:rPr/>
         <w:t xml:space="preserve"> and </w:t>
       </w:r>
-      <w:hyperlink r:id="rId40">
+      <w:hyperlink r:id="rId45">
         <w:r>
           <w:rPr>
             <w:rStyle w:val="Hyperlink"/>
@@ -25128,7 +25210,7 @@
         <w:rPr/>
         <w:t xml:space="preserve"> file in the package and the </w:t>
       </w:r>
-      <w:hyperlink r:id="rId41">
+      <w:hyperlink r:id="rId46">
         <w:r>
           <w:rPr>
             <w:rStyle w:val="Hyperlink"/>
@@ -25185,7 +25267,7 @@
         <w:rPr/>
         <w:t xml:space="preserve">(1), 26–41. </w:t>
       </w:r>
-      <w:hyperlink r:id="rId42">
+      <w:hyperlink r:id="rId47">
         <w:r>
           <w:rPr>
             <w:rStyle w:val="Hyperlink"/>
@@ -25215,7 +25297,7 @@
         <w:rPr/>
         <w:t xml:space="preserve">, 32–44. </w:t>
       </w:r>
-      <w:hyperlink r:id="rId43">
+      <w:hyperlink r:id="rId48">
         <w:r>
           <w:rPr>
             <w:rStyle w:val="Hyperlink"/>
@@ -25267,7 +25349,7 @@
         <w:rPr/>
         <w:t xml:space="preserve">(7), 1256–1265. </w:t>
       </w:r>
-      <w:hyperlink r:id="rId44">
+      <w:hyperlink r:id="rId49">
         <w:r>
           <w:rPr>
             <w:rStyle w:val="Hyperlink"/>
@@ -25297,7 +25379,7 @@
         <w:rPr/>
         <w:t xml:space="preserve">(4), 292–298. </w:t>
       </w:r>
-      <w:hyperlink r:id="rId45">
+      <w:hyperlink r:id="rId50">
         <w:r>
           <w:rPr>
             <w:rStyle w:val="Hyperlink"/>
@@ -25327,7 +25409,7 @@
         <w:rPr/>
         <w:t xml:space="preserve">, 175. </w:t>
       </w:r>
-      <w:hyperlink r:id="rId46">
+      <w:hyperlink r:id="rId51">
         <w:r>
           <w:rPr>
             <w:rStyle w:val="Hyperlink"/>
@@ -25357,7 +25439,7 @@
         <w:rPr/>
         <w:t xml:space="preserve">, 8. </w:t>
       </w:r>
-      <w:hyperlink r:id="rId47">
+      <w:hyperlink r:id="rId52">
         <w:r>
           <w:rPr>
             <w:rStyle w:val="Hyperlink"/>
@@ -25387,7 +25469,7 @@
         <w:rPr/>
         <w:t xml:space="preserve">, 119474. </w:t>
       </w:r>
-      <w:hyperlink r:id="rId48">
+      <w:hyperlink r:id="rId53">
         <w:r>
           <w:rPr>
             <w:rStyle w:val="Hyperlink"/>
@@ -25417,7 +25499,7 @@
         <w:rPr/>
         <w:t xml:space="preserve">(2), 782–790. </w:t>
       </w:r>
-      <w:hyperlink r:id="rId49">
+      <w:hyperlink r:id="rId54">
         <w:r>
           <w:rPr>
             <w:rStyle w:val="Hyperlink"/>
@@ -25447,7 +25529,7 @@
         <w:rPr/>
         <w:t xml:space="preserve">, 411–426. </w:t>
       </w:r>
-      <w:hyperlink r:id="rId50">
+      <w:hyperlink r:id="rId55">
         <w:r>
           <w:rPr>
             <w:rStyle w:val="Hyperlink"/>
@@ -25477,7 +25559,7 @@
         <w:rPr/>
         <w:t xml:space="preserve">(1). </w:t>
       </w:r>
-      <w:hyperlink r:id="rId51">
+      <w:hyperlink r:id="rId56">
         <w:r>
           <w:rPr>
             <w:rStyle w:val="Hyperlink"/>
@@ -25507,7 +25589,7 @@
         <w:rPr/>
         <w:t xml:space="preserve">(2–3), 155–171. </w:t>
       </w:r>
-      <w:hyperlink r:id="rId52">
+      <w:hyperlink r:id="rId57">
         <w:r>
           <w:rPr>
             <w:rStyle w:val="Hyperlink"/>
@@ -25537,7 +25619,7 @@
         <w:rPr/>
         <w:t xml:space="preserve">, 580–589. </w:t>
       </w:r>
-      <w:hyperlink r:id="rId53">
+      <w:hyperlink r:id="rId58">
         <w:r>
           <w:rPr>
             <w:rStyle w:val="Hyperlink"/>
@@ -25567,7 +25649,7 @@
         <w:rPr/>
         <w:t xml:space="preserve">, 118749. </w:t>
       </w:r>
-      <w:hyperlink r:id="rId54">
+      <w:hyperlink r:id="rId59">
         <w:r>
           <w:rPr>
             <w:rStyle w:val="Hyperlink"/>
@@ -25597,7 +25679,7 @@
         <w:rPr/>
         <w:t xml:space="preserve">, 180063. </w:t>
       </w:r>
-      <w:hyperlink r:id="rId55">
+      <w:hyperlink r:id="rId60">
         <w:r>
           <w:rPr>
             <w:rStyle w:val="Hyperlink"/>
@@ -25671,7 +25753,7 @@
         <w:rPr/>
         <w:t xml:space="preserve">, 116137. </w:t>
       </w:r>
-      <w:hyperlink r:id="rId56">
+      <w:hyperlink r:id="rId61">
         <w:r>
           <w:rPr>
             <w:rStyle w:val="Hyperlink"/>
@@ -25701,7 +25783,7 @@
         <w:rPr/>
         <w:t xml:space="preserve">, 1155–1167. </w:t>
       </w:r>
-      <w:hyperlink r:id="rId57">
+      <w:hyperlink r:id="rId62">
         <w:r>
           <w:rPr>
             <w:rStyle w:val="Hyperlink"/>
@@ -25731,7 +25813,7 @@
         <w:rPr/>
         <w:t xml:space="preserve">(5), 1165–1177. </w:t>
       </w:r>
-      <w:hyperlink r:id="rId58">
+      <w:hyperlink r:id="rId63">
         <w:r>
           <w:rPr>
             <w:rStyle w:val="Hyperlink"/>
@@ -25761,7 +25843,7 @@
         <w:rPr/>
         <w:t xml:space="preserve">, 318–331. </w:t>
       </w:r>
-      <w:hyperlink r:id="rId59">
+      <w:hyperlink r:id="rId64">
         <w:r>
           <w:rPr>
             <w:rStyle w:val="Hyperlink"/>
@@ -25791,7 +25873,7 @@
         <w:rPr/>
         <w:t xml:space="preserve">, 381–397. </w:t>
       </w:r>
-      <w:hyperlink r:id="rId60">
+      <w:hyperlink r:id="rId65">
         <w:r>
           <w:rPr>
             <w:rStyle w:val="Hyperlink"/>
@@ -25821,7 +25903,7 @@
         <w:rPr/>
         <w:t xml:space="preserve">(11), e49790. </w:t>
       </w:r>
-      <w:hyperlink r:id="rId61">
+      <w:hyperlink r:id="rId66">
         <w:r>
           <w:rPr>
             <w:rStyle w:val="Hyperlink"/>
@@ -25851,7 +25933,7 @@
         <w:rPr/>
         <w:t xml:space="preserve">(4), 1000–1016. </w:t>
       </w:r>
-      <w:hyperlink r:id="rId62">
+      <w:hyperlink r:id="rId67">
         <w:r>
           <w:rPr>
             <w:rStyle w:val="Hyperlink"/>

</xml_diff>

<commit_message>
Say what a step is, not which tool a reader is assumed to know
The first node of the workflow diagram read 'Preprocessed diffusion data and
T1 / preprocessing tutorial or QSIPrep'; the second line named a tool without
saying what it is. The node now states the input, and the link to the
preprocessing tutorial stays in the prose under Inputs, where it is explained.
The intro likewise said 'QSIPrep produces equivalent inputs' with no
indication of what QSIPrep is; it now says so and links it.
</commit_message>
<xml_diff>
--- a/static/supplement/MesoConnect_Supplementary_Methods.docx
+++ b/static/supplement/MesoConnect_Supplementary_Methods.docx
@@ -188,7 +188,19 @@
       </w:hyperlink>
       <w:r>
         <w:rPr/>
-        <w:t xml:space="preserve"> lists them and names the step that produces each. QSIPrep produces equivalent inputs.</w:t>
+        <w:t xml:space="preserve"> lists them and names the step that produces each. </w:t>
+      </w:r>
+      <w:hyperlink r:id="rId4">
+        <w:r>
+          <w:rPr>
+            <w:rStyle w:val="Hyperlink"/>
+          </w:rPr>
+          <w:t>QSIPrep</w:t>
+        </w:r>
+      </w:hyperlink>
+      <w:r>
+        <w:rPr/>
+        <w:t>, a containerized preprocessing pipeline for diffusion MRI, produces equivalent inputs.</w:t>
       </w:r>
     </w:p>
     <w:p>
@@ -665,7 +677,7 @@
                     </pic:cNvPicPr>
                   </pic:nvPicPr>
                   <pic:blipFill>
-                    <a:blip r:embed="rId4"/>
+                    <a:blip r:embed="rId5"/>
                     <a:stretch>
                       <a:fillRect/>
                     </a:stretch>
@@ -3222,7 +3234,7 @@
         <w:rPr/>
         <w:t xml:space="preserve">) and the tractography commands with these masks are in the atlas repository's </w:t>
       </w:r>
-      <w:hyperlink r:id="rId5">
+      <w:hyperlink r:id="rId6">
         <w:r>
           <w:rPr>
             <w:rStyle w:val="Hyperlink"/>
@@ -3278,7 +3290,7 @@
         <w:rPr/>
         <w:t xml:space="preserve">The MesoConnect Atlas is distributed as one package, </w:t>
       </w:r>
-      <w:hyperlink r:id="rId6">
+      <w:hyperlink r:id="rId7">
         <w:r>
           <w:rPr>
             <w:rStyle w:val="Hyperlink"/>
@@ -3290,7 +3302,7 @@
         <w:rPr/>
         <w:t xml:space="preserve"> (3.4 MB). The canonical copy and the individual files are in the atlas authors' </w:t>
       </w:r>
-      <w:hyperlink r:id="rId7">
+      <w:hyperlink r:id="rId8">
         <w:r>
           <w:rPr>
             <w:rStyle w:val="Hyperlink"/>
@@ -3302,7 +3314,7 @@
         <w:rPr/>
         <w:t xml:space="preserve">; the copy served here is identical (SHA-256 </w:t>
       </w:r>
-      <w:hyperlink r:id="rId8">
+      <w:hyperlink r:id="rId9">
         <w:r>
           <w:rPr>
             <w:rStyle w:val="Hyperlink"/>
@@ -3792,7 +3804,7 @@
         <w:rPr/>
         <w:t xml:space="preserve">The atlas package does not redistribute the third-party regions used as seeds and targets during atlas construction (Harvard–Oxford hippocampus, amygdala and nucleus accumbens; the ventral tegmental area (VTA) of Trutti et al., 2021; the ventral pallidum of Pauli et al., 2018). The atlas authors' </w:t>
       </w:r>
-      <w:hyperlink r:id="rId9">
+      <w:hyperlink r:id="rId10">
         <w:r>
           <w:rPr>
             <w:rStyle w:val="Hyperlink"/>
@@ -3942,7 +3954,7 @@
               <w:jc w:val="left"/>
               <w:rPr/>
             </w:pPr>
-            <w:hyperlink r:id="rId10">
+            <w:hyperlink r:id="rId11">
               <w:r>
                 <w:rPr>
                   <w:rStyle w:val="Hyperlink"/>
@@ -4012,7 +4024,7 @@
               <w:jc w:val="left"/>
               <w:rPr/>
             </w:pPr>
-            <w:hyperlink r:id="rId11">
+            <w:hyperlink r:id="rId12">
               <w:r>
                 <w:rPr>
                   <w:rStyle w:val="Hyperlink"/>
@@ -4082,7 +4094,7 @@
               <w:jc w:val="left"/>
               <w:rPr/>
             </w:pPr>
-            <w:hyperlink r:id="rId12">
+            <w:hyperlink r:id="rId13">
               <w:r>
                 <w:rPr>
                   <w:rStyle w:val="Hyperlink"/>
@@ -4154,7 +4166,7 @@
               <w:jc w:val="left"/>
               <w:rPr/>
             </w:pPr>
-            <w:hyperlink r:id="rId13">
+            <w:hyperlink r:id="rId14">
               <w:r>
                 <w:rPr>
                   <w:rStyle w:val="Hyperlink"/>
@@ -4817,7 +4829,7 @@
         <w:rPr/>
         <w:t xml:space="preserve">Every input below comes from preprocessing; the </w:t>
       </w:r>
-      <w:hyperlink r:id="rId14">
+      <w:hyperlink r:id="rId15">
         <w:r>
           <w:rPr>
             <w:rStyle w:val="Hyperlink"/>
@@ -4829,7 +4841,7 @@
         <w:rPr/>
         <w:t xml:space="preserve"> produces them, and its </w:t>
       </w:r>
-      <w:hyperlink r:id="rId15">
+      <w:hyperlink r:id="rId16">
         <w:r>
           <w:rPr>
             <w:rStyle w:val="Hyperlink"/>
@@ -6528,7 +6540,7 @@
         <w:rPr/>
         <w:t>If the T1 image has not been skull-stripped, this should be done first (</w:t>
       </w:r>
-      <w:hyperlink r:id="rId16">
+      <w:hyperlink r:id="rId17">
         <w:r>
           <w:rPr>
             <w:rStyle w:val="Hyperlink"/>
@@ -7426,7 +7438,7 @@
                     </pic:cNvPicPr>
                   </pic:nvPicPr>
                   <pic:blipFill>
-                    <a:blip r:embed="rId17"/>
+                    <a:blip r:embed="rId18"/>
                     <a:stretch>
                       <a:fillRect/>
                     </a:stretch>
@@ -7470,101 +7482,6 @@
                 <pic:pic xmlns:pic="http://schemas.openxmlformats.org/drawingml/2006/picture">
                   <pic:nvPicPr>
                     <pic:cNvPr id="3" name="Image3" descr="Magnified view of the warped left VTA"/>
-                    <pic:cNvPicPr>
-                      <a:picLocks noChangeAspect="1" noChangeArrowheads="1"/>
-                    </pic:cNvPicPr>
-                  </pic:nvPicPr>
-                  <pic:blipFill>
-                    <a:blip r:embed="rId18"/>
-                    <a:stretch>
-                      <a:fillRect/>
-                    </a:stretch>
-                  </pic:blipFill>
-                  <pic:spPr bwMode="auto">
-                    <a:xfrm>
-                      <a:off x="0" y="0"/>
-                      <a:ext cx="5334000" cy="1771650"/>
-                    </a:xfrm>
-                    <a:prstGeom prst="rect">
-                      <a:avLst/>
-                    </a:prstGeom>
-                    <a:noFill/>
-                  </pic:spPr>
-                </pic:pic>
-              </a:graphicData>
-            </a:graphic>
-          </wp:inline>
-        </w:drawing>
-      </w:r>
-    </w:p>
-    <w:p>
-      <w:pPr>
-        <w:pStyle w:val="BodyText"/>
-        <w:bidi w:val="0"/>
-        <w:jc w:val="left"/>
-        <w:rPr/>
-      </w:pPr>
-      <w:r>
-        <w:rPr>
-          <w:rStyle w:val="Emphasis"/>
-        </w:rPr>
-        <w:t>Note.</w:t>
-      </w:r>
-      <w:r>
-        <w:rPr/>
-        <w:t xml:space="preserve"> Whole-brain view (top) and magnified view (bottom), example dataset.</w:t>
-      </w:r>
-    </w:p>
-    <w:p>
-      <w:pPr>
-        <w:pStyle w:val="BodyText"/>
-        <w:bidi w:val="0"/>
-        <w:jc w:val="left"/>
-        <w:rPr/>
-      </w:pPr>
-      <w:r>
-        <w:rPr>
-          <w:rStyle w:val="Strong"/>
-        </w:rPr>
-        <w:t>Figure S4</w:t>
-      </w:r>
-    </w:p>
-    <w:p>
-      <w:pPr>
-        <w:pStyle w:val="BodyText"/>
-        <w:bidi w:val="0"/>
-        <w:jc w:val="left"/>
-        <w:rPr/>
-      </w:pPr>
-      <w:r>
-        <w:rPr>
-          <w:rStyle w:val="Emphasis"/>
-        </w:rPr>
-        <w:t>Warped Left Hippocampus Target and Left VTA → Hippocampus Atlas</w:t>
-      </w:r>
-    </w:p>
-    <w:p>
-      <w:pPr>
-        <w:pStyle w:val="BodyText"/>
-        <w:bidi w:val="0"/>
-        <w:jc w:val="left"/>
-        <w:rPr/>
-      </w:pPr>
-      <w:r>
-        <w:rPr/>
-        <w:drawing>
-          <wp:inline distT="0" distB="0" distL="0" distR="0">
-            <wp:extent cx="5334000" cy="1771650"/>
-            <wp:effectExtent l="0" t="0" r="0" b="0"/>
-            <wp:docPr id="4" name="Image4" descr="Magnified view of the warped left hippocampus"/>
-            <wp:cNvGraphicFramePr>
-              <a:graphicFrameLocks xmlns:a="http://schemas.openxmlformats.org/drawingml/2006/main" noChangeAspect="1"/>
-            </wp:cNvGraphicFramePr>
-            <a:graphic xmlns:a="http://schemas.openxmlformats.org/drawingml/2006/main">
-              <a:graphicData uri="http://schemas.openxmlformats.org/drawingml/2006/picture">
-                <pic:pic xmlns:pic="http://schemas.openxmlformats.org/drawingml/2006/picture">
-                  <pic:nvPicPr>
-                    <pic:cNvPr id="4" name="Image4" descr="Magnified view of the warped left hippocampus"/>
                     <pic:cNvPicPr>
                       <a:picLocks noChangeAspect="1" noChangeArrowheads="1"/>
                     </pic:cNvPicPr>
@@ -7600,12 +7517,58 @@
         <w:rPr/>
       </w:pPr>
       <w:r>
+        <w:rPr>
+          <w:rStyle w:val="Emphasis"/>
+        </w:rPr>
+        <w:t>Note.</w:t>
+      </w:r>
+      <w:r>
+        <w:rPr/>
+        <w:t xml:space="preserve"> Whole-brain view (top) and magnified view (bottom), example dataset.</w:t>
+      </w:r>
+    </w:p>
+    <w:p>
+      <w:pPr>
+        <w:pStyle w:val="BodyText"/>
+        <w:bidi w:val="0"/>
+        <w:jc w:val="left"/>
+        <w:rPr/>
+      </w:pPr>
+      <w:r>
+        <w:rPr>
+          <w:rStyle w:val="Strong"/>
+        </w:rPr>
+        <w:t>Figure S4</w:t>
+      </w:r>
+    </w:p>
+    <w:p>
+      <w:pPr>
+        <w:pStyle w:val="BodyText"/>
+        <w:bidi w:val="0"/>
+        <w:jc w:val="left"/>
+        <w:rPr/>
+      </w:pPr>
+      <w:r>
+        <w:rPr>
+          <w:rStyle w:val="Emphasis"/>
+        </w:rPr>
+        <w:t>Warped Left Hippocampus Target and Left VTA → Hippocampus Atlas</w:t>
+      </w:r>
+    </w:p>
+    <w:p>
+      <w:pPr>
+        <w:pStyle w:val="BodyText"/>
+        <w:bidi w:val="0"/>
+        <w:jc w:val="left"/>
+        <w:rPr/>
+      </w:pPr>
+      <w:r>
         <w:rPr/>
         <w:drawing>
           <wp:inline distT="0" distB="0" distL="0" distR="0">
             <wp:extent cx="5334000" cy="1771650"/>
             <wp:effectExtent l="0" t="0" r="0" b="0"/>
-            <wp:docPr id="5" name="Image5" descr="Magnified view of the warped left atlas"/>
+            <wp:docPr id="4" name="Image4" descr="Magnified view of the warped left hippocampus"/>
             <wp:cNvGraphicFramePr>
               <a:graphicFrameLocks xmlns:a="http://schemas.openxmlformats.org/drawingml/2006/main" noChangeAspect="1"/>
             </wp:cNvGraphicFramePr>
@@ -7613,7 +7576,7 @@
               <a:graphicData uri="http://schemas.openxmlformats.org/drawingml/2006/picture">
                 <pic:pic xmlns:pic="http://schemas.openxmlformats.org/drawingml/2006/picture">
                   <pic:nvPicPr>
-                    <pic:cNvPr id="5" name="Image5" descr="Magnified view of the warped left atlas"/>
+                    <pic:cNvPr id="4" name="Image4" descr="Magnified view of the warped left hippocampus"/>
                     <pic:cNvPicPr>
                       <a:picLocks noChangeAspect="1" noChangeArrowheads="1"/>
                     </pic:cNvPicPr>
@@ -7649,58 +7612,12 @@
         <w:rPr/>
       </w:pPr>
       <w:r>
-        <w:rPr>
-          <w:rStyle w:val="Emphasis"/>
-        </w:rPr>
-        <w:t>Note.</w:t>
-      </w:r>
-      <w:r>
-        <w:rPr/>
-        <w:t xml:space="preserve"> Hippocampus (top) and atlas at the 50% threshold (bottom), magnified views.</w:t>
-      </w:r>
-    </w:p>
-    <w:p>
-      <w:pPr>
-        <w:pStyle w:val="BodyText"/>
-        <w:bidi w:val="0"/>
-        <w:jc w:val="left"/>
-        <w:rPr/>
-      </w:pPr>
-      <w:r>
-        <w:rPr>
-          <w:rStyle w:val="Strong"/>
-        </w:rPr>
-        <w:t>Figure S5</w:t>
-      </w:r>
-    </w:p>
-    <w:p>
-      <w:pPr>
-        <w:pStyle w:val="BodyText"/>
-        <w:bidi w:val="0"/>
-        <w:jc w:val="left"/>
-        <w:rPr/>
-      </w:pPr>
-      <w:r>
-        <w:rPr>
-          <w:rStyle w:val="Emphasis"/>
-        </w:rPr>
-        <w:t>Orthogonal Render of the Warped Regions</w:t>
-      </w:r>
-    </w:p>
-    <w:p>
-      <w:pPr>
-        <w:pStyle w:val="BodyText"/>
-        <w:bidi w:val="0"/>
-        <w:jc w:val="left"/>
-        <w:rPr/>
-      </w:pPr>
-      <w:r>
         <w:rPr/>
         <w:drawing>
           <wp:inline distT="0" distB="0" distL="0" distR="0">
             <wp:extent cx="5334000" cy="1771650"/>
             <wp:effectExtent l="0" t="0" r="0" b="0"/>
-            <wp:docPr id="6" name="Image6" descr="Orthogonal render with VTA, hippocampus and atlas"/>
+            <wp:docPr id="5" name="Image5" descr="Magnified view of the warped left atlas"/>
             <wp:cNvGraphicFramePr>
               <a:graphicFrameLocks xmlns:a="http://schemas.openxmlformats.org/drawingml/2006/main" noChangeAspect="1"/>
             </wp:cNvGraphicFramePr>
@@ -7708,7 +7625,7 @@
               <a:graphicData uri="http://schemas.openxmlformats.org/drawingml/2006/picture">
                 <pic:pic xmlns:pic="http://schemas.openxmlformats.org/drawingml/2006/picture">
                   <pic:nvPicPr>
-                    <pic:cNvPr id="6" name="Image6" descr="Orthogonal render with VTA, hippocampus and atlas"/>
+                    <pic:cNvPr id="5" name="Image5" descr="Magnified view of the warped left atlas"/>
                     <pic:cNvPicPr>
                       <a:picLocks noChangeAspect="1" noChangeArrowheads="1"/>
                     </pic:cNvPicPr>
@@ -7751,6 +7668,101 @@
       </w:r>
       <w:r>
         <w:rPr/>
+        <w:t xml:space="preserve"> Hippocampus (top) and atlas at the 50% threshold (bottom), magnified views.</w:t>
+      </w:r>
+    </w:p>
+    <w:p>
+      <w:pPr>
+        <w:pStyle w:val="BodyText"/>
+        <w:bidi w:val="0"/>
+        <w:jc w:val="left"/>
+        <w:rPr/>
+      </w:pPr>
+      <w:r>
+        <w:rPr>
+          <w:rStyle w:val="Strong"/>
+        </w:rPr>
+        <w:t>Figure S5</w:t>
+      </w:r>
+    </w:p>
+    <w:p>
+      <w:pPr>
+        <w:pStyle w:val="BodyText"/>
+        <w:bidi w:val="0"/>
+        <w:jc w:val="left"/>
+        <w:rPr/>
+      </w:pPr>
+      <w:r>
+        <w:rPr>
+          <w:rStyle w:val="Emphasis"/>
+        </w:rPr>
+        <w:t>Orthogonal Render of the Warped Regions</w:t>
+      </w:r>
+    </w:p>
+    <w:p>
+      <w:pPr>
+        <w:pStyle w:val="BodyText"/>
+        <w:bidi w:val="0"/>
+        <w:jc w:val="left"/>
+        <w:rPr/>
+      </w:pPr>
+      <w:r>
+        <w:rPr/>
+        <w:drawing>
+          <wp:inline distT="0" distB="0" distL="0" distR="0">
+            <wp:extent cx="5334000" cy="1771650"/>
+            <wp:effectExtent l="0" t="0" r="0" b="0"/>
+            <wp:docPr id="6" name="Image6" descr="Orthogonal render with VTA, hippocampus and atlas"/>
+            <wp:cNvGraphicFramePr>
+              <a:graphicFrameLocks xmlns:a="http://schemas.openxmlformats.org/drawingml/2006/main" noChangeAspect="1"/>
+            </wp:cNvGraphicFramePr>
+            <a:graphic xmlns:a="http://schemas.openxmlformats.org/drawingml/2006/main">
+              <a:graphicData uri="http://schemas.openxmlformats.org/drawingml/2006/picture">
+                <pic:pic xmlns:pic="http://schemas.openxmlformats.org/drawingml/2006/picture">
+                  <pic:nvPicPr>
+                    <pic:cNvPr id="6" name="Image6" descr="Orthogonal render with VTA, hippocampus and atlas"/>
+                    <pic:cNvPicPr>
+                      <a:picLocks noChangeAspect="1" noChangeArrowheads="1"/>
+                    </pic:cNvPicPr>
+                  </pic:nvPicPr>
+                  <pic:blipFill>
+                    <a:blip r:embed="rId22"/>
+                    <a:stretch>
+                      <a:fillRect/>
+                    </a:stretch>
+                  </pic:blipFill>
+                  <pic:spPr bwMode="auto">
+                    <a:xfrm>
+                      <a:off x="0" y="0"/>
+                      <a:ext cx="5334000" cy="1771650"/>
+                    </a:xfrm>
+                    <a:prstGeom prst="rect">
+                      <a:avLst/>
+                    </a:prstGeom>
+                    <a:noFill/>
+                  </pic:spPr>
+                </pic:pic>
+              </a:graphicData>
+            </a:graphic>
+          </wp:inline>
+        </w:drawing>
+      </w:r>
+    </w:p>
+    <w:p>
+      <w:pPr>
+        <w:pStyle w:val="BodyText"/>
+        <w:bidi w:val="0"/>
+        <w:jc w:val="left"/>
+        <w:rPr/>
+      </w:pPr>
+      <w:r>
+        <w:rPr>
+          <w:rStyle w:val="Emphasis"/>
+        </w:rPr>
+        <w:t>Note.</w:t>
+      </w:r>
+      <w:r>
+        <w:rPr/>
         <w:t xml:space="preserve"> VTA in yellow, hippocampus in red, atlas in green.</w:t>
       </w:r>
     </w:p>
@@ -7816,317 +7828,6 @@
                 <pic:pic xmlns:pic="http://schemas.openxmlformats.org/drawingml/2006/picture">
                   <pic:nvPicPr>
                     <pic:cNvPr id="7" name="Image7" descr="Warped anterior atlas"/>
-                    <pic:cNvPicPr>
-                      <a:picLocks noChangeAspect="1" noChangeArrowheads="1"/>
-                    </pic:cNvPicPr>
-                  </pic:nvPicPr>
-                  <pic:blipFill>
-                    <a:blip r:embed="rId22"/>
-                    <a:stretch>
-                      <a:fillRect/>
-                    </a:stretch>
-                  </pic:blipFill>
-                  <pic:spPr bwMode="auto">
-                    <a:xfrm>
-                      <a:off x="0" y="0"/>
-                      <a:ext cx="5334000" cy="2495550"/>
-                    </a:xfrm>
-                    <a:prstGeom prst="rect">
-                      <a:avLst/>
-                    </a:prstGeom>
-                    <a:noFill/>
-                  </pic:spPr>
-                </pic:pic>
-              </a:graphicData>
-            </a:graphic>
-          </wp:inline>
-        </w:drawing>
-      </w:r>
-    </w:p>
-    <w:p>
-      <w:pPr>
-        <w:pStyle w:val="BodyText"/>
-        <w:bidi w:val="0"/>
-        <w:jc w:val="left"/>
-        <w:rPr/>
-      </w:pPr>
-      <w:r>
-        <w:rPr>
-          <w:rStyle w:val="Emphasis"/>
-        </w:rPr>
-        <w:t>Note.</w:t>
-      </w:r>
-      <w:r>
-        <w:rPr/>
-        <w:t xml:space="preserve"> Atlas in red over the mean </w:t>
-      </w:r>
-      <w:r>
-        <w:rPr>
-          <w:rStyle w:val="Emphasis"/>
-        </w:rPr>
-        <w:t>b</w:t>
-      </w:r>
-      <w:r>
-        <w:rPr/>
-        <w:t xml:space="preserve"> = 0 image. Left: axial view. Right: coronal view.</w:t>
-      </w:r>
-    </w:p>
-    <w:p>
-      <w:pPr>
-        <w:pStyle w:val="Heading1"/>
-        <w:bidi w:val="0"/>
-        <w:rPr/>
-      </w:pPr>
-      <w:r>
-        <w:rPr/>
-        <w:t>Step 3. Corridor construction</w:t>
-      </w:r>
-    </w:p>
-    <w:p>
-      <w:pPr>
-        <w:pStyle w:val="BodyText"/>
-        <w:bidi w:val="0"/>
-        <w:jc w:val="left"/>
-        <w:rPr/>
-      </w:pPr>
-      <w:r>
-        <w:rPr/>
-        <w:t>Atlas construction used approximately a dozen individually prepared exclusion regions per tract. The corridor workflow replaces them with a single mask derived from the warped atlas. The atlas is dilated, the seed and target regions are added, the union is binarized to form an inclusion zone, and the inclusion zone is inverted. The inverted image serves as the sole exclusion mask for tractography: any streamline leaving the corridor is discarded.</w:t>
-      </w:r>
-    </w:p>
-    <w:p>
-      <w:pPr>
-        <w:pStyle w:val="Heading2"/>
-        <w:bidi w:val="0"/>
-        <w:jc w:val="left"/>
-        <w:rPr/>
-      </w:pPr>
-      <w:r>
-        <w:rPr/>
-        <w:t>Procedure</w:t>
-      </w:r>
-    </w:p>
-    <w:p>
-      <w:pPr>
-        <w:pStyle w:val="PreformattedTextcode"/>
-        <w:bidi w:val="0"/>
-        <w:jc w:val="left"/>
-        <w:rPr/>
-      </w:pPr>
-      <w:r>
-        <w:rPr/>
-        <w:t>fslmaths "$d/${TRACT}_atlas_diff.nii.gz" -dilM -dilM "$d/${TRACT}_atlas_dilated.nii.gz"</w:t>
-      </w:r>
-    </w:p>
-    <w:p>
-      <w:pPr>
-        <w:pStyle w:val="PreformattedTextcode"/>
-        <w:bidi w:val="0"/>
-        <w:jc w:val="left"/>
-        <w:rPr/>
-      </w:pPr>
-      <w:r>
-        <w:rPr/>
-        <w:t>fslmaths "$d/${TRACT}_atlas_dilated.nii.gz" -add "$d/${TRACT}_seed_diff.nii.gz" \</w:t>
-      </w:r>
-    </w:p>
-    <w:p>
-      <w:pPr>
-        <w:pStyle w:val="PreformattedTextcode"/>
-        <w:bidi w:val="0"/>
-        <w:jc w:val="left"/>
-        <w:rPr/>
-      </w:pPr>
-      <w:r>
-        <w:rPr/>
-        <w:t xml:space="preserve">         </w:t>
-      </w:r>
-      <w:r>
-        <w:rPr/>
-        <w:t>-add "$d/${TRACT}_target_diff.nii.gz" -bin "$d/${TRACT}_inclusion_zone.nii.gz"</w:t>
-      </w:r>
-    </w:p>
-    <w:p>
-      <w:pPr>
-        <w:pStyle w:val="PreformattedTextcode"/>
-        <w:bidi w:val="0"/>
-        <w:spacing w:before="0" w:after="283"/>
-        <w:jc w:val="left"/>
-        <w:rPr/>
-      </w:pPr>
-      <w:r>
-        <w:rPr/>
-        <w:t>fslmaths "$d/${TRACT}_inclusion_zone.nii.gz" -binv "$d/${TRACT}_exclusion_mask.nii.gz"</w:t>
-      </w:r>
-    </w:p>
-    <w:p>
-      <w:pPr>
-        <w:pStyle w:val="BodyText"/>
-        <w:bidi w:val="0"/>
-        <w:jc w:val="left"/>
-        <w:rPr/>
-      </w:pPr>
-      <w:r>
-        <w:rPr/>
-        <w:t xml:space="preserve">The seed and target must be added before inversion; otherwise the corridor terminates short of them and tracking stops at the boundary. The full script follows; the </w:t>
-      </w:r>
-      <w:r>
-        <w:rPr>
-          <w:rStyle w:val="SourceText"/>
-        </w:rPr>
-        <w:t>DILATE_VOX</w:t>
-      </w:r>
-      <w:r>
-        <w:rPr/>
-        <w:t xml:space="preserve"> setting in the configuration controls the number of </w:t>
-      </w:r>
-      <w:r>
-        <w:rPr>
-          <w:rStyle w:val="SourceText"/>
-        </w:rPr>
-        <w:t>-dilM</w:t>
-      </w:r>
-      <w:r>
-        <w:rPr/>
-        <w:t xml:space="preserve"> passes.</w:t>
-      </w:r>
-    </w:p>
-    <w:p>
-      <w:pPr>
-        <w:pStyle w:val="BodyText"/>
-        <w:bidi w:val="0"/>
-        <w:jc w:val="left"/>
-        <w:rPr/>
-      </w:pPr>
-      <w:r>
-        <w:rPr>
-          <w:rStyle w:val="Emphasis"/>
-        </w:rPr>
-        <w:t xml:space="preserve">The script </w:t>
-      </w:r>
-      <w:r>
-        <w:rPr>
-          <w:rStyle w:val="SourceText"/>
-        </w:rPr>
-        <w:t>03_build_corridor_mask.sh</w:t>
-      </w:r>
-      <w:r>
-        <w:rPr>
-          <w:rStyle w:val="Emphasis"/>
-        </w:rPr>
-        <w:t xml:space="preserve"> is reproduced in the Supplementary Scripts appendix.</w:t>
-      </w:r>
-    </w:p>
-    <w:p>
-      <w:pPr>
-        <w:pStyle w:val="Heading2"/>
-        <w:bidi w:val="0"/>
-        <w:jc w:val="left"/>
-        <w:rPr/>
-      </w:pPr>
-      <w:r>
-        <w:rPr/>
-        <w:t>Dilation</w:t>
-      </w:r>
-    </w:p>
-    <w:p>
-      <w:pPr>
-        <w:pStyle w:val="BodyText"/>
-        <w:bidi w:val="0"/>
-        <w:jc w:val="left"/>
-        <w:rPr/>
-      </w:pPr>
-      <w:r>
-        <w:rPr/>
-        <w:t>A dilation of two voxels was used in the example dataset at 2 mm isotropic resolution. One voxel is appropriate when registration is accurate and pilot reconstructions appear loose; four voxels serves as a sensitivity setting when registration is uncertain. The 50% atlas is already somewhat wider than the median participant's core, which is why two voxels is generally sufficient. The dilation used should be reported.</w:t>
-      </w:r>
-    </w:p>
-    <w:p>
-      <w:pPr>
-        <w:pStyle w:val="Heading2"/>
-        <w:bidi w:val="0"/>
-        <w:jc w:val="left"/>
-        <w:rPr/>
-      </w:pPr>
-      <w:r>
-        <w:rPr/>
-        <w:t>Verification</w:t>
-      </w:r>
-    </w:p>
-    <w:p>
-      <w:pPr>
-        <w:pStyle w:val="BodyText"/>
-        <w:bidi w:val="0"/>
-        <w:jc w:val="left"/>
-        <w:rPr/>
-      </w:pPr>
-      <w:r>
-        <w:rPr/>
-        <w:t>The script confirms that the seed and target voxels have value 0 in the exclusion mask (that is, are not excluded) and reports the corridor size, which should be similar across participants (roughly 1,500 to 1,900 voxels at 2 mm for VTA → hippocampus in the example dataset). A corridor much larger or smaller than the others indicates a registration problem.</w:t>
-      </w:r>
-    </w:p>
-    <w:p>
-      <w:pPr>
-        <w:pStyle w:val="BodyText"/>
-        <w:bidi w:val="0"/>
-        <w:jc w:val="left"/>
-        <w:rPr/>
-      </w:pPr>
-      <w:r>
-        <w:rPr/>
-        <w:t>Visual inspection confirms that the corridor follows a plausible path from seed to target and contains both regions (Figure S7). Contact with the ventricle or extension into cortex indicates excessive dilation or a registration error.</w:t>
-      </w:r>
-    </w:p>
-    <w:p>
-      <w:pPr>
-        <w:pStyle w:val="BodyText"/>
-        <w:bidi w:val="0"/>
-        <w:jc w:val="left"/>
-        <w:rPr/>
-      </w:pPr>
-      <w:r>
-        <w:rPr>
-          <w:rStyle w:val="Strong"/>
-        </w:rPr>
-        <w:t>Figure S7</w:t>
-      </w:r>
-    </w:p>
-    <w:p>
-      <w:pPr>
-        <w:pStyle w:val="BodyText"/>
-        <w:bidi w:val="0"/>
-        <w:jc w:val="left"/>
-        <w:rPr/>
-      </w:pPr>
-      <w:r>
-        <w:rPr>
-          <w:rStyle w:val="Emphasis"/>
-        </w:rPr>
-        <w:t>Inclusion Zone for the Anterior VTA → Hippocampus Tract</w:t>
-      </w:r>
-    </w:p>
-    <w:p>
-      <w:pPr>
-        <w:pStyle w:val="BodyText"/>
-        <w:bidi w:val="0"/>
-        <w:jc w:val="left"/>
-        <w:rPr/>
-      </w:pPr>
-      <w:r>
-        <w:rPr/>
-        <w:drawing>
-          <wp:inline distT="0" distB="0" distL="0" distR="0">
-            <wp:extent cx="5334000" cy="2495550"/>
-            <wp:effectExtent l="0" t="0" r="0" b="0"/>
-            <wp:docPr id="8" name="Image8" descr="Inclusion zone over the mean b = 0 image"/>
-            <wp:cNvGraphicFramePr>
-              <a:graphicFrameLocks xmlns:a="http://schemas.openxmlformats.org/drawingml/2006/main" noChangeAspect="1"/>
-            </wp:cNvGraphicFramePr>
-            <a:graphic xmlns:a="http://schemas.openxmlformats.org/drawingml/2006/main">
-              <a:graphicData uri="http://schemas.openxmlformats.org/drawingml/2006/picture">
-                <pic:pic xmlns:pic="http://schemas.openxmlformats.org/drawingml/2006/picture">
-                  <pic:nvPicPr>
-                    <pic:cNvPr id="8" name="Image8" descr="Inclusion zone over the mean b = 0 image"/>
                     <pic:cNvPicPr>
                       <a:picLocks noChangeAspect="1" noChangeArrowheads="1"/>
                     </pic:cNvPicPr>
@@ -8169,6 +7870,317 @@
       </w:r>
       <w:r>
         <w:rPr/>
+        <w:t xml:space="preserve"> Atlas in red over the mean </w:t>
+      </w:r>
+      <w:r>
+        <w:rPr>
+          <w:rStyle w:val="Emphasis"/>
+        </w:rPr>
+        <w:t>b</w:t>
+      </w:r>
+      <w:r>
+        <w:rPr/>
+        <w:t xml:space="preserve"> = 0 image. Left: axial view. Right: coronal view.</w:t>
+      </w:r>
+    </w:p>
+    <w:p>
+      <w:pPr>
+        <w:pStyle w:val="Heading1"/>
+        <w:bidi w:val="0"/>
+        <w:rPr/>
+      </w:pPr>
+      <w:r>
+        <w:rPr/>
+        <w:t>Step 3. Corridor construction</w:t>
+      </w:r>
+    </w:p>
+    <w:p>
+      <w:pPr>
+        <w:pStyle w:val="BodyText"/>
+        <w:bidi w:val="0"/>
+        <w:jc w:val="left"/>
+        <w:rPr/>
+      </w:pPr>
+      <w:r>
+        <w:rPr/>
+        <w:t>Atlas construction used approximately a dozen individually prepared exclusion regions per tract. The corridor workflow replaces them with a single mask derived from the warped atlas. The atlas is dilated, the seed and target regions are added, the union is binarized to form an inclusion zone, and the inclusion zone is inverted. The inverted image serves as the sole exclusion mask for tractography: any streamline leaving the corridor is discarded.</w:t>
+      </w:r>
+    </w:p>
+    <w:p>
+      <w:pPr>
+        <w:pStyle w:val="Heading2"/>
+        <w:bidi w:val="0"/>
+        <w:jc w:val="left"/>
+        <w:rPr/>
+      </w:pPr>
+      <w:r>
+        <w:rPr/>
+        <w:t>Procedure</w:t>
+      </w:r>
+    </w:p>
+    <w:p>
+      <w:pPr>
+        <w:pStyle w:val="PreformattedTextcode"/>
+        <w:bidi w:val="0"/>
+        <w:jc w:val="left"/>
+        <w:rPr/>
+      </w:pPr>
+      <w:r>
+        <w:rPr/>
+        <w:t>fslmaths "$d/${TRACT}_atlas_diff.nii.gz" -dilM -dilM "$d/${TRACT}_atlas_dilated.nii.gz"</w:t>
+      </w:r>
+    </w:p>
+    <w:p>
+      <w:pPr>
+        <w:pStyle w:val="PreformattedTextcode"/>
+        <w:bidi w:val="0"/>
+        <w:jc w:val="left"/>
+        <w:rPr/>
+      </w:pPr>
+      <w:r>
+        <w:rPr/>
+        <w:t>fslmaths "$d/${TRACT}_atlas_dilated.nii.gz" -add "$d/${TRACT}_seed_diff.nii.gz" \</w:t>
+      </w:r>
+    </w:p>
+    <w:p>
+      <w:pPr>
+        <w:pStyle w:val="PreformattedTextcode"/>
+        <w:bidi w:val="0"/>
+        <w:jc w:val="left"/>
+        <w:rPr/>
+      </w:pPr>
+      <w:r>
+        <w:rPr/>
+        <w:t xml:space="preserve">         </w:t>
+      </w:r>
+      <w:r>
+        <w:rPr/>
+        <w:t>-add "$d/${TRACT}_target_diff.nii.gz" -bin "$d/${TRACT}_inclusion_zone.nii.gz"</w:t>
+      </w:r>
+    </w:p>
+    <w:p>
+      <w:pPr>
+        <w:pStyle w:val="PreformattedTextcode"/>
+        <w:bidi w:val="0"/>
+        <w:spacing w:before="0" w:after="283"/>
+        <w:jc w:val="left"/>
+        <w:rPr/>
+      </w:pPr>
+      <w:r>
+        <w:rPr/>
+        <w:t>fslmaths "$d/${TRACT}_inclusion_zone.nii.gz" -binv "$d/${TRACT}_exclusion_mask.nii.gz"</w:t>
+      </w:r>
+    </w:p>
+    <w:p>
+      <w:pPr>
+        <w:pStyle w:val="BodyText"/>
+        <w:bidi w:val="0"/>
+        <w:jc w:val="left"/>
+        <w:rPr/>
+      </w:pPr>
+      <w:r>
+        <w:rPr/>
+        <w:t xml:space="preserve">The seed and target must be added before inversion; otherwise the corridor terminates short of them and tracking stops at the boundary. The full script follows; the </w:t>
+      </w:r>
+      <w:r>
+        <w:rPr>
+          <w:rStyle w:val="SourceText"/>
+        </w:rPr>
+        <w:t>DILATE_VOX</w:t>
+      </w:r>
+      <w:r>
+        <w:rPr/>
+        <w:t xml:space="preserve"> setting in the configuration controls the number of </w:t>
+      </w:r>
+      <w:r>
+        <w:rPr>
+          <w:rStyle w:val="SourceText"/>
+        </w:rPr>
+        <w:t>-dilM</w:t>
+      </w:r>
+      <w:r>
+        <w:rPr/>
+        <w:t xml:space="preserve"> passes.</w:t>
+      </w:r>
+    </w:p>
+    <w:p>
+      <w:pPr>
+        <w:pStyle w:val="BodyText"/>
+        <w:bidi w:val="0"/>
+        <w:jc w:val="left"/>
+        <w:rPr/>
+      </w:pPr>
+      <w:r>
+        <w:rPr>
+          <w:rStyle w:val="Emphasis"/>
+        </w:rPr>
+        <w:t xml:space="preserve">The script </w:t>
+      </w:r>
+      <w:r>
+        <w:rPr>
+          <w:rStyle w:val="SourceText"/>
+        </w:rPr>
+        <w:t>03_build_corridor_mask.sh</w:t>
+      </w:r>
+      <w:r>
+        <w:rPr>
+          <w:rStyle w:val="Emphasis"/>
+        </w:rPr>
+        <w:t xml:space="preserve"> is reproduced in the Supplementary Scripts appendix.</w:t>
+      </w:r>
+    </w:p>
+    <w:p>
+      <w:pPr>
+        <w:pStyle w:val="Heading2"/>
+        <w:bidi w:val="0"/>
+        <w:jc w:val="left"/>
+        <w:rPr/>
+      </w:pPr>
+      <w:r>
+        <w:rPr/>
+        <w:t>Dilation</w:t>
+      </w:r>
+    </w:p>
+    <w:p>
+      <w:pPr>
+        <w:pStyle w:val="BodyText"/>
+        <w:bidi w:val="0"/>
+        <w:jc w:val="left"/>
+        <w:rPr/>
+      </w:pPr>
+      <w:r>
+        <w:rPr/>
+        <w:t>A dilation of two voxels was used in the example dataset at 2 mm isotropic resolution. One voxel is appropriate when registration is accurate and pilot reconstructions appear loose; four voxels serves as a sensitivity setting when registration is uncertain. The 50% atlas is already somewhat wider than the median participant's core, which is why two voxels is generally sufficient. The dilation used should be reported.</w:t>
+      </w:r>
+    </w:p>
+    <w:p>
+      <w:pPr>
+        <w:pStyle w:val="Heading2"/>
+        <w:bidi w:val="0"/>
+        <w:jc w:val="left"/>
+        <w:rPr/>
+      </w:pPr>
+      <w:r>
+        <w:rPr/>
+        <w:t>Verification</w:t>
+      </w:r>
+    </w:p>
+    <w:p>
+      <w:pPr>
+        <w:pStyle w:val="BodyText"/>
+        <w:bidi w:val="0"/>
+        <w:jc w:val="left"/>
+        <w:rPr/>
+      </w:pPr>
+      <w:r>
+        <w:rPr/>
+        <w:t>The script confirms that the seed and target voxels have value 0 in the exclusion mask (that is, are not excluded) and reports the corridor size, which should be similar across participants (roughly 1,500 to 1,900 voxels at 2 mm for VTA → hippocampus in the example dataset). A corridor much larger or smaller than the others indicates a registration problem.</w:t>
+      </w:r>
+    </w:p>
+    <w:p>
+      <w:pPr>
+        <w:pStyle w:val="BodyText"/>
+        <w:bidi w:val="0"/>
+        <w:jc w:val="left"/>
+        <w:rPr/>
+      </w:pPr>
+      <w:r>
+        <w:rPr/>
+        <w:t>Visual inspection confirms that the corridor follows a plausible path from seed to target and contains both regions (Figure S7). Contact with the ventricle or extension into cortex indicates excessive dilation or a registration error.</w:t>
+      </w:r>
+    </w:p>
+    <w:p>
+      <w:pPr>
+        <w:pStyle w:val="BodyText"/>
+        <w:bidi w:val="0"/>
+        <w:jc w:val="left"/>
+        <w:rPr/>
+      </w:pPr>
+      <w:r>
+        <w:rPr>
+          <w:rStyle w:val="Strong"/>
+        </w:rPr>
+        <w:t>Figure S7</w:t>
+      </w:r>
+    </w:p>
+    <w:p>
+      <w:pPr>
+        <w:pStyle w:val="BodyText"/>
+        <w:bidi w:val="0"/>
+        <w:jc w:val="left"/>
+        <w:rPr/>
+      </w:pPr>
+      <w:r>
+        <w:rPr>
+          <w:rStyle w:val="Emphasis"/>
+        </w:rPr>
+        <w:t>Inclusion Zone for the Anterior VTA → Hippocampus Tract</w:t>
+      </w:r>
+    </w:p>
+    <w:p>
+      <w:pPr>
+        <w:pStyle w:val="BodyText"/>
+        <w:bidi w:val="0"/>
+        <w:jc w:val="left"/>
+        <w:rPr/>
+      </w:pPr>
+      <w:r>
+        <w:rPr/>
+        <w:drawing>
+          <wp:inline distT="0" distB="0" distL="0" distR="0">
+            <wp:extent cx="5334000" cy="2495550"/>
+            <wp:effectExtent l="0" t="0" r="0" b="0"/>
+            <wp:docPr id="8" name="Image8" descr="Inclusion zone over the mean b = 0 image"/>
+            <wp:cNvGraphicFramePr>
+              <a:graphicFrameLocks xmlns:a="http://schemas.openxmlformats.org/drawingml/2006/main" noChangeAspect="1"/>
+            </wp:cNvGraphicFramePr>
+            <a:graphic xmlns:a="http://schemas.openxmlformats.org/drawingml/2006/main">
+              <a:graphicData uri="http://schemas.openxmlformats.org/drawingml/2006/picture">
+                <pic:pic xmlns:pic="http://schemas.openxmlformats.org/drawingml/2006/picture">
+                  <pic:nvPicPr>
+                    <pic:cNvPr id="8" name="Image8" descr="Inclusion zone over the mean b = 0 image"/>
+                    <pic:cNvPicPr>
+                      <a:picLocks noChangeAspect="1" noChangeArrowheads="1"/>
+                    </pic:cNvPicPr>
+                  </pic:nvPicPr>
+                  <pic:blipFill>
+                    <a:blip r:embed="rId24"/>
+                    <a:stretch>
+                      <a:fillRect/>
+                    </a:stretch>
+                  </pic:blipFill>
+                  <pic:spPr bwMode="auto">
+                    <a:xfrm>
+                      <a:off x="0" y="0"/>
+                      <a:ext cx="5334000" cy="2495550"/>
+                    </a:xfrm>
+                    <a:prstGeom prst="rect">
+                      <a:avLst/>
+                    </a:prstGeom>
+                    <a:noFill/>
+                  </pic:spPr>
+                </pic:pic>
+              </a:graphicData>
+            </a:graphic>
+          </wp:inline>
+        </w:drawing>
+      </w:r>
+    </w:p>
+    <w:p>
+      <w:pPr>
+        <w:pStyle w:val="BodyText"/>
+        <w:bidi w:val="0"/>
+        <w:jc w:val="left"/>
+        <w:rPr/>
+      </w:pPr>
+      <w:r>
+        <w:rPr>
+          <w:rStyle w:val="Emphasis"/>
+        </w:rPr>
+        <w:t>Note.</w:t>
+      </w:r>
+      <w:r>
+        <w:rPr/>
         <w:t xml:space="preserve"> Inclusion zone in cyan over the mean </w:t>
       </w:r>
       <w:r>
@@ -10372,7 +10384,7 @@
                     </pic:cNvPicPr>
                   </pic:nvPicPr>
                   <pic:blipFill>
-                    <a:blip r:embed="rId24"/>
+                    <a:blip r:embed="rId25"/>
                     <a:stretch>
                       <a:fillRect/>
                     </a:stretch>
@@ -10467,7 +10479,7 @@
                     </pic:cNvPicPr>
                   </pic:nvPicPr>
                   <pic:blipFill>
-                    <a:blip r:embed="rId25"/>
+                    <a:blip r:embed="rId26"/>
                     <a:stretch>
                       <a:fillRect/>
                     </a:stretch>
@@ -10691,7 +10703,7 @@
         <w:rPr/>
         <w:t xml:space="preserve"> using second-order integration over fibre orientation distributions (iFOD2; Tournier et al., 2010). The FOD image is the last output of preprocessing (</w:t>
       </w:r>
-      <w:hyperlink r:id="rId26">
+      <w:hyperlink r:id="rId27">
         <w:r>
           <w:rPr>
             <w:rStyle w:val="Hyperlink"/>
@@ -13167,7 +13179,7 @@
                     </pic:cNvPicPr>
                   </pic:nvPicPr>
                   <pic:blipFill>
-                    <a:blip r:embed="rId27"/>
+                    <a:blip r:embed="rId28"/>
                     <a:stretch>
                       <a:fillRect/>
                     </a:stretch>
@@ -13262,7 +13274,7 @@
                     </pic:cNvPicPr>
                   </pic:nvPicPr>
                   <pic:blipFill>
-                    <a:blip r:embed="rId28"/>
+                    <a:blip r:embed="rId29"/>
                     <a:stretch>
                       <a:fillRect/>
                     </a:stretch>
@@ -13815,111 +13827,6 @@
                 <pic:pic xmlns:pic="http://schemas.openxmlformats.org/drawingml/2006/picture">
                   <pic:nvPicPr>
                     <pic:cNvPr id="13" name="Image13" descr="Cleaned posterior tract"/>
-                    <pic:cNvPicPr>
-                      <a:picLocks noChangeAspect="1" noChangeArrowheads="1"/>
-                    </pic:cNvPicPr>
-                  </pic:nvPicPr>
-                  <pic:blipFill>
-                    <a:blip r:embed="rId29"/>
-                    <a:stretch>
-                      <a:fillRect/>
-                    </a:stretch>
-                  </pic:blipFill>
-                  <pic:spPr bwMode="auto">
-                    <a:xfrm>
-                      <a:off x="0" y="0"/>
-                      <a:ext cx="5334000" cy="2476500"/>
-                    </a:xfrm>
-                    <a:prstGeom prst="rect">
-                      <a:avLst/>
-                    </a:prstGeom>
-                    <a:noFill/>
-                  </pic:spPr>
-                </pic:pic>
-              </a:graphicData>
-            </a:graphic>
-          </wp:inline>
-        </w:drawing>
-      </w:r>
-    </w:p>
-    <w:p>
-      <w:pPr>
-        <w:pStyle w:val="BodyText"/>
-        <w:bidi w:val="0"/>
-        <w:jc w:val="left"/>
-        <w:rPr/>
-      </w:pPr>
-      <w:r>
-        <w:rPr>
-          <w:rStyle w:val="Emphasis"/>
-        </w:rPr>
-        <w:t>Note.</w:t>
-      </w:r>
-      <w:r>
-        <w:rPr/>
-        <w:t xml:space="preserve"> Streamline density over the mean </w:t>
-      </w:r>
-      <w:r>
-        <w:rPr>
-          <w:rStyle w:val="Emphasis"/>
-        </w:rPr>
-        <w:t>b</w:t>
-      </w:r>
-      <w:r>
-        <w:rPr/>
-        <w:t xml:space="preserve"> = 0 image. Left: axial view. Right: coronal view. The same layout applies to Figures S13 and S14.</w:t>
-      </w:r>
-    </w:p>
-    <w:p>
-      <w:pPr>
-        <w:pStyle w:val="BodyText"/>
-        <w:bidi w:val="0"/>
-        <w:jc w:val="left"/>
-        <w:rPr/>
-      </w:pPr>
-      <w:r>
-        <w:rPr>
-          <w:rStyle w:val="Strong"/>
-        </w:rPr>
-        <w:t>Figure S13</w:t>
-      </w:r>
-    </w:p>
-    <w:p>
-      <w:pPr>
-        <w:pStyle w:val="BodyText"/>
-        <w:bidi w:val="0"/>
-        <w:jc w:val="left"/>
-        <w:rPr/>
-      </w:pPr>
-      <w:r>
-        <w:rPr>
-          <w:rStyle w:val="Emphasis"/>
-        </w:rPr>
-        <w:t>Cleaned Tract at the Low End of Retention</w:t>
-      </w:r>
-    </w:p>
-    <w:p>
-      <w:pPr>
-        <w:pStyle w:val="BodyText"/>
-        <w:bidi w:val="0"/>
-        <w:jc w:val="left"/>
-        <w:rPr/>
-      </w:pPr>
-      <w:r>
-        <w:rPr/>
-        <w:drawing>
-          <wp:inline distT="0" distB="0" distL="0" distR="0">
-            <wp:extent cx="5334000" cy="2476500"/>
-            <wp:effectExtent l="0" t="0" r="0" b="0"/>
-            <wp:docPr id="14" name="Image14" descr="Cleaned tract with low retention"/>
-            <wp:cNvGraphicFramePr>
-              <a:graphicFrameLocks xmlns:a="http://schemas.openxmlformats.org/drawingml/2006/main" noChangeAspect="1"/>
-            </wp:cNvGraphicFramePr>
-            <a:graphic xmlns:a="http://schemas.openxmlformats.org/drawingml/2006/main">
-              <a:graphicData uri="http://schemas.openxmlformats.org/drawingml/2006/picture">
-                <pic:pic xmlns:pic="http://schemas.openxmlformats.org/drawingml/2006/picture">
-                  <pic:nvPicPr>
-                    <pic:cNvPr id="14" name="Image14" descr="Cleaned tract with low retention"/>
                     <pic:cNvPicPr>
                       <a:picLocks noChangeAspect="1" noChangeArrowheads="1"/>
                     </pic:cNvPicPr>
@@ -13962,6 +13869,111 @@
       </w:r>
       <w:r>
         <w:rPr/>
+        <w:t xml:space="preserve"> Streamline density over the mean </w:t>
+      </w:r>
+      <w:r>
+        <w:rPr>
+          <w:rStyle w:val="Emphasis"/>
+        </w:rPr>
+        <w:t>b</w:t>
+      </w:r>
+      <w:r>
+        <w:rPr/>
+        <w:t xml:space="preserve"> = 0 image. Left: axial view. Right: coronal view. The same layout applies to Figures S13 and S14.</w:t>
+      </w:r>
+    </w:p>
+    <w:p>
+      <w:pPr>
+        <w:pStyle w:val="BodyText"/>
+        <w:bidi w:val="0"/>
+        <w:jc w:val="left"/>
+        <w:rPr/>
+      </w:pPr>
+      <w:r>
+        <w:rPr>
+          <w:rStyle w:val="Strong"/>
+        </w:rPr>
+        <w:t>Figure S13</w:t>
+      </w:r>
+    </w:p>
+    <w:p>
+      <w:pPr>
+        <w:pStyle w:val="BodyText"/>
+        <w:bidi w:val="0"/>
+        <w:jc w:val="left"/>
+        <w:rPr/>
+      </w:pPr>
+      <w:r>
+        <w:rPr>
+          <w:rStyle w:val="Emphasis"/>
+        </w:rPr>
+        <w:t>Cleaned Tract at the Low End of Retention</w:t>
+      </w:r>
+    </w:p>
+    <w:p>
+      <w:pPr>
+        <w:pStyle w:val="BodyText"/>
+        <w:bidi w:val="0"/>
+        <w:jc w:val="left"/>
+        <w:rPr/>
+      </w:pPr>
+      <w:r>
+        <w:rPr/>
+        <w:drawing>
+          <wp:inline distT="0" distB="0" distL="0" distR="0">
+            <wp:extent cx="5334000" cy="2476500"/>
+            <wp:effectExtent l="0" t="0" r="0" b="0"/>
+            <wp:docPr id="14" name="Image14" descr="Cleaned tract with low retention"/>
+            <wp:cNvGraphicFramePr>
+              <a:graphicFrameLocks xmlns:a="http://schemas.openxmlformats.org/drawingml/2006/main" noChangeAspect="1"/>
+            </wp:cNvGraphicFramePr>
+            <a:graphic xmlns:a="http://schemas.openxmlformats.org/drawingml/2006/main">
+              <a:graphicData uri="http://schemas.openxmlformats.org/drawingml/2006/picture">
+                <pic:pic xmlns:pic="http://schemas.openxmlformats.org/drawingml/2006/picture">
+                  <pic:nvPicPr>
+                    <pic:cNvPr id="14" name="Image14" descr="Cleaned tract with low retention"/>
+                    <pic:cNvPicPr>
+                      <a:picLocks noChangeAspect="1" noChangeArrowheads="1"/>
+                    </pic:cNvPicPr>
+                  </pic:nvPicPr>
+                  <pic:blipFill>
+                    <a:blip r:embed="rId31"/>
+                    <a:stretch>
+                      <a:fillRect/>
+                    </a:stretch>
+                  </pic:blipFill>
+                  <pic:spPr bwMode="auto">
+                    <a:xfrm>
+                      <a:off x="0" y="0"/>
+                      <a:ext cx="5334000" cy="2476500"/>
+                    </a:xfrm>
+                    <a:prstGeom prst="rect">
+                      <a:avLst/>
+                    </a:prstGeom>
+                    <a:noFill/>
+                  </pic:spPr>
+                </pic:pic>
+              </a:graphicData>
+            </a:graphic>
+          </wp:inline>
+        </w:drawing>
+      </w:r>
+    </w:p>
+    <w:p>
+      <w:pPr>
+        <w:pStyle w:val="BodyText"/>
+        <w:bidi w:val="0"/>
+        <w:jc w:val="left"/>
+        <w:rPr/>
+      </w:pPr>
+      <w:r>
+        <w:rPr>
+          <w:rStyle w:val="Emphasis"/>
+        </w:rPr>
+        <w:t>Note.</w:t>
+      </w:r>
+      <w:r>
+        <w:rPr/>
         <w:t xml:space="preserve"> About a quarter of the streamlines survived cleaning; the bundle is still well formed.</w:t>
       </w:r>
     </w:p>
@@ -14020,7 +14032,7 @@
                     </pic:cNvPicPr>
                   </pic:nvPicPr>
                   <pic:blipFill>
-                    <a:blip r:embed="rId31"/>
+                    <a:blip r:embed="rId32"/>
                     <a:stretch>
                       <a:fillRect/>
                     </a:stretch>
@@ -14805,101 +14817,6 @@
                 <pic:pic xmlns:pic="http://schemas.openxmlformats.org/drawingml/2006/picture">
                   <pic:nvPicPr>
                     <pic:cNvPr id="16" name="Image16" descr="FA profile"/>
-                    <pic:cNvPicPr>
-                      <a:picLocks noChangeAspect="1" noChangeArrowheads="1"/>
-                    </pic:cNvPicPr>
-                  </pic:nvPicPr>
-                  <pic:blipFill>
-                    <a:blip r:embed="rId32"/>
-                    <a:stretch>
-                      <a:fillRect/>
-                    </a:stretch>
-                  </pic:blipFill>
-                  <pic:spPr bwMode="auto">
-                    <a:xfrm>
-                      <a:off x="0" y="0"/>
-                      <a:ext cx="5334000" cy="3762375"/>
-                    </a:xfrm>
-                    <a:prstGeom prst="rect">
-                      <a:avLst/>
-                    </a:prstGeom>
-                    <a:noFill/>
-                  </pic:spPr>
-                </pic:pic>
-              </a:graphicData>
-            </a:graphic>
-          </wp:inline>
-        </w:drawing>
-      </w:r>
-    </w:p>
-    <w:p>
-      <w:pPr>
-        <w:pStyle w:val="BodyText"/>
-        <w:bidi w:val="0"/>
-        <w:jc w:val="left"/>
-        <w:rPr/>
-      </w:pPr>
-      <w:r>
-        <w:rPr>
-          <w:rStyle w:val="Emphasis"/>
-        </w:rPr>
-        <w:t>Note.</w:t>
-      </w:r>
-      <w:r>
-        <w:rPr/>
-        <w:t xml:space="preserve"> FA peaks in deep white matter and declines toward the hippocampal end. VTA = ventral tegmental area.</w:t>
-      </w:r>
-    </w:p>
-    <w:p>
-      <w:pPr>
-        <w:pStyle w:val="BodyText"/>
-        <w:bidi w:val="0"/>
-        <w:jc w:val="left"/>
-        <w:rPr/>
-      </w:pPr>
-      <w:r>
-        <w:rPr>
-          <w:rStyle w:val="Strong"/>
-        </w:rPr>
-        <w:t>Figure S16</w:t>
-      </w:r>
-    </w:p>
-    <w:p>
-      <w:pPr>
-        <w:pStyle w:val="BodyText"/>
-        <w:bidi w:val="0"/>
-        <w:jc w:val="left"/>
-        <w:rPr/>
-      </w:pPr>
-      <w:r>
-        <w:rPr>
-          <w:rStyle w:val="Emphasis"/>
-        </w:rPr>
-        <w:t>NODDI Indices Along the Same Bundle</w:t>
-      </w:r>
-    </w:p>
-    <w:p>
-      <w:pPr>
-        <w:pStyle w:val="BodyText"/>
-        <w:bidi w:val="0"/>
-        <w:jc w:val="left"/>
-        <w:rPr/>
-      </w:pPr>
-      <w:r>
-        <w:rPr/>
-        <w:drawing>
-          <wp:inline distT="0" distB="0" distL="0" distR="0">
-            <wp:extent cx="5334000" cy="3762375"/>
-            <wp:effectExtent l="0" t="0" r="0" b="0"/>
-            <wp:docPr id="17" name="Image17" descr="NDI profile"/>
-            <wp:cNvGraphicFramePr>
-              <a:graphicFrameLocks xmlns:a="http://schemas.openxmlformats.org/drawingml/2006/main" noChangeAspect="1"/>
-            </wp:cNvGraphicFramePr>
-            <a:graphic xmlns:a="http://schemas.openxmlformats.org/drawingml/2006/main">
-              <a:graphicData uri="http://schemas.openxmlformats.org/drawingml/2006/picture">
-                <pic:pic xmlns:pic="http://schemas.openxmlformats.org/drawingml/2006/picture">
-                  <pic:nvPicPr>
-                    <pic:cNvPr id="17" name="Image17" descr="NDI profile"/>
                     <pic:cNvPicPr>
                       <a:picLocks noChangeAspect="1" noChangeArrowheads="1"/>
                     </pic:cNvPicPr>
@@ -14935,6 +14852,101 @@
         <w:rPr/>
       </w:pPr>
       <w:r>
+        <w:rPr>
+          <w:rStyle w:val="Emphasis"/>
+        </w:rPr>
+        <w:t>Note.</w:t>
+      </w:r>
+      <w:r>
+        <w:rPr/>
+        <w:t xml:space="preserve"> FA peaks in deep white matter and declines toward the hippocampal end. VTA = ventral tegmental area.</w:t>
+      </w:r>
+    </w:p>
+    <w:p>
+      <w:pPr>
+        <w:pStyle w:val="BodyText"/>
+        <w:bidi w:val="0"/>
+        <w:jc w:val="left"/>
+        <w:rPr/>
+      </w:pPr>
+      <w:r>
+        <w:rPr>
+          <w:rStyle w:val="Strong"/>
+        </w:rPr>
+        <w:t>Figure S16</w:t>
+      </w:r>
+    </w:p>
+    <w:p>
+      <w:pPr>
+        <w:pStyle w:val="BodyText"/>
+        <w:bidi w:val="0"/>
+        <w:jc w:val="left"/>
+        <w:rPr/>
+      </w:pPr>
+      <w:r>
+        <w:rPr>
+          <w:rStyle w:val="Emphasis"/>
+        </w:rPr>
+        <w:t>NODDI Indices Along the Same Bundle</w:t>
+      </w:r>
+    </w:p>
+    <w:p>
+      <w:pPr>
+        <w:pStyle w:val="BodyText"/>
+        <w:bidi w:val="0"/>
+        <w:jc w:val="left"/>
+        <w:rPr/>
+      </w:pPr>
+      <w:r>
+        <w:rPr/>
+        <w:drawing>
+          <wp:inline distT="0" distB="0" distL="0" distR="0">
+            <wp:extent cx="5334000" cy="3762375"/>
+            <wp:effectExtent l="0" t="0" r="0" b="0"/>
+            <wp:docPr id="17" name="Image17" descr="NDI profile"/>
+            <wp:cNvGraphicFramePr>
+              <a:graphicFrameLocks xmlns:a="http://schemas.openxmlformats.org/drawingml/2006/main" noChangeAspect="1"/>
+            </wp:cNvGraphicFramePr>
+            <a:graphic xmlns:a="http://schemas.openxmlformats.org/drawingml/2006/main">
+              <a:graphicData uri="http://schemas.openxmlformats.org/drawingml/2006/picture">
+                <pic:pic xmlns:pic="http://schemas.openxmlformats.org/drawingml/2006/picture">
+                  <pic:nvPicPr>
+                    <pic:cNvPr id="17" name="Image17" descr="NDI profile"/>
+                    <pic:cNvPicPr>
+                      <a:picLocks noChangeAspect="1" noChangeArrowheads="1"/>
+                    </pic:cNvPicPr>
+                  </pic:nvPicPr>
+                  <pic:blipFill>
+                    <a:blip r:embed="rId34"/>
+                    <a:stretch>
+                      <a:fillRect/>
+                    </a:stretch>
+                  </pic:blipFill>
+                  <pic:spPr bwMode="auto">
+                    <a:xfrm>
+                      <a:off x="0" y="0"/>
+                      <a:ext cx="5334000" cy="3762375"/>
+                    </a:xfrm>
+                    <a:prstGeom prst="rect">
+                      <a:avLst/>
+                    </a:prstGeom>
+                    <a:noFill/>
+                  </pic:spPr>
+                </pic:pic>
+              </a:graphicData>
+            </a:graphic>
+          </wp:inline>
+        </w:drawing>
+      </w:r>
+    </w:p>
+    <w:p>
+      <w:pPr>
+        <w:pStyle w:val="BodyText"/>
+        <w:bidi w:val="0"/>
+        <w:jc w:val="left"/>
+        <w:rPr/>
+      </w:pPr>
+      <w:r>
         <w:rPr/>
         <w:drawing>
           <wp:inline distT="0" distB="0" distL="0" distR="0">
@@ -14954,7 +14966,7 @@
                     </pic:cNvPicPr>
                   </pic:nvPicPr>
                   <pic:blipFill>
-                    <a:blip r:embed="rId34"/>
+                    <a:blip r:embed="rId35"/>
                     <a:stretch>
                       <a:fillRect/>
                     </a:stretch>
@@ -14998,101 +15010,6 @@
                 <pic:pic xmlns:pic="http://schemas.openxmlformats.org/drawingml/2006/picture">
                   <pic:nvPicPr>
                     <pic:cNvPr id="19" name="Image19" descr="FWF profile"/>
-                    <pic:cNvPicPr>
-                      <a:picLocks noChangeAspect="1" noChangeArrowheads="1"/>
-                    </pic:cNvPicPr>
-                  </pic:nvPicPr>
-                  <pic:blipFill>
-                    <a:blip r:embed="rId35"/>
-                    <a:stretch>
-                      <a:fillRect/>
-                    </a:stretch>
-                  </pic:blipFill>
-                  <pic:spPr bwMode="auto">
-                    <a:xfrm>
-                      <a:off x="0" y="0"/>
-                      <a:ext cx="5334000" cy="3762375"/>
-                    </a:xfrm>
-                    <a:prstGeom prst="rect">
-                      <a:avLst/>
-                    </a:prstGeom>
-                    <a:noFill/>
-                  </pic:spPr>
-                </pic:pic>
-              </a:graphicData>
-            </a:graphic>
-          </wp:inline>
-        </w:drawing>
-      </w:r>
-    </w:p>
-    <w:p>
-      <w:pPr>
-        <w:pStyle w:val="BodyText"/>
-        <w:bidi w:val="0"/>
-        <w:jc w:val="left"/>
-        <w:rPr/>
-      </w:pPr>
-      <w:r>
-        <w:rPr>
-          <w:rStyle w:val="Emphasis"/>
-        </w:rPr>
-        <w:t>Note.</w:t>
-      </w:r>
-      <w:r>
-        <w:rPr/>
-        <w:t xml:space="preserve"> NDI (top), ODI (middle) and FWF (bottom). NDI is high near the VTA and increases again toward the hippocampus; ODI is higher at both ends where fibres fan; FWF rises sharply at the hippocampal end adjacent to cerebrospinal fluid.</w:t>
-      </w:r>
-    </w:p>
-    <w:p>
-      <w:pPr>
-        <w:pStyle w:val="BodyText"/>
-        <w:bidi w:val="0"/>
-        <w:jc w:val="left"/>
-        <w:rPr/>
-      </w:pPr>
-      <w:r>
-        <w:rPr>
-          <w:rStyle w:val="Strong"/>
-        </w:rPr>
-        <w:t>Figure S17</w:t>
-      </w:r>
-    </w:p>
-    <w:p>
-      <w:pPr>
-        <w:pStyle w:val="BodyText"/>
-        <w:bidi w:val="0"/>
-        <w:jc w:val="left"/>
-        <w:rPr/>
-      </w:pPr>
-      <w:r>
-        <w:rPr>
-          <w:rStyle w:val="Emphasis"/>
-        </w:rPr>
-        <w:t>NDI Along the Anterior Tract for the Same Participant</w:t>
-      </w:r>
-    </w:p>
-    <w:p>
-      <w:pPr>
-        <w:pStyle w:val="BodyText"/>
-        <w:bidi w:val="0"/>
-        <w:jc w:val="left"/>
-        <w:rPr/>
-      </w:pPr>
-      <w:r>
-        <w:rPr/>
-        <w:drawing>
-          <wp:inline distT="0" distB="0" distL="0" distR="0">
-            <wp:extent cx="5334000" cy="3762375"/>
-            <wp:effectExtent l="0" t="0" r="0" b="0"/>
-            <wp:docPr id="20" name="Image20" descr="NDI profile, anterior tract"/>
-            <wp:cNvGraphicFramePr>
-              <a:graphicFrameLocks xmlns:a="http://schemas.openxmlformats.org/drawingml/2006/main" noChangeAspect="1"/>
-            </wp:cNvGraphicFramePr>
-            <a:graphic xmlns:a="http://schemas.openxmlformats.org/drawingml/2006/main">
-              <a:graphicData uri="http://schemas.openxmlformats.org/drawingml/2006/picture">
-                <pic:pic xmlns:pic="http://schemas.openxmlformats.org/drawingml/2006/picture">
-                  <pic:nvPicPr>
-                    <pic:cNvPr id="20" name="Image20" descr="NDI profile, anterior tract"/>
                     <pic:cNvPicPr>
                       <a:picLocks noChangeAspect="1" noChangeArrowheads="1"/>
                     </pic:cNvPicPr>
@@ -15135,6 +15052,101 @@
       </w:r>
       <w:r>
         <w:rPr/>
+        <w:t xml:space="preserve"> NDI (top), ODI (middle) and FWF (bottom). NDI is high near the VTA and increases again toward the hippocampus; ODI is higher at both ends where fibres fan; FWF rises sharply at the hippocampal end adjacent to cerebrospinal fluid.</w:t>
+      </w:r>
+    </w:p>
+    <w:p>
+      <w:pPr>
+        <w:pStyle w:val="BodyText"/>
+        <w:bidi w:val="0"/>
+        <w:jc w:val="left"/>
+        <w:rPr/>
+      </w:pPr>
+      <w:r>
+        <w:rPr>
+          <w:rStyle w:val="Strong"/>
+        </w:rPr>
+        <w:t>Figure S17</w:t>
+      </w:r>
+    </w:p>
+    <w:p>
+      <w:pPr>
+        <w:pStyle w:val="BodyText"/>
+        <w:bidi w:val="0"/>
+        <w:jc w:val="left"/>
+        <w:rPr/>
+      </w:pPr>
+      <w:r>
+        <w:rPr>
+          <w:rStyle w:val="Emphasis"/>
+        </w:rPr>
+        <w:t>NDI Along the Anterior Tract for the Same Participant</w:t>
+      </w:r>
+    </w:p>
+    <w:p>
+      <w:pPr>
+        <w:pStyle w:val="BodyText"/>
+        <w:bidi w:val="0"/>
+        <w:jc w:val="left"/>
+        <w:rPr/>
+      </w:pPr>
+      <w:r>
+        <w:rPr/>
+        <w:drawing>
+          <wp:inline distT="0" distB="0" distL="0" distR="0">
+            <wp:extent cx="5334000" cy="3762375"/>
+            <wp:effectExtent l="0" t="0" r="0" b="0"/>
+            <wp:docPr id="20" name="Image20" descr="NDI profile, anterior tract"/>
+            <wp:cNvGraphicFramePr>
+              <a:graphicFrameLocks xmlns:a="http://schemas.openxmlformats.org/drawingml/2006/main" noChangeAspect="1"/>
+            </wp:cNvGraphicFramePr>
+            <a:graphic xmlns:a="http://schemas.openxmlformats.org/drawingml/2006/main">
+              <a:graphicData uri="http://schemas.openxmlformats.org/drawingml/2006/picture">
+                <pic:pic xmlns:pic="http://schemas.openxmlformats.org/drawingml/2006/picture">
+                  <pic:nvPicPr>
+                    <pic:cNvPr id="20" name="Image20" descr="NDI profile, anterior tract"/>
+                    <pic:cNvPicPr>
+                      <a:picLocks noChangeAspect="1" noChangeArrowheads="1"/>
+                    </pic:cNvPicPr>
+                  </pic:nvPicPr>
+                  <pic:blipFill>
+                    <a:blip r:embed="rId37"/>
+                    <a:stretch>
+                      <a:fillRect/>
+                    </a:stretch>
+                  </pic:blipFill>
+                  <pic:spPr bwMode="auto">
+                    <a:xfrm>
+                      <a:off x="0" y="0"/>
+                      <a:ext cx="5334000" cy="3762375"/>
+                    </a:xfrm>
+                    <a:prstGeom prst="rect">
+                      <a:avLst/>
+                    </a:prstGeom>
+                    <a:noFill/>
+                  </pic:spPr>
+                </pic:pic>
+              </a:graphicData>
+            </a:graphic>
+          </wp:inline>
+        </w:drawing>
+      </w:r>
+    </w:p>
+    <w:p>
+      <w:pPr>
+        <w:pStyle w:val="BodyText"/>
+        <w:bidi w:val="0"/>
+        <w:jc w:val="left"/>
+        <w:rPr/>
+      </w:pPr>
+      <w:r>
+        <w:rPr>
+          <w:rStyle w:val="Emphasis"/>
+        </w:rPr>
+        <w:t>Note.</w:t>
+      </w:r>
+      <w:r>
+        <w:rPr/>
         <w:t xml:space="preserve"> The anterior tract shares the early trajectory and diverges late.</w:t>
       </w:r>
     </w:p>
@@ -16594,7 +16606,7 @@
         <w:jc w:val="left"/>
         <w:rPr/>
       </w:pPr>
-      <w:hyperlink r:id="rId37">
+      <w:hyperlink r:id="rId38">
         <w:r>
           <w:rPr>
             <w:rStyle w:val="Hyperlink"/>
@@ -16609,7 +16621,7 @@
         <w:rPr/>
         <w:t xml:space="preserve"> · </w:t>
       </w:r>
-      <w:hyperlink r:id="rId38">
+      <w:hyperlink r:id="rId39">
         <w:r>
           <w:rPr>
             <w:rStyle w:val="Hyperlink"/>
@@ -21237,7 +21249,7 @@
         <w:rPr/>
         <w:t xml:space="preserve">Symptoms that appear at Step 1 or Step 2 often originate upstream, in the brain mask, the skull strip or the T1-to-diffusion transform; those steps are documented in the </w:t>
       </w:r>
-      <w:hyperlink r:id="rId39">
+      <w:hyperlink r:id="rId40">
         <w:r>
           <w:rPr>
             <w:rStyle w:val="Hyperlink"/>
@@ -22045,7 +22057,7 @@
         <w:rPr/>
         <w:t xml:space="preserve">The </w:t>
       </w:r>
-      <w:hyperlink r:id="rId40">
+      <w:hyperlink r:id="rId41">
         <w:r>
           <w:rPr>
             <w:rStyle w:val="Hyperlink"/>
@@ -22057,7 +22069,7 @@
         <w:rPr/>
         <w:t xml:space="preserve"> covers this as its Steps 11 and 12 (</w:t>
       </w:r>
-      <w:hyperlink r:id="rId41">
+      <w:hyperlink r:id="rId42">
         <w:r>
           <w:rPr>
             <w:rStyle w:val="Hyperlink"/>
@@ -22069,7 +22081,7 @@
         <w:rPr/>
         <w:t xml:space="preserve">, </w:t>
       </w:r>
-      <w:hyperlink r:id="rId42">
+      <w:hyperlink r:id="rId43">
         <w:r>
           <w:rPr>
             <w:rStyle w:val="Hyperlink"/>
@@ -23921,7 +23933,7 @@
         <w:rPr/>
         <w:t xml:space="preserve">The scripts from which these were generalized are in the </w:t>
       </w:r>
-      <w:hyperlink r:id="rId43">
+      <w:hyperlink r:id="rId44">
         <w:r>
           <w:rPr>
             <w:rStyle w:val="Hyperlink"/>
@@ -23968,7 +23980,7 @@
         <w:rPr/>
         <w:t xml:space="preserve">The whole tutorial is also available as a single document, with tables and figures numbered S1, S2 and so on and the scripts in an appendix: </w:t>
       </w:r>
-      <w:hyperlink r:id="rId44">
+      <w:hyperlink r:id="rId45">
         <w:r>
           <w:rPr>
             <w:rStyle w:val="Hyperlink"/>
@@ -23980,7 +23992,7 @@
         <w:rPr/>
         <w:t xml:space="preserve"> and </w:t>
       </w:r>
-      <w:hyperlink r:id="rId45">
+      <w:hyperlink r:id="rId46">
         <w:r>
           <w:rPr>
             <w:rStyle w:val="Hyperlink"/>
@@ -25210,7 +25222,7 @@
         <w:rPr/>
         <w:t xml:space="preserve"> file in the package and the </w:t>
       </w:r>
-      <w:hyperlink r:id="rId46">
+      <w:hyperlink r:id="rId47">
         <w:r>
           <w:rPr>
             <w:rStyle w:val="Hyperlink"/>
@@ -25267,7 +25279,7 @@
         <w:rPr/>
         <w:t xml:space="preserve">(1), 26–41. </w:t>
       </w:r>
-      <w:hyperlink r:id="rId47">
+      <w:hyperlink r:id="rId48">
         <w:r>
           <w:rPr>
             <w:rStyle w:val="Hyperlink"/>
@@ -25297,7 +25309,7 @@
         <w:rPr/>
         <w:t xml:space="preserve">, 32–44. </w:t>
       </w:r>
-      <w:hyperlink r:id="rId48">
+      <w:hyperlink r:id="rId49">
         <w:r>
           <w:rPr>
             <w:rStyle w:val="Hyperlink"/>
@@ -25349,7 +25361,7 @@
         <w:rPr/>
         <w:t xml:space="preserve">(7), 1256–1265. </w:t>
       </w:r>
-      <w:hyperlink r:id="rId49">
+      <w:hyperlink r:id="rId50">
         <w:r>
           <w:rPr>
             <w:rStyle w:val="Hyperlink"/>
@@ -25379,7 +25391,7 @@
         <w:rPr/>
         <w:t xml:space="preserve">(4), 292–298. </w:t>
       </w:r>
-      <w:hyperlink r:id="rId50">
+      <w:hyperlink r:id="rId51">
         <w:r>
           <w:rPr>
             <w:rStyle w:val="Hyperlink"/>
@@ -25409,7 +25421,7 @@
         <w:rPr/>
         <w:t xml:space="preserve">, 175. </w:t>
       </w:r>
-      <w:hyperlink r:id="rId51">
+      <w:hyperlink r:id="rId52">
         <w:r>
           <w:rPr>
             <w:rStyle w:val="Hyperlink"/>
@@ -25439,7 +25451,7 @@
         <w:rPr/>
         <w:t xml:space="preserve">, 8. </w:t>
       </w:r>
-      <w:hyperlink r:id="rId52">
+      <w:hyperlink r:id="rId53">
         <w:r>
           <w:rPr>
             <w:rStyle w:val="Hyperlink"/>
@@ -25469,7 +25481,7 @@
         <w:rPr/>
         <w:t xml:space="preserve">, 119474. </w:t>
       </w:r>
-      <w:hyperlink r:id="rId53">
+      <w:hyperlink r:id="rId54">
         <w:r>
           <w:rPr>
             <w:rStyle w:val="Hyperlink"/>
@@ -25499,7 +25511,7 @@
         <w:rPr/>
         <w:t xml:space="preserve">(2), 782–790. </w:t>
       </w:r>
-      <w:hyperlink r:id="rId54">
+      <w:hyperlink r:id="rId55">
         <w:r>
           <w:rPr>
             <w:rStyle w:val="Hyperlink"/>
@@ -25529,7 +25541,7 @@
         <w:rPr/>
         <w:t xml:space="preserve">, 411–426. </w:t>
       </w:r>
-      <w:hyperlink r:id="rId55">
+      <w:hyperlink r:id="rId56">
         <w:r>
           <w:rPr>
             <w:rStyle w:val="Hyperlink"/>
@@ -25559,7 +25571,7 @@
         <w:rPr/>
         <w:t xml:space="preserve">(1). </w:t>
       </w:r>
-      <w:hyperlink r:id="rId56">
+      <w:hyperlink r:id="rId57">
         <w:r>
           <w:rPr>
             <w:rStyle w:val="Hyperlink"/>
@@ -25589,7 +25601,7 @@
         <w:rPr/>
         <w:t xml:space="preserve">(2–3), 155–171. </w:t>
       </w:r>
-      <w:hyperlink r:id="rId57">
+      <w:hyperlink r:id="rId58">
         <w:r>
           <w:rPr>
             <w:rStyle w:val="Hyperlink"/>
@@ -25619,7 +25631,7 @@
         <w:rPr/>
         <w:t xml:space="preserve">, 580–589. </w:t>
       </w:r>
-      <w:hyperlink r:id="rId58">
+      <w:hyperlink r:id="rId59">
         <w:r>
           <w:rPr>
             <w:rStyle w:val="Hyperlink"/>
@@ -25649,7 +25661,7 @@
         <w:rPr/>
         <w:t xml:space="preserve">, 118749. </w:t>
       </w:r>
-      <w:hyperlink r:id="rId59">
+      <w:hyperlink r:id="rId60">
         <w:r>
           <w:rPr>
             <w:rStyle w:val="Hyperlink"/>
@@ -25679,7 +25691,7 @@
         <w:rPr/>
         <w:t xml:space="preserve">, 180063. </w:t>
       </w:r>
-      <w:hyperlink r:id="rId60">
+      <w:hyperlink r:id="rId61">
         <w:r>
           <w:rPr>
             <w:rStyle w:val="Hyperlink"/>
@@ -25753,7 +25765,7 @@
         <w:rPr/>
         <w:t xml:space="preserve">, 116137. </w:t>
       </w:r>
-      <w:hyperlink r:id="rId61">
+      <w:hyperlink r:id="rId62">
         <w:r>
           <w:rPr>
             <w:rStyle w:val="Hyperlink"/>
@@ -25783,7 +25795,7 @@
         <w:rPr/>
         <w:t xml:space="preserve">, 1155–1167. </w:t>
       </w:r>
-      <w:hyperlink r:id="rId62">
+      <w:hyperlink r:id="rId63">
         <w:r>
           <w:rPr>
             <w:rStyle w:val="Hyperlink"/>
@@ -25813,7 +25825,7 @@
         <w:rPr/>
         <w:t xml:space="preserve">(5), 1165–1177. </w:t>
       </w:r>
-      <w:hyperlink r:id="rId63">
+      <w:hyperlink r:id="rId64">
         <w:r>
           <w:rPr>
             <w:rStyle w:val="Hyperlink"/>
@@ -25843,7 +25855,7 @@
         <w:rPr/>
         <w:t xml:space="preserve">, 318–331. </w:t>
       </w:r>
-      <w:hyperlink r:id="rId64">
+      <w:hyperlink r:id="rId65">
         <w:r>
           <w:rPr>
             <w:rStyle w:val="Hyperlink"/>
@@ -25873,7 +25885,7 @@
         <w:rPr/>
         <w:t xml:space="preserve">, 381–397. </w:t>
       </w:r>
-      <w:hyperlink r:id="rId65">
+      <w:hyperlink r:id="rId66">
         <w:r>
           <w:rPr>
             <w:rStyle w:val="Hyperlink"/>
@@ -25903,7 +25915,7 @@
         <w:rPr/>
         <w:t xml:space="preserve">(11), e49790. </w:t>
       </w:r>
-      <w:hyperlink r:id="rId66">
+      <w:hyperlink r:id="rId67">
         <w:r>
           <w:rPr>
             <w:rStyle w:val="Hyperlink"/>
@@ -25933,7 +25945,7 @@
         <w:rPr/>
         <w:t xml:space="preserve">(4), 1000–1016. </w:t>
       </w:r>
-      <w:hyperlink r:id="rId67">
+      <w:hyperlink r:id="rId68">
         <w:r>
           <w:rPr>
             <w:rStyle w:val="Hyperlink"/>

</xml_diff>